<commit_message>
Add project sections 3 and 4
</commit_message>
<xml_diff>
--- a/docs/Phase_2_Feasibility_Study.docx
+++ b/docs/Phase_2_Feasibility_Study.docx
@@ -2807,6 +2807,13 @@
     <w:p>
       <w:pPr>
         <w:pStyle w:val="Heading1"/>
+        <w:rPr>
+          <w:rFonts w:ascii="Aptos" w:eastAsiaTheme="minorEastAsia" w:hAnsi="Aptos" w:cstheme="minorBidi"/>
+          <w:b w:val="0"/>
+          <w:bCs w:val="0"/>
+          <w:sz w:val="22"/>
+          <w:szCs w:val="22"/>
+        </w:rPr>
       </w:pPr>
       <w:r>
         <w:rPr>
@@ -2880,6 +2887,2285 @@
         </w:rPr>
         <w:t>. The prototype should return search and match results. The prototype should stop actions. The prototype should compute sample sustainability indicators, from known inputs. AI quality must be evaluated separately from workflow completion. A successful transfer does not prove that an AI recommendation was accurate. A relevant recommendation does not prove that a transfer was approved or beneficial.</w:t>
       </w:r>
+    </w:p>
+    <w:p>
+      <w:pPr>
+        <w:rPr>
+          <w:b/>
+          <w:bCs/>
+          <w:lang w:val="en-AE"/>
+        </w:rPr>
+      </w:pPr>
+      <w:r>
+        <w:rPr>
+          <w:b/>
+          <w:bCs/>
+          <w:lang w:val="en-AE"/>
+        </w:rPr>
+        <w:t>3 Feasibility Evaluation Method</w:t>
+      </w:r>
+    </w:p>
+    <w:p>
+      <w:pPr>
+        <w:rPr>
+          <w:lang w:val="en-AE"/>
+        </w:rPr>
+      </w:pPr>
+      <w:r>
+        <w:rPr>
+          <w:lang w:val="en-AE"/>
+        </w:rPr>
+        <w:t>The evaluation is based on six dimensions from the Phase 2 instructions. Each dimension gets a score from one, to five. A score of one means the project cannot move forward under the assumptions. A score of three means the area is possible but has limitations. A score of five means the area is clearly feasible using existing resources and standard methods. These scores wrap up the analysis. They do not replace the detailed conditions and risks explained in the following sections.</w:t>
+      </w:r>
+    </w:p>
+    <w:p>
+      <w:pPr>
+        <w:rPr>
+          <w:lang w:val="en-AE"/>
+        </w:rPr>
+      </w:pPr>
+      <w:r>
+        <w:rPr>
+          <w:b/>
+          <w:bCs/>
+          <w:lang w:val="en-AE"/>
+        </w:rPr>
+        <w:t>Table 3 Feasibility Dimensions and Evidence</w:t>
+      </w:r>
+    </w:p>
+    <w:tbl>
+      <w:tblPr>
+        <w:tblW w:w="0" w:type="auto"/>
+        <w:jc w:val="center"/>
+        <w:tblCellMar>
+          <w:top w:w="15" w:type="dxa"/>
+          <w:left w:w="15" w:type="dxa"/>
+          <w:bottom w:w="15" w:type="dxa"/>
+          <w:right w:w="15" w:type="dxa"/>
+        </w:tblCellMar>
+        <w:tblLook w:val="04A0" w:firstRow="1" w:lastRow="0" w:firstColumn="1" w:lastColumn="0" w:noHBand="0" w:noVBand="1"/>
+      </w:tblPr>
+      <w:tblGrid>
+        <w:gridCol w:w="2172"/>
+        <w:gridCol w:w="1147"/>
+        <w:gridCol w:w="6543"/>
+      </w:tblGrid>
+      <w:tr>
+        <w:trPr>
+          <w:tblHeader/>
+          <w:jc w:val="center"/>
+        </w:trPr>
+        <w:tc>
+          <w:tcPr>
+            <w:tcW w:w="0" w:type="auto"/>
+            <w:tcBorders>
+              <w:top w:val="single" w:sz="6" w:space="0" w:color="D9D9D9"/>
+              <w:left w:val="single" w:sz="6" w:space="0" w:color="D9D9D9"/>
+              <w:bottom w:val="single" w:sz="6" w:space="0" w:color="D9D9D9"/>
+              <w:right w:val="single" w:sz="6" w:space="0" w:color="D9D9D9"/>
+            </w:tcBorders>
+            <w:shd w:val="clear" w:color="auto" w:fill="17365D"/>
+            <w:tcMar>
+              <w:top w:w="105" w:type="dxa"/>
+              <w:left w:w="115" w:type="dxa"/>
+              <w:bottom w:w="105" w:type="dxa"/>
+              <w:right w:w="115" w:type="dxa"/>
+            </w:tcMar>
+            <w:vAlign w:val="center"/>
+            <w:hideMark/>
+          </w:tcPr>
+          <w:p>
+            <w:pPr>
+              <w:rPr>
+                <w:b/>
+                <w:bCs/>
+                <w:lang w:val="en-AE"/>
+              </w:rPr>
+            </w:pPr>
+            <w:r>
+              <w:rPr>
+                <w:b/>
+                <w:bCs/>
+                <w:lang w:val="en-AE"/>
+              </w:rPr>
+              <w:t>Dimension</w:t>
+            </w:r>
+          </w:p>
+        </w:tc>
+        <w:tc>
+          <w:tcPr>
+            <w:tcW w:w="0" w:type="auto"/>
+            <w:tcBorders>
+              <w:top w:val="single" w:sz="6" w:space="0" w:color="D9D9D9"/>
+              <w:left w:val="single" w:sz="6" w:space="0" w:color="D9D9D9"/>
+              <w:bottom w:val="single" w:sz="6" w:space="0" w:color="D9D9D9"/>
+              <w:right w:val="single" w:sz="6" w:space="0" w:color="D9D9D9"/>
+            </w:tcBorders>
+            <w:shd w:val="clear" w:color="auto" w:fill="17365D"/>
+            <w:tcMar>
+              <w:top w:w="105" w:type="dxa"/>
+              <w:left w:w="115" w:type="dxa"/>
+              <w:bottom w:w="105" w:type="dxa"/>
+              <w:right w:w="115" w:type="dxa"/>
+            </w:tcMar>
+            <w:vAlign w:val="center"/>
+            <w:hideMark/>
+          </w:tcPr>
+          <w:p>
+            <w:pPr>
+              <w:rPr>
+                <w:b/>
+                <w:bCs/>
+                <w:lang w:val="en-AE"/>
+              </w:rPr>
+            </w:pPr>
+            <w:r>
+              <w:rPr>
+                <w:b/>
+                <w:bCs/>
+                <w:lang w:val="en-AE"/>
+              </w:rPr>
+              <w:t>Weight</w:t>
+            </w:r>
+          </w:p>
+        </w:tc>
+        <w:tc>
+          <w:tcPr>
+            <w:tcW w:w="0" w:type="auto"/>
+            <w:tcBorders>
+              <w:top w:val="single" w:sz="6" w:space="0" w:color="D9D9D9"/>
+              <w:left w:val="single" w:sz="6" w:space="0" w:color="D9D9D9"/>
+              <w:bottom w:val="single" w:sz="6" w:space="0" w:color="D9D9D9"/>
+              <w:right w:val="single" w:sz="6" w:space="0" w:color="D9D9D9"/>
+            </w:tcBorders>
+            <w:shd w:val="clear" w:color="auto" w:fill="17365D"/>
+            <w:tcMar>
+              <w:top w:w="105" w:type="dxa"/>
+              <w:left w:w="115" w:type="dxa"/>
+              <w:bottom w:w="105" w:type="dxa"/>
+              <w:right w:w="115" w:type="dxa"/>
+            </w:tcMar>
+            <w:vAlign w:val="center"/>
+            <w:hideMark/>
+          </w:tcPr>
+          <w:p>
+            <w:pPr>
+              <w:rPr>
+                <w:b/>
+                <w:bCs/>
+                <w:lang w:val="en-AE"/>
+              </w:rPr>
+            </w:pPr>
+            <w:r>
+              <w:rPr>
+                <w:b/>
+                <w:bCs/>
+                <w:lang w:val="en-AE"/>
+              </w:rPr>
+              <w:t>Evidence Considered</w:t>
+            </w:r>
+          </w:p>
+        </w:tc>
+      </w:tr>
+      <w:tr>
+        <w:trPr>
+          <w:jc w:val="center"/>
+        </w:trPr>
+        <w:tc>
+          <w:tcPr>
+            <w:tcW w:w="0" w:type="auto"/>
+            <w:tcBorders>
+              <w:top w:val="single" w:sz="6" w:space="0" w:color="D9D9D9"/>
+              <w:left w:val="single" w:sz="6" w:space="0" w:color="D9D9D9"/>
+              <w:bottom w:val="single" w:sz="6" w:space="0" w:color="D9D9D9"/>
+              <w:right w:val="single" w:sz="6" w:space="0" w:color="D9D9D9"/>
+            </w:tcBorders>
+            <w:tcMar>
+              <w:top w:w="95" w:type="dxa"/>
+              <w:left w:w="115" w:type="dxa"/>
+              <w:bottom w:w="95" w:type="dxa"/>
+              <w:right w:w="115" w:type="dxa"/>
+            </w:tcMar>
+            <w:vAlign w:val="center"/>
+            <w:hideMark/>
+          </w:tcPr>
+          <w:p>
+            <w:pPr>
+              <w:rPr>
+                <w:lang w:val="en-AE"/>
+              </w:rPr>
+            </w:pPr>
+            <w:r>
+              <w:rPr>
+                <w:lang w:val="en-AE"/>
+              </w:rPr>
+              <w:t>Technical</w:t>
+            </w:r>
+          </w:p>
+        </w:tc>
+        <w:tc>
+          <w:tcPr>
+            <w:tcW w:w="0" w:type="auto"/>
+            <w:tcBorders>
+              <w:top w:val="single" w:sz="6" w:space="0" w:color="D9D9D9"/>
+              <w:left w:val="single" w:sz="6" w:space="0" w:color="D9D9D9"/>
+              <w:bottom w:val="single" w:sz="6" w:space="0" w:color="D9D9D9"/>
+              <w:right w:val="single" w:sz="6" w:space="0" w:color="D9D9D9"/>
+            </w:tcBorders>
+            <w:tcMar>
+              <w:top w:w="95" w:type="dxa"/>
+              <w:left w:w="115" w:type="dxa"/>
+              <w:bottom w:w="95" w:type="dxa"/>
+              <w:right w:w="115" w:type="dxa"/>
+            </w:tcMar>
+            <w:vAlign w:val="center"/>
+            <w:hideMark/>
+          </w:tcPr>
+          <w:p>
+            <w:pPr>
+              <w:rPr>
+                <w:lang w:val="en-AE"/>
+              </w:rPr>
+            </w:pPr>
+            <w:r>
+              <w:rPr>
+                <w:lang w:val="en-AE"/>
+              </w:rPr>
+              <w:t>20 percent</w:t>
+            </w:r>
+          </w:p>
+        </w:tc>
+        <w:tc>
+          <w:tcPr>
+            <w:tcW w:w="0" w:type="auto"/>
+            <w:tcBorders>
+              <w:top w:val="single" w:sz="6" w:space="0" w:color="D9D9D9"/>
+              <w:left w:val="single" w:sz="6" w:space="0" w:color="D9D9D9"/>
+              <w:bottom w:val="single" w:sz="6" w:space="0" w:color="D9D9D9"/>
+              <w:right w:val="single" w:sz="6" w:space="0" w:color="D9D9D9"/>
+            </w:tcBorders>
+            <w:tcMar>
+              <w:top w:w="95" w:type="dxa"/>
+              <w:left w:w="115" w:type="dxa"/>
+              <w:bottom w:w="95" w:type="dxa"/>
+              <w:right w:w="115" w:type="dxa"/>
+            </w:tcMar>
+            <w:vAlign w:val="center"/>
+            <w:hideMark/>
+          </w:tcPr>
+          <w:p>
+            <w:pPr>
+              <w:rPr>
+                <w:lang w:val="en-AE"/>
+              </w:rPr>
+            </w:pPr>
+            <w:r>
+              <w:rPr>
+                <w:lang w:val="en-AE"/>
+              </w:rPr>
+              <w:t xml:space="preserve">Architecture complexity, software availability, integration effort, performance, fallback </w:t>
+            </w:r>
+            <w:proofErr w:type="spellStart"/>
+            <w:r>
+              <w:rPr>
+                <w:lang w:val="en-AE"/>
+              </w:rPr>
+              <w:t>behavior</w:t>
+            </w:r>
+            <w:proofErr w:type="spellEnd"/>
+          </w:p>
+        </w:tc>
+      </w:tr>
+      <w:tr>
+        <w:trPr>
+          <w:jc w:val="center"/>
+        </w:trPr>
+        <w:tc>
+          <w:tcPr>
+            <w:tcW w:w="0" w:type="auto"/>
+            <w:tcBorders>
+              <w:top w:val="single" w:sz="6" w:space="0" w:color="D9D9D9"/>
+              <w:left w:val="single" w:sz="6" w:space="0" w:color="D9D9D9"/>
+              <w:bottom w:val="single" w:sz="6" w:space="0" w:color="D9D9D9"/>
+              <w:right w:val="single" w:sz="6" w:space="0" w:color="D9D9D9"/>
+            </w:tcBorders>
+            <w:shd w:val="clear" w:color="auto" w:fill="EAF2F8"/>
+            <w:tcMar>
+              <w:top w:w="95" w:type="dxa"/>
+              <w:left w:w="115" w:type="dxa"/>
+              <w:bottom w:w="95" w:type="dxa"/>
+              <w:right w:w="115" w:type="dxa"/>
+            </w:tcMar>
+            <w:vAlign w:val="center"/>
+            <w:hideMark/>
+          </w:tcPr>
+          <w:p>
+            <w:pPr>
+              <w:rPr>
+                <w:lang w:val="en-AE"/>
+              </w:rPr>
+            </w:pPr>
+            <w:r>
+              <w:rPr>
+                <w:lang w:val="en-AE"/>
+              </w:rPr>
+              <w:t>Data and AI</w:t>
+            </w:r>
+          </w:p>
+        </w:tc>
+        <w:tc>
+          <w:tcPr>
+            <w:tcW w:w="0" w:type="auto"/>
+            <w:tcBorders>
+              <w:top w:val="single" w:sz="6" w:space="0" w:color="D9D9D9"/>
+              <w:left w:val="single" w:sz="6" w:space="0" w:color="D9D9D9"/>
+              <w:bottom w:val="single" w:sz="6" w:space="0" w:color="D9D9D9"/>
+              <w:right w:val="single" w:sz="6" w:space="0" w:color="D9D9D9"/>
+            </w:tcBorders>
+            <w:shd w:val="clear" w:color="auto" w:fill="EAF2F8"/>
+            <w:tcMar>
+              <w:top w:w="95" w:type="dxa"/>
+              <w:left w:w="115" w:type="dxa"/>
+              <w:bottom w:w="95" w:type="dxa"/>
+              <w:right w:w="115" w:type="dxa"/>
+            </w:tcMar>
+            <w:vAlign w:val="center"/>
+            <w:hideMark/>
+          </w:tcPr>
+          <w:p>
+            <w:pPr>
+              <w:rPr>
+                <w:lang w:val="en-AE"/>
+              </w:rPr>
+            </w:pPr>
+            <w:r>
+              <w:rPr>
+                <w:lang w:val="en-AE"/>
+              </w:rPr>
+              <w:t>20 percent</w:t>
+            </w:r>
+          </w:p>
+        </w:tc>
+        <w:tc>
+          <w:tcPr>
+            <w:tcW w:w="0" w:type="auto"/>
+            <w:tcBorders>
+              <w:top w:val="single" w:sz="6" w:space="0" w:color="D9D9D9"/>
+              <w:left w:val="single" w:sz="6" w:space="0" w:color="D9D9D9"/>
+              <w:bottom w:val="single" w:sz="6" w:space="0" w:color="D9D9D9"/>
+              <w:right w:val="single" w:sz="6" w:space="0" w:color="D9D9D9"/>
+            </w:tcBorders>
+            <w:shd w:val="clear" w:color="auto" w:fill="EAF2F8"/>
+            <w:tcMar>
+              <w:top w:w="95" w:type="dxa"/>
+              <w:left w:w="115" w:type="dxa"/>
+              <w:bottom w:w="95" w:type="dxa"/>
+              <w:right w:w="115" w:type="dxa"/>
+            </w:tcMar>
+            <w:vAlign w:val="center"/>
+            <w:hideMark/>
+          </w:tcPr>
+          <w:p>
+            <w:pPr>
+              <w:rPr>
+                <w:lang w:val="en-AE"/>
+              </w:rPr>
+            </w:pPr>
+            <w:r>
+              <w:rPr>
+                <w:lang w:val="en-AE"/>
+              </w:rPr>
+              <w:t>Data availability, completeness, privacy, model suitability, evaluation, explainability</w:t>
+            </w:r>
+          </w:p>
+        </w:tc>
+      </w:tr>
+      <w:tr>
+        <w:trPr>
+          <w:jc w:val="center"/>
+        </w:trPr>
+        <w:tc>
+          <w:tcPr>
+            <w:tcW w:w="0" w:type="auto"/>
+            <w:tcBorders>
+              <w:top w:val="single" w:sz="6" w:space="0" w:color="D9D9D9"/>
+              <w:left w:val="single" w:sz="6" w:space="0" w:color="D9D9D9"/>
+              <w:bottom w:val="single" w:sz="6" w:space="0" w:color="D9D9D9"/>
+              <w:right w:val="single" w:sz="6" w:space="0" w:color="D9D9D9"/>
+            </w:tcBorders>
+            <w:tcMar>
+              <w:top w:w="95" w:type="dxa"/>
+              <w:left w:w="115" w:type="dxa"/>
+              <w:bottom w:w="95" w:type="dxa"/>
+              <w:right w:w="115" w:type="dxa"/>
+            </w:tcMar>
+            <w:vAlign w:val="center"/>
+            <w:hideMark/>
+          </w:tcPr>
+          <w:p>
+            <w:pPr>
+              <w:rPr>
+                <w:lang w:val="en-AE"/>
+              </w:rPr>
+            </w:pPr>
+            <w:r>
+              <w:rPr>
+                <w:lang w:val="en-AE"/>
+              </w:rPr>
+              <w:t>Operational</w:t>
+            </w:r>
+          </w:p>
+        </w:tc>
+        <w:tc>
+          <w:tcPr>
+            <w:tcW w:w="0" w:type="auto"/>
+            <w:tcBorders>
+              <w:top w:val="single" w:sz="6" w:space="0" w:color="D9D9D9"/>
+              <w:left w:val="single" w:sz="6" w:space="0" w:color="D9D9D9"/>
+              <w:bottom w:val="single" w:sz="6" w:space="0" w:color="D9D9D9"/>
+              <w:right w:val="single" w:sz="6" w:space="0" w:color="D9D9D9"/>
+            </w:tcBorders>
+            <w:tcMar>
+              <w:top w:w="95" w:type="dxa"/>
+              <w:left w:w="115" w:type="dxa"/>
+              <w:bottom w:w="95" w:type="dxa"/>
+              <w:right w:w="115" w:type="dxa"/>
+            </w:tcMar>
+            <w:vAlign w:val="center"/>
+            <w:hideMark/>
+          </w:tcPr>
+          <w:p>
+            <w:pPr>
+              <w:rPr>
+                <w:lang w:val="en-AE"/>
+              </w:rPr>
+            </w:pPr>
+            <w:r>
+              <w:rPr>
+                <w:lang w:val="en-AE"/>
+              </w:rPr>
+              <w:t>15 percent</w:t>
+            </w:r>
+          </w:p>
+        </w:tc>
+        <w:tc>
+          <w:tcPr>
+            <w:tcW w:w="0" w:type="auto"/>
+            <w:tcBorders>
+              <w:top w:val="single" w:sz="6" w:space="0" w:color="D9D9D9"/>
+              <w:left w:val="single" w:sz="6" w:space="0" w:color="D9D9D9"/>
+              <w:bottom w:val="single" w:sz="6" w:space="0" w:color="D9D9D9"/>
+              <w:right w:val="single" w:sz="6" w:space="0" w:color="D9D9D9"/>
+            </w:tcBorders>
+            <w:tcMar>
+              <w:top w:w="95" w:type="dxa"/>
+              <w:left w:w="115" w:type="dxa"/>
+              <w:bottom w:w="95" w:type="dxa"/>
+              <w:right w:w="115" w:type="dxa"/>
+            </w:tcMar>
+            <w:vAlign w:val="center"/>
+            <w:hideMark/>
+          </w:tcPr>
+          <w:p>
+            <w:pPr>
+              <w:rPr>
+                <w:lang w:val="en-AE"/>
+              </w:rPr>
+            </w:pPr>
+            <w:r>
+              <w:rPr>
+                <w:lang w:val="en-AE"/>
+              </w:rPr>
+              <w:t>Role fit, workflow adoption, training, ownership, support</w:t>
+            </w:r>
+          </w:p>
+        </w:tc>
+      </w:tr>
+      <w:tr>
+        <w:trPr>
+          <w:jc w:val="center"/>
+        </w:trPr>
+        <w:tc>
+          <w:tcPr>
+            <w:tcW w:w="0" w:type="auto"/>
+            <w:tcBorders>
+              <w:top w:val="single" w:sz="6" w:space="0" w:color="D9D9D9"/>
+              <w:left w:val="single" w:sz="6" w:space="0" w:color="D9D9D9"/>
+              <w:bottom w:val="single" w:sz="6" w:space="0" w:color="D9D9D9"/>
+              <w:right w:val="single" w:sz="6" w:space="0" w:color="D9D9D9"/>
+            </w:tcBorders>
+            <w:shd w:val="clear" w:color="auto" w:fill="EAF2F8"/>
+            <w:tcMar>
+              <w:top w:w="95" w:type="dxa"/>
+              <w:left w:w="115" w:type="dxa"/>
+              <w:bottom w:w="95" w:type="dxa"/>
+              <w:right w:w="115" w:type="dxa"/>
+            </w:tcMar>
+            <w:vAlign w:val="center"/>
+            <w:hideMark/>
+          </w:tcPr>
+          <w:p>
+            <w:pPr>
+              <w:rPr>
+                <w:lang w:val="en-AE"/>
+              </w:rPr>
+            </w:pPr>
+            <w:r>
+              <w:rPr>
+                <w:lang w:val="en-AE"/>
+              </w:rPr>
+              <w:t>Financial</w:t>
+            </w:r>
+          </w:p>
+        </w:tc>
+        <w:tc>
+          <w:tcPr>
+            <w:tcW w:w="0" w:type="auto"/>
+            <w:tcBorders>
+              <w:top w:val="single" w:sz="6" w:space="0" w:color="D9D9D9"/>
+              <w:left w:val="single" w:sz="6" w:space="0" w:color="D9D9D9"/>
+              <w:bottom w:val="single" w:sz="6" w:space="0" w:color="D9D9D9"/>
+              <w:right w:val="single" w:sz="6" w:space="0" w:color="D9D9D9"/>
+            </w:tcBorders>
+            <w:shd w:val="clear" w:color="auto" w:fill="EAF2F8"/>
+            <w:tcMar>
+              <w:top w:w="95" w:type="dxa"/>
+              <w:left w:w="115" w:type="dxa"/>
+              <w:bottom w:w="95" w:type="dxa"/>
+              <w:right w:w="115" w:type="dxa"/>
+            </w:tcMar>
+            <w:vAlign w:val="center"/>
+            <w:hideMark/>
+          </w:tcPr>
+          <w:p>
+            <w:pPr>
+              <w:rPr>
+                <w:lang w:val="en-AE"/>
+              </w:rPr>
+            </w:pPr>
+            <w:r>
+              <w:rPr>
+                <w:lang w:val="en-AE"/>
+              </w:rPr>
+              <w:t>15 percent</w:t>
+            </w:r>
+          </w:p>
+        </w:tc>
+        <w:tc>
+          <w:tcPr>
+            <w:tcW w:w="0" w:type="auto"/>
+            <w:tcBorders>
+              <w:top w:val="single" w:sz="6" w:space="0" w:color="D9D9D9"/>
+              <w:left w:val="single" w:sz="6" w:space="0" w:color="D9D9D9"/>
+              <w:bottom w:val="single" w:sz="6" w:space="0" w:color="D9D9D9"/>
+              <w:right w:val="single" w:sz="6" w:space="0" w:color="D9D9D9"/>
+            </w:tcBorders>
+            <w:shd w:val="clear" w:color="auto" w:fill="EAF2F8"/>
+            <w:tcMar>
+              <w:top w:w="95" w:type="dxa"/>
+              <w:left w:w="115" w:type="dxa"/>
+              <w:bottom w:w="95" w:type="dxa"/>
+              <w:right w:w="115" w:type="dxa"/>
+            </w:tcMar>
+            <w:vAlign w:val="center"/>
+            <w:hideMark/>
+          </w:tcPr>
+          <w:p>
+            <w:pPr>
+              <w:rPr>
+                <w:lang w:val="en-AE"/>
+              </w:rPr>
+            </w:pPr>
+            <w:r>
+              <w:rPr>
+                <w:lang w:val="en-AE"/>
+              </w:rPr>
+              <w:t>Development resources, direct expense, service cost, support cost, measurable benefits</w:t>
+            </w:r>
+          </w:p>
+        </w:tc>
+      </w:tr>
+      <w:tr>
+        <w:trPr>
+          <w:jc w:val="center"/>
+        </w:trPr>
+        <w:tc>
+          <w:tcPr>
+            <w:tcW w:w="0" w:type="auto"/>
+            <w:tcBorders>
+              <w:top w:val="single" w:sz="6" w:space="0" w:color="D9D9D9"/>
+              <w:left w:val="single" w:sz="6" w:space="0" w:color="D9D9D9"/>
+              <w:bottom w:val="single" w:sz="6" w:space="0" w:color="D9D9D9"/>
+              <w:right w:val="single" w:sz="6" w:space="0" w:color="D9D9D9"/>
+            </w:tcBorders>
+            <w:tcMar>
+              <w:top w:w="95" w:type="dxa"/>
+              <w:left w:w="115" w:type="dxa"/>
+              <w:bottom w:w="95" w:type="dxa"/>
+              <w:right w:w="115" w:type="dxa"/>
+            </w:tcMar>
+            <w:vAlign w:val="center"/>
+            <w:hideMark/>
+          </w:tcPr>
+          <w:p>
+            <w:pPr>
+              <w:rPr>
+                <w:lang w:val="en-AE"/>
+              </w:rPr>
+            </w:pPr>
+            <w:r>
+              <w:rPr>
+                <w:lang w:val="en-AE"/>
+              </w:rPr>
+              <w:t>Schedule</w:t>
+            </w:r>
+          </w:p>
+        </w:tc>
+        <w:tc>
+          <w:tcPr>
+            <w:tcW w:w="0" w:type="auto"/>
+            <w:tcBorders>
+              <w:top w:val="single" w:sz="6" w:space="0" w:color="D9D9D9"/>
+              <w:left w:val="single" w:sz="6" w:space="0" w:color="D9D9D9"/>
+              <w:bottom w:val="single" w:sz="6" w:space="0" w:color="D9D9D9"/>
+              <w:right w:val="single" w:sz="6" w:space="0" w:color="D9D9D9"/>
+            </w:tcBorders>
+            <w:tcMar>
+              <w:top w:w="95" w:type="dxa"/>
+              <w:left w:w="115" w:type="dxa"/>
+              <w:bottom w:w="95" w:type="dxa"/>
+              <w:right w:w="115" w:type="dxa"/>
+            </w:tcMar>
+            <w:vAlign w:val="center"/>
+            <w:hideMark/>
+          </w:tcPr>
+          <w:p>
+            <w:pPr>
+              <w:rPr>
+                <w:lang w:val="en-AE"/>
+              </w:rPr>
+            </w:pPr>
+            <w:r>
+              <w:rPr>
+                <w:lang w:val="en-AE"/>
+              </w:rPr>
+              <w:t>15 percent</w:t>
+            </w:r>
+          </w:p>
+        </w:tc>
+        <w:tc>
+          <w:tcPr>
+            <w:tcW w:w="0" w:type="auto"/>
+            <w:tcBorders>
+              <w:top w:val="single" w:sz="6" w:space="0" w:color="D9D9D9"/>
+              <w:left w:val="single" w:sz="6" w:space="0" w:color="D9D9D9"/>
+              <w:bottom w:val="single" w:sz="6" w:space="0" w:color="D9D9D9"/>
+              <w:right w:val="single" w:sz="6" w:space="0" w:color="D9D9D9"/>
+            </w:tcBorders>
+            <w:tcMar>
+              <w:top w:w="95" w:type="dxa"/>
+              <w:left w:w="115" w:type="dxa"/>
+              <w:bottom w:w="95" w:type="dxa"/>
+              <w:right w:w="115" w:type="dxa"/>
+            </w:tcMar>
+            <w:vAlign w:val="center"/>
+            <w:hideMark/>
+          </w:tcPr>
+          <w:p>
+            <w:pPr>
+              <w:rPr>
+                <w:lang w:val="en-AE"/>
+              </w:rPr>
+            </w:pPr>
+            <w:r>
+              <w:rPr>
+                <w:lang w:val="en-AE"/>
+              </w:rPr>
+              <w:t>Course milestones, two-person capacity, dependencies, testing time</w:t>
+            </w:r>
+          </w:p>
+        </w:tc>
+      </w:tr>
+      <w:tr>
+        <w:trPr>
+          <w:jc w:val="center"/>
+        </w:trPr>
+        <w:tc>
+          <w:tcPr>
+            <w:tcW w:w="0" w:type="auto"/>
+            <w:tcBorders>
+              <w:top w:val="single" w:sz="6" w:space="0" w:color="D9D9D9"/>
+              <w:left w:val="single" w:sz="6" w:space="0" w:color="D9D9D9"/>
+              <w:bottom w:val="single" w:sz="6" w:space="0" w:color="D9D9D9"/>
+              <w:right w:val="single" w:sz="6" w:space="0" w:color="D9D9D9"/>
+            </w:tcBorders>
+            <w:shd w:val="clear" w:color="auto" w:fill="EAF2F8"/>
+            <w:tcMar>
+              <w:top w:w="95" w:type="dxa"/>
+              <w:left w:w="115" w:type="dxa"/>
+              <w:bottom w:w="95" w:type="dxa"/>
+              <w:right w:w="115" w:type="dxa"/>
+            </w:tcMar>
+            <w:vAlign w:val="center"/>
+            <w:hideMark/>
+          </w:tcPr>
+          <w:p>
+            <w:pPr>
+              <w:rPr>
+                <w:lang w:val="en-AE"/>
+              </w:rPr>
+            </w:pPr>
+            <w:r>
+              <w:rPr>
+                <w:lang w:val="en-AE"/>
+              </w:rPr>
+              <w:t>Compliance and security</w:t>
+            </w:r>
+          </w:p>
+        </w:tc>
+        <w:tc>
+          <w:tcPr>
+            <w:tcW w:w="0" w:type="auto"/>
+            <w:tcBorders>
+              <w:top w:val="single" w:sz="6" w:space="0" w:color="D9D9D9"/>
+              <w:left w:val="single" w:sz="6" w:space="0" w:color="D9D9D9"/>
+              <w:bottom w:val="single" w:sz="6" w:space="0" w:color="D9D9D9"/>
+              <w:right w:val="single" w:sz="6" w:space="0" w:color="D9D9D9"/>
+            </w:tcBorders>
+            <w:shd w:val="clear" w:color="auto" w:fill="EAF2F8"/>
+            <w:tcMar>
+              <w:top w:w="95" w:type="dxa"/>
+              <w:left w:w="115" w:type="dxa"/>
+              <w:bottom w:w="95" w:type="dxa"/>
+              <w:right w:w="115" w:type="dxa"/>
+            </w:tcMar>
+            <w:vAlign w:val="center"/>
+            <w:hideMark/>
+          </w:tcPr>
+          <w:p>
+            <w:pPr>
+              <w:rPr>
+                <w:lang w:val="en-AE"/>
+              </w:rPr>
+            </w:pPr>
+            <w:r>
+              <w:rPr>
+                <w:lang w:val="en-AE"/>
+              </w:rPr>
+              <w:t>15 percent</w:t>
+            </w:r>
+          </w:p>
+        </w:tc>
+        <w:tc>
+          <w:tcPr>
+            <w:tcW w:w="0" w:type="auto"/>
+            <w:tcBorders>
+              <w:top w:val="single" w:sz="6" w:space="0" w:color="D9D9D9"/>
+              <w:left w:val="single" w:sz="6" w:space="0" w:color="D9D9D9"/>
+              <w:bottom w:val="single" w:sz="6" w:space="0" w:color="D9D9D9"/>
+              <w:right w:val="single" w:sz="6" w:space="0" w:color="D9D9D9"/>
+            </w:tcBorders>
+            <w:shd w:val="clear" w:color="auto" w:fill="EAF2F8"/>
+            <w:tcMar>
+              <w:top w:w="95" w:type="dxa"/>
+              <w:left w:w="115" w:type="dxa"/>
+              <w:bottom w:w="95" w:type="dxa"/>
+              <w:right w:w="115" w:type="dxa"/>
+            </w:tcMar>
+            <w:vAlign w:val="center"/>
+            <w:hideMark/>
+          </w:tcPr>
+          <w:p>
+            <w:pPr>
+              <w:rPr>
+                <w:lang w:val="en-AE"/>
+              </w:rPr>
+            </w:pPr>
+            <w:r>
+              <w:rPr>
+                <w:lang w:val="en-AE"/>
+              </w:rPr>
+              <w:t>Privacy, authorization, auditability, procurement, safety, policy approval</w:t>
+            </w:r>
+          </w:p>
+        </w:tc>
+      </w:tr>
+    </w:tbl>
+    <w:p>
+      <w:pPr>
+        <w:rPr>
+          <w:lang w:val="en-AE"/>
+        </w:rPr>
+      </w:pPr>
+    </w:p>
+    <w:p>
+      <w:pPr>
+        <w:rPr>
+          <w:b/>
+          <w:bCs/>
+          <w:lang w:val="en-AE"/>
+        </w:rPr>
+      </w:pPr>
+      <w:r>
+        <w:rPr>
+          <w:b/>
+          <w:bCs/>
+          <w:lang w:val="en-AE"/>
+        </w:rPr>
+        <w:t>3 1 Evidence and Limitations</w:t>
+      </w:r>
+    </w:p>
+    <w:p>
+      <w:pPr>
+        <w:rPr>
+          <w:lang w:val="en-AE"/>
+        </w:rPr>
+      </w:pPr>
+      <w:r>
+        <w:rPr>
+          <w:lang w:val="en-AE"/>
+        </w:rPr>
+        <w:t xml:space="preserve">The analysis uses the course project brief, the Phase 1 planning document the Phase 2 lecture slides, the official course schedule and current official public references on UAE data protection and Khalifa University privacy and policy access. The team has not yet provided an institutional asset dataset, integration specification, production hosting standard, procurement quotation or approved university business process. </w:t>
+      </w:r>
+      <w:proofErr w:type="gramStart"/>
+      <w:r>
+        <w:rPr>
+          <w:lang w:val="en-AE"/>
+        </w:rPr>
+        <w:t>Accordingly</w:t>
+      </w:r>
+      <w:proofErr w:type="gramEnd"/>
+      <w:r>
+        <w:rPr>
+          <w:lang w:val="en-AE"/>
+        </w:rPr>
+        <w:t xml:space="preserve"> all cost ranges are planning </w:t>
+      </w:r>
+      <w:proofErr w:type="gramStart"/>
+      <w:r>
+        <w:rPr>
+          <w:lang w:val="en-AE"/>
+        </w:rPr>
+        <w:t>assumptions</w:t>
+      </w:r>
+      <w:proofErr w:type="gramEnd"/>
+      <w:r>
+        <w:rPr>
+          <w:lang w:val="en-AE"/>
+        </w:rPr>
+        <w:t xml:space="preserve"> and all AI performance claims remain to be tested. The report deliberately avoids a guaranteed return on investment or model accuracy percentage.</w:t>
+      </w:r>
+    </w:p>
+    <w:p>
+      <w:pPr>
+        <w:rPr>
+          <w:b/>
+          <w:bCs/>
+          <w:lang w:val="en-AE"/>
+        </w:rPr>
+      </w:pPr>
+      <w:r>
+        <w:rPr>
+          <w:b/>
+          <w:bCs/>
+          <w:lang w:val="en-AE"/>
+        </w:rPr>
+        <w:t>4 Technical Feasibility</w:t>
+      </w:r>
+    </w:p>
+    <w:p>
+      <w:pPr>
+        <w:rPr>
+          <w:b/>
+          <w:bCs/>
+          <w:lang w:val="en-AE"/>
+        </w:rPr>
+      </w:pPr>
+      <w:r>
+        <w:rPr>
+          <w:lang w:val="en-AE"/>
+        </w:rPr>
+        <w:t xml:space="preserve">Technical feasibility is high for the baseline system. Moderate for the AI extensions. The core workflows resemble information systems: authenticated users create records, search data, request actions approve state changes and review reports. These functions fit a web application backed by a database. The challenge comes from integrating AI without making the system </w:t>
+      </w:r>
+      <w:proofErr w:type="gramStart"/>
+      <w:r>
+        <w:rPr>
+          <w:lang w:val="en-AE"/>
+        </w:rPr>
+        <w:t>dependent,</w:t>
+      </w:r>
+      <w:proofErr w:type="gramEnd"/>
+      <w:r>
+        <w:rPr>
+          <w:lang w:val="en-AE"/>
+        </w:rPr>
+        <w:t xml:space="preserve"> on expensive services.</w:t>
+      </w:r>
+      <w:r>
+        <w:rPr>
+          <w:b/>
+          <w:bCs/>
+          <w:lang w:val="en-AE"/>
+        </w:rPr>
+        <w:t>4 1 Recommended Architecture Approach</w:t>
+      </w:r>
+    </w:p>
+    <w:p>
+      <w:pPr>
+        <w:rPr>
+          <w:lang w:val="en-AE"/>
+        </w:rPr>
+      </w:pPr>
+      <w:r>
+        <w:rPr>
+          <w:lang w:val="en-AE"/>
+        </w:rPr>
+        <w:t xml:space="preserve">I believe a modular monolith is the architecture for the semester prototype. It lets us keep user management assets, requests, approvals, transfers, maintenance, sustainability reporting and AI adapters all inside a deployable application. This way the two of us can. Debug more easily while </w:t>
+      </w:r>
+      <w:proofErr w:type="gramStart"/>
+      <w:r>
+        <w:rPr>
+          <w:lang w:val="en-AE"/>
+        </w:rPr>
+        <w:t>still keeping</w:t>
+      </w:r>
+      <w:proofErr w:type="gramEnd"/>
+      <w:r>
+        <w:rPr>
+          <w:lang w:val="en-AE"/>
+        </w:rPr>
+        <w:t xml:space="preserve"> each part clear and separate. In contrast microservices would bring network traffic, service discovery, distributed logging, several separate deployments and a lot of integration tests even though the project is not yet ready to scale each part independently.</w:t>
+      </w:r>
+    </w:p>
+    <w:p>
+      <w:pPr>
+        <w:rPr>
+          <w:lang w:val="en-AE"/>
+        </w:rPr>
+      </w:pPr>
+      <w:r>
+        <w:rPr>
+          <w:lang w:val="en-AE"/>
+        </w:rPr>
+        <w:t xml:space="preserve">The application should show the AI functions through a service interface. The classification function takes approved asset fields. Gives back suggested categories, tags, missing metadata, confidence and an explanation. The matching function takes a request and candidate assets. Gives back ranked suggestions. The rest of the application stays in charge of authentication, authorization, workflow status, approvals, audit records and final decisions. This setup lets the team swap a model for a local model or a deterministic rule, without having to rewrite </w:t>
+      </w:r>
+      <w:proofErr w:type="spellStart"/>
+      <w:proofErr w:type="gramStart"/>
+      <w:r>
+        <w:rPr>
+          <w:lang w:val="en-AE"/>
+        </w:rPr>
+        <w:t>everything.</w:t>
+      </w:r>
+      <w:r>
+        <w:rPr>
+          <w:b/>
+          <w:bCs/>
+          <w:lang w:val="en-AE"/>
+        </w:rPr>
+        <w:t>Table</w:t>
+      </w:r>
+      <w:proofErr w:type="spellEnd"/>
+      <w:proofErr w:type="gramEnd"/>
+      <w:r>
+        <w:rPr>
+          <w:b/>
+          <w:bCs/>
+          <w:lang w:val="en-AE"/>
+        </w:rPr>
+        <w:t xml:space="preserve"> 4 Technical Component Feasibility</w:t>
+      </w:r>
+    </w:p>
+    <w:tbl>
+      <w:tblPr>
+        <w:tblW w:w="0" w:type="auto"/>
+        <w:jc w:val="center"/>
+        <w:tblCellMar>
+          <w:top w:w="15" w:type="dxa"/>
+          <w:left w:w="15" w:type="dxa"/>
+          <w:bottom w:w="15" w:type="dxa"/>
+          <w:right w:w="15" w:type="dxa"/>
+        </w:tblCellMar>
+        <w:tblLook w:val="04A0" w:firstRow="1" w:lastRow="0" w:firstColumn="1" w:lastColumn="0" w:noHBand="0" w:noVBand="1"/>
+      </w:tblPr>
+      <w:tblGrid>
+        <w:gridCol w:w="1910"/>
+        <w:gridCol w:w="3487"/>
+        <w:gridCol w:w="4465"/>
+      </w:tblGrid>
+      <w:tr>
+        <w:trPr>
+          <w:tblHeader/>
+          <w:jc w:val="center"/>
+        </w:trPr>
+        <w:tc>
+          <w:tcPr>
+            <w:tcW w:w="0" w:type="auto"/>
+            <w:tcBorders>
+              <w:top w:val="single" w:sz="6" w:space="0" w:color="D9D9D9"/>
+              <w:left w:val="single" w:sz="6" w:space="0" w:color="D9D9D9"/>
+              <w:bottom w:val="single" w:sz="6" w:space="0" w:color="D9D9D9"/>
+              <w:right w:val="single" w:sz="6" w:space="0" w:color="D9D9D9"/>
+            </w:tcBorders>
+            <w:shd w:val="clear" w:color="auto" w:fill="17365D"/>
+            <w:tcMar>
+              <w:top w:w="105" w:type="dxa"/>
+              <w:left w:w="115" w:type="dxa"/>
+              <w:bottom w:w="105" w:type="dxa"/>
+              <w:right w:w="115" w:type="dxa"/>
+            </w:tcMar>
+            <w:vAlign w:val="center"/>
+            <w:hideMark/>
+          </w:tcPr>
+          <w:p>
+            <w:pPr>
+              <w:rPr>
+                <w:b/>
+                <w:bCs/>
+                <w:lang w:val="en-AE"/>
+              </w:rPr>
+            </w:pPr>
+            <w:r>
+              <w:rPr>
+                <w:b/>
+                <w:bCs/>
+                <w:lang w:val="en-AE"/>
+              </w:rPr>
+              <w:t>Component</w:t>
+            </w:r>
+          </w:p>
+        </w:tc>
+        <w:tc>
+          <w:tcPr>
+            <w:tcW w:w="0" w:type="auto"/>
+            <w:tcBorders>
+              <w:top w:val="single" w:sz="6" w:space="0" w:color="D9D9D9"/>
+              <w:left w:val="single" w:sz="6" w:space="0" w:color="D9D9D9"/>
+              <w:bottom w:val="single" w:sz="6" w:space="0" w:color="D9D9D9"/>
+              <w:right w:val="single" w:sz="6" w:space="0" w:color="D9D9D9"/>
+            </w:tcBorders>
+            <w:shd w:val="clear" w:color="auto" w:fill="17365D"/>
+            <w:tcMar>
+              <w:top w:w="105" w:type="dxa"/>
+              <w:left w:w="115" w:type="dxa"/>
+              <w:bottom w:w="105" w:type="dxa"/>
+              <w:right w:w="115" w:type="dxa"/>
+            </w:tcMar>
+            <w:vAlign w:val="center"/>
+            <w:hideMark/>
+          </w:tcPr>
+          <w:p>
+            <w:pPr>
+              <w:rPr>
+                <w:b/>
+                <w:bCs/>
+                <w:lang w:val="en-AE"/>
+              </w:rPr>
+            </w:pPr>
+            <w:r>
+              <w:rPr>
+                <w:b/>
+                <w:bCs/>
+                <w:lang w:val="en-AE"/>
+              </w:rPr>
+              <w:t>Feasible Prototype Choice</w:t>
+            </w:r>
+          </w:p>
+        </w:tc>
+        <w:tc>
+          <w:tcPr>
+            <w:tcW w:w="0" w:type="auto"/>
+            <w:tcBorders>
+              <w:top w:val="single" w:sz="6" w:space="0" w:color="D9D9D9"/>
+              <w:left w:val="single" w:sz="6" w:space="0" w:color="D9D9D9"/>
+              <w:bottom w:val="single" w:sz="6" w:space="0" w:color="D9D9D9"/>
+              <w:right w:val="single" w:sz="6" w:space="0" w:color="D9D9D9"/>
+            </w:tcBorders>
+            <w:shd w:val="clear" w:color="auto" w:fill="17365D"/>
+            <w:tcMar>
+              <w:top w:w="105" w:type="dxa"/>
+              <w:left w:w="115" w:type="dxa"/>
+              <w:bottom w:w="105" w:type="dxa"/>
+              <w:right w:w="115" w:type="dxa"/>
+            </w:tcMar>
+            <w:vAlign w:val="center"/>
+            <w:hideMark/>
+          </w:tcPr>
+          <w:p>
+            <w:pPr>
+              <w:rPr>
+                <w:b/>
+                <w:bCs/>
+                <w:lang w:val="en-AE"/>
+              </w:rPr>
+            </w:pPr>
+            <w:r>
+              <w:rPr>
+                <w:b/>
+                <w:bCs/>
+                <w:lang w:val="en-AE"/>
+              </w:rPr>
+              <w:t>Assessment and Constraint</w:t>
+            </w:r>
+          </w:p>
+        </w:tc>
+      </w:tr>
+      <w:tr>
+        <w:trPr>
+          <w:jc w:val="center"/>
+        </w:trPr>
+        <w:tc>
+          <w:tcPr>
+            <w:tcW w:w="0" w:type="auto"/>
+            <w:tcBorders>
+              <w:top w:val="single" w:sz="6" w:space="0" w:color="D9D9D9"/>
+              <w:left w:val="single" w:sz="6" w:space="0" w:color="D9D9D9"/>
+              <w:bottom w:val="single" w:sz="6" w:space="0" w:color="D9D9D9"/>
+              <w:right w:val="single" w:sz="6" w:space="0" w:color="D9D9D9"/>
+            </w:tcBorders>
+            <w:tcMar>
+              <w:top w:w="95" w:type="dxa"/>
+              <w:left w:w="115" w:type="dxa"/>
+              <w:bottom w:w="95" w:type="dxa"/>
+              <w:right w:w="115" w:type="dxa"/>
+            </w:tcMar>
+            <w:vAlign w:val="center"/>
+            <w:hideMark/>
+          </w:tcPr>
+          <w:p>
+            <w:pPr>
+              <w:rPr>
+                <w:lang w:val="en-AE"/>
+              </w:rPr>
+            </w:pPr>
+            <w:r>
+              <w:rPr>
+                <w:lang w:val="en-AE"/>
+              </w:rPr>
+              <w:t>User interface</w:t>
+            </w:r>
+          </w:p>
+        </w:tc>
+        <w:tc>
+          <w:tcPr>
+            <w:tcW w:w="0" w:type="auto"/>
+            <w:tcBorders>
+              <w:top w:val="single" w:sz="6" w:space="0" w:color="D9D9D9"/>
+              <w:left w:val="single" w:sz="6" w:space="0" w:color="D9D9D9"/>
+              <w:bottom w:val="single" w:sz="6" w:space="0" w:color="D9D9D9"/>
+              <w:right w:val="single" w:sz="6" w:space="0" w:color="D9D9D9"/>
+            </w:tcBorders>
+            <w:tcMar>
+              <w:top w:w="95" w:type="dxa"/>
+              <w:left w:w="115" w:type="dxa"/>
+              <w:bottom w:w="95" w:type="dxa"/>
+              <w:right w:w="115" w:type="dxa"/>
+            </w:tcMar>
+            <w:vAlign w:val="center"/>
+            <w:hideMark/>
+          </w:tcPr>
+          <w:p>
+            <w:pPr>
+              <w:rPr>
+                <w:lang w:val="en-AE"/>
+              </w:rPr>
+            </w:pPr>
+            <w:r>
+              <w:rPr>
+                <w:lang w:val="en-AE"/>
+              </w:rPr>
+              <w:t>Responsive web interface</w:t>
+            </w:r>
+          </w:p>
+        </w:tc>
+        <w:tc>
+          <w:tcPr>
+            <w:tcW w:w="0" w:type="auto"/>
+            <w:tcBorders>
+              <w:top w:val="single" w:sz="6" w:space="0" w:color="D9D9D9"/>
+              <w:left w:val="single" w:sz="6" w:space="0" w:color="D9D9D9"/>
+              <w:bottom w:val="single" w:sz="6" w:space="0" w:color="D9D9D9"/>
+              <w:right w:val="single" w:sz="6" w:space="0" w:color="D9D9D9"/>
+            </w:tcBorders>
+            <w:tcMar>
+              <w:top w:w="95" w:type="dxa"/>
+              <w:left w:w="115" w:type="dxa"/>
+              <w:bottom w:w="95" w:type="dxa"/>
+              <w:right w:w="115" w:type="dxa"/>
+            </w:tcMar>
+            <w:vAlign w:val="center"/>
+            <w:hideMark/>
+          </w:tcPr>
+          <w:p>
+            <w:pPr>
+              <w:rPr>
+                <w:lang w:val="en-AE"/>
+              </w:rPr>
+            </w:pPr>
+            <w:r>
+              <w:rPr>
+                <w:lang w:val="en-AE"/>
+              </w:rPr>
+              <w:t>High feasibility using standard forms, tables, validation, and dashboards</w:t>
+            </w:r>
+          </w:p>
+        </w:tc>
+      </w:tr>
+      <w:tr>
+        <w:trPr>
+          <w:jc w:val="center"/>
+        </w:trPr>
+        <w:tc>
+          <w:tcPr>
+            <w:tcW w:w="0" w:type="auto"/>
+            <w:tcBorders>
+              <w:top w:val="single" w:sz="6" w:space="0" w:color="D9D9D9"/>
+              <w:left w:val="single" w:sz="6" w:space="0" w:color="D9D9D9"/>
+              <w:bottom w:val="single" w:sz="6" w:space="0" w:color="D9D9D9"/>
+              <w:right w:val="single" w:sz="6" w:space="0" w:color="D9D9D9"/>
+            </w:tcBorders>
+            <w:shd w:val="clear" w:color="auto" w:fill="EAF2F8"/>
+            <w:tcMar>
+              <w:top w:w="95" w:type="dxa"/>
+              <w:left w:w="115" w:type="dxa"/>
+              <w:bottom w:w="95" w:type="dxa"/>
+              <w:right w:w="115" w:type="dxa"/>
+            </w:tcMar>
+            <w:vAlign w:val="center"/>
+            <w:hideMark/>
+          </w:tcPr>
+          <w:p>
+            <w:pPr>
+              <w:rPr>
+                <w:lang w:val="en-AE"/>
+              </w:rPr>
+            </w:pPr>
+            <w:r>
+              <w:rPr>
+                <w:lang w:val="en-AE"/>
+              </w:rPr>
+              <w:t>Application services</w:t>
+            </w:r>
+          </w:p>
+        </w:tc>
+        <w:tc>
+          <w:tcPr>
+            <w:tcW w:w="0" w:type="auto"/>
+            <w:tcBorders>
+              <w:top w:val="single" w:sz="6" w:space="0" w:color="D9D9D9"/>
+              <w:left w:val="single" w:sz="6" w:space="0" w:color="D9D9D9"/>
+              <w:bottom w:val="single" w:sz="6" w:space="0" w:color="D9D9D9"/>
+              <w:right w:val="single" w:sz="6" w:space="0" w:color="D9D9D9"/>
+            </w:tcBorders>
+            <w:shd w:val="clear" w:color="auto" w:fill="EAF2F8"/>
+            <w:tcMar>
+              <w:top w:w="95" w:type="dxa"/>
+              <w:left w:w="115" w:type="dxa"/>
+              <w:bottom w:w="95" w:type="dxa"/>
+              <w:right w:w="115" w:type="dxa"/>
+            </w:tcMar>
+            <w:vAlign w:val="center"/>
+            <w:hideMark/>
+          </w:tcPr>
+          <w:p>
+            <w:pPr>
+              <w:rPr>
+                <w:lang w:val="en-AE"/>
+              </w:rPr>
+            </w:pPr>
+            <w:r>
+              <w:rPr>
+                <w:lang w:val="en-AE"/>
+              </w:rPr>
+              <w:t>Single backend with separated modules</w:t>
+            </w:r>
+          </w:p>
+        </w:tc>
+        <w:tc>
+          <w:tcPr>
+            <w:tcW w:w="0" w:type="auto"/>
+            <w:tcBorders>
+              <w:top w:val="single" w:sz="6" w:space="0" w:color="D9D9D9"/>
+              <w:left w:val="single" w:sz="6" w:space="0" w:color="D9D9D9"/>
+              <w:bottom w:val="single" w:sz="6" w:space="0" w:color="D9D9D9"/>
+              <w:right w:val="single" w:sz="6" w:space="0" w:color="D9D9D9"/>
+            </w:tcBorders>
+            <w:shd w:val="clear" w:color="auto" w:fill="EAF2F8"/>
+            <w:tcMar>
+              <w:top w:w="95" w:type="dxa"/>
+              <w:left w:w="115" w:type="dxa"/>
+              <w:bottom w:w="95" w:type="dxa"/>
+              <w:right w:w="115" w:type="dxa"/>
+            </w:tcMar>
+            <w:vAlign w:val="center"/>
+            <w:hideMark/>
+          </w:tcPr>
+          <w:p>
+            <w:pPr>
+              <w:rPr>
+                <w:lang w:val="en-AE"/>
+              </w:rPr>
+            </w:pPr>
+            <w:r>
+              <w:rPr>
+                <w:lang w:val="en-AE"/>
+              </w:rPr>
+              <w:t>High feasibility and easier integration testing than microservices</w:t>
+            </w:r>
+          </w:p>
+        </w:tc>
+      </w:tr>
+      <w:tr>
+        <w:trPr>
+          <w:jc w:val="center"/>
+        </w:trPr>
+        <w:tc>
+          <w:tcPr>
+            <w:tcW w:w="0" w:type="auto"/>
+            <w:tcBorders>
+              <w:top w:val="single" w:sz="6" w:space="0" w:color="D9D9D9"/>
+              <w:left w:val="single" w:sz="6" w:space="0" w:color="D9D9D9"/>
+              <w:bottom w:val="single" w:sz="6" w:space="0" w:color="D9D9D9"/>
+              <w:right w:val="single" w:sz="6" w:space="0" w:color="D9D9D9"/>
+            </w:tcBorders>
+            <w:tcMar>
+              <w:top w:w="95" w:type="dxa"/>
+              <w:left w:w="115" w:type="dxa"/>
+              <w:bottom w:w="95" w:type="dxa"/>
+              <w:right w:w="115" w:type="dxa"/>
+            </w:tcMar>
+            <w:vAlign w:val="center"/>
+            <w:hideMark/>
+          </w:tcPr>
+          <w:p>
+            <w:pPr>
+              <w:rPr>
+                <w:lang w:val="en-AE"/>
+              </w:rPr>
+            </w:pPr>
+            <w:r>
+              <w:rPr>
+                <w:lang w:val="en-AE"/>
+              </w:rPr>
+              <w:t>Relational data</w:t>
+            </w:r>
+          </w:p>
+        </w:tc>
+        <w:tc>
+          <w:tcPr>
+            <w:tcW w:w="0" w:type="auto"/>
+            <w:tcBorders>
+              <w:top w:val="single" w:sz="6" w:space="0" w:color="D9D9D9"/>
+              <w:left w:val="single" w:sz="6" w:space="0" w:color="D9D9D9"/>
+              <w:bottom w:val="single" w:sz="6" w:space="0" w:color="D9D9D9"/>
+              <w:right w:val="single" w:sz="6" w:space="0" w:color="D9D9D9"/>
+            </w:tcBorders>
+            <w:tcMar>
+              <w:top w:w="95" w:type="dxa"/>
+              <w:left w:w="115" w:type="dxa"/>
+              <w:bottom w:w="95" w:type="dxa"/>
+              <w:right w:w="115" w:type="dxa"/>
+            </w:tcMar>
+            <w:vAlign w:val="center"/>
+            <w:hideMark/>
+          </w:tcPr>
+          <w:p>
+            <w:pPr>
+              <w:rPr>
+                <w:lang w:val="en-AE"/>
+              </w:rPr>
+            </w:pPr>
+            <w:r>
+              <w:rPr>
+                <w:lang w:val="en-AE"/>
+              </w:rPr>
+              <w:t>PostgreSQL or SQLite for local demonstration</w:t>
+            </w:r>
+          </w:p>
+        </w:tc>
+        <w:tc>
+          <w:tcPr>
+            <w:tcW w:w="0" w:type="auto"/>
+            <w:tcBorders>
+              <w:top w:val="single" w:sz="6" w:space="0" w:color="D9D9D9"/>
+              <w:left w:val="single" w:sz="6" w:space="0" w:color="D9D9D9"/>
+              <w:bottom w:val="single" w:sz="6" w:space="0" w:color="D9D9D9"/>
+              <w:right w:val="single" w:sz="6" w:space="0" w:color="D9D9D9"/>
+            </w:tcBorders>
+            <w:tcMar>
+              <w:top w:w="95" w:type="dxa"/>
+              <w:left w:w="115" w:type="dxa"/>
+              <w:bottom w:w="95" w:type="dxa"/>
+              <w:right w:w="115" w:type="dxa"/>
+            </w:tcMar>
+            <w:vAlign w:val="center"/>
+            <w:hideMark/>
+          </w:tcPr>
+          <w:p>
+            <w:pPr>
+              <w:rPr>
+                <w:lang w:val="en-AE"/>
+              </w:rPr>
+            </w:pPr>
+            <w:r>
+              <w:rPr>
+                <w:lang w:val="en-AE"/>
+              </w:rPr>
+              <w:t>High feasibility; PostgreSQL is preferable if multi-user deployment is required</w:t>
+            </w:r>
+          </w:p>
+        </w:tc>
+      </w:tr>
+      <w:tr>
+        <w:trPr>
+          <w:jc w:val="center"/>
+        </w:trPr>
+        <w:tc>
+          <w:tcPr>
+            <w:tcW w:w="0" w:type="auto"/>
+            <w:tcBorders>
+              <w:top w:val="single" w:sz="6" w:space="0" w:color="D9D9D9"/>
+              <w:left w:val="single" w:sz="6" w:space="0" w:color="D9D9D9"/>
+              <w:bottom w:val="single" w:sz="6" w:space="0" w:color="D9D9D9"/>
+              <w:right w:val="single" w:sz="6" w:space="0" w:color="D9D9D9"/>
+            </w:tcBorders>
+            <w:shd w:val="clear" w:color="auto" w:fill="EAF2F8"/>
+            <w:tcMar>
+              <w:top w:w="95" w:type="dxa"/>
+              <w:left w:w="115" w:type="dxa"/>
+              <w:bottom w:w="95" w:type="dxa"/>
+              <w:right w:w="115" w:type="dxa"/>
+            </w:tcMar>
+            <w:vAlign w:val="center"/>
+            <w:hideMark/>
+          </w:tcPr>
+          <w:p>
+            <w:pPr>
+              <w:rPr>
+                <w:lang w:val="en-AE"/>
+              </w:rPr>
+            </w:pPr>
+            <w:r>
+              <w:rPr>
+                <w:lang w:val="en-AE"/>
+              </w:rPr>
+              <w:t>Files and photographs</w:t>
+            </w:r>
+          </w:p>
+        </w:tc>
+        <w:tc>
+          <w:tcPr>
+            <w:tcW w:w="0" w:type="auto"/>
+            <w:tcBorders>
+              <w:top w:val="single" w:sz="6" w:space="0" w:color="D9D9D9"/>
+              <w:left w:val="single" w:sz="6" w:space="0" w:color="D9D9D9"/>
+              <w:bottom w:val="single" w:sz="6" w:space="0" w:color="D9D9D9"/>
+              <w:right w:val="single" w:sz="6" w:space="0" w:color="D9D9D9"/>
+            </w:tcBorders>
+            <w:shd w:val="clear" w:color="auto" w:fill="EAF2F8"/>
+            <w:tcMar>
+              <w:top w:w="95" w:type="dxa"/>
+              <w:left w:w="115" w:type="dxa"/>
+              <w:bottom w:w="95" w:type="dxa"/>
+              <w:right w:w="115" w:type="dxa"/>
+            </w:tcMar>
+            <w:vAlign w:val="center"/>
+            <w:hideMark/>
+          </w:tcPr>
+          <w:p>
+            <w:pPr>
+              <w:rPr>
+                <w:lang w:val="en-AE"/>
+              </w:rPr>
+            </w:pPr>
+            <w:r>
+              <w:rPr>
+                <w:lang w:val="en-AE"/>
+              </w:rPr>
+              <w:t>Controlled local or object storage</w:t>
+            </w:r>
+          </w:p>
+        </w:tc>
+        <w:tc>
+          <w:tcPr>
+            <w:tcW w:w="0" w:type="auto"/>
+            <w:tcBorders>
+              <w:top w:val="single" w:sz="6" w:space="0" w:color="D9D9D9"/>
+              <w:left w:val="single" w:sz="6" w:space="0" w:color="D9D9D9"/>
+              <w:bottom w:val="single" w:sz="6" w:space="0" w:color="D9D9D9"/>
+              <w:right w:val="single" w:sz="6" w:space="0" w:color="D9D9D9"/>
+            </w:tcBorders>
+            <w:shd w:val="clear" w:color="auto" w:fill="EAF2F8"/>
+            <w:tcMar>
+              <w:top w:w="95" w:type="dxa"/>
+              <w:left w:w="115" w:type="dxa"/>
+              <w:bottom w:w="95" w:type="dxa"/>
+              <w:right w:w="115" w:type="dxa"/>
+            </w:tcMar>
+            <w:vAlign w:val="center"/>
+            <w:hideMark/>
+          </w:tcPr>
+          <w:p>
+            <w:pPr>
+              <w:rPr>
+                <w:lang w:val="en-AE"/>
+              </w:rPr>
+            </w:pPr>
+            <w:r>
+              <w:rPr>
+                <w:lang w:val="en-AE"/>
+              </w:rPr>
+              <w:t>Feasible if file type, size, access, and retention rules are enforced</w:t>
+            </w:r>
+          </w:p>
+        </w:tc>
+      </w:tr>
+      <w:tr>
+        <w:trPr>
+          <w:jc w:val="center"/>
+        </w:trPr>
+        <w:tc>
+          <w:tcPr>
+            <w:tcW w:w="0" w:type="auto"/>
+            <w:tcBorders>
+              <w:top w:val="single" w:sz="6" w:space="0" w:color="D9D9D9"/>
+              <w:left w:val="single" w:sz="6" w:space="0" w:color="D9D9D9"/>
+              <w:bottom w:val="single" w:sz="6" w:space="0" w:color="D9D9D9"/>
+              <w:right w:val="single" w:sz="6" w:space="0" w:color="D9D9D9"/>
+            </w:tcBorders>
+            <w:tcMar>
+              <w:top w:w="95" w:type="dxa"/>
+              <w:left w:w="115" w:type="dxa"/>
+              <w:bottom w:w="95" w:type="dxa"/>
+              <w:right w:w="115" w:type="dxa"/>
+            </w:tcMar>
+            <w:vAlign w:val="center"/>
+            <w:hideMark/>
+          </w:tcPr>
+          <w:p>
+            <w:pPr>
+              <w:rPr>
+                <w:lang w:val="en-AE"/>
+              </w:rPr>
+            </w:pPr>
+            <w:r>
+              <w:rPr>
+                <w:lang w:val="en-AE"/>
+              </w:rPr>
+              <w:t>Search and filters</w:t>
+            </w:r>
+          </w:p>
+        </w:tc>
+        <w:tc>
+          <w:tcPr>
+            <w:tcW w:w="0" w:type="auto"/>
+            <w:tcBorders>
+              <w:top w:val="single" w:sz="6" w:space="0" w:color="D9D9D9"/>
+              <w:left w:val="single" w:sz="6" w:space="0" w:color="D9D9D9"/>
+              <w:bottom w:val="single" w:sz="6" w:space="0" w:color="D9D9D9"/>
+              <w:right w:val="single" w:sz="6" w:space="0" w:color="D9D9D9"/>
+            </w:tcBorders>
+            <w:tcMar>
+              <w:top w:w="95" w:type="dxa"/>
+              <w:left w:w="115" w:type="dxa"/>
+              <w:bottom w:w="95" w:type="dxa"/>
+              <w:right w:w="115" w:type="dxa"/>
+            </w:tcMar>
+            <w:vAlign w:val="center"/>
+            <w:hideMark/>
+          </w:tcPr>
+          <w:p>
+            <w:pPr>
+              <w:rPr>
+                <w:lang w:val="en-AE"/>
+              </w:rPr>
+            </w:pPr>
+            <w:r>
+              <w:rPr>
+                <w:lang w:val="en-AE"/>
+              </w:rPr>
+              <w:t>Database queries with indexed fields</w:t>
+            </w:r>
+          </w:p>
+        </w:tc>
+        <w:tc>
+          <w:tcPr>
+            <w:tcW w:w="0" w:type="auto"/>
+            <w:tcBorders>
+              <w:top w:val="single" w:sz="6" w:space="0" w:color="D9D9D9"/>
+              <w:left w:val="single" w:sz="6" w:space="0" w:color="D9D9D9"/>
+              <w:bottom w:val="single" w:sz="6" w:space="0" w:color="D9D9D9"/>
+              <w:right w:val="single" w:sz="6" w:space="0" w:color="D9D9D9"/>
+            </w:tcBorders>
+            <w:tcMar>
+              <w:top w:w="95" w:type="dxa"/>
+              <w:left w:w="115" w:type="dxa"/>
+              <w:bottom w:w="95" w:type="dxa"/>
+              <w:right w:w="115" w:type="dxa"/>
+            </w:tcMar>
+            <w:vAlign w:val="center"/>
+            <w:hideMark/>
+          </w:tcPr>
+          <w:p>
+            <w:pPr>
+              <w:rPr>
+                <w:lang w:val="en-AE"/>
+              </w:rPr>
+            </w:pPr>
+            <w:r>
+              <w:rPr>
+                <w:lang w:val="en-AE"/>
+              </w:rPr>
+              <w:t>High feasibility and mandatory as the non-AI fallback</w:t>
+            </w:r>
+          </w:p>
+        </w:tc>
+      </w:tr>
+      <w:tr>
+        <w:trPr>
+          <w:jc w:val="center"/>
+        </w:trPr>
+        <w:tc>
+          <w:tcPr>
+            <w:tcW w:w="0" w:type="auto"/>
+            <w:tcBorders>
+              <w:top w:val="single" w:sz="6" w:space="0" w:color="D9D9D9"/>
+              <w:left w:val="single" w:sz="6" w:space="0" w:color="D9D9D9"/>
+              <w:bottom w:val="single" w:sz="6" w:space="0" w:color="D9D9D9"/>
+              <w:right w:val="single" w:sz="6" w:space="0" w:color="D9D9D9"/>
+            </w:tcBorders>
+            <w:shd w:val="clear" w:color="auto" w:fill="EAF2F8"/>
+            <w:tcMar>
+              <w:top w:w="95" w:type="dxa"/>
+              <w:left w:w="115" w:type="dxa"/>
+              <w:bottom w:w="95" w:type="dxa"/>
+              <w:right w:w="115" w:type="dxa"/>
+            </w:tcMar>
+            <w:vAlign w:val="center"/>
+            <w:hideMark/>
+          </w:tcPr>
+          <w:p>
+            <w:pPr>
+              <w:rPr>
+                <w:lang w:val="en-AE"/>
+              </w:rPr>
+            </w:pPr>
+            <w:r>
+              <w:rPr>
+                <w:lang w:val="en-AE"/>
+              </w:rPr>
+              <w:t>Semantic search</w:t>
+            </w:r>
+          </w:p>
+        </w:tc>
+        <w:tc>
+          <w:tcPr>
+            <w:tcW w:w="0" w:type="auto"/>
+            <w:tcBorders>
+              <w:top w:val="single" w:sz="6" w:space="0" w:color="D9D9D9"/>
+              <w:left w:val="single" w:sz="6" w:space="0" w:color="D9D9D9"/>
+              <w:bottom w:val="single" w:sz="6" w:space="0" w:color="D9D9D9"/>
+              <w:right w:val="single" w:sz="6" w:space="0" w:color="D9D9D9"/>
+            </w:tcBorders>
+            <w:shd w:val="clear" w:color="auto" w:fill="EAF2F8"/>
+            <w:tcMar>
+              <w:top w:w="95" w:type="dxa"/>
+              <w:left w:w="115" w:type="dxa"/>
+              <w:bottom w:w="95" w:type="dxa"/>
+              <w:right w:w="115" w:type="dxa"/>
+            </w:tcMar>
+            <w:vAlign w:val="center"/>
+            <w:hideMark/>
+          </w:tcPr>
+          <w:p>
+            <w:pPr>
+              <w:rPr>
+                <w:lang w:val="en-AE"/>
+              </w:rPr>
+            </w:pPr>
+            <w:r>
+              <w:rPr>
+                <w:lang w:val="en-AE"/>
+              </w:rPr>
+              <w:t>Text embeddings with a vector index</w:t>
+            </w:r>
+          </w:p>
+        </w:tc>
+        <w:tc>
+          <w:tcPr>
+            <w:tcW w:w="0" w:type="auto"/>
+            <w:tcBorders>
+              <w:top w:val="single" w:sz="6" w:space="0" w:color="D9D9D9"/>
+              <w:left w:val="single" w:sz="6" w:space="0" w:color="D9D9D9"/>
+              <w:bottom w:val="single" w:sz="6" w:space="0" w:color="D9D9D9"/>
+              <w:right w:val="single" w:sz="6" w:space="0" w:color="D9D9D9"/>
+            </w:tcBorders>
+            <w:shd w:val="clear" w:color="auto" w:fill="EAF2F8"/>
+            <w:tcMar>
+              <w:top w:w="95" w:type="dxa"/>
+              <w:left w:w="115" w:type="dxa"/>
+              <w:bottom w:w="95" w:type="dxa"/>
+              <w:right w:w="115" w:type="dxa"/>
+            </w:tcMar>
+            <w:vAlign w:val="center"/>
+            <w:hideMark/>
+          </w:tcPr>
+          <w:p>
+            <w:pPr>
+              <w:rPr>
+                <w:lang w:val="en-AE"/>
+              </w:rPr>
+            </w:pPr>
+            <w:r>
+              <w:rPr>
+                <w:lang w:val="en-AE"/>
+              </w:rPr>
+              <w:t>Moderate feasibility; quality depends on descriptions and domain vocabulary</w:t>
+            </w:r>
+          </w:p>
+        </w:tc>
+      </w:tr>
+      <w:tr>
+        <w:trPr>
+          <w:jc w:val="center"/>
+        </w:trPr>
+        <w:tc>
+          <w:tcPr>
+            <w:tcW w:w="0" w:type="auto"/>
+            <w:tcBorders>
+              <w:top w:val="single" w:sz="6" w:space="0" w:color="D9D9D9"/>
+              <w:left w:val="single" w:sz="6" w:space="0" w:color="D9D9D9"/>
+              <w:bottom w:val="single" w:sz="6" w:space="0" w:color="D9D9D9"/>
+              <w:right w:val="single" w:sz="6" w:space="0" w:color="D9D9D9"/>
+            </w:tcBorders>
+            <w:tcMar>
+              <w:top w:w="95" w:type="dxa"/>
+              <w:left w:w="115" w:type="dxa"/>
+              <w:bottom w:w="95" w:type="dxa"/>
+              <w:right w:w="115" w:type="dxa"/>
+            </w:tcMar>
+            <w:vAlign w:val="center"/>
+            <w:hideMark/>
+          </w:tcPr>
+          <w:p>
+            <w:pPr>
+              <w:rPr>
+                <w:lang w:val="en-AE"/>
+              </w:rPr>
+            </w:pPr>
+            <w:r>
+              <w:rPr>
+                <w:lang w:val="en-AE"/>
+              </w:rPr>
+              <w:t>AI classification</w:t>
+            </w:r>
+          </w:p>
+        </w:tc>
+        <w:tc>
+          <w:tcPr>
+            <w:tcW w:w="0" w:type="auto"/>
+            <w:tcBorders>
+              <w:top w:val="single" w:sz="6" w:space="0" w:color="D9D9D9"/>
+              <w:left w:val="single" w:sz="6" w:space="0" w:color="D9D9D9"/>
+              <w:bottom w:val="single" w:sz="6" w:space="0" w:color="D9D9D9"/>
+              <w:right w:val="single" w:sz="6" w:space="0" w:color="D9D9D9"/>
+            </w:tcBorders>
+            <w:tcMar>
+              <w:top w:w="95" w:type="dxa"/>
+              <w:left w:w="115" w:type="dxa"/>
+              <w:bottom w:w="95" w:type="dxa"/>
+              <w:right w:w="115" w:type="dxa"/>
+            </w:tcMar>
+            <w:vAlign w:val="center"/>
+            <w:hideMark/>
+          </w:tcPr>
+          <w:p>
+            <w:pPr>
+              <w:rPr>
+                <w:lang w:val="en-AE"/>
+              </w:rPr>
+            </w:pPr>
+            <w:r>
+              <w:rPr>
+                <w:lang w:val="en-AE"/>
+              </w:rPr>
+              <w:t>Prompted LLM or small classification model</w:t>
+            </w:r>
+          </w:p>
+        </w:tc>
+        <w:tc>
+          <w:tcPr>
+            <w:tcW w:w="0" w:type="auto"/>
+            <w:tcBorders>
+              <w:top w:val="single" w:sz="6" w:space="0" w:color="D9D9D9"/>
+              <w:left w:val="single" w:sz="6" w:space="0" w:color="D9D9D9"/>
+              <w:bottom w:val="single" w:sz="6" w:space="0" w:color="D9D9D9"/>
+              <w:right w:val="single" w:sz="6" w:space="0" w:color="D9D9D9"/>
+            </w:tcBorders>
+            <w:tcMar>
+              <w:top w:w="95" w:type="dxa"/>
+              <w:left w:w="115" w:type="dxa"/>
+              <w:bottom w:w="95" w:type="dxa"/>
+              <w:right w:w="115" w:type="dxa"/>
+            </w:tcMar>
+            <w:vAlign w:val="center"/>
+            <w:hideMark/>
+          </w:tcPr>
+          <w:p>
+            <w:pPr>
+              <w:rPr>
+                <w:lang w:val="en-AE"/>
+              </w:rPr>
+            </w:pPr>
+            <w:r>
+              <w:rPr>
+                <w:lang w:val="en-AE"/>
+              </w:rPr>
+              <w:t>Moderate feasibility; requires confidence, review, and repeatable evaluation</w:t>
+            </w:r>
+          </w:p>
+        </w:tc>
+      </w:tr>
+      <w:tr>
+        <w:trPr>
+          <w:jc w:val="center"/>
+        </w:trPr>
+        <w:tc>
+          <w:tcPr>
+            <w:tcW w:w="0" w:type="auto"/>
+            <w:tcBorders>
+              <w:top w:val="single" w:sz="6" w:space="0" w:color="D9D9D9"/>
+              <w:left w:val="single" w:sz="6" w:space="0" w:color="D9D9D9"/>
+              <w:bottom w:val="single" w:sz="6" w:space="0" w:color="D9D9D9"/>
+              <w:right w:val="single" w:sz="6" w:space="0" w:color="D9D9D9"/>
+            </w:tcBorders>
+            <w:shd w:val="clear" w:color="auto" w:fill="EAF2F8"/>
+            <w:tcMar>
+              <w:top w:w="95" w:type="dxa"/>
+              <w:left w:w="115" w:type="dxa"/>
+              <w:bottom w:w="95" w:type="dxa"/>
+              <w:right w:w="115" w:type="dxa"/>
+            </w:tcMar>
+            <w:vAlign w:val="center"/>
+            <w:hideMark/>
+          </w:tcPr>
+          <w:p>
+            <w:pPr>
+              <w:rPr>
+                <w:lang w:val="en-AE"/>
+              </w:rPr>
+            </w:pPr>
+            <w:r>
+              <w:rPr>
+                <w:lang w:val="en-AE"/>
+              </w:rPr>
+              <w:t>LLM assistant</w:t>
+            </w:r>
+          </w:p>
+        </w:tc>
+        <w:tc>
+          <w:tcPr>
+            <w:tcW w:w="0" w:type="auto"/>
+            <w:tcBorders>
+              <w:top w:val="single" w:sz="6" w:space="0" w:color="D9D9D9"/>
+              <w:left w:val="single" w:sz="6" w:space="0" w:color="D9D9D9"/>
+              <w:bottom w:val="single" w:sz="6" w:space="0" w:color="D9D9D9"/>
+              <w:right w:val="single" w:sz="6" w:space="0" w:color="D9D9D9"/>
+            </w:tcBorders>
+            <w:shd w:val="clear" w:color="auto" w:fill="EAF2F8"/>
+            <w:tcMar>
+              <w:top w:w="95" w:type="dxa"/>
+              <w:left w:w="115" w:type="dxa"/>
+              <w:bottom w:w="95" w:type="dxa"/>
+              <w:right w:w="115" w:type="dxa"/>
+            </w:tcMar>
+            <w:vAlign w:val="center"/>
+            <w:hideMark/>
+          </w:tcPr>
+          <w:p>
+            <w:pPr>
+              <w:rPr>
+                <w:lang w:val="en-AE"/>
+              </w:rPr>
+            </w:pPr>
+            <w:r>
+              <w:rPr>
+                <w:lang w:val="en-AE"/>
+              </w:rPr>
+              <w:t>Retrieval over approved system data and help content</w:t>
+            </w:r>
+          </w:p>
+        </w:tc>
+        <w:tc>
+          <w:tcPr>
+            <w:tcW w:w="0" w:type="auto"/>
+            <w:tcBorders>
+              <w:top w:val="single" w:sz="6" w:space="0" w:color="D9D9D9"/>
+              <w:left w:val="single" w:sz="6" w:space="0" w:color="D9D9D9"/>
+              <w:bottom w:val="single" w:sz="6" w:space="0" w:color="D9D9D9"/>
+              <w:right w:val="single" w:sz="6" w:space="0" w:color="D9D9D9"/>
+            </w:tcBorders>
+            <w:shd w:val="clear" w:color="auto" w:fill="EAF2F8"/>
+            <w:tcMar>
+              <w:top w:w="95" w:type="dxa"/>
+              <w:left w:w="115" w:type="dxa"/>
+              <w:bottom w:w="95" w:type="dxa"/>
+              <w:right w:w="115" w:type="dxa"/>
+            </w:tcMar>
+            <w:vAlign w:val="center"/>
+            <w:hideMark/>
+          </w:tcPr>
+          <w:p>
+            <w:pPr>
+              <w:rPr>
+                <w:lang w:val="en-AE"/>
+              </w:rPr>
+            </w:pPr>
+            <w:r>
+              <w:rPr>
+                <w:lang w:val="en-AE"/>
+              </w:rPr>
+              <w:t>Moderate feasibility; restrict actions and prevent direct approval decisions</w:t>
+            </w:r>
+          </w:p>
+        </w:tc>
+      </w:tr>
+      <w:tr>
+        <w:trPr>
+          <w:jc w:val="center"/>
+        </w:trPr>
+        <w:tc>
+          <w:tcPr>
+            <w:tcW w:w="0" w:type="auto"/>
+            <w:tcBorders>
+              <w:top w:val="single" w:sz="6" w:space="0" w:color="D9D9D9"/>
+              <w:left w:val="single" w:sz="6" w:space="0" w:color="D9D9D9"/>
+              <w:bottom w:val="single" w:sz="6" w:space="0" w:color="D9D9D9"/>
+              <w:right w:val="single" w:sz="6" w:space="0" w:color="D9D9D9"/>
+            </w:tcBorders>
+            <w:tcMar>
+              <w:top w:w="95" w:type="dxa"/>
+              <w:left w:w="115" w:type="dxa"/>
+              <w:bottom w:w="95" w:type="dxa"/>
+              <w:right w:w="115" w:type="dxa"/>
+            </w:tcMar>
+            <w:vAlign w:val="center"/>
+            <w:hideMark/>
+          </w:tcPr>
+          <w:p>
+            <w:pPr>
+              <w:rPr>
+                <w:lang w:val="en-AE"/>
+              </w:rPr>
+            </w:pPr>
+            <w:r>
+              <w:rPr>
+                <w:lang w:val="en-AE"/>
+              </w:rPr>
+              <w:t>Reports</w:t>
+            </w:r>
+          </w:p>
+        </w:tc>
+        <w:tc>
+          <w:tcPr>
+            <w:tcW w:w="0" w:type="auto"/>
+            <w:tcBorders>
+              <w:top w:val="single" w:sz="6" w:space="0" w:color="D9D9D9"/>
+              <w:left w:val="single" w:sz="6" w:space="0" w:color="D9D9D9"/>
+              <w:bottom w:val="single" w:sz="6" w:space="0" w:color="D9D9D9"/>
+              <w:right w:val="single" w:sz="6" w:space="0" w:color="D9D9D9"/>
+            </w:tcBorders>
+            <w:tcMar>
+              <w:top w:w="95" w:type="dxa"/>
+              <w:left w:w="115" w:type="dxa"/>
+              <w:bottom w:w="95" w:type="dxa"/>
+              <w:right w:w="115" w:type="dxa"/>
+            </w:tcMar>
+            <w:vAlign w:val="center"/>
+            <w:hideMark/>
+          </w:tcPr>
+          <w:p>
+            <w:pPr>
+              <w:rPr>
+                <w:lang w:val="en-AE"/>
+              </w:rPr>
+            </w:pPr>
+            <w:r>
+              <w:rPr>
+                <w:lang w:val="en-AE"/>
+              </w:rPr>
+              <w:t>Database summaries with optional generated narrative</w:t>
+            </w:r>
+          </w:p>
+        </w:tc>
+        <w:tc>
+          <w:tcPr>
+            <w:tcW w:w="0" w:type="auto"/>
+            <w:tcBorders>
+              <w:top w:val="single" w:sz="6" w:space="0" w:color="D9D9D9"/>
+              <w:left w:val="single" w:sz="6" w:space="0" w:color="D9D9D9"/>
+              <w:bottom w:val="single" w:sz="6" w:space="0" w:color="D9D9D9"/>
+              <w:right w:val="single" w:sz="6" w:space="0" w:color="D9D9D9"/>
+            </w:tcBorders>
+            <w:tcMar>
+              <w:top w:w="95" w:type="dxa"/>
+              <w:left w:w="115" w:type="dxa"/>
+              <w:bottom w:w="95" w:type="dxa"/>
+              <w:right w:w="115" w:type="dxa"/>
+            </w:tcMar>
+            <w:vAlign w:val="center"/>
+            <w:hideMark/>
+          </w:tcPr>
+          <w:p>
+            <w:pPr>
+              <w:rPr>
+                <w:lang w:val="en-AE"/>
+              </w:rPr>
+            </w:pPr>
+            <w:r>
+              <w:rPr>
+                <w:lang w:val="en-AE"/>
+              </w:rPr>
+              <w:t>High feasibility if every generated statement traces back to calculated data</w:t>
+            </w:r>
+          </w:p>
+        </w:tc>
+      </w:tr>
+      <w:tr>
+        <w:trPr>
+          <w:jc w:val="center"/>
+        </w:trPr>
+        <w:tc>
+          <w:tcPr>
+            <w:tcW w:w="0" w:type="auto"/>
+            <w:tcBorders>
+              <w:top w:val="single" w:sz="6" w:space="0" w:color="D9D9D9"/>
+              <w:left w:val="single" w:sz="6" w:space="0" w:color="D9D9D9"/>
+              <w:bottom w:val="single" w:sz="6" w:space="0" w:color="D9D9D9"/>
+              <w:right w:val="single" w:sz="6" w:space="0" w:color="D9D9D9"/>
+            </w:tcBorders>
+            <w:shd w:val="clear" w:color="auto" w:fill="EAF2F8"/>
+            <w:tcMar>
+              <w:top w:w="95" w:type="dxa"/>
+              <w:left w:w="115" w:type="dxa"/>
+              <w:bottom w:w="95" w:type="dxa"/>
+              <w:right w:w="115" w:type="dxa"/>
+            </w:tcMar>
+            <w:vAlign w:val="center"/>
+            <w:hideMark/>
+          </w:tcPr>
+          <w:p>
+            <w:pPr>
+              <w:rPr>
+                <w:lang w:val="en-AE"/>
+              </w:rPr>
+            </w:pPr>
+            <w:r>
+              <w:rPr>
+                <w:lang w:val="en-AE"/>
+              </w:rPr>
+              <w:t>External integrations</w:t>
+            </w:r>
+          </w:p>
+        </w:tc>
+        <w:tc>
+          <w:tcPr>
+            <w:tcW w:w="0" w:type="auto"/>
+            <w:tcBorders>
+              <w:top w:val="single" w:sz="6" w:space="0" w:color="D9D9D9"/>
+              <w:left w:val="single" w:sz="6" w:space="0" w:color="D9D9D9"/>
+              <w:bottom w:val="single" w:sz="6" w:space="0" w:color="D9D9D9"/>
+              <w:right w:val="single" w:sz="6" w:space="0" w:color="D9D9D9"/>
+            </w:tcBorders>
+            <w:shd w:val="clear" w:color="auto" w:fill="EAF2F8"/>
+            <w:tcMar>
+              <w:top w:w="95" w:type="dxa"/>
+              <w:left w:w="115" w:type="dxa"/>
+              <w:bottom w:w="95" w:type="dxa"/>
+              <w:right w:w="115" w:type="dxa"/>
+            </w:tcMar>
+            <w:vAlign w:val="center"/>
+            <w:hideMark/>
+          </w:tcPr>
+          <w:p>
+            <w:pPr>
+              <w:rPr>
+                <w:lang w:val="en-AE"/>
+              </w:rPr>
+            </w:pPr>
+            <w:r>
+              <w:rPr>
+                <w:lang w:val="en-AE"/>
+              </w:rPr>
+              <w:t>Mocked interfaces for the prototype</w:t>
+            </w:r>
+          </w:p>
+        </w:tc>
+        <w:tc>
+          <w:tcPr>
+            <w:tcW w:w="0" w:type="auto"/>
+            <w:tcBorders>
+              <w:top w:val="single" w:sz="6" w:space="0" w:color="D9D9D9"/>
+              <w:left w:val="single" w:sz="6" w:space="0" w:color="D9D9D9"/>
+              <w:bottom w:val="single" w:sz="6" w:space="0" w:color="D9D9D9"/>
+              <w:right w:val="single" w:sz="6" w:space="0" w:color="D9D9D9"/>
+            </w:tcBorders>
+            <w:shd w:val="clear" w:color="auto" w:fill="EAF2F8"/>
+            <w:tcMar>
+              <w:top w:w="95" w:type="dxa"/>
+              <w:left w:w="115" w:type="dxa"/>
+              <w:bottom w:w="95" w:type="dxa"/>
+              <w:right w:w="115" w:type="dxa"/>
+            </w:tcMar>
+            <w:vAlign w:val="center"/>
+            <w:hideMark/>
+          </w:tcPr>
+          <w:p>
+            <w:pPr>
+              <w:rPr>
+                <w:lang w:val="en-AE"/>
+              </w:rPr>
+            </w:pPr>
+            <w:r>
+              <w:rPr>
+                <w:lang w:val="en-AE"/>
+              </w:rPr>
+              <w:t>Low to moderate feasibility until university APIs and approvals are known</w:t>
+            </w:r>
+          </w:p>
+        </w:tc>
+      </w:tr>
+    </w:tbl>
+    <w:p>
+      <w:pPr>
+        <w:rPr>
+          <w:lang w:val="en-AE"/>
+        </w:rPr>
+      </w:pPr>
+    </w:p>
+    <w:p>
+      <w:pPr>
+        <w:rPr>
+          <w:b/>
+          <w:bCs/>
+          <w:lang w:val="en-AE"/>
+        </w:rPr>
+      </w:pPr>
+      <w:r>
+        <w:rPr>
+          <w:b/>
+          <w:bCs/>
+          <w:lang w:val="en-AE"/>
+        </w:rPr>
+        <w:t>4 2 Database and Life Cycle Tracking</w:t>
+      </w:r>
+    </w:p>
+    <w:p>
+      <w:pPr>
+        <w:rPr>
+          <w:lang w:val="en-AE"/>
+        </w:rPr>
+      </w:pPr>
+      <w:r>
+        <w:rPr>
+          <w:lang w:val="en-AE"/>
+        </w:rPr>
+        <w:t>I see that the data model is doable because the main concepts are organized and related. Users belong to departments. Are given roles. Assets belong to departments and categories. They collect inspections, maintenance records, transfers, documents and life cycle events. Requests explain a need. May get several possible matches. Approvals refer to a requested action. Keep the approver, time, decision and reason. Audit records capture changes. This model supports relational rules and transactions which are more reliable than storing the operational state only in AI</w:t>
+      </w:r>
+      <w:r>
+        <w:rPr>
+          <w:rFonts w:ascii="Cambria Math" w:hAnsi="Cambria Math" w:cs="Cambria Math"/>
+          <w:lang w:val="en-AE"/>
+        </w:rPr>
+        <w:t>‑</w:t>
+      </w:r>
+      <w:r>
+        <w:rPr>
+          <w:lang w:val="en-AE"/>
+        </w:rPr>
+        <w:t>generated text.</w:t>
+      </w:r>
+    </w:p>
+    <w:p>
+      <w:pPr>
+        <w:rPr>
+          <w:b/>
+          <w:bCs/>
+          <w:lang w:val="en-AE"/>
+        </w:rPr>
+      </w:pPr>
+      <w:r>
+        <w:rPr>
+          <w:b/>
+          <w:bCs/>
+          <w:lang w:val="en-AE"/>
+        </w:rPr>
+        <w:t>4 3 Performance. Reliability</w:t>
+      </w:r>
+    </w:p>
+    <w:p>
+      <w:pPr>
+        <w:rPr>
+          <w:lang w:val="en-AE"/>
+        </w:rPr>
+      </w:pPr>
+      <w:r>
+        <w:rPr>
+          <w:lang w:val="en-AE"/>
+        </w:rPr>
+        <w:t xml:space="preserve">I think the prototype will not need transactions so one application instance and one relational database will be enough for the course. The team still needs to index fields that are often filtered such, as category, department, condition, status, location and availability. Large photographs and documents should stay outside database rows. AI operations should use timeouts, retries and run asynchronously when a request might take several seconds. If a classification fails it should not stop </w:t>
+      </w:r>
+      <w:proofErr w:type="gramStart"/>
+      <w:r>
+        <w:rPr>
+          <w:lang w:val="en-AE"/>
+        </w:rPr>
+        <w:t>an</w:t>
+      </w:r>
+      <w:proofErr w:type="gramEnd"/>
+      <w:r>
+        <w:rPr>
+          <w:lang w:val="en-AE"/>
+        </w:rPr>
+        <w:t xml:space="preserve"> user from saving an asset manually.</w:t>
+      </w:r>
+    </w:p>
+    <w:p>
+      <w:pPr>
+        <w:rPr>
+          <w:b/>
+          <w:bCs/>
+          <w:lang w:val="en-AE"/>
+        </w:rPr>
+      </w:pPr>
+      <w:r>
+        <w:rPr>
+          <w:b/>
+          <w:bCs/>
+          <w:lang w:val="en-AE"/>
+        </w:rPr>
+        <w:t>4 4 Security Engineering Feasibility</w:t>
+      </w:r>
+    </w:p>
+    <w:p>
+      <w:pPr>
+        <w:rPr>
+          <w:lang w:val="en-AE"/>
+        </w:rPr>
+      </w:pPr>
+      <w:r>
+        <w:rPr>
+          <w:lang w:val="en-AE"/>
+        </w:rPr>
+        <w:t>Authentication and role-based authorization are feasible with established frameworks. Every sensitive operation must check permission in the backend, even if the interface hides unavailable actions. Passwords should use framework-provided secure hashing. Sessions or tokens require expiration and secure storage. Transfer approval, ownership change, disposal, user administration, and configuration changes should create immutable audit entries. The prototype should avoid storing identity documents, personal phone numbers, or unrelated personal details because they are not needed to demonstrate the workflow.</w:t>
+      </w:r>
+    </w:p>
+    <w:p>
+      <w:pPr>
+        <w:rPr>
+          <w:lang w:val="en-AE"/>
+        </w:rPr>
+      </w:pPr>
     </w:p>
     <w:sectPr>
       <w:headerReference w:type="default" r:id="rId8"/>

</xml_diff>

<commit_message>
Add sections 5 and 6
</commit_message>
<xml_diff>
--- a/docs/Phase_2_Feasibility_Study.docx
+++ b/docs/Phase_2_Feasibility_Study.docx
@@ -1081,21 +1081,7 @@
         <w:rPr>
           <w:lang w:val="en-AE"/>
         </w:rPr>
-        <w:t xml:space="preserve">The proposed Intelligent AI Powered Circular Campus Resource Exchange and Asset Life Cycle Management System is feasible as an experimental campus resource management system prototype. The decision recommendation is </w:t>
-      </w:r>
-      <w:proofErr w:type="gramStart"/>
-      <w:r>
-        <w:rPr>
-          <w:lang w:val="en-AE"/>
-        </w:rPr>
-        <w:t>go</w:t>
-      </w:r>
-      <w:proofErr w:type="gramEnd"/>
-      <w:r>
-        <w:rPr>
-          <w:lang w:val="en-AE"/>
-        </w:rPr>
-        <w:t xml:space="preserve"> with conditions. The team shall proceed to the next phase only with a constrained scope, synthetic or anonymized data set, modular application design, human approval of all transfers and life cycle actions, and deterministic fallback in case of AI services unavailability or ambiguity.</w:t>
+        <w:t>The proposed Intelligent AI Powered Circular Campus Resource Exchange and Asset Life Cycle Management System is feasible as an experimental campus resource management system prototype. The decision recommendation is go with conditions. The team shall proceed to the next phase only with a constrained scope, synthetic or anonymized data set, modular application design, human approval of all transfers and life cycle actions, and deterministic fallback in case of AI services unavailability or ambiguity.</w:t>
       </w:r>
     </w:p>
     <w:p>
@@ -1113,28 +1099,12 @@
     </w:p>
     <w:p>
       <w:r>
-        <w:t xml:space="preserve">The level of operational feasibility is </w:t>
-      </w:r>
-      <w:proofErr w:type="gramStart"/>
-      <w:r>
-        <w:t>fairly high</w:t>
-      </w:r>
-      <w:proofErr w:type="gramEnd"/>
-      <w:r>
-        <w:t xml:space="preserve"> since the proposed flow is aligned with roles defined in Phase 1. Representatives of departments deliver information about assets; requestors do searches and submit requests; custodians validate the status of assets and their custody; administration approves transfers; maintenance records maintenance activity; while sustainability, procurement, and finance officers evaluate outcomes. Successful implementation requires forms of easy use, permission levels, consistent data input, approval status, and a training manual. It is important that the system does not require all stakeholders to be aware of the AI algorithm.</w:t>
+        <w:t>The level of operational feasibility is fairly high since the proposed flow is aligned with roles defined in Phase 1. Representatives of departments deliver information about assets; requestors do searches and submit requests; custodians validate the status of assets and their custody; administration approves transfers; maintenance records maintenance activity; while sustainability, procurement, and finance officers evaluate outcomes. Successful implementation requires forms of easy use, permission levels, consistent data input, approval status, and a training manual. It is important that the system does not require all stakeholders to be aware of the AI algorithm.</w:t>
       </w:r>
     </w:p>
     <w:p>
       <w:r>
-        <w:t xml:space="preserve">Financial feasibility is acceptable for the course project prototype since the team may rely on its own and university equipment, Git/GitHub, </w:t>
-      </w:r>
-      <w:proofErr w:type="gramStart"/>
-      <w:r>
-        <w:t>open source</w:t>
-      </w:r>
-      <w:proofErr w:type="gramEnd"/>
-      <w:r>
-        <w:t xml:space="preserve"> development environment, and a local database. There will be minimal direct cash costs if paying for cloud services and AI services is optional. It is impossible to estimate costs of deployment in the production environment in Phase 2 because hosting requirements, integrations, procurement policies, support, amount of data, and security assessment are still unknown. The report estimates costs using transparent ranges and benefit formulas.</w:t>
+        <w:t>Financial feasibility is acceptable for the course project prototype since the team may rely on its own and university equipment, Git/GitHub, open source development environment, and a local database. There will be minimal direct cash costs if paying for cloud services and AI services is optional. It is impossible to estimate costs of deployment in the production environment in Phase 2 because hosting requirements, integrations, procurement policies, support, amount of data, and security assessment are still unknown. The report estimates costs using transparent ranges and benefit formulas.</w:t>
       </w:r>
     </w:p>
     <w:p>
@@ -1767,29 +1737,7 @@
           <w:sz w:val="22"/>
           <w:szCs w:val="22"/>
         </w:rPr>
-        <w:t xml:space="preserve">This Phase 2 report determines the viability of the project defined in Phase 1 inside the constraints of the course environment. It reviews the architecture, database, AI services, semantic search, reporting capability, integrations, development resource pool, expected operating model, schedule of the project, readiness of the data, and relevant constraints. It does not replace the comprehensive requirements document that will be created in Phase 3. Rather, it sets the stage for determining what we can responsibly develop, what needs to wait, and what </w:t>
-      </w:r>
-      <w:proofErr w:type="gramStart"/>
-      <w:r>
-        <w:rPr>
-          <w:rFonts w:ascii="Aptos" w:eastAsiaTheme="minorEastAsia" w:hAnsi="Aptos" w:cstheme="minorBidi"/>
-          <w:b w:val="0"/>
-          <w:bCs w:val="0"/>
-          <w:sz w:val="22"/>
-          <w:szCs w:val="22"/>
-        </w:rPr>
-        <w:t>has to</w:t>
-      </w:r>
-      <w:proofErr w:type="gramEnd"/>
-      <w:r>
-        <w:rPr>
-          <w:rFonts w:ascii="Aptos" w:eastAsiaTheme="minorEastAsia" w:hAnsi="Aptos" w:cstheme="minorBidi"/>
-          <w:b w:val="0"/>
-          <w:bCs w:val="0"/>
-          <w:sz w:val="22"/>
-          <w:szCs w:val="22"/>
-        </w:rPr>
-        <w:t xml:space="preserve"> be sorted out before we finalize requirements.</w:t>
+        <w:t>This Phase 2 report determines the viability of the project defined in Phase 1 inside the constraints of the course environment. It reviews the architecture, database, AI services, semantic search, reporting capability, integrations, development resource pool, expected operating model, schedule of the project, readiness of the data, and relevant constraints. It does not replace the comprehensive requirements document that will be created in Phase 3. Rather, it sets the stage for determining what we can responsibly develop, what needs to wait, and what has to be sorted out before we finalize requirements.</w:t>
       </w:r>
     </w:p>
     <w:p>
@@ -2863,29 +2811,7 @@
           <w:sz w:val="22"/>
           <w:szCs w:val="22"/>
         </w:rPr>
-        <w:t xml:space="preserve">end asset reuse workflow. The prototype should preserve </w:t>
-      </w:r>
-      <w:proofErr w:type="gramStart"/>
-      <w:r>
-        <w:rPr>
-          <w:rFonts w:ascii="Aptos" w:eastAsiaTheme="minorEastAsia" w:hAnsi="Aptos" w:cstheme="minorBidi"/>
-          <w:b w:val="0"/>
-          <w:bCs w:val="0"/>
-          <w:sz w:val="22"/>
-          <w:szCs w:val="22"/>
-        </w:rPr>
-        <w:t>a history</w:t>
-      </w:r>
-      <w:proofErr w:type="gramEnd"/>
-      <w:r>
-        <w:rPr>
-          <w:rFonts w:ascii="Aptos" w:eastAsiaTheme="minorEastAsia" w:hAnsi="Aptos" w:cstheme="minorBidi"/>
-          <w:b w:val="0"/>
-          <w:bCs w:val="0"/>
-          <w:sz w:val="22"/>
-          <w:szCs w:val="22"/>
-        </w:rPr>
-        <w:t>. The prototype should return search and match results. The prototype should stop actions. The prototype should compute sample sustainability indicators, from known inputs. AI quality must be evaluated separately from workflow completion. A successful transfer does not prove that an AI recommendation was accurate. A relevant recommendation does not prove that a transfer was approved or beneficial.</w:t>
+        <w:t>end asset reuse workflow. The prototype should preserve a history. The prototype should return search and match results. The prototype should stop actions. The prototype should compute sample sustainability indicators, from known inputs. AI quality must be evaluated separately from workflow completion. A successful transfer does not prove that an AI recommendation was accurate. A relevant recommendation does not prove that a transfer was approved or beneficial.</w:t>
       </w:r>
     </w:p>
     <w:p>
@@ -3725,35 +3651,7 @@
         <w:rPr>
           <w:lang w:val="en-AE"/>
         </w:rPr>
-        <w:t xml:space="preserve">The analysis uses the course project brief, the Phase 1 planning document the Phase 2 lecture slides, the official course schedule and current official public references on UAE data protection and Khalifa University privacy and policy access. The team has not yet provided an institutional asset dataset, integration specification, production hosting standard, procurement quotation or approved university business process. </w:t>
-      </w:r>
-      <w:proofErr w:type="gramStart"/>
-      <w:r>
-        <w:rPr>
-          <w:lang w:val="en-AE"/>
-        </w:rPr>
-        <w:t>Accordingly</w:t>
-      </w:r>
-      <w:proofErr w:type="gramEnd"/>
-      <w:r>
-        <w:rPr>
-          <w:lang w:val="en-AE"/>
-        </w:rPr>
-        <w:t xml:space="preserve"> all cost ranges are planning </w:t>
-      </w:r>
-      <w:proofErr w:type="gramStart"/>
-      <w:r>
-        <w:rPr>
-          <w:lang w:val="en-AE"/>
-        </w:rPr>
-        <w:t>assumptions</w:t>
-      </w:r>
-      <w:proofErr w:type="gramEnd"/>
-      <w:r>
-        <w:rPr>
-          <w:lang w:val="en-AE"/>
-        </w:rPr>
-        <w:t xml:space="preserve"> and all AI performance claims remain to be tested. The report deliberately avoids a guaranteed return on investment or model accuracy percentage.</w:t>
+        <w:t>The analysis uses the course project brief, the Phase 1 planning document the Phase 2 lecture slides, the official course schedule and current official public references on UAE data protection and Khalifa University privacy and policy access. The team has not yet provided an institutional asset dataset, integration specification, production hosting standard, procurement quotation or approved university business process. Accordingly all cost ranges are planning assumptions and all AI performance claims remain to be tested. The report deliberately avoids a guaranteed return on investment or model accuracy percentage.</w:t>
       </w:r>
     </w:p>
     <w:p>
@@ -3785,21 +3683,7 @@
         <w:rPr>
           <w:lang w:val="en-AE"/>
         </w:rPr>
-        <w:t xml:space="preserve">Technical feasibility is high for the baseline system. Moderate for the AI extensions. The core workflows resemble information systems: authenticated users create records, search data, request actions approve state changes and review reports. These functions fit a web application backed by a database. The challenge comes from integrating AI without making the system </w:t>
-      </w:r>
-      <w:proofErr w:type="gramStart"/>
-      <w:r>
-        <w:rPr>
-          <w:lang w:val="en-AE"/>
-        </w:rPr>
-        <w:t>dependent,</w:t>
-      </w:r>
-      <w:proofErr w:type="gramEnd"/>
-      <w:r>
-        <w:rPr>
-          <w:lang w:val="en-AE"/>
-        </w:rPr>
-        <w:t xml:space="preserve"> on expensive services.</w:t>
+        <w:t>Technical feasibility is high for the baseline system. Moderate for the AI extensions. The core workflows resemble information systems: authenticated users create records, search data, request actions approve state changes and review reports. These functions fit a web application backed by a database. The challenge comes from integrating AI without making the system dependent, on expensive services.</w:t>
       </w:r>
       <w:r>
         <w:rPr>
@@ -3820,21 +3704,7 @@
         <w:rPr>
           <w:lang w:val="en-AE"/>
         </w:rPr>
-        <w:t xml:space="preserve">I believe a modular monolith is the architecture for the semester prototype. It lets us keep user management assets, requests, approvals, transfers, maintenance, sustainability reporting and AI adapters all inside a deployable application. This way the two of us can. Debug more easily while </w:t>
-      </w:r>
-      <w:proofErr w:type="gramStart"/>
-      <w:r>
-        <w:rPr>
-          <w:lang w:val="en-AE"/>
-        </w:rPr>
-        <w:t>still keeping</w:t>
-      </w:r>
-      <w:proofErr w:type="gramEnd"/>
-      <w:r>
-        <w:rPr>
-          <w:lang w:val="en-AE"/>
-        </w:rPr>
-        <w:t xml:space="preserve"> each part clear and separate. In contrast microservices would bring network traffic, service discovery, distributed logging, several separate deployments and a lot of integration tests even though the project is not yet ready to scale each part independently.</w:t>
+        <w:t>I believe a modular monolith is the architecture for the semester prototype. It lets us keep user management assets, requests, approvals, transfers, maintenance, sustainability reporting and AI adapters all inside a deployable application. This way the two of us can. Debug more easily while still keeping each part clear and separate. In contrast microservices would bring network traffic, service discovery, distributed logging, several separate deployments and a lot of integration tests even though the project is not yet ready to scale each part independently.</w:t>
       </w:r>
     </w:p>
     <w:p>
@@ -3850,7 +3720,6 @@
         <w:t xml:space="preserve">The application should show the AI functions through a service interface. The classification function takes approved asset fields. Gives back suggested categories, tags, missing metadata, confidence and an explanation. The matching function takes a request and candidate assets. Gives back ranked suggestions. The rest of the application stays in charge of authentication, authorization, workflow status, approvals, audit records and final decisions. This setup lets the team swap a model for a local model or a deterministic rule, without having to rewrite </w:t>
       </w:r>
       <w:proofErr w:type="spellStart"/>
-      <w:proofErr w:type="gramStart"/>
       <w:r>
         <w:rPr>
           <w:lang w:val="en-AE"/>
@@ -3866,7 +3735,6 @@
         <w:t>Table</w:t>
       </w:r>
       <w:proofErr w:type="spellEnd"/>
-      <w:proofErr w:type="gramEnd"/>
       <w:r>
         <w:rPr>
           <w:b/>
@@ -5113,21 +4981,7 @@
         <w:rPr>
           <w:lang w:val="en-AE"/>
         </w:rPr>
-        <w:t xml:space="preserve">I think the prototype will not need transactions so one application instance and one relational database will be enough for the course. The team still needs to index fields that are often filtered such, as category, department, condition, status, location and availability. Large photographs and documents should stay outside database rows. AI operations should use timeouts, retries and run asynchronously when a request might take several seconds. If a classification fails it should not stop </w:t>
-      </w:r>
-      <w:proofErr w:type="gramStart"/>
-      <w:r>
-        <w:rPr>
-          <w:lang w:val="en-AE"/>
-        </w:rPr>
-        <w:t>an</w:t>
-      </w:r>
-      <w:proofErr w:type="gramEnd"/>
-      <w:r>
-        <w:rPr>
-          <w:lang w:val="en-AE"/>
-        </w:rPr>
-        <w:t xml:space="preserve"> user from saving an asset manually.</w:t>
+        <w:t>I think the prototype will not need transactions so one application instance and one relational database will be enough for the course. The team still needs to index fields that are often filtered such, as category, department, condition, status, location and availability. Large photographs and documents should stay outside database rows. AI operations should use timeouts, retries and run asynchronously when a request might take several seconds. If a classification fails it should not stop an user from saving an asset manually.</w:t>
       </w:r>
     </w:p>
     <w:p>
@@ -5158,6 +5012,2647 @@
           <w:lang w:val="en-AE"/>
         </w:rPr>
         <w:t>Authentication and role-based authorization are feasible with established frameworks. Every sensitive operation must check permission in the backend, even if the interface hides unavailable actions. Passwords should use framework-provided secure hashing. Sessions or tokens require expiration and secure storage. Transfer approval, ownership change, disposal, user administration, and configuration changes should create immutable audit entries. The prototype should avoid storing identity documents, personal phone numbers, or unrelated personal details because they are not needed to demonstrate the workflow.</w:t>
+      </w:r>
+    </w:p>
+    <w:p>
+      <w:pPr>
+        <w:rPr>
+          <w:b/>
+          <w:bCs/>
+          <w:lang w:val="en-AE"/>
+        </w:rPr>
+      </w:pPr>
+      <w:r>
+        <w:rPr>
+          <w:b/>
+          <w:bCs/>
+          <w:lang w:val="en-AE"/>
+        </w:rPr>
+        <w:t>5 Data and AI Feasibility</w:t>
+      </w:r>
+    </w:p>
+    <w:p>
+      <w:pPr>
+        <w:rPr>
+          <w:lang w:val="en-AE"/>
+        </w:rPr>
+      </w:pPr>
+      <w:r>
+        <w:rPr>
+          <w:lang w:val="en-AE"/>
+        </w:rPr>
+        <w:t>I think Data and AI feasibility looks moderate. The AI functions that are being proposed are realistic.. The usefulness of the AI functions depends more on data quality and evaluation discipline than, on having a powerful model.</w:t>
+      </w:r>
+    </w:p>
+    <w:p>
+      <w:pPr>
+        <w:rPr>
+          <w:lang w:val="en-AE"/>
+        </w:rPr>
+      </w:pPr>
+      <w:r>
+        <w:rPr>
+          <w:lang w:val="en-AE"/>
+        </w:rPr>
+        <w:t>Asset descriptions might be incomplete. Departments may call the item by different names. Condition ratings can be subjective. Historic transfer and maintenance records might not exist in a form.</w:t>
+      </w:r>
+    </w:p>
+    <w:p>
+      <w:pPr>
+        <w:rPr>
+          <w:lang w:val="en-AE"/>
+        </w:rPr>
+      </w:pPr>
+      <w:r>
+        <w:rPr>
+          <w:lang w:val="en-AE"/>
+        </w:rPr>
+        <w:t>The prototype should therefore show the workflow with a controlled dataset. The prototype should also report the limitations clearly.</w:t>
+      </w:r>
+    </w:p>
+    <w:p>
+      <w:pPr>
+        <w:rPr>
+          <w:b/>
+          <w:bCs/>
+          <w:lang w:val="en-AE"/>
+        </w:rPr>
+      </w:pPr>
+      <w:r>
+        <w:rPr>
+          <w:b/>
+          <w:bCs/>
+          <w:lang w:val="en-AE"/>
+        </w:rPr>
+        <w:t>5 1 Data Readiness</w:t>
+      </w:r>
+    </w:p>
+    <w:p>
+      <w:pPr>
+        <w:rPr>
+          <w:lang w:val="en-AE"/>
+        </w:rPr>
+      </w:pPr>
+      <w:r>
+        <w:rPr>
+          <w:b/>
+          <w:bCs/>
+          <w:lang w:val="en-AE"/>
+        </w:rPr>
+        <w:t>Table 5 Data Readiness and Prototype Strategy</w:t>
+      </w:r>
+    </w:p>
+    <w:tbl>
+      <w:tblPr>
+        <w:tblW w:w="0" w:type="auto"/>
+        <w:jc w:val="center"/>
+        <w:tblCellMar>
+          <w:top w:w="15" w:type="dxa"/>
+          <w:left w:w="15" w:type="dxa"/>
+          <w:bottom w:w="15" w:type="dxa"/>
+          <w:right w:w="15" w:type="dxa"/>
+        </w:tblCellMar>
+        <w:tblLook w:val="04A0" w:firstRow="1" w:lastRow="0" w:firstColumn="1" w:lastColumn="0" w:noHBand="0" w:noVBand="1"/>
+      </w:tblPr>
+      <w:tblGrid>
+        <w:gridCol w:w="1808"/>
+        <w:gridCol w:w="2146"/>
+        <w:gridCol w:w="2989"/>
+        <w:gridCol w:w="2919"/>
+      </w:tblGrid>
+      <w:tr>
+        <w:trPr>
+          <w:tblHeader/>
+          <w:jc w:val="center"/>
+        </w:trPr>
+        <w:tc>
+          <w:tcPr>
+            <w:tcW w:w="0" w:type="auto"/>
+            <w:tcBorders>
+              <w:top w:val="single" w:sz="6" w:space="0" w:color="D9D9D9"/>
+              <w:left w:val="single" w:sz="6" w:space="0" w:color="D9D9D9"/>
+              <w:bottom w:val="single" w:sz="6" w:space="0" w:color="D9D9D9"/>
+              <w:right w:val="single" w:sz="6" w:space="0" w:color="D9D9D9"/>
+            </w:tcBorders>
+            <w:shd w:val="clear" w:color="auto" w:fill="17365D"/>
+            <w:tcMar>
+              <w:top w:w="105" w:type="dxa"/>
+              <w:left w:w="115" w:type="dxa"/>
+              <w:bottom w:w="105" w:type="dxa"/>
+              <w:right w:w="115" w:type="dxa"/>
+            </w:tcMar>
+            <w:vAlign w:val="center"/>
+            <w:hideMark/>
+          </w:tcPr>
+          <w:p>
+            <w:pPr>
+              <w:rPr>
+                <w:b/>
+                <w:bCs/>
+                <w:lang w:val="en-AE"/>
+              </w:rPr>
+            </w:pPr>
+            <w:r>
+              <w:rPr>
+                <w:b/>
+                <w:bCs/>
+                <w:lang w:val="en-AE"/>
+              </w:rPr>
+              <w:t>Data Domain</w:t>
+            </w:r>
+          </w:p>
+        </w:tc>
+        <w:tc>
+          <w:tcPr>
+            <w:tcW w:w="0" w:type="auto"/>
+            <w:tcBorders>
+              <w:top w:val="single" w:sz="6" w:space="0" w:color="D9D9D9"/>
+              <w:left w:val="single" w:sz="6" w:space="0" w:color="D9D9D9"/>
+              <w:bottom w:val="single" w:sz="6" w:space="0" w:color="D9D9D9"/>
+              <w:right w:val="single" w:sz="6" w:space="0" w:color="D9D9D9"/>
+            </w:tcBorders>
+            <w:shd w:val="clear" w:color="auto" w:fill="17365D"/>
+            <w:tcMar>
+              <w:top w:w="105" w:type="dxa"/>
+              <w:left w:w="115" w:type="dxa"/>
+              <w:bottom w:w="105" w:type="dxa"/>
+              <w:right w:w="115" w:type="dxa"/>
+            </w:tcMar>
+            <w:vAlign w:val="center"/>
+            <w:hideMark/>
+          </w:tcPr>
+          <w:p>
+            <w:pPr>
+              <w:rPr>
+                <w:b/>
+                <w:bCs/>
+                <w:lang w:val="en-AE"/>
+              </w:rPr>
+            </w:pPr>
+            <w:r>
+              <w:rPr>
+                <w:b/>
+                <w:bCs/>
+                <w:lang w:val="en-AE"/>
+              </w:rPr>
+              <w:t>Likely Readiness</w:t>
+            </w:r>
+          </w:p>
+        </w:tc>
+        <w:tc>
+          <w:tcPr>
+            <w:tcW w:w="0" w:type="auto"/>
+            <w:tcBorders>
+              <w:top w:val="single" w:sz="6" w:space="0" w:color="D9D9D9"/>
+              <w:left w:val="single" w:sz="6" w:space="0" w:color="D9D9D9"/>
+              <w:bottom w:val="single" w:sz="6" w:space="0" w:color="D9D9D9"/>
+              <w:right w:val="single" w:sz="6" w:space="0" w:color="D9D9D9"/>
+            </w:tcBorders>
+            <w:shd w:val="clear" w:color="auto" w:fill="17365D"/>
+            <w:tcMar>
+              <w:top w:w="105" w:type="dxa"/>
+              <w:left w:w="115" w:type="dxa"/>
+              <w:bottom w:w="105" w:type="dxa"/>
+              <w:right w:w="115" w:type="dxa"/>
+            </w:tcMar>
+            <w:vAlign w:val="center"/>
+            <w:hideMark/>
+          </w:tcPr>
+          <w:p>
+            <w:pPr>
+              <w:rPr>
+                <w:b/>
+                <w:bCs/>
+                <w:lang w:val="en-AE"/>
+              </w:rPr>
+            </w:pPr>
+            <w:r>
+              <w:rPr>
+                <w:b/>
+                <w:bCs/>
+                <w:lang w:val="en-AE"/>
+              </w:rPr>
+              <w:t>Prototype Strategy</w:t>
+            </w:r>
+          </w:p>
+        </w:tc>
+        <w:tc>
+          <w:tcPr>
+            <w:tcW w:w="0" w:type="auto"/>
+            <w:tcBorders>
+              <w:top w:val="single" w:sz="6" w:space="0" w:color="D9D9D9"/>
+              <w:left w:val="single" w:sz="6" w:space="0" w:color="D9D9D9"/>
+              <w:bottom w:val="single" w:sz="6" w:space="0" w:color="D9D9D9"/>
+              <w:right w:val="single" w:sz="6" w:space="0" w:color="D9D9D9"/>
+            </w:tcBorders>
+            <w:shd w:val="clear" w:color="auto" w:fill="17365D"/>
+            <w:tcMar>
+              <w:top w:w="105" w:type="dxa"/>
+              <w:left w:w="115" w:type="dxa"/>
+              <w:bottom w:w="105" w:type="dxa"/>
+              <w:right w:w="115" w:type="dxa"/>
+            </w:tcMar>
+            <w:vAlign w:val="center"/>
+            <w:hideMark/>
+          </w:tcPr>
+          <w:p>
+            <w:pPr>
+              <w:rPr>
+                <w:b/>
+                <w:bCs/>
+                <w:lang w:val="en-AE"/>
+              </w:rPr>
+            </w:pPr>
+            <w:r>
+              <w:rPr>
+                <w:b/>
+                <w:bCs/>
+                <w:lang w:val="en-AE"/>
+              </w:rPr>
+              <w:t>Quality Check</w:t>
+            </w:r>
+          </w:p>
+        </w:tc>
+      </w:tr>
+      <w:tr>
+        <w:trPr>
+          <w:jc w:val="center"/>
+        </w:trPr>
+        <w:tc>
+          <w:tcPr>
+            <w:tcW w:w="0" w:type="auto"/>
+            <w:tcBorders>
+              <w:top w:val="single" w:sz="6" w:space="0" w:color="D9D9D9"/>
+              <w:left w:val="single" w:sz="6" w:space="0" w:color="D9D9D9"/>
+              <w:bottom w:val="single" w:sz="6" w:space="0" w:color="D9D9D9"/>
+              <w:right w:val="single" w:sz="6" w:space="0" w:color="D9D9D9"/>
+            </w:tcBorders>
+            <w:tcMar>
+              <w:top w:w="95" w:type="dxa"/>
+              <w:left w:w="115" w:type="dxa"/>
+              <w:bottom w:w="95" w:type="dxa"/>
+              <w:right w:w="115" w:type="dxa"/>
+            </w:tcMar>
+            <w:vAlign w:val="center"/>
+            <w:hideMark/>
+          </w:tcPr>
+          <w:p>
+            <w:pPr>
+              <w:rPr>
+                <w:lang w:val="en-AE"/>
+              </w:rPr>
+            </w:pPr>
+            <w:r>
+              <w:rPr>
+                <w:lang w:val="en-AE"/>
+              </w:rPr>
+              <w:t>Asset inventory</w:t>
+            </w:r>
+          </w:p>
+        </w:tc>
+        <w:tc>
+          <w:tcPr>
+            <w:tcW w:w="0" w:type="auto"/>
+            <w:tcBorders>
+              <w:top w:val="single" w:sz="6" w:space="0" w:color="D9D9D9"/>
+              <w:left w:val="single" w:sz="6" w:space="0" w:color="D9D9D9"/>
+              <w:bottom w:val="single" w:sz="6" w:space="0" w:color="D9D9D9"/>
+              <w:right w:val="single" w:sz="6" w:space="0" w:color="D9D9D9"/>
+            </w:tcBorders>
+            <w:tcMar>
+              <w:top w:w="95" w:type="dxa"/>
+              <w:left w:w="115" w:type="dxa"/>
+              <w:bottom w:w="95" w:type="dxa"/>
+              <w:right w:w="115" w:type="dxa"/>
+            </w:tcMar>
+            <w:vAlign w:val="center"/>
+            <w:hideMark/>
+          </w:tcPr>
+          <w:p>
+            <w:pPr>
+              <w:rPr>
+                <w:lang w:val="en-AE"/>
+              </w:rPr>
+            </w:pPr>
+            <w:r>
+              <w:rPr>
+                <w:lang w:val="en-AE"/>
+              </w:rPr>
+              <w:t>Partial or unknown</w:t>
+            </w:r>
+          </w:p>
+        </w:tc>
+        <w:tc>
+          <w:tcPr>
+            <w:tcW w:w="0" w:type="auto"/>
+            <w:tcBorders>
+              <w:top w:val="single" w:sz="6" w:space="0" w:color="D9D9D9"/>
+              <w:left w:val="single" w:sz="6" w:space="0" w:color="D9D9D9"/>
+              <w:bottom w:val="single" w:sz="6" w:space="0" w:color="D9D9D9"/>
+              <w:right w:val="single" w:sz="6" w:space="0" w:color="D9D9D9"/>
+            </w:tcBorders>
+            <w:tcMar>
+              <w:top w:w="95" w:type="dxa"/>
+              <w:left w:w="115" w:type="dxa"/>
+              <w:bottom w:w="95" w:type="dxa"/>
+              <w:right w:w="115" w:type="dxa"/>
+            </w:tcMar>
+            <w:vAlign w:val="center"/>
+            <w:hideMark/>
+          </w:tcPr>
+          <w:p>
+            <w:pPr>
+              <w:rPr>
+                <w:lang w:val="en-AE"/>
+              </w:rPr>
+            </w:pPr>
+            <w:r>
+              <w:rPr>
+                <w:lang w:val="en-AE"/>
+              </w:rPr>
+              <w:t>Create representative synthetic records across key categories</w:t>
+            </w:r>
+          </w:p>
+        </w:tc>
+        <w:tc>
+          <w:tcPr>
+            <w:tcW w:w="0" w:type="auto"/>
+            <w:tcBorders>
+              <w:top w:val="single" w:sz="6" w:space="0" w:color="D9D9D9"/>
+              <w:left w:val="single" w:sz="6" w:space="0" w:color="D9D9D9"/>
+              <w:bottom w:val="single" w:sz="6" w:space="0" w:color="D9D9D9"/>
+              <w:right w:val="single" w:sz="6" w:space="0" w:color="D9D9D9"/>
+            </w:tcBorders>
+            <w:tcMar>
+              <w:top w:w="95" w:type="dxa"/>
+              <w:left w:w="115" w:type="dxa"/>
+              <w:bottom w:w="95" w:type="dxa"/>
+              <w:right w:w="115" w:type="dxa"/>
+            </w:tcMar>
+            <w:vAlign w:val="center"/>
+            <w:hideMark/>
+          </w:tcPr>
+          <w:p>
+            <w:pPr>
+              <w:rPr>
+                <w:lang w:val="en-AE"/>
+              </w:rPr>
+            </w:pPr>
+            <w:r>
+              <w:rPr>
+                <w:lang w:val="en-AE"/>
+              </w:rPr>
+              <w:t>Required fields, unique identifiers, valid status and department</w:t>
+            </w:r>
+          </w:p>
+        </w:tc>
+      </w:tr>
+      <w:tr>
+        <w:trPr>
+          <w:jc w:val="center"/>
+        </w:trPr>
+        <w:tc>
+          <w:tcPr>
+            <w:tcW w:w="0" w:type="auto"/>
+            <w:tcBorders>
+              <w:top w:val="single" w:sz="6" w:space="0" w:color="D9D9D9"/>
+              <w:left w:val="single" w:sz="6" w:space="0" w:color="D9D9D9"/>
+              <w:bottom w:val="single" w:sz="6" w:space="0" w:color="D9D9D9"/>
+              <w:right w:val="single" w:sz="6" w:space="0" w:color="D9D9D9"/>
+            </w:tcBorders>
+            <w:shd w:val="clear" w:color="auto" w:fill="EAF2F8"/>
+            <w:tcMar>
+              <w:top w:w="95" w:type="dxa"/>
+              <w:left w:w="115" w:type="dxa"/>
+              <w:bottom w:w="95" w:type="dxa"/>
+              <w:right w:w="115" w:type="dxa"/>
+            </w:tcMar>
+            <w:vAlign w:val="center"/>
+            <w:hideMark/>
+          </w:tcPr>
+          <w:p>
+            <w:pPr>
+              <w:rPr>
+                <w:lang w:val="en-AE"/>
+              </w:rPr>
+            </w:pPr>
+            <w:r>
+              <w:rPr>
+                <w:lang w:val="en-AE"/>
+              </w:rPr>
+              <w:t>Department requests</w:t>
+            </w:r>
+          </w:p>
+        </w:tc>
+        <w:tc>
+          <w:tcPr>
+            <w:tcW w:w="0" w:type="auto"/>
+            <w:tcBorders>
+              <w:top w:val="single" w:sz="6" w:space="0" w:color="D9D9D9"/>
+              <w:left w:val="single" w:sz="6" w:space="0" w:color="D9D9D9"/>
+              <w:bottom w:val="single" w:sz="6" w:space="0" w:color="D9D9D9"/>
+              <w:right w:val="single" w:sz="6" w:space="0" w:color="D9D9D9"/>
+            </w:tcBorders>
+            <w:shd w:val="clear" w:color="auto" w:fill="EAF2F8"/>
+            <w:tcMar>
+              <w:top w:w="95" w:type="dxa"/>
+              <w:left w:w="115" w:type="dxa"/>
+              <w:bottom w:w="95" w:type="dxa"/>
+              <w:right w:w="115" w:type="dxa"/>
+            </w:tcMar>
+            <w:vAlign w:val="center"/>
+            <w:hideMark/>
+          </w:tcPr>
+          <w:p>
+            <w:pPr>
+              <w:rPr>
+                <w:lang w:val="en-AE"/>
+              </w:rPr>
+            </w:pPr>
+            <w:r>
+              <w:rPr>
+                <w:lang w:val="en-AE"/>
+              </w:rPr>
+              <w:t>Limited historic data</w:t>
+            </w:r>
+          </w:p>
+        </w:tc>
+        <w:tc>
+          <w:tcPr>
+            <w:tcW w:w="0" w:type="auto"/>
+            <w:tcBorders>
+              <w:top w:val="single" w:sz="6" w:space="0" w:color="D9D9D9"/>
+              <w:left w:val="single" w:sz="6" w:space="0" w:color="D9D9D9"/>
+              <w:bottom w:val="single" w:sz="6" w:space="0" w:color="D9D9D9"/>
+              <w:right w:val="single" w:sz="6" w:space="0" w:color="D9D9D9"/>
+            </w:tcBorders>
+            <w:shd w:val="clear" w:color="auto" w:fill="EAF2F8"/>
+            <w:tcMar>
+              <w:top w:w="95" w:type="dxa"/>
+              <w:left w:w="115" w:type="dxa"/>
+              <w:bottom w:w="95" w:type="dxa"/>
+              <w:right w:w="115" w:type="dxa"/>
+            </w:tcMar>
+            <w:vAlign w:val="center"/>
+            <w:hideMark/>
+          </w:tcPr>
+          <w:p>
+            <w:pPr>
+              <w:rPr>
+                <w:lang w:val="en-AE"/>
+              </w:rPr>
+            </w:pPr>
+            <w:r>
+              <w:rPr>
+                <w:lang w:val="en-AE"/>
+              </w:rPr>
+              <w:t>Generate sample requests with different vocabulary and urgency</w:t>
+            </w:r>
+          </w:p>
+        </w:tc>
+        <w:tc>
+          <w:tcPr>
+            <w:tcW w:w="0" w:type="auto"/>
+            <w:tcBorders>
+              <w:top w:val="single" w:sz="6" w:space="0" w:color="D9D9D9"/>
+              <w:left w:val="single" w:sz="6" w:space="0" w:color="D9D9D9"/>
+              <w:bottom w:val="single" w:sz="6" w:space="0" w:color="D9D9D9"/>
+              <w:right w:val="single" w:sz="6" w:space="0" w:color="D9D9D9"/>
+            </w:tcBorders>
+            <w:shd w:val="clear" w:color="auto" w:fill="EAF2F8"/>
+            <w:tcMar>
+              <w:top w:w="95" w:type="dxa"/>
+              <w:left w:w="115" w:type="dxa"/>
+              <w:bottom w:w="95" w:type="dxa"/>
+              <w:right w:w="115" w:type="dxa"/>
+            </w:tcMar>
+            <w:vAlign w:val="center"/>
+            <w:hideMark/>
+          </w:tcPr>
+          <w:p>
+            <w:pPr>
+              <w:rPr>
+                <w:lang w:val="en-AE"/>
+              </w:rPr>
+            </w:pPr>
+            <w:r>
+              <w:rPr>
+                <w:lang w:val="en-AE"/>
+              </w:rPr>
+              <w:t>Complete purpose, quantity, required date, and specifications</w:t>
+            </w:r>
+          </w:p>
+        </w:tc>
+      </w:tr>
+      <w:tr>
+        <w:trPr>
+          <w:jc w:val="center"/>
+        </w:trPr>
+        <w:tc>
+          <w:tcPr>
+            <w:tcW w:w="0" w:type="auto"/>
+            <w:tcBorders>
+              <w:top w:val="single" w:sz="6" w:space="0" w:color="D9D9D9"/>
+              <w:left w:val="single" w:sz="6" w:space="0" w:color="D9D9D9"/>
+              <w:bottom w:val="single" w:sz="6" w:space="0" w:color="D9D9D9"/>
+              <w:right w:val="single" w:sz="6" w:space="0" w:color="D9D9D9"/>
+            </w:tcBorders>
+            <w:tcMar>
+              <w:top w:w="95" w:type="dxa"/>
+              <w:left w:w="115" w:type="dxa"/>
+              <w:bottom w:w="95" w:type="dxa"/>
+              <w:right w:w="115" w:type="dxa"/>
+            </w:tcMar>
+            <w:vAlign w:val="center"/>
+            <w:hideMark/>
+          </w:tcPr>
+          <w:p>
+            <w:pPr>
+              <w:rPr>
+                <w:lang w:val="en-AE"/>
+              </w:rPr>
+            </w:pPr>
+            <w:r>
+              <w:rPr>
+                <w:lang w:val="en-AE"/>
+              </w:rPr>
+              <w:t>Transfers and approvals</w:t>
+            </w:r>
+          </w:p>
+        </w:tc>
+        <w:tc>
+          <w:tcPr>
+            <w:tcW w:w="0" w:type="auto"/>
+            <w:tcBorders>
+              <w:top w:val="single" w:sz="6" w:space="0" w:color="D9D9D9"/>
+              <w:left w:val="single" w:sz="6" w:space="0" w:color="D9D9D9"/>
+              <w:bottom w:val="single" w:sz="6" w:space="0" w:color="D9D9D9"/>
+              <w:right w:val="single" w:sz="6" w:space="0" w:color="D9D9D9"/>
+            </w:tcBorders>
+            <w:tcMar>
+              <w:top w:w="95" w:type="dxa"/>
+              <w:left w:w="115" w:type="dxa"/>
+              <w:bottom w:w="95" w:type="dxa"/>
+              <w:right w:w="115" w:type="dxa"/>
+            </w:tcMar>
+            <w:vAlign w:val="center"/>
+            <w:hideMark/>
+          </w:tcPr>
+          <w:p>
+            <w:pPr>
+              <w:rPr>
+                <w:lang w:val="en-AE"/>
+              </w:rPr>
+            </w:pPr>
+            <w:r>
+              <w:rPr>
+                <w:lang w:val="en-AE"/>
+              </w:rPr>
+              <w:t>May be distributed across documents</w:t>
+            </w:r>
+          </w:p>
+        </w:tc>
+        <w:tc>
+          <w:tcPr>
+            <w:tcW w:w="0" w:type="auto"/>
+            <w:tcBorders>
+              <w:top w:val="single" w:sz="6" w:space="0" w:color="D9D9D9"/>
+              <w:left w:val="single" w:sz="6" w:space="0" w:color="D9D9D9"/>
+              <w:bottom w:val="single" w:sz="6" w:space="0" w:color="D9D9D9"/>
+              <w:right w:val="single" w:sz="6" w:space="0" w:color="D9D9D9"/>
+            </w:tcBorders>
+            <w:tcMar>
+              <w:top w:w="95" w:type="dxa"/>
+              <w:left w:w="115" w:type="dxa"/>
+              <w:bottom w:w="95" w:type="dxa"/>
+              <w:right w:w="115" w:type="dxa"/>
+            </w:tcMar>
+            <w:vAlign w:val="center"/>
+            <w:hideMark/>
+          </w:tcPr>
+          <w:p>
+            <w:pPr>
+              <w:rPr>
+                <w:lang w:val="en-AE"/>
+              </w:rPr>
+            </w:pPr>
+            <w:r>
+              <w:rPr>
+                <w:lang w:val="en-AE"/>
+              </w:rPr>
+              <w:t>Simulate state transitions and approval records</w:t>
+            </w:r>
+          </w:p>
+        </w:tc>
+        <w:tc>
+          <w:tcPr>
+            <w:tcW w:w="0" w:type="auto"/>
+            <w:tcBorders>
+              <w:top w:val="single" w:sz="6" w:space="0" w:color="D9D9D9"/>
+              <w:left w:val="single" w:sz="6" w:space="0" w:color="D9D9D9"/>
+              <w:bottom w:val="single" w:sz="6" w:space="0" w:color="D9D9D9"/>
+              <w:right w:val="single" w:sz="6" w:space="0" w:color="D9D9D9"/>
+            </w:tcBorders>
+            <w:tcMar>
+              <w:top w:w="95" w:type="dxa"/>
+              <w:left w:w="115" w:type="dxa"/>
+              <w:bottom w:w="95" w:type="dxa"/>
+              <w:right w:w="115" w:type="dxa"/>
+            </w:tcMar>
+            <w:vAlign w:val="center"/>
+            <w:hideMark/>
+          </w:tcPr>
+          <w:p>
+            <w:pPr>
+              <w:rPr>
+                <w:lang w:val="en-AE"/>
+              </w:rPr>
+            </w:pPr>
+            <w:r>
+              <w:rPr>
+                <w:lang w:val="en-AE"/>
+              </w:rPr>
+              <w:t>Valid sequence, authorized actor, timestamp, reason</w:t>
+            </w:r>
+          </w:p>
+        </w:tc>
+      </w:tr>
+      <w:tr>
+        <w:trPr>
+          <w:jc w:val="center"/>
+        </w:trPr>
+        <w:tc>
+          <w:tcPr>
+            <w:tcW w:w="0" w:type="auto"/>
+            <w:tcBorders>
+              <w:top w:val="single" w:sz="6" w:space="0" w:color="D9D9D9"/>
+              <w:left w:val="single" w:sz="6" w:space="0" w:color="D9D9D9"/>
+              <w:bottom w:val="single" w:sz="6" w:space="0" w:color="D9D9D9"/>
+              <w:right w:val="single" w:sz="6" w:space="0" w:color="D9D9D9"/>
+            </w:tcBorders>
+            <w:shd w:val="clear" w:color="auto" w:fill="EAF2F8"/>
+            <w:tcMar>
+              <w:top w:w="95" w:type="dxa"/>
+              <w:left w:w="115" w:type="dxa"/>
+              <w:bottom w:w="95" w:type="dxa"/>
+              <w:right w:w="115" w:type="dxa"/>
+            </w:tcMar>
+            <w:vAlign w:val="center"/>
+            <w:hideMark/>
+          </w:tcPr>
+          <w:p>
+            <w:pPr>
+              <w:rPr>
+                <w:lang w:val="en-AE"/>
+              </w:rPr>
+            </w:pPr>
+            <w:r>
+              <w:rPr>
+                <w:lang w:val="en-AE"/>
+              </w:rPr>
+              <w:t>Maintenance history</w:t>
+            </w:r>
+          </w:p>
+        </w:tc>
+        <w:tc>
+          <w:tcPr>
+            <w:tcW w:w="0" w:type="auto"/>
+            <w:tcBorders>
+              <w:top w:val="single" w:sz="6" w:space="0" w:color="D9D9D9"/>
+              <w:left w:val="single" w:sz="6" w:space="0" w:color="D9D9D9"/>
+              <w:bottom w:val="single" w:sz="6" w:space="0" w:color="D9D9D9"/>
+              <w:right w:val="single" w:sz="6" w:space="0" w:color="D9D9D9"/>
+            </w:tcBorders>
+            <w:shd w:val="clear" w:color="auto" w:fill="EAF2F8"/>
+            <w:tcMar>
+              <w:top w:w="95" w:type="dxa"/>
+              <w:left w:w="115" w:type="dxa"/>
+              <w:bottom w:w="95" w:type="dxa"/>
+              <w:right w:w="115" w:type="dxa"/>
+            </w:tcMar>
+            <w:vAlign w:val="center"/>
+            <w:hideMark/>
+          </w:tcPr>
+          <w:p>
+            <w:pPr>
+              <w:rPr>
+                <w:lang w:val="en-AE"/>
+              </w:rPr>
+            </w:pPr>
+            <w:r>
+              <w:rPr>
+                <w:lang w:val="en-AE"/>
+              </w:rPr>
+              <w:t>Variable detail</w:t>
+            </w:r>
+          </w:p>
+        </w:tc>
+        <w:tc>
+          <w:tcPr>
+            <w:tcW w:w="0" w:type="auto"/>
+            <w:tcBorders>
+              <w:top w:val="single" w:sz="6" w:space="0" w:color="D9D9D9"/>
+              <w:left w:val="single" w:sz="6" w:space="0" w:color="D9D9D9"/>
+              <w:bottom w:val="single" w:sz="6" w:space="0" w:color="D9D9D9"/>
+              <w:right w:val="single" w:sz="6" w:space="0" w:color="D9D9D9"/>
+            </w:tcBorders>
+            <w:shd w:val="clear" w:color="auto" w:fill="EAF2F8"/>
+            <w:tcMar>
+              <w:top w:w="95" w:type="dxa"/>
+              <w:left w:w="115" w:type="dxa"/>
+              <w:bottom w:w="95" w:type="dxa"/>
+              <w:right w:w="115" w:type="dxa"/>
+            </w:tcMar>
+            <w:vAlign w:val="center"/>
+            <w:hideMark/>
+          </w:tcPr>
+          <w:p>
+            <w:pPr>
+              <w:rPr>
+                <w:lang w:val="en-AE"/>
+              </w:rPr>
+            </w:pPr>
+            <w:r>
+              <w:rPr>
+                <w:lang w:val="en-AE"/>
+              </w:rPr>
+              <w:t>Use sample inspections and repairs linked to assets</w:t>
+            </w:r>
+          </w:p>
+        </w:tc>
+        <w:tc>
+          <w:tcPr>
+            <w:tcW w:w="0" w:type="auto"/>
+            <w:tcBorders>
+              <w:top w:val="single" w:sz="6" w:space="0" w:color="D9D9D9"/>
+              <w:left w:val="single" w:sz="6" w:space="0" w:color="D9D9D9"/>
+              <w:bottom w:val="single" w:sz="6" w:space="0" w:color="D9D9D9"/>
+              <w:right w:val="single" w:sz="6" w:space="0" w:color="D9D9D9"/>
+            </w:tcBorders>
+            <w:shd w:val="clear" w:color="auto" w:fill="EAF2F8"/>
+            <w:tcMar>
+              <w:top w:w="95" w:type="dxa"/>
+              <w:left w:w="115" w:type="dxa"/>
+              <w:bottom w:w="95" w:type="dxa"/>
+              <w:right w:w="115" w:type="dxa"/>
+            </w:tcMar>
+            <w:vAlign w:val="center"/>
+            <w:hideMark/>
+          </w:tcPr>
+          <w:p>
+            <w:pPr>
+              <w:rPr>
+                <w:lang w:val="en-AE"/>
+              </w:rPr>
+            </w:pPr>
+            <w:r>
+              <w:rPr>
+                <w:lang w:val="en-AE"/>
+              </w:rPr>
+              <w:t>Cost units, dates, before and after condition</w:t>
+            </w:r>
+          </w:p>
+        </w:tc>
+      </w:tr>
+      <w:tr>
+        <w:trPr>
+          <w:jc w:val="center"/>
+        </w:trPr>
+        <w:tc>
+          <w:tcPr>
+            <w:tcW w:w="0" w:type="auto"/>
+            <w:tcBorders>
+              <w:top w:val="single" w:sz="6" w:space="0" w:color="D9D9D9"/>
+              <w:left w:val="single" w:sz="6" w:space="0" w:color="D9D9D9"/>
+              <w:bottom w:val="single" w:sz="6" w:space="0" w:color="D9D9D9"/>
+              <w:right w:val="single" w:sz="6" w:space="0" w:color="D9D9D9"/>
+            </w:tcBorders>
+            <w:tcMar>
+              <w:top w:w="95" w:type="dxa"/>
+              <w:left w:w="115" w:type="dxa"/>
+              <w:bottom w:w="95" w:type="dxa"/>
+              <w:right w:w="115" w:type="dxa"/>
+            </w:tcMar>
+            <w:vAlign w:val="center"/>
+            <w:hideMark/>
+          </w:tcPr>
+          <w:p>
+            <w:pPr>
+              <w:rPr>
+                <w:lang w:val="en-AE"/>
+              </w:rPr>
+            </w:pPr>
+            <w:r>
+              <w:rPr>
+                <w:lang w:val="en-AE"/>
+              </w:rPr>
+              <w:t>Procurement values</w:t>
+            </w:r>
+          </w:p>
+        </w:tc>
+        <w:tc>
+          <w:tcPr>
+            <w:tcW w:w="0" w:type="auto"/>
+            <w:tcBorders>
+              <w:top w:val="single" w:sz="6" w:space="0" w:color="D9D9D9"/>
+              <w:left w:val="single" w:sz="6" w:space="0" w:color="D9D9D9"/>
+              <w:bottom w:val="single" w:sz="6" w:space="0" w:color="D9D9D9"/>
+              <w:right w:val="single" w:sz="6" w:space="0" w:color="D9D9D9"/>
+            </w:tcBorders>
+            <w:tcMar>
+              <w:top w:w="95" w:type="dxa"/>
+              <w:left w:w="115" w:type="dxa"/>
+              <w:bottom w:w="95" w:type="dxa"/>
+              <w:right w:w="115" w:type="dxa"/>
+            </w:tcMar>
+            <w:vAlign w:val="center"/>
+            <w:hideMark/>
+          </w:tcPr>
+          <w:p>
+            <w:pPr>
+              <w:rPr>
+                <w:lang w:val="en-AE"/>
+              </w:rPr>
+            </w:pPr>
+            <w:r>
+              <w:rPr>
+                <w:lang w:val="en-AE"/>
+              </w:rPr>
+              <w:t>Sensitive and access controlled</w:t>
+            </w:r>
+          </w:p>
+        </w:tc>
+        <w:tc>
+          <w:tcPr>
+            <w:tcW w:w="0" w:type="auto"/>
+            <w:tcBorders>
+              <w:top w:val="single" w:sz="6" w:space="0" w:color="D9D9D9"/>
+              <w:left w:val="single" w:sz="6" w:space="0" w:color="D9D9D9"/>
+              <w:bottom w:val="single" w:sz="6" w:space="0" w:color="D9D9D9"/>
+              <w:right w:val="single" w:sz="6" w:space="0" w:color="D9D9D9"/>
+            </w:tcBorders>
+            <w:tcMar>
+              <w:top w:w="95" w:type="dxa"/>
+              <w:left w:w="115" w:type="dxa"/>
+              <w:bottom w:w="95" w:type="dxa"/>
+              <w:right w:w="115" w:type="dxa"/>
+            </w:tcMar>
+            <w:vAlign w:val="center"/>
+            <w:hideMark/>
+          </w:tcPr>
+          <w:p>
+            <w:pPr>
+              <w:rPr>
+                <w:lang w:val="en-AE"/>
+              </w:rPr>
+            </w:pPr>
+            <w:r>
+              <w:rPr>
+                <w:lang w:val="en-AE"/>
+              </w:rPr>
+              <w:t xml:space="preserve">Use clearly </w:t>
+            </w:r>
+            <w:proofErr w:type="spellStart"/>
+            <w:r>
+              <w:rPr>
+                <w:lang w:val="en-AE"/>
+              </w:rPr>
+              <w:t>labeled</w:t>
+            </w:r>
+            <w:proofErr w:type="spellEnd"/>
+            <w:r>
+              <w:rPr>
+                <w:lang w:val="en-AE"/>
+              </w:rPr>
+              <w:t xml:space="preserve"> sample reference values</w:t>
+            </w:r>
+          </w:p>
+        </w:tc>
+        <w:tc>
+          <w:tcPr>
+            <w:tcW w:w="0" w:type="auto"/>
+            <w:tcBorders>
+              <w:top w:val="single" w:sz="6" w:space="0" w:color="D9D9D9"/>
+              <w:left w:val="single" w:sz="6" w:space="0" w:color="D9D9D9"/>
+              <w:bottom w:val="single" w:sz="6" w:space="0" w:color="D9D9D9"/>
+              <w:right w:val="single" w:sz="6" w:space="0" w:color="D9D9D9"/>
+            </w:tcBorders>
+            <w:tcMar>
+              <w:top w:w="95" w:type="dxa"/>
+              <w:left w:w="115" w:type="dxa"/>
+              <w:bottom w:w="95" w:type="dxa"/>
+              <w:right w:w="115" w:type="dxa"/>
+            </w:tcMar>
+            <w:vAlign w:val="center"/>
+            <w:hideMark/>
+          </w:tcPr>
+          <w:p>
+            <w:pPr>
+              <w:rPr>
+                <w:lang w:val="en-AE"/>
+              </w:rPr>
+            </w:pPr>
+            <w:r>
+              <w:rPr>
+                <w:lang w:val="en-AE"/>
+              </w:rPr>
+              <w:t>Currency, date, source, and approval for use</w:t>
+            </w:r>
+          </w:p>
+        </w:tc>
+      </w:tr>
+      <w:tr>
+        <w:trPr>
+          <w:jc w:val="center"/>
+        </w:trPr>
+        <w:tc>
+          <w:tcPr>
+            <w:tcW w:w="0" w:type="auto"/>
+            <w:tcBorders>
+              <w:top w:val="single" w:sz="6" w:space="0" w:color="D9D9D9"/>
+              <w:left w:val="single" w:sz="6" w:space="0" w:color="D9D9D9"/>
+              <w:bottom w:val="single" w:sz="6" w:space="0" w:color="D9D9D9"/>
+              <w:right w:val="single" w:sz="6" w:space="0" w:color="D9D9D9"/>
+            </w:tcBorders>
+            <w:shd w:val="clear" w:color="auto" w:fill="EAF2F8"/>
+            <w:tcMar>
+              <w:top w:w="95" w:type="dxa"/>
+              <w:left w:w="115" w:type="dxa"/>
+              <w:bottom w:w="95" w:type="dxa"/>
+              <w:right w:w="115" w:type="dxa"/>
+            </w:tcMar>
+            <w:vAlign w:val="center"/>
+            <w:hideMark/>
+          </w:tcPr>
+          <w:p>
+            <w:pPr>
+              <w:rPr>
+                <w:lang w:val="en-AE"/>
+              </w:rPr>
+            </w:pPr>
+            <w:r>
+              <w:rPr>
+                <w:lang w:val="en-AE"/>
+              </w:rPr>
+              <w:t>Sustainability factors</w:t>
+            </w:r>
+          </w:p>
+        </w:tc>
+        <w:tc>
+          <w:tcPr>
+            <w:tcW w:w="0" w:type="auto"/>
+            <w:tcBorders>
+              <w:top w:val="single" w:sz="6" w:space="0" w:color="D9D9D9"/>
+              <w:left w:val="single" w:sz="6" w:space="0" w:color="D9D9D9"/>
+              <w:bottom w:val="single" w:sz="6" w:space="0" w:color="D9D9D9"/>
+              <w:right w:val="single" w:sz="6" w:space="0" w:color="D9D9D9"/>
+            </w:tcBorders>
+            <w:shd w:val="clear" w:color="auto" w:fill="EAF2F8"/>
+            <w:tcMar>
+              <w:top w:w="95" w:type="dxa"/>
+              <w:left w:w="115" w:type="dxa"/>
+              <w:bottom w:w="95" w:type="dxa"/>
+              <w:right w:w="115" w:type="dxa"/>
+            </w:tcMar>
+            <w:vAlign w:val="center"/>
+            <w:hideMark/>
+          </w:tcPr>
+          <w:p>
+            <w:pPr>
+              <w:rPr>
+                <w:lang w:val="en-AE"/>
+              </w:rPr>
+            </w:pPr>
+            <w:r>
+              <w:rPr>
+                <w:lang w:val="en-AE"/>
+              </w:rPr>
+              <w:t>Methodology dependent</w:t>
+            </w:r>
+          </w:p>
+        </w:tc>
+        <w:tc>
+          <w:tcPr>
+            <w:tcW w:w="0" w:type="auto"/>
+            <w:tcBorders>
+              <w:top w:val="single" w:sz="6" w:space="0" w:color="D9D9D9"/>
+              <w:left w:val="single" w:sz="6" w:space="0" w:color="D9D9D9"/>
+              <w:bottom w:val="single" w:sz="6" w:space="0" w:color="D9D9D9"/>
+              <w:right w:val="single" w:sz="6" w:space="0" w:color="D9D9D9"/>
+            </w:tcBorders>
+            <w:shd w:val="clear" w:color="auto" w:fill="EAF2F8"/>
+            <w:tcMar>
+              <w:top w:w="95" w:type="dxa"/>
+              <w:left w:w="115" w:type="dxa"/>
+              <w:bottom w:w="95" w:type="dxa"/>
+              <w:right w:w="115" w:type="dxa"/>
+            </w:tcMar>
+            <w:vAlign w:val="center"/>
+            <w:hideMark/>
+          </w:tcPr>
+          <w:p>
+            <w:pPr>
+              <w:rPr>
+                <w:lang w:val="en-AE"/>
+              </w:rPr>
+            </w:pPr>
+            <w:r>
+              <w:rPr>
+                <w:lang w:val="en-AE"/>
+              </w:rPr>
+              <w:t>Use documented sample factors with uncertainty labels</w:t>
+            </w:r>
+          </w:p>
+        </w:tc>
+        <w:tc>
+          <w:tcPr>
+            <w:tcW w:w="0" w:type="auto"/>
+            <w:tcBorders>
+              <w:top w:val="single" w:sz="6" w:space="0" w:color="D9D9D9"/>
+              <w:left w:val="single" w:sz="6" w:space="0" w:color="D9D9D9"/>
+              <w:bottom w:val="single" w:sz="6" w:space="0" w:color="D9D9D9"/>
+              <w:right w:val="single" w:sz="6" w:space="0" w:color="D9D9D9"/>
+            </w:tcBorders>
+            <w:shd w:val="clear" w:color="auto" w:fill="EAF2F8"/>
+            <w:tcMar>
+              <w:top w:w="95" w:type="dxa"/>
+              <w:left w:w="115" w:type="dxa"/>
+              <w:bottom w:w="95" w:type="dxa"/>
+              <w:right w:w="115" w:type="dxa"/>
+            </w:tcMar>
+            <w:vAlign w:val="center"/>
+            <w:hideMark/>
+          </w:tcPr>
+          <w:p>
+            <w:pPr>
+              <w:rPr>
+                <w:lang w:val="en-AE"/>
+              </w:rPr>
+            </w:pPr>
+            <w:r>
+              <w:rPr>
+                <w:lang w:val="en-AE"/>
+              </w:rPr>
+              <w:t>Unit, source, boundary, version, and calculation trace</w:t>
+            </w:r>
+          </w:p>
+        </w:tc>
+      </w:tr>
+      <w:tr>
+        <w:trPr>
+          <w:jc w:val="center"/>
+        </w:trPr>
+        <w:tc>
+          <w:tcPr>
+            <w:tcW w:w="0" w:type="auto"/>
+            <w:tcBorders>
+              <w:top w:val="single" w:sz="6" w:space="0" w:color="D9D9D9"/>
+              <w:left w:val="single" w:sz="6" w:space="0" w:color="D9D9D9"/>
+              <w:bottom w:val="single" w:sz="6" w:space="0" w:color="D9D9D9"/>
+              <w:right w:val="single" w:sz="6" w:space="0" w:color="D9D9D9"/>
+            </w:tcBorders>
+            <w:tcMar>
+              <w:top w:w="95" w:type="dxa"/>
+              <w:left w:w="115" w:type="dxa"/>
+              <w:bottom w:w="95" w:type="dxa"/>
+              <w:right w:w="115" w:type="dxa"/>
+            </w:tcMar>
+            <w:vAlign w:val="center"/>
+            <w:hideMark/>
+          </w:tcPr>
+          <w:p>
+            <w:pPr>
+              <w:rPr>
+                <w:lang w:val="en-AE"/>
+              </w:rPr>
+            </w:pPr>
+            <w:r>
+              <w:rPr>
+                <w:lang w:val="en-AE"/>
+              </w:rPr>
+              <w:t>Images and documents</w:t>
+            </w:r>
+          </w:p>
+        </w:tc>
+        <w:tc>
+          <w:tcPr>
+            <w:tcW w:w="0" w:type="auto"/>
+            <w:tcBorders>
+              <w:top w:val="single" w:sz="6" w:space="0" w:color="D9D9D9"/>
+              <w:left w:val="single" w:sz="6" w:space="0" w:color="D9D9D9"/>
+              <w:bottom w:val="single" w:sz="6" w:space="0" w:color="D9D9D9"/>
+              <w:right w:val="single" w:sz="6" w:space="0" w:color="D9D9D9"/>
+            </w:tcBorders>
+            <w:tcMar>
+              <w:top w:w="95" w:type="dxa"/>
+              <w:left w:w="115" w:type="dxa"/>
+              <w:bottom w:w="95" w:type="dxa"/>
+              <w:right w:w="115" w:type="dxa"/>
+            </w:tcMar>
+            <w:vAlign w:val="center"/>
+            <w:hideMark/>
+          </w:tcPr>
+          <w:p>
+            <w:pPr>
+              <w:rPr>
+                <w:lang w:val="en-AE"/>
+              </w:rPr>
+            </w:pPr>
+            <w:r>
+              <w:rPr>
+                <w:lang w:val="en-AE"/>
+              </w:rPr>
+              <w:t>Potential privacy and copyright limits</w:t>
+            </w:r>
+          </w:p>
+        </w:tc>
+        <w:tc>
+          <w:tcPr>
+            <w:tcW w:w="0" w:type="auto"/>
+            <w:tcBorders>
+              <w:top w:val="single" w:sz="6" w:space="0" w:color="D9D9D9"/>
+              <w:left w:val="single" w:sz="6" w:space="0" w:color="D9D9D9"/>
+              <w:bottom w:val="single" w:sz="6" w:space="0" w:color="D9D9D9"/>
+              <w:right w:val="single" w:sz="6" w:space="0" w:color="D9D9D9"/>
+            </w:tcBorders>
+            <w:tcMar>
+              <w:top w:w="95" w:type="dxa"/>
+              <w:left w:w="115" w:type="dxa"/>
+              <w:bottom w:w="95" w:type="dxa"/>
+              <w:right w:w="115" w:type="dxa"/>
+            </w:tcMar>
+            <w:vAlign w:val="center"/>
+            <w:hideMark/>
+          </w:tcPr>
+          <w:p>
+            <w:pPr>
+              <w:rPr>
+                <w:lang w:val="en-AE"/>
+              </w:rPr>
+            </w:pPr>
+            <w:r>
+              <w:rPr>
+                <w:lang w:val="en-AE"/>
+              </w:rPr>
+              <w:t>Use team-created or approved sample files</w:t>
+            </w:r>
+          </w:p>
+        </w:tc>
+        <w:tc>
+          <w:tcPr>
+            <w:tcW w:w="0" w:type="auto"/>
+            <w:tcBorders>
+              <w:top w:val="single" w:sz="6" w:space="0" w:color="D9D9D9"/>
+              <w:left w:val="single" w:sz="6" w:space="0" w:color="D9D9D9"/>
+              <w:bottom w:val="single" w:sz="6" w:space="0" w:color="D9D9D9"/>
+              <w:right w:val="single" w:sz="6" w:space="0" w:color="D9D9D9"/>
+            </w:tcBorders>
+            <w:tcMar>
+              <w:top w:w="95" w:type="dxa"/>
+              <w:left w:w="115" w:type="dxa"/>
+              <w:bottom w:w="95" w:type="dxa"/>
+              <w:right w:w="115" w:type="dxa"/>
+            </w:tcMar>
+            <w:vAlign w:val="center"/>
+            <w:hideMark/>
+          </w:tcPr>
+          <w:p>
+            <w:pPr>
+              <w:rPr>
+                <w:lang w:val="en-AE"/>
+              </w:rPr>
+            </w:pPr>
+            <w:r>
+              <w:rPr>
+                <w:lang w:val="en-AE"/>
+              </w:rPr>
+              <w:t>File type, malware screening, ownership, retention</w:t>
+            </w:r>
+          </w:p>
+        </w:tc>
+      </w:tr>
+    </w:tbl>
+    <w:p>
+      <w:pPr>
+        <w:rPr>
+          <w:lang w:val="en-AE"/>
+        </w:rPr>
+      </w:pPr>
+    </w:p>
+    <w:p>
+      <w:pPr>
+        <w:rPr>
+          <w:b/>
+          <w:bCs/>
+          <w:lang w:val="en-AE"/>
+        </w:rPr>
+      </w:pPr>
+      <w:r>
+        <w:rPr>
+          <w:b/>
+          <w:bCs/>
+          <w:lang w:val="en-AE"/>
+        </w:rPr>
+        <w:t>5 2 AI Assisted Classification</w:t>
+      </w:r>
+    </w:p>
+    <w:p>
+      <w:pPr>
+        <w:rPr>
+          <w:lang w:val="en-AE"/>
+        </w:rPr>
+      </w:pPr>
+      <w:r>
+        <w:rPr>
+          <w:lang w:val="en-AE"/>
+        </w:rPr>
+        <w:t xml:space="preserve">Classification can work well as a help tool. A person can type an asset title, description, specifications. Optionally add a picture. The AI service might propose a Classification, subcategory, material tag or a missing field. The interface should display the Classification suggestion of quietly changing the person’s own input. To judge the AI use a </w:t>
+      </w:r>
+      <w:proofErr w:type="spellStart"/>
+      <w:r>
+        <w:rPr>
+          <w:lang w:val="en-AE"/>
+        </w:rPr>
+        <w:t>labeled</w:t>
+      </w:r>
+      <w:proofErr w:type="spellEnd"/>
+      <w:r>
+        <w:rPr>
+          <w:lang w:val="en-AE"/>
+        </w:rPr>
+        <w:t xml:space="preserve"> test set that the model did not see during creation. The team can track Classification accuracy, top</w:t>
+      </w:r>
+      <w:r>
+        <w:rPr>
+          <w:rFonts w:ascii="Cambria Math" w:hAnsi="Cambria Math" w:cs="Cambria Math"/>
+          <w:lang w:val="en-AE"/>
+        </w:rPr>
+        <w:t>‑</w:t>
+      </w:r>
+      <w:r>
+        <w:rPr>
+          <w:lang w:val="en-AE"/>
+        </w:rPr>
+        <w:t>k accuracy, invalid Classification rate and the share of Classification proposals that people accept or change.</w:t>
+      </w:r>
+    </w:p>
+    <w:p>
+      <w:pPr>
+        <w:rPr>
+          <w:b/>
+          <w:bCs/>
+          <w:lang w:val="en-AE"/>
+        </w:rPr>
+      </w:pPr>
+      <w:r>
+        <w:rPr>
+          <w:b/>
+          <w:bCs/>
+          <w:lang w:val="en-AE"/>
+        </w:rPr>
+        <w:t>5 3 Semantic Matching and Ranking</w:t>
+      </w:r>
+    </w:p>
+    <w:p>
+      <w:pPr>
+        <w:rPr>
+          <w:lang w:val="en-AE"/>
+        </w:rPr>
+      </w:pPr>
+      <w:r>
+        <w:rPr>
+          <w:lang w:val="en-AE"/>
+        </w:rPr>
+        <w:t>Semantic Matching gives the AI help because a person asking for something may describe it in a different way than the owner of the item. An embedding model can find items that have a meaning then simple rules can drop items that are not available or that have not enough quantity. A clear Ranking formula can mix Semantic Matching similarity with condition, location, urgency, required date transfer cost and repair need. The Ranking formula and its weights should be saved by version so the team can explain why one Semantic Matching candidate comes before another. The team should check match relevance with a set of requests and candidate items that experts have reviewed. Good checks include how many of the Ranking results are correct whether at least one suitable item is in the top five the average relevance from reviewers, how useful the explanation is and the override rate. A small sample cannot prove that the Semantic Matching model is fair or accurate for all campus items. The evaluation must say its sample size and the categories used.</w:t>
+      </w:r>
+    </w:p>
+    <w:p>
+      <w:pPr>
+        <w:rPr>
+          <w:b/>
+          <w:bCs/>
+          <w:lang w:val="en-AE"/>
+        </w:rPr>
+      </w:pPr>
+      <w:r>
+        <w:rPr>
+          <w:b/>
+          <w:bCs/>
+          <w:lang w:val="en-AE"/>
+        </w:rPr>
+        <w:t>5 4 Sustainable Action Recommendations</w:t>
+      </w:r>
+    </w:p>
+    <w:p>
+      <w:pPr>
+        <w:rPr>
+          <w:lang w:val="en-AE"/>
+        </w:rPr>
+      </w:pPr>
+      <w:r>
+        <w:rPr>
+          <w:lang w:val="en-AE"/>
+        </w:rPr>
+        <w:t>Recommendations about repair, transfer, donation, recycling or disposal can change safety, ownership and cost. The prototype should use decision rules for hard limits, such as unavailable status, required inspection, hazardous material handling or missing approval. AI can sum up the factors and rank the allowed options but a user, with permission must make the final choice. Disposal must stay a controlled step and must never happen just because a language model gave a convincing explanation.</w:t>
+      </w:r>
+    </w:p>
+    <w:p>
+      <w:pPr>
+        <w:rPr>
+          <w:b/>
+          <w:bCs/>
+          <w:lang w:val="en-AE"/>
+        </w:rPr>
+      </w:pPr>
+      <w:r>
+        <w:rPr>
+          <w:b/>
+          <w:bCs/>
+          <w:lang w:val="en-AE"/>
+        </w:rPr>
+        <w:t>5 5 LLM Assistant and Generated Reports</w:t>
+      </w:r>
+    </w:p>
+    <w:p>
+      <w:pPr>
+        <w:rPr>
+          <w:lang w:val="en-AE"/>
+        </w:rPr>
+      </w:pPr>
+      <w:r>
+        <w:rPr>
+          <w:lang w:val="en-AE"/>
+        </w:rPr>
+        <w:t>LLM Assistant can work if it only pulls records that the user is allowed to view. The LLM Assistant may help people search explain a status draft a request or find a policy page. It should not carry out transfers approve disposal change ownership or expose departments’ restricted data. Generated Reports should start from verified totals made by database queries. The model can rewrite those totals into text but the Generated Report must show the raw numbers and point out any uncertain estimates</w:t>
+      </w:r>
+    </w:p>
+    <w:p>
+      <w:pPr>
+        <w:rPr>
+          <w:b/>
+          <w:bCs/>
+          <w:lang w:val="en-AE"/>
+        </w:rPr>
+      </w:pPr>
+      <w:r>
+        <w:rPr>
+          <w:b/>
+          <w:bCs/>
+          <w:lang w:val="en-AE"/>
+        </w:rPr>
+        <w:t>.</w:t>
+      </w:r>
+      <w:r>
+        <w:rPr>
+          <w:b/>
+          <w:bCs/>
+          <w:lang w:val="en-AE"/>
+        </w:rPr>
+        <w:t>5 6 AI Failure and Fallback</w:t>
+      </w:r>
+    </w:p>
+    <w:p>
+      <w:pPr>
+        <w:numPr>
+          <w:ilvl w:val="0"/>
+          <w:numId w:val="10"/>
+        </w:numPr>
+        <w:rPr>
+          <w:lang w:val="en-AE"/>
+        </w:rPr>
+      </w:pPr>
+      <w:r>
+        <w:rPr>
+          <w:lang w:val="en-AE"/>
+        </w:rPr>
+        <w:t>If classification fails, users select a category and tags manually.</w:t>
+      </w:r>
+    </w:p>
+    <w:p>
+      <w:pPr>
+        <w:numPr>
+          <w:ilvl w:val="0"/>
+          <w:numId w:val="10"/>
+        </w:numPr>
+        <w:rPr>
+          <w:lang w:val="en-AE"/>
+        </w:rPr>
+      </w:pPr>
+      <w:r>
+        <w:rPr>
+          <w:lang w:val="en-AE"/>
+        </w:rPr>
+        <w:t>If semantic search fails, exact keyword, category, condition, department, location, and status filters remain available.</w:t>
+      </w:r>
+    </w:p>
+    <w:p>
+      <w:pPr>
+        <w:numPr>
+          <w:ilvl w:val="0"/>
+          <w:numId w:val="10"/>
+        </w:numPr>
+        <w:rPr>
+          <w:lang w:val="en-AE"/>
+        </w:rPr>
+      </w:pPr>
+      <w:r>
+        <w:rPr>
+          <w:lang w:val="en-AE"/>
+        </w:rPr>
+        <w:t>If the model returns low confidence, the system labels the result for review and does not treat it as a completed decision.</w:t>
+      </w:r>
+    </w:p>
+    <w:p>
+      <w:pPr>
+        <w:numPr>
+          <w:ilvl w:val="0"/>
+          <w:numId w:val="10"/>
+        </w:numPr>
+        <w:rPr>
+          <w:lang w:val="en-AE"/>
+        </w:rPr>
+      </w:pPr>
+      <w:r>
+        <w:rPr>
+          <w:lang w:val="en-AE"/>
+        </w:rPr>
+        <w:t>If an external service is unavailable, the application records the failure without losing the asset or request transaction.</w:t>
+      </w:r>
+    </w:p>
+    <w:p>
+      <w:pPr>
+        <w:numPr>
+          <w:ilvl w:val="0"/>
+          <w:numId w:val="10"/>
+        </w:numPr>
+        <w:rPr>
+          <w:lang w:val="en-AE"/>
+        </w:rPr>
+      </w:pPr>
+      <w:r>
+        <w:rPr>
+          <w:lang w:val="en-AE"/>
+        </w:rPr>
+        <w:t>If generated text conflicts with calculated data, the calculated totals and source records take priority.</w:t>
+      </w:r>
+    </w:p>
+    <w:p>
+      <w:pPr>
+        <w:rPr>
+          <w:b/>
+          <w:bCs/>
+          <w:lang w:val="en-AE"/>
+        </w:rPr>
+      </w:pPr>
+      <w:r>
+        <w:rPr>
+          <w:b/>
+          <w:bCs/>
+          <w:lang w:val="en-AE"/>
+        </w:rPr>
+        <w:t>6 Financial Feasibility</w:t>
+      </w:r>
+    </w:p>
+    <w:p>
+      <w:pPr>
+        <w:rPr>
+          <w:lang w:val="en-AE"/>
+        </w:rPr>
+      </w:pPr>
+      <w:r>
+        <w:rPr>
+          <w:lang w:val="en-AE"/>
+        </w:rPr>
+        <w:t xml:space="preserve">Financial feasibility is acceptable, for a student prototype. Phase 1 already identified the resources as the two team members, personal or university computers, Git and GitHub development tools, a database, </w:t>
+      </w:r>
+      <w:proofErr w:type="spellStart"/>
+      <w:r>
+        <w:rPr>
+          <w:lang w:val="en-AE"/>
+        </w:rPr>
+        <w:t>modeling</w:t>
+      </w:r>
+      <w:proofErr w:type="spellEnd"/>
+      <w:r>
+        <w:rPr>
+          <w:lang w:val="en-AE"/>
+        </w:rPr>
+        <w:t xml:space="preserve"> tools, testing tools and AI libraries or services. Most can be used without payment. The main uncertain costs are hosting external AI calls, file storage, backups and any future integration or security work.</w:t>
+      </w:r>
+    </w:p>
+    <w:p>
+      <w:pPr>
+        <w:rPr>
+          <w:b/>
+          <w:bCs/>
+          <w:lang w:val="en-AE"/>
+        </w:rPr>
+      </w:pPr>
+      <w:r>
+        <w:rPr>
+          <w:b/>
+          <w:bCs/>
+          <w:lang w:val="en-AE"/>
+        </w:rPr>
+        <w:t>6 1 Prototype Cost Assumptions</w:t>
+      </w:r>
+    </w:p>
+    <w:p>
+      <w:pPr>
+        <w:rPr>
+          <w:lang w:val="en-AE"/>
+        </w:rPr>
+      </w:pPr>
+      <w:r>
+        <w:rPr>
+          <w:b/>
+          <w:bCs/>
+          <w:lang w:val="en-AE"/>
+        </w:rPr>
+        <w:t>Table 6 Illustrative Direct Cost Range for the Course Prototype</w:t>
+      </w:r>
+    </w:p>
+    <w:tbl>
+      <w:tblPr>
+        <w:tblW w:w="0" w:type="auto"/>
+        <w:jc w:val="center"/>
+        <w:tblCellMar>
+          <w:top w:w="15" w:type="dxa"/>
+          <w:left w:w="15" w:type="dxa"/>
+          <w:bottom w:w="15" w:type="dxa"/>
+          <w:right w:w="15" w:type="dxa"/>
+        </w:tblCellMar>
+        <w:tblLook w:val="04A0" w:firstRow="1" w:lastRow="0" w:firstColumn="1" w:lastColumn="0" w:noHBand="0" w:noVBand="1"/>
+      </w:tblPr>
+      <w:tblGrid>
+        <w:gridCol w:w="2767"/>
+        <w:gridCol w:w="2024"/>
+        <w:gridCol w:w="5071"/>
+      </w:tblGrid>
+      <w:tr>
+        <w:trPr>
+          <w:tblHeader/>
+          <w:jc w:val="center"/>
+        </w:trPr>
+        <w:tc>
+          <w:tcPr>
+            <w:tcW w:w="0" w:type="auto"/>
+            <w:tcBorders>
+              <w:top w:val="single" w:sz="6" w:space="0" w:color="D9D9D9"/>
+              <w:left w:val="single" w:sz="6" w:space="0" w:color="D9D9D9"/>
+              <w:bottom w:val="single" w:sz="6" w:space="0" w:color="D9D9D9"/>
+              <w:right w:val="single" w:sz="6" w:space="0" w:color="D9D9D9"/>
+            </w:tcBorders>
+            <w:shd w:val="clear" w:color="auto" w:fill="17365D"/>
+            <w:tcMar>
+              <w:top w:w="105" w:type="dxa"/>
+              <w:left w:w="115" w:type="dxa"/>
+              <w:bottom w:w="105" w:type="dxa"/>
+              <w:right w:w="115" w:type="dxa"/>
+            </w:tcMar>
+            <w:vAlign w:val="center"/>
+            <w:hideMark/>
+          </w:tcPr>
+          <w:p>
+            <w:pPr>
+              <w:rPr>
+                <w:b/>
+                <w:bCs/>
+                <w:lang w:val="en-AE"/>
+              </w:rPr>
+            </w:pPr>
+            <w:r>
+              <w:rPr>
+                <w:b/>
+                <w:bCs/>
+                <w:lang w:val="en-AE"/>
+              </w:rPr>
+              <w:t>Cost Area</w:t>
+            </w:r>
+          </w:p>
+        </w:tc>
+        <w:tc>
+          <w:tcPr>
+            <w:tcW w:w="0" w:type="auto"/>
+            <w:tcBorders>
+              <w:top w:val="single" w:sz="6" w:space="0" w:color="D9D9D9"/>
+              <w:left w:val="single" w:sz="6" w:space="0" w:color="D9D9D9"/>
+              <w:bottom w:val="single" w:sz="6" w:space="0" w:color="D9D9D9"/>
+              <w:right w:val="single" w:sz="6" w:space="0" w:color="D9D9D9"/>
+            </w:tcBorders>
+            <w:shd w:val="clear" w:color="auto" w:fill="17365D"/>
+            <w:tcMar>
+              <w:top w:w="105" w:type="dxa"/>
+              <w:left w:w="115" w:type="dxa"/>
+              <w:bottom w:w="105" w:type="dxa"/>
+              <w:right w:w="115" w:type="dxa"/>
+            </w:tcMar>
+            <w:vAlign w:val="center"/>
+            <w:hideMark/>
+          </w:tcPr>
+          <w:p>
+            <w:pPr>
+              <w:rPr>
+                <w:b/>
+                <w:bCs/>
+                <w:lang w:val="en-AE"/>
+              </w:rPr>
+            </w:pPr>
+            <w:r>
+              <w:rPr>
+                <w:b/>
+                <w:bCs/>
+                <w:lang w:val="en-AE"/>
+              </w:rPr>
+              <w:t>Planning Range in AED</w:t>
+            </w:r>
+          </w:p>
+        </w:tc>
+        <w:tc>
+          <w:tcPr>
+            <w:tcW w:w="0" w:type="auto"/>
+            <w:tcBorders>
+              <w:top w:val="single" w:sz="6" w:space="0" w:color="D9D9D9"/>
+              <w:left w:val="single" w:sz="6" w:space="0" w:color="D9D9D9"/>
+              <w:bottom w:val="single" w:sz="6" w:space="0" w:color="D9D9D9"/>
+              <w:right w:val="single" w:sz="6" w:space="0" w:color="D9D9D9"/>
+            </w:tcBorders>
+            <w:shd w:val="clear" w:color="auto" w:fill="17365D"/>
+            <w:tcMar>
+              <w:top w:w="105" w:type="dxa"/>
+              <w:left w:w="115" w:type="dxa"/>
+              <w:bottom w:w="105" w:type="dxa"/>
+              <w:right w:w="115" w:type="dxa"/>
+            </w:tcMar>
+            <w:vAlign w:val="center"/>
+            <w:hideMark/>
+          </w:tcPr>
+          <w:p>
+            <w:pPr>
+              <w:rPr>
+                <w:b/>
+                <w:bCs/>
+                <w:lang w:val="en-AE"/>
+              </w:rPr>
+            </w:pPr>
+            <w:r>
+              <w:rPr>
+                <w:b/>
+                <w:bCs/>
+                <w:lang w:val="en-AE"/>
+              </w:rPr>
+              <w:t>Basis and Control</w:t>
+            </w:r>
+          </w:p>
+        </w:tc>
+      </w:tr>
+      <w:tr>
+        <w:trPr>
+          <w:jc w:val="center"/>
+        </w:trPr>
+        <w:tc>
+          <w:tcPr>
+            <w:tcW w:w="0" w:type="auto"/>
+            <w:tcBorders>
+              <w:top w:val="single" w:sz="6" w:space="0" w:color="D9D9D9"/>
+              <w:left w:val="single" w:sz="6" w:space="0" w:color="D9D9D9"/>
+              <w:bottom w:val="single" w:sz="6" w:space="0" w:color="D9D9D9"/>
+              <w:right w:val="single" w:sz="6" w:space="0" w:color="D9D9D9"/>
+            </w:tcBorders>
+            <w:tcMar>
+              <w:top w:w="95" w:type="dxa"/>
+              <w:left w:w="115" w:type="dxa"/>
+              <w:bottom w:w="95" w:type="dxa"/>
+              <w:right w:w="115" w:type="dxa"/>
+            </w:tcMar>
+            <w:vAlign w:val="center"/>
+            <w:hideMark/>
+          </w:tcPr>
+          <w:p>
+            <w:pPr>
+              <w:rPr>
+                <w:lang w:val="en-AE"/>
+              </w:rPr>
+            </w:pPr>
+            <w:r>
+              <w:rPr>
+                <w:lang w:val="en-AE"/>
+              </w:rPr>
+              <w:t>Source control and collaboration</w:t>
+            </w:r>
+          </w:p>
+        </w:tc>
+        <w:tc>
+          <w:tcPr>
+            <w:tcW w:w="0" w:type="auto"/>
+            <w:tcBorders>
+              <w:top w:val="single" w:sz="6" w:space="0" w:color="D9D9D9"/>
+              <w:left w:val="single" w:sz="6" w:space="0" w:color="D9D9D9"/>
+              <w:bottom w:val="single" w:sz="6" w:space="0" w:color="D9D9D9"/>
+              <w:right w:val="single" w:sz="6" w:space="0" w:color="D9D9D9"/>
+            </w:tcBorders>
+            <w:tcMar>
+              <w:top w:w="95" w:type="dxa"/>
+              <w:left w:w="115" w:type="dxa"/>
+              <w:bottom w:w="95" w:type="dxa"/>
+              <w:right w:w="115" w:type="dxa"/>
+            </w:tcMar>
+            <w:vAlign w:val="center"/>
+            <w:hideMark/>
+          </w:tcPr>
+          <w:p>
+            <w:pPr>
+              <w:rPr>
+                <w:lang w:val="en-AE"/>
+              </w:rPr>
+            </w:pPr>
+            <w:r>
+              <w:rPr>
+                <w:lang w:val="en-AE"/>
+              </w:rPr>
+              <w:t>0</w:t>
+            </w:r>
+          </w:p>
+        </w:tc>
+        <w:tc>
+          <w:tcPr>
+            <w:tcW w:w="0" w:type="auto"/>
+            <w:tcBorders>
+              <w:top w:val="single" w:sz="6" w:space="0" w:color="D9D9D9"/>
+              <w:left w:val="single" w:sz="6" w:space="0" w:color="D9D9D9"/>
+              <w:bottom w:val="single" w:sz="6" w:space="0" w:color="D9D9D9"/>
+              <w:right w:val="single" w:sz="6" w:space="0" w:color="D9D9D9"/>
+            </w:tcBorders>
+            <w:tcMar>
+              <w:top w:w="95" w:type="dxa"/>
+              <w:left w:w="115" w:type="dxa"/>
+              <w:bottom w:w="95" w:type="dxa"/>
+              <w:right w:w="115" w:type="dxa"/>
+            </w:tcMar>
+            <w:vAlign w:val="center"/>
+            <w:hideMark/>
+          </w:tcPr>
+          <w:p>
+            <w:pPr>
+              <w:rPr>
+                <w:lang w:val="en-AE"/>
+              </w:rPr>
+            </w:pPr>
+            <w:r>
+              <w:rPr>
+                <w:lang w:val="en-AE"/>
+              </w:rPr>
+              <w:t>Use Git and GitHub within available educational or free access</w:t>
+            </w:r>
+          </w:p>
+        </w:tc>
+      </w:tr>
+      <w:tr>
+        <w:trPr>
+          <w:jc w:val="center"/>
+        </w:trPr>
+        <w:tc>
+          <w:tcPr>
+            <w:tcW w:w="0" w:type="auto"/>
+            <w:tcBorders>
+              <w:top w:val="single" w:sz="6" w:space="0" w:color="D9D9D9"/>
+              <w:left w:val="single" w:sz="6" w:space="0" w:color="D9D9D9"/>
+              <w:bottom w:val="single" w:sz="6" w:space="0" w:color="D9D9D9"/>
+              <w:right w:val="single" w:sz="6" w:space="0" w:color="D9D9D9"/>
+            </w:tcBorders>
+            <w:shd w:val="clear" w:color="auto" w:fill="EAF2F8"/>
+            <w:tcMar>
+              <w:top w:w="95" w:type="dxa"/>
+              <w:left w:w="115" w:type="dxa"/>
+              <w:bottom w:w="95" w:type="dxa"/>
+              <w:right w:w="115" w:type="dxa"/>
+            </w:tcMar>
+            <w:vAlign w:val="center"/>
+            <w:hideMark/>
+          </w:tcPr>
+          <w:p>
+            <w:pPr>
+              <w:rPr>
+                <w:lang w:val="en-AE"/>
+              </w:rPr>
+            </w:pPr>
+            <w:r>
+              <w:rPr>
+                <w:lang w:val="en-AE"/>
+              </w:rPr>
+              <w:t xml:space="preserve">Development and </w:t>
+            </w:r>
+            <w:proofErr w:type="spellStart"/>
+            <w:r>
+              <w:rPr>
+                <w:lang w:val="en-AE"/>
+              </w:rPr>
+              <w:t>modeling</w:t>
+            </w:r>
+            <w:proofErr w:type="spellEnd"/>
+            <w:r>
+              <w:rPr>
+                <w:lang w:val="en-AE"/>
+              </w:rPr>
+              <w:t xml:space="preserve"> tools</w:t>
+            </w:r>
+          </w:p>
+        </w:tc>
+        <w:tc>
+          <w:tcPr>
+            <w:tcW w:w="0" w:type="auto"/>
+            <w:tcBorders>
+              <w:top w:val="single" w:sz="6" w:space="0" w:color="D9D9D9"/>
+              <w:left w:val="single" w:sz="6" w:space="0" w:color="D9D9D9"/>
+              <w:bottom w:val="single" w:sz="6" w:space="0" w:color="D9D9D9"/>
+              <w:right w:val="single" w:sz="6" w:space="0" w:color="D9D9D9"/>
+            </w:tcBorders>
+            <w:shd w:val="clear" w:color="auto" w:fill="EAF2F8"/>
+            <w:tcMar>
+              <w:top w:w="95" w:type="dxa"/>
+              <w:left w:w="115" w:type="dxa"/>
+              <w:bottom w:w="95" w:type="dxa"/>
+              <w:right w:w="115" w:type="dxa"/>
+            </w:tcMar>
+            <w:vAlign w:val="center"/>
+            <w:hideMark/>
+          </w:tcPr>
+          <w:p>
+            <w:pPr>
+              <w:rPr>
+                <w:lang w:val="en-AE"/>
+              </w:rPr>
+            </w:pPr>
+            <w:r>
+              <w:rPr>
+                <w:lang w:val="en-AE"/>
+              </w:rPr>
+              <w:t>0 to 500</w:t>
+            </w:r>
+          </w:p>
+        </w:tc>
+        <w:tc>
+          <w:tcPr>
+            <w:tcW w:w="0" w:type="auto"/>
+            <w:tcBorders>
+              <w:top w:val="single" w:sz="6" w:space="0" w:color="D9D9D9"/>
+              <w:left w:val="single" w:sz="6" w:space="0" w:color="D9D9D9"/>
+              <w:bottom w:val="single" w:sz="6" w:space="0" w:color="D9D9D9"/>
+              <w:right w:val="single" w:sz="6" w:space="0" w:color="D9D9D9"/>
+            </w:tcBorders>
+            <w:shd w:val="clear" w:color="auto" w:fill="EAF2F8"/>
+            <w:tcMar>
+              <w:top w:w="95" w:type="dxa"/>
+              <w:left w:w="115" w:type="dxa"/>
+              <w:bottom w:w="95" w:type="dxa"/>
+              <w:right w:w="115" w:type="dxa"/>
+            </w:tcMar>
+            <w:vAlign w:val="center"/>
+            <w:hideMark/>
+          </w:tcPr>
+          <w:p>
+            <w:pPr>
+              <w:rPr>
+                <w:lang w:val="en-AE"/>
+              </w:rPr>
+            </w:pPr>
+            <w:r>
+              <w:rPr>
+                <w:lang w:val="en-AE"/>
+              </w:rPr>
+              <w:t>Prefer open source or university-provided tools</w:t>
+            </w:r>
+          </w:p>
+        </w:tc>
+      </w:tr>
+      <w:tr>
+        <w:trPr>
+          <w:jc w:val="center"/>
+        </w:trPr>
+        <w:tc>
+          <w:tcPr>
+            <w:tcW w:w="0" w:type="auto"/>
+            <w:tcBorders>
+              <w:top w:val="single" w:sz="6" w:space="0" w:color="D9D9D9"/>
+              <w:left w:val="single" w:sz="6" w:space="0" w:color="D9D9D9"/>
+              <w:bottom w:val="single" w:sz="6" w:space="0" w:color="D9D9D9"/>
+              <w:right w:val="single" w:sz="6" w:space="0" w:color="D9D9D9"/>
+            </w:tcBorders>
+            <w:tcMar>
+              <w:top w:w="95" w:type="dxa"/>
+              <w:left w:w="115" w:type="dxa"/>
+              <w:bottom w:w="95" w:type="dxa"/>
+              <w:right w:w="115" w:type="dxa"/>
+            </w:tcMar>
+            <w:vAlign w:val="center"/>
+            <w:hideMark/>
+          </w:tcPr>
+          <w:p>
+            <w:pPr>
+              <w:rPr>
+                <w:lang w:val="en-AE"/>
+              </w:rPr>
+            </w:pPr>
+            <w:r>
+              <w:rPr>
+                <w:lang w:val="en-AE"/>
+              </w:rPr>
+              <w:t>Database and local storage</w:t>
+            </w:r>
+          </w:p>
+        </w:tc>
+        <w:tc>
+          <w:tcPr>
+            <w:tcW w:w="0" w:type="auto"/>
+            <w:tcBorders>
+              <w:top w:val="single" w:sz="6" w:space="0" w:color="D9D9D9"/>
+              <w:left w:val="single" w:sz="6" w:space="0" w:color="D9D9D9"/>
+              <w:bottom w:val="single" w:sz="6" w:space="0" w:color="D9D9D9"/>
+              <w:right w:val="single" w:sz="6" w:space="0" w:color="D9D9D9"/>
+            </w:tcBorders>
+            <w:tcMar>
+              <w:top w:w="95" w:type="dxa"/>
+              <w:left w:w="115" w:type="dxa"/>
+              <w:bottom w:w="95" w:type="dxa"/>
+              <w:right w:w="115" w:type="dxa"/>
+            </w:tcMar>
+            <w:vAlign w:val="center"/>
+            <w:hideMark/>
+          </w:tcPr>
+          <w:p>
+            <w:pPr>
+              <w:rPr>
+                <w:lang w:val="en-AE"/>
+              </w:rPr>
+            </w:pPr>
+            <w:r>
+              <w:rPr>
+                <w:lang w:val="en-AE"/>
+              </w:rPr>
+              <w:t>0</w:t>
+            </w:r>
+          </w:p>
+        </w:tc>
+        <w:tc>
+          <w:tcPr>
+            <w:tcW w:w="0" w:type="auto"/>
+            <w:tcBorders>
+              <w:top w:val="single" w:sz="6" w:space="0" w:color="D9D9D9"/>
+              <w:left w:val="single" w:sz="6" w:space="0" w:color="D9D9D9"/>
+              <w:bottom w:val="single" w:sz="6" w:space="0" w:color="D9D9D9"/>
+              <w:right w:val="single" w:sz="6" w:space="0" w:color="D9D9D9"/>
+            </w:tcBorders>
+            <w:tcMar>
+              <w:top w:w="95" w:type="dxa"/>
+              <w:left w:w="115" w:type="dxa"/>
+              <w:bottom w:w="95" w:type="dxa"/>
+              <w:right w:w="115" w:type="dxa"/>
+            </w:tcMar>
+            <w:vAlign w:val="center"/>
+            <w:hideMark/>
+          </w:tcPr>
+          <w:p>
+            <w:pPr>
+              <w:rPr>
+                <w:lang w:val="en-AE"/>
+              </w:rPr>
+            </w:pPr>
+            <w:r>
+              <w:rPr>
+                <w:lang w:val="en-AE"/>
+              </w:rPr>
+              <w:t>Use local PostgreSQL or SQLite during development</w:t>
+            </w:r>
+          </w:p>
+        </w:tc>
+      </w:tr>
+      <w:tr>
+        <w:trPr>
+          <w:jc w:val="center"/>
+        </w:trPr>
+        <w:tc>
+          <w:tcPr>
+            <w:tcW w:w="0" w:type="auto"/>
+            <w:tcBorders>
+              <w:top w:val="single" w:sz="6" w:space="0" w:color="D9D9D9"/>
+              <w:left w:val="single" w:sz="6" w:space="0" w:color="D9D9D9"/>
+              <w:bottom w:val="single" w:sz="6" w:space="0" w:color="D9D9D9"/>
+              <w:right w:val="single" w:sz="6" w:space="0" w:color="D9D9D9"/>
+            </w:tcBorders>
+            <w:shd w:val="clear" w:color="auto" w:fill="EAF2F8"/>
+            <w:tcMar>
+              <w:top w:w="95" w:type="dxa"/>
+              <w:left w:w="115" w:type="dxa"/>
+              <w:bottom w:w="95" w:type="dxa"/>
+              <w:right w:w="115" w:type="dxa"/>
+            </w:tcMar>
+            <w:vAlign w:val="center"/>
+            <w:hideMark/>
+          </w:tcPr>
+          <w:p>
+            <w:pPr>
+              <w:rPr>
+                <w:lang w:val="en-AE"/>
+              </w:rPr>
+            </w:pPr>
+            <w:r>
+              <w:rPr>
+                <w:lang w:val="en-AE"/>
+              </w:rPr>
+              <w:t>Prototype hosting</w:t>
+            </w:r>
+          </w:p>
+        </w:tc>
+        <w:tc>
+          <w:tcPr>
+            <w:tcW w:w="0" w:type="auto"/>
+            <w:tcBorders>
+              <w:top w:val="single" w:sz="6" w:space="0" w:color="D9D9D9"/>
+              <w:left w:val="single" w:sz="6" w:space="0" w:color="D9D9D9"/>
+              <w:bottom w:val="single" w:sz="6" w:space="0" w:color="D9D9D9"/>
+              <w:right w:val="single" w:sz="6" w:space="0" w:color="D9D9D9"/>
+            </w:tcBorders>
+            <w:shd w:val="clear" w:color="auto" w:fill="EAF2F8"/>
+            <w:tcMar>
+              <w:top w:w="95" w:type="dxa"/>
+              <w:left w:w="115" w:type="dxa"/>
+              <w:bottom w:w="95" w:type="dxa"/>
+              <w:right w:w="115" w:type="dxa"/>
+            </w:tcMar>
+            <w:vAlign w:val="center"/>
+            <w:hideMark/>
+          </w:tcPr>
+          <w:p>
+            <w:pPr>
+              <w:rPr>
+                <w:lang w:val="en-AE"/>
+              </w:rPr>
+            </w:pPr>
+            <w:r>
+              <w:rPr>
+                <w:lang w:val="en-AE"/>
+              </w:rPr>
+              <w:t>0 to 1500</w:t>
+            </w:r>
+          </w:p>
+        </w:tc>
+        <w:tc>
+          <w:tcPr>
+            <w:tcW w:w="0" w:type="auto"/>
+            <w:tcBorders>
+              <w:top w:val="single" w:sz="6" w:space="0" w:color="D9D9D9"/>
+              <w:left w:val="single" w:sz="6" w:space="0" w:color="D9D9D9"/>
+              <w:bottom w:val="single" w:sz="6" w:space="0" w:color="D9D9D9"/>
+              <w:right w:val="single" w:sz="6" w:space="0" w:color="D9D9D9"/>
+            </w:tcBorders>
+            <w:shd w:val="clear" w:color="auto" w:fill="EAF2F8"/>
+            <w:tcMar>
+              <w:top w:w="95" w:type="dxa"/>
+              <w:left w:w="115" w:type="dxa"/>
+              <w:bottom w:w="95" w:type="dxa"/>
+              <w:right w:w="115" w:type="dxa"/>
+            </w:tcMar>
+            <w:vAlign w:val="center"/>
+            <w:hideMark/>
+          </w:tcPr>
+          <w:p>
+            <w:pPr>
+              <w:rPr>
+                <w:lang w:val="en-AE"/>
+              </w:rPr>
+            </w:pPr>
+            <w:r>
+              <w:rPr>
+                <w:lang w:val="en-AE"/>
+              </w:rPr>
+              <w:t>Free or low-cost hosting only if remote demonstration is required</w:t>
+            </w:r>
+          </w:p>
+        </w:tc>
+      </w:tr>
+      <w:tr>
+        <w:trPr>
+          <w:jc w:val="center"/>
+        </w:trPr>
+        <w:tc>
+          <w:tcPr>
+            <w:tcW w:w="0" w:type="auto"/>
+            <w:tcBorders>
+              <w:top w:val="single" w:sz="6" w:space="0" w:color="D9D9D9"/>
+              <w:left w:val="single" w:sz="6" w:space="0" w:color="D9D9D9"/>
+              <w:bottom w:val="single" w:sz="6" w:space="0" w:color="D9D9D9"/>
+              <w:right w:val="single" w:sz="6" w:space="0" w:color="D9D9D9"/>
+            </w:tcBorders>
+            <w:tcMar>
+              <w:top w:w="95" w:type="dxa"/>
+              <w:left w:w="115" w:type="dxa"/>
+              <w:bottom w:w="95" w:type="dxa"/>
+              <w:right w:w="115" w:type="dxa"/>
+            </w:tcMar>
+            <w:vAlign w:val="center"/>
+            <w:hideMark/>
+          </w:tcPr>
+          <w:p>
+            <w:pPr>
+              <w:rPr>
+                <w:lang w:val="en-AE"/>
+              </w:rPr>
+            </w:pPr>
+            <w:r>
+              <w:rPr>
+                <w:lang w:val="en-AE"/>
+              </w:rPr>
+              <w:t>AI service usage</w:t>
+            </w:r>
+          </w:p>
+        </w:tc>
+        <w:tc>
+          <w:tcPr>
+            <w:tcW w:w="0" w:type="auto"/>
+            <w:tcBorders>
+              <w:top w:val="single" w:sz="6" w:space="0" w:color="D9D9D9"/>
+              <w:left w:val="single" w:sz="6" w:space="0" w:color="D9D9D9"/>
+              <w:bottom w:val="single" w:sz="6" w:space="0" w:color="D9D9D9"/>
+              <w:right w:val="single" w:sz="6" w:space="0" w:color="D9D9D9"/>
+            </w:tcBorders>
+            <w:tcMar>
+              <w:top w:w="95" w:type="dxa"/>
+              <w:left w:w="115" w:type="dxa"/>
+              <w:bottom w:w="95" w:type="dxa"/>
+              <w:right w:w="115" w:type="dxa"/>
+            </w:tcMar>
+            <w:vAlign w:val="center"/>
+            <w:hideMark/>
+          </w:tcPr>
+          <w:p>
+            <w:pPr>
+              <w:rPr>
+                <w:lang w:val="en-AE"/>
+              </w:rPr>
+            </w:pPr>
+            <w:r>
+              <w:rPr>
+                <w:lang w:val="en-AE"/>
+              </w:rPr>
+              <w:t>0 to 2500</w:t>
+            </w:r>
+          </w:p>
+        </w:tc>
+        <w:tc>
+          <w:tcPr>
+            <w:tcW w:w="0" w:type="auto"/>
+            <w:tcBorders>
+              <w:top w:val="single" w:sz="6" w:space="0" w:color="D9D9D9"/>
+              <w:left w:val="single" w:sz="6" w:space="0" w:color="D9D9D9"/>
+              <w:bottom w:val="single" w:sz="6" w:space="0" w:color="D9D9D9"/>
+              <w:right w:val="single" w:sz="6" w:space="0" w:color="D9D9D9"/>
+            </w:tcBorders>
+            <w:tcMar>
+              <w:top w:w="95" w:type="dxa"/>
+              <w:left w:w="115" w:type="dxa"/>
+              <w:bottom w:w="95" w:type="dxa"/>
+              <w:right w:w="115" w:type="dxa"/>
+            </w:tcMar>
+            <w:vAlign w:val="center"/>
+            <w:hideMark/>
+          </w:tcPr>
+          <w:p>
+            <w:pPr>
+              <w:rPr>
+                <w:lang w:val="en-AE"/>
+              </w:rPr>
+            </w:pPr>
+            <w:r>
+              <w:rPr>
+                <w:lang w:val="en-AE"/>
+              </w:rPr>
+              <w:t>Cap requests, cache results, and preserve a local or manual fallback</w:t>
+            </w:r>
+          </w:p>
+        </w:tc>
+      </w:tr>
+      <w:tr>
+        <w:trPr>
+          <w:jc w:val="center"/>
+        </w:trPr>
+        <w:tc>
+          <w:tcPr>
+            <w:tcW w:w="0" w:type="auto"/>
+            <w:tcBorders>
+              <w:top w:val="single" w:sz="6" w:space="0" w:color="D9D9D9"/>
+              <w:left w:val="single" w:sz="6" w:space="0" w:color="D9D9D9"/>
+              <w:bottom w:val="single" w:sz="6" w:space="0" w:color="D9D9D9"/>
+              <w:right w:val="single" w:sz="6" w:space="0" w:color="D9D9D9"/>
+            </w:tcBorders>
+            <w:shd w:val="clear" w:color="auto" w:fill="EAF2F8"/>
+            <w:tcMar>
+              <w:top w:w="95" w:type="dxa"/>
+              <w:left w:w="115" w:type="dxa"/>
+              <w:bottom w:w="95" w:type="dxa"/>
+              <w:right w:w="115" w:type="dxa"/>
+            </w:tcMar>
+            <w:vAlign w:val="center"/>
+            <w:hideMark/>
+          </w:tcPr>
+          <w:p>
+            <w:pPr>
+              <w:rPr>
+                <w:lang w:val="en-AE"/>
+              </w:rPr>
+            </w:pPr>
+            <w:r>
+              <w:rPr>
+                <w:lang w:val="en-AE"/>
+              </w:rPr>
+              <w:t>Backup and test storage</w:t>
+            </w:r>
+          </w:p>
+        </w:tc>
+        <w:tc>
+          <w:tcPr>
+            <w:tcW w:w="0" w:type="auto"/>
+            <w:tcBorders>
+              <w:top w:val="single" w:sz="6" w:space="0" w:color="D9D9D9"/>
+              <w:left w:val="single" w:sz="6" w:space="0" w:color="D9D9D9"/>
+              <w:bottom w:val="single" w:sz="6" w:space="0" w:color="D9D9D9"/>
+              <w:right w:val="single" w:sz="6" w:space="0" w:color="D9D9D9"/>
+            </w:tcBorders>
+            <w:shd w:val="clear" w:color="auto" w:fill="EAF2F8"/>
+            <w:tcMar>
+              <w:top w:w="95" w:type="dxa"/>
+              <w:left w:w="115" w:type="dxa"/>
+              <w:bottom w:w="95" w:type="dxa"/>
+              <w:right w:w="115" w:type="dxa"/>
+            </w:tcMar>
+            <w:vAlign w:val="center"/>
+            <w:hideMark/>
+          </w:tcPr>
+          <w:p>
+            <w:pPr>
+              <w:rPr>
+                <w:lang w:val="en-AE"/>
+              </w:rPr>
+            </w:pPr>
+            <w:r>
+              <w:rPr>
+                <w:lang w:val="en-AE"/>
+              </w:rPr>
+              <w:t>0 to 500</w:t>
+            </w:r>
+          </w:p>
+        </w:tc>
+        <w:tc>
+          <w:tcPr>
+            <w:tcW w:w="0" w:type="auto"/>
+            <w:tcBorders>
+              <w:top w:val="single" w:sz="6" w:space="0" w:color="D9D9D9"/>
+              <w:left w:val="single" w:sz="6" w:space="0" w:color="D9D9D9"/>
+              <w:bottom w:val="single" w:sz="6" w:space="0" w:color="D9D9D9"/>
+              <w:right w:val="single" w:sz="6" w:space="0" w:color="D9D9D9"/>
+            </w:tcBorders>
+            <w:shd w:val="clear" w:color="auto" w:fill="EAF2F8"/>
+            <w:tcMar>
+              <w:top w:w="95" w:type="dxa"/>
+              <w:left w:w="115" w:type="dxa"/>
+              <w:bottom w:w="95" w:type="dxa"/>
+              <w:right w:w="115" w:type="dxa"/>
+            </w:tcMar>
+            <w:vAlign w:val="center"/>
+            <w:hideMark/>
+          </w:tcPr>
+          <w:p>
+            <w:pPr>
+              <w:rPr>
+                <w:lang w:val="en-AE"/>
+              </w:rPr>
+            </w:pPr>
+            <w:r>
+              <w:rPr>
+                <w:lang w:val="en-AE"/>
+              </w:rPr>
+              <w:t>Keep only approved sample files and limit retention</w:t>
+            </w:r>
+          </w:p>
+        </w:tc>
+      </w:tr>
+      <w:tr>
+        <w:trPr>
+          <w:jc w:val="center"/>
+        </w:trPr>
+        <w:tc>
+          <w:tcPr>
+            <w:tcW w:w="0" w:type="auto"/>
+            <w:tcBorders>
+              <w:top w:val="single" w:sz="6" w:space="0" w:color="D9D9D9"/>
+              <w:left w:val="single" w:sz="6" w:space="0" w:color="D9D9D9"/>
+              <w:bottom w:val="single" w:sz="6" w:space="0" w:color="D9D9D9"/>
+              <w:right w:val="single" w:sz="6" w:space="0" w:color="D9D9D9"/>
+            </w:tcBorders>
+            <w:tcMar>
+              <w:top w:w="95" w:type="dxa"/>
+              <w:left w:w="115" w:type="dxa"/>
+              <w:bottom w:w="95" w:type="dxa"/>
+              <w:right w:w="115" w:type="dxa"/>
+            </w:tcMar>
+            <w:vAlign w:val="center"/>
+            <w:hideMark/>
+          </w:tcPr>
+          <w:p>
+            <w:pPr>
+              <w:rPr>
+                <w:lang w:val="en-AE"/>
+              </w:rPr>
+            </w:pPr>
+            <w:r>
+              <w:rPr>
+                <w:lang w:val="en-AE"/>
+              </w:rPr>
+              <w:t>Contingency</w:t>
+            </w:r>
+          </w:p>
+        </w:tc>
+        <w:tc>
+          <w:tcPr>
+            <w:tcW w:w="0" w:type="auto"/>
+            <w:tcBorders>
+              <w:top w:val="single" w:sz="6" w:space="0" w:color="D9D9D9"/>
+              <w:left w:val="single" w:sz="6" w:space="0" w:color="D9D9D9"/>
+              <w:bottom w:val="single" w:sz="6" w:space="0" w:color="D9D9D9"/>
+              <w:right w:val="single" w:sz="6" w:space="0" w:color="D9D9D9"/>
+            </w:tcBorders>
+            <w:tcMar>
+              <w:top w:w="95" w:type="dxa"/>
+              <w:left w:w="115" w:type="dxa"/>
+              <w:bottom w:w="95" w:type="dxa"/>
+              <w:right w:w="115" w:type="dxa"/>
+            </w:tcMar>
+            <w:vAlign w:val="center"/>
+            <w:hideMark/>
+          </w:tcPr>
+          <w:p>
+            <w:pPr>
+              <w:rPr>
+                <w:lang w:val="en-AE"/>
+              </w:rPr>
+            </w:pPr>
+            <w:r>
+              <w:rPr>
+                <w:lang w:val="en-AE"/>
+              </w:rPr>
+              <w:t>0 to 1000</w:t>
+            </w:r>
+          </w:p>
+        </w:tc>
+        <w:tc>
+          <w:tcPr>
+            <w:tcW w:w="0" w:type="auto"/>
+            <w:tcBorders>
+              <w:top w:val="single" w:sz="6" w:space="0" w:color="D9D9D9"/>
+              <w:left w:val="single" w:sz="6" w:space="0" w:color="D9D9D9"/>
+              <w:bottom w:val="single" w:sz="6" w:space="0" w:color="D9D9D9"/>
+              <w:right w:val="single" w:sz="6" w:space="0" w:color="D9D9D9"/>
+            </w:tcBorders>
+            <w:tcMar>
+              <w:top w:w="95" w:type="dxa"/>
+              <w:left w:w="115" w:type="dxa"/>
+              <w:bottom w:w="95" w:type="dxa"/>
+              <w:right w:w="115" w:type="dxa"/>
+            </w:tcMar>
+            <w:vAlign w:val="center"/>
+            <w:hideMark/>
+          </w:tcPr>
+          <w:p>
+            <w:pPr>
+              <w:rPr>
+                <w:lang w:val="en-AE"/>
+              </w:rPr>
+            </w:pPr>
+            <w:r>
+              <w:rPr>
+                <w:lang w:val="en-AE"/>
+              </w:rPr>
+              <w:t>Do not commit until a specific need and owner are identified</w:t>
+            </w:r>
+          </w:p>
+        </w:tc>
+      </w:tr>
+      <w:tr>
+        <w:trPr>
+          <w:jc w:val="center"/>
+        </w:trPr>
+        <w:tc>
+          <w:tcPr>
+            <w:tcW w:w="0" w:type="auto"/>
+            <w:tcBorders>
+              <w:top w:val="single" w:sz="6" w:space="0" w:color="D9D9D9"/>
+              <w:left w:val="single" w:sz="6" w:space="0" w:color="D9D9D9"/>
+              <w:bottom w:val="single" w:sz="6" w:space="0" w:color="D9D9D9"/>
+              <w:right w:val="single" w:sz="6" w:space="0" w:color="D9D9D9"/>
+            </w:tcBorders>
+            <w:shd w:val="clear" w:color="auto" w:fill="EAF2F8"/>
+            <w:tcMar>
+              <w:top w:w="95" w:type="dxa"/>
+              <w:left w:w="115" w:type="dxa"/>
+              <w:bottom w:w="95" w:type="dxa"/>
+              <w:right w:w="115" w:type="dxa"/>
+            </w:tcMar>
+            <w:vAlign w:val="center"/>
+            <w:hideMark/>
+          </w:tcPr>
+          <w:p>
+            <w:pPr>
+              <w:rPr>
+                <w:lang w:val="en-AE"/>
+              </w:rPr>
+            </w:pPr>
+            <w:r>
+              <w:rPr>
+                <w:lang w:val="en-AE"/>
+              </w:rPr>
+              <w:t>Total direct cash range</w:t>
+            </w:r>
+          </w:p>
+        </w:tc>
+        <w:tc>
+          <w:tcPr>
+            <w:tcW w:w="0" w:type="auto"/>
+            <w:tcBorders>
+              <w:top w:val="single" w:sz="6" w:space="0" w:color="D9D9D9"/>
+              <w:left w:val="single" w:sz="6" w:space="0" w:color="D9D9D9"/>
+              <w:bottom w:val="single" w:sz="6" w:space="0" w:color="D9D9D9"/>
+              <w:right w:val="single" w:sz="6" w:space="0" w:color="D9D9D9"/>
+            </w:tcBorders>
+            <w:shd w:val="clear" w:color="auto" w:fill="EAF2F8"/>
+            <w:tcMar>
+              <w:top w:w="95" w:type="dxa"/>
+              <w:left w:w="115" w:type="dxa"/>
+              <w:bottom w:w="95" w:type="dxa"/>
+              <w:right w:w="115" w:type="dxa"/>
+            </w:tcMar>
+            <w:vAlign w:val="center"/>
+            <w:hideMark/>
+          </w:tcPr>
+          <w:p>
+            <w:pPr>
+              <w:rPr>
+                <w:lang w:val="en-AE"/>
+              </w:rPr>
+            </w:pPr>
+            <w:r>
+              <w:rPr>
+                <w:lang w:val="en-AE"/>
+              </w:rPr>
+              <w:t>0 to 5500</w:t>
+            </w:r>
+          </w:p>
+        </w:tc>
+        <w:tc>
+          <w:tcPr>
+            <w:tcW w:w="0" w:type="auto"/>
+            <w:tcBorders>
+              <w:top w:val="single" w:sz="6" w:space="0" w:color="D9D9D9"/>
+              <w:left w:val="single" w:sz="6" w:space="0" w:color="D9D9D9"/>
+              <w:bottom w:val="single" w:sz="6" w:space="0" w:color="D9D9D9"/>
+              <w:right w:val="single" w:sz="6" w:space="0" w:color="D9D9D9"/>
+            </w:tcBorders>
+            <w:shd w:val="clear" w:color="auto" w:fill="EAF2F8"/>
+            <w:tcMar>
+              <w:top w:w="95" w:type="dxa"/>
+              <w:left w:w="115" w:type="dxa"/>
+              <w:bottom w:w="95" w:type="dxa"/>
+              <w:right w:w="115" w:type="dxa"/>
+            </w:tcMar>
+            <w:vAlign w:val="center"/>
+            <w:hideMark/>
+          </w:tcPr>
+          <w:p>
+            <w:pPr>
+              <w:rPr>
+                <w:lang w:val="en-AE"/>
+              </w:rPr>
+            </w:pPr>
+            <w:r>
+              <w:rPr>
+                <w:lang w:val="en-AE"/>
+              </w:rPr>
+              <w:t xml:space="preserve">Excludes student </w:t>
+            </w:r>
+            <w:proofErr w:type="spellStart"/>
+            <w:r>
+              <w:rPr>
+                <w:lang w:val="en-AE"/>
+              </w:rPr>
+              <w:t>labor</w:t>
+            </w:r>
+            <w:proofErr w:type="spellEnd"/>
+            <w:r>
+              <w:rPr>
+                <w:lang w:val="en-AE"/>
+              </w:rPr>
+              <w:t xml:space="preserve"> and any production deployment</w:t>
+            </w:r>
+          </w:p>
+        </w:tc>
+      </w:tr>
+    </w:tbl>
+    <w:p>
+      <w:pPr>
+        <w:rPr>
+          <w:lang w:val="en-AE"/>
+        </w:rPr>
+      </w:pPr>
+    </w:p>
+    <w:p>
+      <w:pPr>
+        <w:rPr>
+          <w:lang w:val="en-AE"/>
+        </w:rPr>
+      </w:pPr>
+      <w:r>
+        <w:rPr>
+          <w:i/>
+          <w:iCs/>
+          <w:lang w:val="en-AE"/>
+        </w:rPr>
+        <w:t xml:space="preserve">These values are feasibility assumptions, not quotations. The project should be designed so the lower end remains possible. Any paid service should have a spending cap, an owner, usage logging, and a replacement path. Student </w:t>
+      </w:r>
+      <w:proofErr w:type="spellStart"/>
+      <w:r>
+        <w:rPr>
+          <w:i/>
+          <w:iCs/>
+          <w:lang w:val="en-AE"/>
+        </w:rPr>
+        <w:t>labor</w:t>
+      </w:r>
+      <w:proofErr w:type="spellEnd"/>
+      <w:r>
+        <w:rPr>
+          <w:i/>
+          <w:iCs/>
+          <w:lang w:val="en-AE"/>
+        </w:rPr>
+        <w:t xml:space="preserve"> is excluded from the direct cash total because it is course work, but the schedule section treats team time as the main scarce resource.</w:t>
+      </w:r>
+    </w:p>
+    <w:p>
+      <w:pPr>
+        <w:rPr>
+          <w:b/>
+          <w:bCs/>
+          <w:lang w:val="en-AE"/>
+        </w:rPr>
+      </w:pPr>
+      <w:r>
+        <w:rPr>
+          <w:b/>
+          <w:bCs/>
+          <w:lang w:val="en-AE"/>
+        </w:rPr>
+        <w:t>6 2 Potential Benefits</w:t>
+      </w:r>
+    </w:p>
+    <w:p>
+      <w:pPr>
+        <w:rPr>
+          <w:lang w:val="en-AE"/>
+        </w:rPr>
+      </w:pPr>
+      <w:r>
+        <w:rPr>
+          <w:lang w:val="en-AE"/>
+        </w:rPr>
+        <w:t>The financial benefits expected from the system come from avoiding or delaying purchases extending the life of assets reducing duplicate inventory and making better maintenance decisions based on accurate information. These benefits can only be claimed after the prototype has recorded reference prices, repair costs, transfer costs, approved quantities and proof that a purchase was truly avoided. The system must calculate the gross value of avoided purchases and then subtract the costs of repair, refurbishment, transfer and any extra operating expenses. Benefits should be reported separately for each time period. It is important not to mix sample data with savings from the university.</w:t>
+      </w:r>
+    </w:p>
+    <w:p>
+      <w:pPr>
+        <w:rPr>
+          <w:b/>
+          <w:bCs/>
+          <w:lang w:val="en-AE"/>
+        </w:rPr>
+      </w:pPr>
+      <w:r>
+        <w:rPr>
+          <w:b/>
+          <w:bCs/>
+          <w:lang w:val="en-AE"/>
+        </w:rPr>
+        <w:t>6 3 Production Cost Gap</w:t>
+      </w:r>
+    </w:p>
+    <w:p>
+      <w:pPr>
+        <w:rPr>
+          <w:lang w:val="en-AE"/>
+        </w:rPr>
+      </w:pPr>
+      <w:r>
+        <w:rPr>
+          <w:lang w:val="en-AE"/>
+        </w:rPr>
+        <w:t>The production budget has not been set yet. Key factors that will affect the budget include hosting and availability needs, integration, with identity management systems, backup and recovery goals, monitoring requirements, security assessments, data migration plans, user support, service ownership, vendor agreements, expected transaction volume, model usage and data retention rules. Phase 3 should list these items as dependencies instead of trying to estimate final costs. This gap does not stop the prototype work. It means the team cannot decide to move into production without a full cost picture.</w:t>
       </w:r>
     </w:p>
     <w:p>
@@ -5452,6 +7947,155 @@
       </w:rPr>
     </w:lvl>
   </w:abstractNum>
+  <w:abstractNum w:abstractNumId="9" w15:restartNumberingAfterBreak="0">
+    <w:nsid w:val="6CEE4675"/>
+    <w:multiLevelType w:val="multilevel"/>
+    <w:tmpl w:val="586ED7CE"/>
+    <w:lvl w:ilvl="0">
+      <w:start w:val="1"/>
+      <w:numFmt w:val="bullet"/>
+      <w:lvlText w:val=""/>
+      <w:lvlJc w:val="left"/>
+      <w:pPr>
+        <w:tabs>
+          <w:tab w:val="num" w:pos="720"/>
+        </w:tabs>
+        <w:ind w:left="720" w:hanging="360"/>
+      </w:pPr>
+      <w:rPr>
+        <w:rFonts w:ascii="Symbol" w:hAnsi="Symbol" w:hint="default"/>
+        <w:sz w:val="20"/>
+      </w:rPr>
+    </w:lvl>
+    <w:lvl w:ilvl="1" w:tentative="1">
+      <w:start w:val="1"/>
+      <w:numFmt w:val="bullet"/>
+      <w:lvlText w:val="o"/>
+      <w:lvlJc w:val="left"/>
+      <w:pPr>
+        <w:tabs>
+          <w:tab w:val="num" w:pos="1440"/>
+        </w:tabs>
+        <w:ind w:left="1440" w:hanging="360"/>
+      </w:pPr>
+      <w:rPr>
+        <w:rFonts w:ascii="Courier New" w:hAnsi="Courier New" w:hint="default"/>
+        <w:sz w:val="20"/>
+      </w:rPr>
+    </w:lvl>
+    <w:lvl w:ilvl="2" w:tentative="1">
+      <w:start w:val="1"/>
+      <w:numFmt w:val="bullet"/>
+      <w:lvlText w:val=""/>
+      <w:lvlJc w:val="left"/>
+      <w:pPr>
+        <w:tabs>
+          <w:tab w:val="num" w:pos="2160"/>
+        </w:tabs>
+        <w:ind w:left="2160" w:hanging="360"/>
+      </w:pPr>
+      <w:rPr>
+        <w:rFonts w:ascii="Wingdings" w:hAnsi="Wingdings" w:hint="default"/>
+        <w:sz w:val="20"/>
+      </w:rPr>
+    </w:lvl>
+    <w:lvl w:ilvl="3" w:tentative="1">
+      <w:start w:val="1"/>
+      <w:numFmt w:val="bullet"/>
+      <w:lvlText w:val=""/>
+      <w:lvlJc w:val="left"/>
+      <w:pPr>
+        <w:tabs>
+          <w:tab w:val="num" w:pos="2880"/>
+        </w:tabs>
+        <w:ind w:left="2880" w:hanging="360"/>
+      </w:pPr>
+      <w:rPr>
+        <w:rFonts w:ascii="Wingdings" w:hAnsi="Wingdings" w:hint="default"/>
+        <w:sz w:val="20"/>
+      </w:rPr>
+    </w:lvl>
+    <w:lvl w:ilvl="4" w:tentative="1">
+      <w:start w:val="1"/>
+      <w:numFmt w:val="bullet"/>
+      <w:lvlText w:val=""/>
+      <w:lvlJc w:val="left"/>
+      <w:pPr>
+        <w:tabs>
+          <w:tab w:val="num" w:pos="3600"/>
+        </w:tabs>
+        <w:ind w:left="3600" w:hanging="360"/>
+      </w:pPr>
+      <w:rPr>
+        <w:rFonts w:ascii="Wingdings" w:hAnsi="Wingdings" w:hint="default"/>
+        <w:sz w:val="20"/>
+      </w:rPr>
+    </w:lvl>
+    <w:lvl w:ilvl="5" w:tentative="1">
+      <w:start w:val="1"/>
+      <w:numFmt w:val="bullet"/>
+      <w:lvlText w:val=""/>
+      <w:lvlJc w:val="left"/>
+      <w:pPr>
+        <w:tabs>
+          <w:tab w:val="num" w:pos="4320"/>
+        </w:tabs>
+        <w:ind w:left="4320" w:hanging="360"/>
+      </w:pPr>
+      <w:rPr>
+        <w:rFonts w:ascii="Wingdings" w:hAnsi="Wingdings" w:hint="default"/>
+        <w:sz w:val="20"/>
+      </w:rPr>
+    </w:lvl>
+    <w:lvl w:ilvl="6" w:tentative="1">
+      <w:start w:val="1"/>
+      <w:numFmt w:val="bullet"/>
+      <w:lvlText w:val=""/>
+      <w:lvlJc w:val="left"/>
+      <w:pPr>
+        <w:tabs>
+          <w:tab w:val="num" w:pos="5040"/>
+        </w:tabs>
+        <w:ind w:left="5040" w:hanging="360"/>
+      </w:pPr>
+      <w:rPr>
+        <w:rFonts w:ascii="Wingdings" w:hAnsi="Wingdings" w:hint="default"/>
+        <w:sz w:val="20"/>
+      </w:rPr>
+    </w:lvl>
+    <w:lvl w:ilvl="7" w:tentative="1">
+      <w:start w:val="1"/>
+      <w:numFmt w:val="bullet"/>
+      <w:lvlText w:val=""/>
+      <w:lvlJc w:val="left"/>
+      <w:pPr>
+        <w:tabs>
+          <w:tab w:val="num" w:pos="5760"/>
+        </w:tabs>
+        <w:ind w:left="5760" w:hanging="360"/>
+      </w:pPr>
+      <w:rPr>
+        <w:rFonts w:ascii="Wingdings" w:hAnsi="Wingdings" w:hint="default"/>
+        <w:sz w:val="20"/>
+      </w:rPr>
+    </w:lvl>
+    <w:lvl w:ilvl="8" w:tentative="1">
+      <w:start w:val="1"/>
+      <w:numFmt w:val="bullet"/>
+      <w:lvlText w:val=""/>
+      <w:lvlJc w:val="left"/>
+      <w:pPr>
+        <w:tabs>
+          <w:tab w:val="num" w:pos="6480"/>
+        </w:tabs>
+        <w:ind w:left="6480" w:hanging="360"/>
+      </w:pPr>
+      <w:rPr>
+        <w:rFonts w:ascii="Wingdings" w:hAnsi="Wingdings" w:hint="default"/>
+        <w:sz w:val="20"/>
+      </w:rPr>
+    </w:lvl>
+  </w:abstractNum>
   <w:num w:numId="1" w16cid:durableId="1958635269">
     <w:abstractNumId w:val="8"/>
   </w:num>
@@ -5478,6 +8122,9 @@
   </w:num>
   <w:num w:numId="9" w16cid:durableId="474375784">
     <w:abstractNumId w:val="0"/>
+  </w:num>
+  <w:num w:numId="10" w16cid:durableId="1152331746">
+    <w:abstractNumId w:val="9"/>
   </w:num>
 </w:numbering>
 </file>

</xml_diff>

<commit_message>
Added parts 7 - 10
</commit_message>
<xml_diff>
--- a/docs/Phase_2_Feasibility_Study.docx
+++ b/docs/Phase_2_Feasibility_Study.docx
@@ -1,6 +1,6 @@
 
 <file path=word/document.xml><?xml version="1.0" encoding="utf-8"?>
-<w:document xmlns:wpc="http://schemas.microsoft.com/office/word/2010/wordprocessingCanvas" xmlns:cx="http://schemas.microsoft.com/office/drawing/2014/chartex" xmlns:cx1="http://schemas.microsoft.com/office/drawing/2015/9/8/chartex" xmlns:cx2="http://schemas.microsoft.com/office/drawing/2015/10/21/chartex" xmlns:cx3="http://schemas.microsoft.com/office/drawing/2016/5/9/chartex" xmlns:cx4="http://schemas.microsoft.com/office/drawing/2016/5/10/chartex" xmlns:cx5="http://schemas.microsoft.com/office/drawing/2016/5/11/chartex" xmlns:cx6="http://schemas.microsoft.com/office/drawing/2016/5/12/chartex" xmlns:cx7="http://schemas.microsoft.com/office/drawing/2016/5/13/chartex" xmlns:cx8="http://schemas.microsoft.com/office/drawing/2016/5/14/chartex" xmlns:mc="http://schemas.openxmlformats.org/markup-compatibility/2006" xmlns:aink="http://schemas.microsoft.com/office/drawing/2016/ink" xmlns:am3d="http://schemas.microsoft.com/office/drawing/2017/model3d" xmlns:o="urn:schemas-microsoft-com:office:office" xmlns:oel="http://schemas.microsoft.com/office/2019/extlst" xmlns:r="http://schemas.openxmlformats.org/officeDocument/2006/relationships" xmlns:m="http://schemas.openxmlformats.org/officeDocument/2006/math" xmlns:v="urn:schemas-microsoft-com:vml" xmlns:wp14="http://schemas.microsoft.com/office/word/2010/wordprocessingDrawing" xmlns:wp="http://schemas.openxmlformats.org/drawingml/2006/wordprocessingDrawing" xmlns:w10="urn:schemas-microsoft-com:office:word" xmlns:w="http://schemas.openxmlformats.org/wordprocessingml/2006/main" xmlns:w14="http://schemas.microsoft.com/office/word/2010/wordml" xmlns:w15="http://schemas.microsoft.com/office/word/2012/wordml" xmlns:w16cex="http://schemas.microsoft.com/office/word/2018/wordml/cex" xmlns:w16cid="http://schemas.microsoft.com/office/word/2016/wordml/cid" xmlns:w16="http://schemas.microsoft.com/office/word/2018/wordml" xmlns:w16du="http://schemas.microsoft.com/office/word/2023/wordml/word16du" xmlns:w16sdtdh="http://schemas.microsoft.com/office/word/2020/wordml/sdtdatahash" xmlns:w16sdtfl="http://schemas.microsoft.com/office/word/2024/wordml/sdtformatlock" xmlns:w16se="http://schemas.microsoft.com/office/word/2015/wordml/symex" xmlns:wpg="http://schemas.microsoft.com/office/word/2010/wordprocessingGroup" xmlns:wpi="http://schemas.microsoft.com/office/word/2010/wordprocessingInk" xmlns:wne="http://schemas.microsoft.com/office/word/2006/wordml" xmlns:wps="http://schemas.microsoft.com/office/word/2010/wordprocessingShape" mc:Ignorable="w14 w15 w16se w16cid w16 w16cex w16sdtdh w16sdtfl w16du wp14">
+<w:document xmlns:wpc="http://schemas.microsoft.com/office/word/2010/wordprocessingCanvas" xmlns:cx="http://schemas.microsoft.com/office/drawing/2014/chartex" xmlns:cx1="http://schemas.microsoft.com/office/drawing/2015/9/8/chartex" xmlns:cx2="http://schemas.microsoft.com/office/drawing/2015/10/21/chartex" xmlns:cx3="http://schemas.microsoft.com/office/drawing/2016/5/9/chartex" xmlns:cx4="http://schemas.microsoft.com/office/drawing/2016/5/10/chartex" xmlns:cx5="http://schemas.microsoft.com/office/drawing/2016/5/11/chartex" xmlns:cx6="http://schemas.microsoft.com/office/drawing/2016/5/12/chartex" xmlns:cx7="http://schemas.microsoft.com/office/drawing/2016/5/13/chartex" xmlns:cx8="http://schemas.microsoft.com/office/drawing/2016/5/14/chartex" xmlns:mc="http://schemas.openxmlformats.org/markup-compatibility/2006" xmlns:m="http://schemas.openxmlformats.org/officeDocument/2006/math" xmlns:aink="http://schemas.microsoft.com/office/drawing/2016/ink" xmlns:am3d="http://schemas.microsoft.com/office/drawing/2017/model3d" xmlns:oel="http://schemas.microsoft.com/office/2019/extlst" xmlns:r="http://schemas.openxmlformats.org/officeDocument/2006/relationships" xmlns:wp14="http://schemas.microsoft.com/office/word/2010/wordprocessingDrawing" xmlns:wp="http://schemas.openxmlformats.org/drawingml/2006/wordprocessingDrawing" xmlns:wpg="http://schemas.microsoft.com/office/word/2010/wordprocessingGroup" xmlns:wpi="http://schemas.microsoft.com/office/word/2010/wordprocessingInk" xmlns:wps="http://schemas.microsoft.com/office/word/2010/wordprocessingShape" xmlns:o="urn:schemas-microsoft-com:office:office" xmlns:v="urn:schemas-microsoft-com:vml" xmlns:w10="urn:schemas-microsoft-com:office:word" xmlns:w="http://schemas.openxmlformats.org/wordprocessingml/2006/main" xmlns:w14="http://schemas.microsoft.com/office/word/2010/wordml" xmlns:w15="http://schemas.microsoft.com/office/word/2012/wordml" xmlns:w16cex="http://schemas.microsoft.com/office/word/2018/wordml/cex" xmlns:w16cid="http://schemas.microsoft.com/office/word/2016/wordml/cid" xmlns:w16="http://schemas.microsoft.com/office/word/2018/wordml" xmlns:w16sdtdh="http://schemas.microsoft.com/office/word/2020/wordml/sdtdatahash" xmlns:w16sdtfl="http://schemas.microsoft.com/office/word/2024/wordml/sdtformatlock" xmlns:w16se="http://schemas.microsoft.com/office/word/2015/wordml/symex" xmlns:w16du="http://schemas.microsoft.com/office/word/2023/wordml/word16du" xmlns:wne="http://schemas.microsoft.com/office/word/2006/wordml" mc:Ignorable="w14 w15 w16se w16cid w16 w16cex w16sdtdh w16sdtfl w16du wp14">
   <w:body>
     <w:p>
       <w:pPr>
@@ -164,6 +164,7 @@
         <w:pStyle w:val="Heading1"/>
       </w:pPr>
       <w:r>
+        <w:lastRenderedPageBreak/>
         <w:t>Contents</w:t>
       </w:r>
     </w:p>
@@ -1065,10 +1066,8 @@
         <w:pStyle w:val="Heading1"/>
       </w:pPr>
       <w:r>
-        <w:t>Ex</w:t>
-      </w:r>
-      <w:r>
-        <w:t>ecutive Summary</w:t>
+        <w:lastRenderedPageBreak/>
+        <w:t>Executive Summary</w:t>
       </w:r>
     </w:p>
     <w:p>
@@ -1099,20 +1098,33 @@
     </w:p>
     <w:p>
       <w:r>
-        <w:t>The level of operational feasibility is fairly high since the proposed flow is aligned with roles defined in Phase 1. Representatives of departments deliver information about assets; requestors do searches and submit requests; custodians validate the status of assets and their custody; administration approves transfers; maintenance records maintenance activity; while sustainability, procurement, and finance officers evaluate outcomes. Successful implementation requires forms of easy use, permission levels, consistent data input, approval status, and a training manual. It is important that the system does not require all stakeholders to be aware of the AI algorithm.</w:t>
+        <w:t xml:space="preserve">The level of operational feasibility is </w:t>
+      </w:r>
+      <w:proofErr w:type="gramStart"/>
+      <w:r>
+        <w:t>fairly high</w:t>
+      </w:r>
+      <w:proofErr w:type="gramEnd"/>
+      <w:r>
+        <w:t xml:space="preserve"> since the proposed flow is aligned with roles defined in Phase 1. Representatives of departments deliver information about assets; requestors do searches and submit requests; custodians validate the status of assets and their custody; administration approves transfers; maintenance records maintenance activity; while sustainability, procurement, and finance officers evaluate outcomes. Successful implementation requires forms of easy use, permission levels, consistent data input, approval status, and a training manual. It is important that the system does not require all stakeholders to be aware of the AI algorithm.</w:t>
       </w:r>
     </w:p>
     <w:p>
       <w:r>
-        <w:t>Financial feasibility is acceptable for the course project prototype since the team may rely on its own and university equipment, Git/GitHub, open source development environment, and a local database. There will be minimal direct cash costs if paying for cloud services and AI services is optional. It is impossible to estimate costs of deployment in the production environment in Phase 2 because hosting requirements, integrations, procurement policies, support, amount of data, and security assessment are still unknown. The report estimates costs using transparent ranges and benefit formulas.</w:t>
+        <w:t xml:space="preserve">Financial feasibility is acceptable for the course project prototype since the team may rely on its own and university equipment, Git/GitHub, </w:t>
+      </w:r>
+      <w:proofErr w:type="gramStart"/>
+      <w:r>
+        <w:t>open source</w:t>
+      </w:r>
+      <w:proofErr w:type="gramEnd"/>
+      <w:r>
+        <w:t xml:space="preserve"> development environment, and a local database. There will be minimal direct cash costs if paying for cloud services and AI services is optional. It is impossible to estimate costs of deployment in the production environment in Phase 2 because hosting requirements, integrations, procurement policies, support, amount of data, and security assessment are still unknown. The report estimates costs using transparent ranges and benefit formulas.</w:t>
       </w:r>
     </w:p>
     <w:p>
       <w:r>
-        <w:t>Schedule feasibility is the most immediate management concern. The course allocates one week to Phase 2, two weeks to requirements, three weeks to design, three weeks to implementation, and a final compressed testing and submission period. A two-person team can complete a convincing prototype only if it delivers a narrow end-to-end workflow first. Advanced image classification, predictive demand forecasting, broad integration with university systems, and autonomous recommendations should remain future exten</w:t>
-      </w:r>
-      <w:r>
-        <w:t>sions unless the core workflow is stable ahead of schedule.</w:t>
+        <w:t>Schedule feasibility is the most immediate management concern. The course allocates one week to Phase 2, two weeks to requirements, three weeks to design, three weeks to implementation, and a final compressed testing and submission period. A two-person team can complete a convincing prototype only if it delivers a narrow end-to-end workflow first. Advanced image classification, predictive demand forecasting, broad integration with university systems, and autonomous recommendations should remain future extensions unless the core workflow is stable ahead of schedule.</w:t>
       </w:r>
     </w:p>
     <w:p>
@@ -1128,6 +1140,7 @@
         <w:jc w:val="center"/>
       </w:pPr>
       <w:r>
+        <w:lastRenderedPageBreak/>
         <w:t>Table 1 Executive Feasibility Summary</w:t>
       </w:r>
     </w:p>
@@ -1737,7 +1750,29 @@
           <w:sz w:val="22"/>
           <w:szCs w:val="22"/>
         </w:rPr>
-        <w:t>This Phase 2 report determines the viability of the project defined in Phase 1 inside the constraints of the course environment. It reviews the architecture, database, AI services, semantic search, reporting capability, integrations, development resource pool, expected operating model, schedule of the project, readiness of the data, and relevant constraints. It does not replace the comprehensive requirements document that will be created in Phase 3. Rather, it sets the stage for determining what we can responsibly develop, what needs to wait, and what has to be sorted out before we finalize requirements.</w:t>
+        <w:t xml:space="preserve">This Phase 2 report determines the viability of the project defined in Phase 1 inside the constraints of the course environment. It reviews the architecture, database, AI services, semantic search, reporting capability, integrations, development resource pool, expected operating model, schedule of the project, readiness of the data, and relevant constraints. It does not replace the comprehensive requirements document that will be created in Phase 3. Rather, it sets the stage for determining what we can responsibly develop, what needs to wait, and what </w:t>
+      </w:r>
+      <w:proofErr w:type="gramStart"/>
+      <w:r>
+        <w:rPr>
+          <w:rFonts w:ascii="Aptos" w:eastAsiaTheme="minorEastAsia" w:hAnsi="Aptos" w:cstheme="minorBidi"/>
+          <w:b w:val="0"/>
+          <w:bCs w:val="0"/>
+          <w:sz w:val="22"/>
+          <w:szCs w:val="22"/>
+        </w:rPr>
+        <w:t>has to</w:t>
+      </w:r>
+      <w:proofErr w:type="gramEnd"/>
+      <w:r>
+        <w:rPr>
+          <w:rFonts w:ascii="Aptos" w:eastAsiaTheme="minorEastAsia" w:hAnsi="Aptos" w:cstheme="minorBidi"/>
+          <w:b w:val="0"/>
+          <w:bCs w:val="0"/>
+          <w:sz w:val="22"/>
+          <w:szCs w:val="22"/>
+        </w:rPr>
+        <w:t xml:space="preserve"> be sorted out before we finalize requirements.</w:t>
       </w:r>
     </w:p>
     <w:p>
@@ -1745,7 +1780,13 @@
         <w:pStyle w:val="Heading2"/>
       </w:pPr>
       <w:r>
-        <w:t>1 1 Feasibility Decision</w:t>
+        <w:t>1</w:t>
+      </w:r>
+      <w:r>
+        <w:t>.</w:t>
+      </w:r>
+      <w:r>
+        <w:t xml:space="preserve"> 1 Feasibility Decision</w:t>
       </w:r>
     </w:p>
     <w:p>
@@ -1765,7 +1806,13 @@
         <w:pStyle w:val="Heading2"/>
       </w:pPr>
       <w:r>
-        <w:t>1 2 Required Conditions</w:t>
+        <w:t>1</w:t>
+      </w:r>
+      <w:r>
+        <w:t>.</w:t>
+      </w:r>
+      <w:r>
+        <w:t xml:space="preserve"> 2 Required Conditions</w:t>
       </w:r>
     </w:p>
     <w:p>
@@ -1792,10 +1839,7 @@
         <w:ind w:left="490" w:hanging="403"/>
       </w:pPr>
       <w:r>
-        <w:t xml:space="preserve">3.  </w:t>
-      </w:r>
-      <w:r>
-        <w:t>Implement AI classification or semantic matching as a recommendation service with confidence information, explanations, and user override.</w:t>
+        <w:t>3.  Implement AI classification or semantic matching as a recommendation service with confidence information, explanations, and user override.</w:t>
       </w:r>
     </w:p>
     <w:p>
@@ -1813,6 +1857,7 @@
         <w:ind w:left="490" w:hanging="403"/>
       </w:pPr>
       <w:r>
+        <w:lastRenderedPageBreak/>
         <w:t>5.  Track direct service usage and cost so free-tier assumptions do not hide a future expense.</w:t>
       </w:r>
     </w:p>
@@ -1822,10 +1867,7 @@
         <w:ind w:left="490" w:hanging="403"/>
       </w:pPr>
       <w:r>
-        <w:t xml:space="preserve">6.  </w:t>
-      </w:r>
-      <w:r>
-        <w:t>Confirm applicable university IT, data, procurement, and acceptable-use policies before connecting to institutional systems or entering non-public information.</w:t>
+        <w:t>6.  Confirm applicable university IT, data, procurement, and acceptable-use policies before connecting to institutional systems or entering non-public information.</w:t>
       </w:r>
     </w:p>
     <w:p>
@@ -1833,7 +1875,13 @@
         <w:pStyle w:val="Heading2"/>
       </w:pPr>
       <w:r>
-        <w:t>1 3 Decision Boundaries</w:t>
+        <w:t>1</w:t>
+      </w:r>
+      <w:r>
+        <w:t>.</w:t>
+      </w:r>
+      <w:r>
+        <w:t xml:space="preserve"> 3 Decision Boundaries</w:t>
       </w:r>
     </w:p>
     <w:p>
@@ -1855,17 +1903,7 @@
           <w:sz w:val="22"/>
           <w:szCs w:val="22"/>
         </w:rPr>
-        <w:t>Conditional Go refers to a course prototype rather than a production version. This prototype can showcase practical workflows and even measure sample sustainability metrics, but it should not be regarded as the system of record for the university. Deployment to production will call for proper ownership, security testing, support setup, data governance, integration approval, legal review, procurement decisions, and proof of stable AI performance on representative institutional data.</w:t>
-      </w:r>
-      <w:r>
-        <w:rPr>
-          <w:rFonts w:ascii="Aptos" w:eastAsiaTheme="minorEastAsia" w:hAnsi="Aptos" w:cstheme="minorBidi"/>
-          <w:b w:val="0"/>
-          <w:bCs w:val="0"/>
-          <w:sz w:val="22"/>
-          <w:szCs w:val="22"/>
-        </w:rPr>
-        <w:t xml:space="preserve"> </w:t>
+        <w:t xml:space="preserve">Conditional Go refers to a course prototype rather than a production version. This prototype can showcase practical workflows and even measure sample sustainability metrics, but it should not be regarded as the system of record for the university. Deployment to production will call for proper ownership, security testing, support setup, data governance, integration approval, legal review, procurement decisions, and proof of stable AI performance on representative institutional data. </w:t>
       </w:r>
     </w:p>
     <w:p>
@@ -1942,6 +1980,9 @@
         <w:t>2</w:t>
       </w:r>
       <w:r>
+        <w:t>.</w:t>
+      </w:r>
+      <w:r>
         <w:t xml:space="preserve"> 1 Scope Carried Forward</w:t>
       </w:r>
     </w:p>
@@ -2004,7 +2045,13 @@
         <w:pStyle w:val="Heading2"/>
       </w:pPr>
       <w:r>
-        <w:t>2 2 Stakeholders Carried Forward</w:t>
+        <w:t>2</w:t>
+      </w:r>
+      <w:r>
+        <w:t>.</w:t>
+      </w:r>
+      <w:r>
+        <w:t xml:space="preserve"> 2 Stakeholders Carried Forward</w:t>
       </w:r>
     </w:p>
     <w:p>
@@ -2379,6 +2426,7 @@
               <w:rPr>
                 <w:sz w:val="17"/>
               </w:rPr>
+              <w:lastRenderedPageBreak/>
               <w:t>Administrators</w:t>
             </w:r>
           </w:p>
@@ -2749,7 +2797,13 @@
         <w:pStyle w:val="Heading2"/>
       </w:pPr>
       <w:r>
-        <w:t>2 3 Success Criteria Refined for Feasibility</w:t>
+        <w:t>2</w:t>
+      </w:r>
+      <w:r>
+        <w:t>.</w:t>
+      </w:r>
+      <w:r>
+        <w:t xml:space="preserve"> 3 Success Criteria Refined for Feasibility</w:t>
       </w:r>
     </w:p>
     <w:p>
@@ -2819,6 +2873,8 @@
         <w:rPr>
           <w:b/>
           <w:bCs/>
+          <w:sz w:val="32"/>
+          <w:szCs w:val="32"/>
           <w:lang w:val="en-AE"/>
         </w:rPr>
       </w:pPr>
@@ -2826,6 +2882,8 @@
         <w:rPr>
           <w:b/>
           <w:bCs/>
+          <w:sz w:val="32"/>
+          <w:szCs w:val="32"/>
           <w:lang w:val="en-AE"/>
         </w:rPr>
         <w:t>3 Feasibility Evaluation Method</w:t>
@@ -3089,16 +3147,8 @@
               <w:rPr>
                 <w:lang w:val="en-AE"/>
               </w:rPr>
-              <w:t xml:space="preserve">Architecture complexity, software availability, integration effort, performance, fallback </w:t>
-            </w:r>
-            <w:proofErr w:type="spellStart"/>
-            <w:r>
-              <w:rPr>
-                <w:lang w:val="en-AE"/>
-              </w:rPr>
-              <w:t>behavior</w:t>
-            </w:r>
-            <w:proofErr w:type="spellEnd"/>
+              <w:t>Architecture complexity, software availability, integration effort, performance, fallback behavior</w:t>
+            </w:r>
           </w:p>
         </w:tc>
       </w:tr>
@@ -3340,6 +3390,7 @@
               <w:rPr>
                 <w:lang w:val="en-AE"/>
               </w:rPr>
+              <w:lastRenderedPageBreak/>
               <w:t>Financial</w:t>
             </w:r>
           </w:p>
@@ -3629,6 +3680,8 @@
         <w:rPr>
           <w:b/>
           <w:bCs/>
+          <w:sz w:val="26"/>
+          <w:szCs w:val="26"/>
           <w:lang w:val="en-AE"/>
         </w:rPr>
       </w:pPr>
@@ -3636,9 +3689,31 @@
         <w:rPr>
           <w:b/>
           <w:bCs/>
+          <w:sz w:val="26"/>
+          <w:szCs w:val="26"/>
           <w:lang w:val="en-AE"/>
         </w:rPr>
-        <w:t>3 1 Evidence and Limitations</w:t>
+        <w:t>3</w:t>
+      </w:r>
+      <w:r>
+        <w:rPr>
+          <w:b/>
+          <w:bCs/>
+          <w:sz w:val="26"/>
+          <w:szCs w:val="26"/>
+          <w:lang w:val="en-AE"/>
+        </w:rPr>
+        <w:t>.</w:t>
+      </w:r>
+      <w:r>
+        <w:rPr>
+          <w:b/>
+          <w:bCs/>
+          <w:sz w:val="26"/>
+          <w:szCs w:val="26"/>
+          <w:lang w:val="en-AE"/>
+        </w:rPr>
+        <w:t xml:space="preserve"> 1 Evidence and Limitations</w:t>
       </w:r>
     </w:p>
     <w:p>
@@ -3659,6 +3734,8 @@
         <w:rPr>
           <w:b/>
           <w:bCs/>
+          <w:sz w:val="32"/>
+          <w:szCs w:val="32"/>
           <w:lang w:val="en-AE"/>
         </w:rPr>
       </w:pPr>
@@ -3666,6 +3743,8 @@
         <w:rPr>
           <w:b/>
           <w:bCs/>
+          <w:sz w:val="32"/>
+          <w:szCs w:val="32"/>
           <w:lang w:val="en-AE"/>
         </w:rPr>
         <w:t>4 Technical Feasibility</w:t>
@@ -3717,14 +3796,7 @@
         <w:rPr>
           <w:lang w:val="en-AE"/>
         </w:rPr>
-        <w:t xml:space="preserve">The application should show the AI functions through a service interface. The classification function takes approved asset fields. Gives back suggested categories, tags, missing metadata, confidence and an explanation. The matching function takes a request and candidate assets. Gives back ranked suggestions. The rest of the application stays in charge of authentication, authorization, workflow status, approvals, audit records and final decisions. This setup lets the team swap a model for a local model or a deterministic rule, without having to rewrite </w:t>
-      </w:r>
-      <w:proofErr w:type="spellStart"/>
-      <w:r>
-        <w:rPr>
-          <w:lang w:val="en-AE"/>
-        </w:rPr>
-        <w:t>everything.</w:t>
+        <w:t>The application should show the AI functions through a service interface. The classification function takes approved asset fields. Gives back suggested categories, tags, missing metadata, confidence and an explanation. The matching function takes a request and candidate assets. Gives back ranked suggestions. The rest of the application stays in charge of authentication, authorization, workflow status, approvals, audit records and final decisions. This setup lets the team swap a model for a local model or a deterministic rule, without having to rewrite everything.</w:t>
       </w:r>
       <w:r>
         <w:rPr>
@@ -3732,16 +3804,7 @@
           <w:bCs/>
           <w:lang w:val="en-AE"/>
         </w:rPr>
-        <w:t>Table</w:t>
-      </w:r>
-      <w:proofErr w:type="spellEnd"/>
-      <w:r>
-        <w:rPr>
-          <w:b/>
-          <w:bCs/>
-          <w:lang w:val="en-AE"/>
-        </w:rPr>
-        <w:t xml:space="preserve"> 4 Technical Component Feasibility</w:t>
+        <w:t>Table 4 Technical Component Feasibility</w:t>
       </w:r>
     </w:p>
     <w:tbl>
@@ -3799,6 +3862,7 @@
                 <w:bCs/>
                 <w:lang w:val="en-AE"/>
               </w:rPr>
+              <w:lastRenderedPageBreak/>
               <w:t>Component</w:t>
             </w:r>
           </w:p>
@@ -4916,6 +4980,8 @@
         <w:rPr>
           <w:b/>
           <w:bCs/>
+          <w:sz w:val="26"/>
+          <w:szCs w:val="26"/>
           <w:lang w:val="en-AE"/>
         </w:rPr>
       </w:pPr>
@@ -4923,9 +4989,31 @@
         <w:rPr>
           <w:b/>
           <w:bCs/>
+          <w:sz w:val="26"/>
+          <w:szCs w:val="26"/>
           <w:lang w:val="en-AE"/>
         </w:rPr>
-        <w:t>4 2 Database and Life Cycle Tracking</w:t>
+        <w:t>4</w:t>
+      </w:r>
+      <w:r>
+        <w:rPr>
+          <w:b/>
+          <w:bCs/>
+          <w:sz w:val="26"/>
+          <w:szCs w:val="26"/>
+          <w:lang w:val="en-AE"/>
+        </w:rPr>
+        <w:t>.</w:t>
+      </w:r>
+      <w:r>
+        <w:rPr>
+          <w:b/>
+          <w:bCs/>
+          <w:sz w:val="26"/>
+          <w:szCs w:val="26"/>
+          <w:lang w:val="en-AE"/>
+        </w:rPr>
+        <w:t xml:space="preserve"> 2 Database and Life Cycle Tracking</w:t>
       </w:r>
     </w:p>
     <w:p>
@@ -4959,6 +5047,8 @@
         <w:rPr>
           <w:b/>
           <w:bCs/>
+          <w:sz w:val="26"/>
+          <w:szCs w:val="26"/>
           <w:lang w:val="en-AE"/>
         </w:rPr>
       </w:pPr>
@@ -4966,9 +5056,31 @@
         <w:rPr>
           <w:b/>
           <w:bCs/>
+          <w:sz w:val="26"/>
+          <w:szCs w:val="26"/>
           <w:lang w:val="en-AE"/>
         </w:rPr>
-        <w:t>4 3 Performance. Reliability</w:t>
+        <w:t>4</w:t>
+      </w:r>
+      <w:r>
+        <w:rPr>
+          <w:b/>
+          <w:bCs/>
+          <w:sz w:val="26"/>
+          <w:szCs w:val="26"/>
+          <w:lang w:val="en-AE"/>
+        </w:rPr>
+        <w:t>.</w:t>
+      </w:r>
+      <w:r>
+        <w:rPr>
+          <w:b/>
+          <w:bCs/>
+          <w:sz w:val="26"/>
+          <w:szCs w:val="26"/>
+          <w:lang w:val="en-AE"/>
+        </w:rPr>
+        <w:t xml:space="preserve"> 3 Performance. Reliability</w:t>
       </w:r>
     </w:p>
     <w:p>
@@ -4981,6 +5093,7 @@
         <w:rPr>
           <w:lang w:val="en-AE"/>
         </w:rPr>
+        <w:lastRenderedPageBreak/>
         <w:t>I think the prototype will not need transactions so one application instance and one relational database will be enough for the course. The team still needs to index fields that are often filtered such, as category, department, condition, status, location and availability. Large photographs and documents should stay outside database rows. AI operations should use timeouts, retries and run asynchronously when a request might take several seconds. If a classification fails it should not stop an user from saving an asset manually.</w:t>
       </w:r>
     </w:p>
@@ -4989,6 +5102,8 @@
         <w:rPr>
           <w:b/>
           <w:bCs/>
+          <w:sz w:val="26"/>
+          <w:szCs w:val="26"/>
           <w:lang w:val="en-AE"/>
         </w:rPr>
       </w:pPr>
@@ -4996,9 +5111,31 @@
         <w:rPr>
           <w:b/>
           <w:bCs/>
+          <w:sz w:val="26"/>
+          <w:szCs w:val="26"/>
           <w:lang w:val="en-AE"/>
         </w:rPr>
-        <w:t>4 4 Security Engineering Feasibility</w:t>
+        <w:t>4</w:t>
+      </w:r>
+      <w:r>
+        <w:rPr>
+          <w:b/>
+          <w:bCs/>
+          <w:sz w:val="26"/>
+          <w:szCs w:val="26"/>
+          <w:lang w:val="en-AE"/>
+        </w:rPr>
+        <w:t>.</w:t>
+      </w:r>
+      <w:r>
+        <w:rPr>
+          <w:b/>
+          <w:bCs/>
+          <w:sz w:val="26"/>
+          <w:szCs w:val="26"/>
+          <w:lang w:val="en-AE"/>
+        </w:rPr>
+        <w:t xml:space="preserve"> 4 Security Engineering Feasibility</w:t>
       </w:r>
     </w:p>
     <w:p>
@@ -5019,6 +5156,8 @@
         <w:rPr>
           <w:b/>
           <w:bCs/>
+          <w:sz w:val="32"/>
+          <w:szCs w:val="32"/>
           <w:lang w:val="en-AE"/>
         </w:rPr>
       </w:pPr>
@@ -5026,6 +5165,8 @@
         <w:rPr>
           <w:b/>
           <w:bCs/>
+          <w:sz w:val="32"/>
+          <w:szCs w:val="32"/>
           <w:lang w:val="en-AE"/>
         </w:rPr>
         <w:t>5 Data and AI Feasibility</w:t>
@@ -5075,6 +5216,8 @@
         <w:rPr>
           <w:b/>
           <w:bCs/>
+          <w:sz w:val="26"/>
+          <w:szCs w:val="26"/>
           <w:lang w:val="en-AE"/>
         </w:rPr>
       </w:pPr>
@@ -5082,9 +5225,31 @@
         <w:rPr>
           <w:b/>
           <w:bCs/>
+          <w:sz w:val="26"/>
+          <w:szCs w:val="26"/>
           <w:lang w:val="en-AE"/>
         </w:rPr>
-        <w:t>5 1 Data Readiness</w:t>
+        <w:t>5</w:t>
+      </w:r>
+      <w:r>
+        <w:rPr>
+          <w:b/>
+          <w:bCs/>
+          <w:sz w:val="26"/>
+          <w:szCs w:val="26"/>
+          <w:lang w:val="en-AE"/>
+        </w:rPr>
+        <w:t>.</w:t>
+      </w:r>
+      <w:r>
+        <w:rPr>
+          <w:b/>
+          <w:bCs/>
+          <w:sz w:val="26"/>
+          <w:szCs w:val="26"/>
+          <w:lang w:val="en-AE"/>
+        </w:rPr>
+        <w:t xml:space="preserve"> 1 Data Readiness</w:t>
       </w:r>
     </w:p>
     <w:p>
@@ -5710,6 +5875,7 @@
               <w:rPr>
                 <w:lang w:val="en-AE"/>
               </w:rPr>
+              <w:lastRenderedPageBreak/>
               <w:t>Maintenance history</w:t>
             </w:r>
           </w:p>
@@ -5910,21 +6076,7 @@
               <w:rPr>
                 <w:lang w:val="en-AE"/>
               </w:rPr>
-              <w:t xml:space="preserve">Use clearly </w:t>
-            </w:r>
-            <w:proofErr w:type="spellStart"/>
-            <w:r>
-              <w:rPr>
-                <w:lang w:val="en-AE"/>
-              </w:rPr>
-              <w:t>labeled</w:t>
-            </w:r>
-            <w:proofErr w:type="spellEnd"/>
-            <w:r>
-              <w:rPr>
-                <w:lang w:val="en-AE"/>
-              </w:rPr>
-              <w:t xml:space="preserve"> sample reference values</w:t>
+              <w:t>Use clearly labeled sample reference values</w:t>
             </w:r>
           </w:p>
         </w:tc>
@@ -6244,6 +6396,8 @@
         <w:rPr>
           <w:b/>
           <w:bCs/>
+          <w:sz w:val="26"/>
+          <w:szCs w:val="26"/>
           <w:lang w:val="en-AE"/>
         </w:rPr>
       </w:pPr>
@@ -6251,9 +6405,31 @@
         <w:rPr>
           <w:b/>
           <w:bCs/>
+          <w:sz w:val="26"/>
+          <w:szCs w:val="26"/>
           <w:lang w:val="en-AE"/>
         </w:rPr>
-        <w:t>5 2 AI Assisted Classification</w:t>
+        <w:t>5</w:t>
+      </w:r>
+      <w:r>
+        <w:rPr>
+          <w:b/>
+          <w:bCs/>
+          <w:sz w:val="26"/>
+          <w:szCs w:val="26"/>
+          <w:lang w:val="en-AE"/>
+        </w:rPr>
+        <w:t>.</w:t>
+      </w:r>
+      <w:r>
+        <w:rPr>
+          <w:b/>
+          <w:bCs/>
+          <w:sz w:val="26"/>
+          <w:szCs w:val="26"/>
+          <w:lang w:val="en-AE"/>
+        </w:rPr>
+        <w:t xml:space="preserve"> 2 AI Assisted Classification</w:t>
       </w:r>
     </w:p>
     <w:p>
@@ -6266,21 +6442,7 @@
         <w:rPr>
           <w:lang w:val="en-AE"/>
         </w:rPr>
-        <w:t xml:space="preserve">Classification can work well as a help tool. A person can type an asset title, description, specifications. Optionally add a picture. The AI service might propose a Classification, subcategory, material tag or a missing field. The interface should display the Classification suggestion of quietly changing the person’s own input. To judge the AI use a </w:t>
-      </w:r>
-      <w:proofErr w:type="spellStart"/>
-      <w:r>
-        <w:rPr>
-          <w:lang w:val="en-AE"/>
-        </w:rPr>
-        <w:t>labeled</w:t>
-      </w:r>
-      <w:proofErr w:type="spellEnd"/>
-      <w:r>
-        <w:rPr>
-          <w:lang w:val="en-AE"/>
-        </w:rPr>
-        <w:t xml:space="preserve"> test set that the model did not see during creation. The team can track Classification accuracy, top</w:t>
+        <w:t>Classification can work well as a help tool. A person can type an asset title, description, specifications. Optionally add a picture. The AI service might propose a Classification, subcategory, material tag or a missing field. The interface should display the Classification suggestion of quietly changing the person’s own input. To judge the AI use a labeled test set that the model did not see during creation. The team can track Classification accuracy, top</w:t>
       </w:r>
       <w:r>
         <w:rPr>
@@ -6301,6 +6463,8 @@
         <w:rPr>
           <w:b/>
           <w:bCs/>
+          <w:sz w:val="26"/>
+          <w:szCs w:val="26"/>
           <w:lang w:val="en-AE"/>
         </w:rPr>
       </w:pPr>
@@ -6308,9 +6472,31 @@
         <w:rPr>
           <w:b/>
           <w:bCs/>
+          <w:sz w:val="26"/>
+          <w:szCs w:val="26"/>
           <w:lang w:val="en-AE"/>
         </w:rPr>
-        <w:t>5 3 Semantic Matching and Ranking</w:t>
+        <w:t>5</w:t>
+      </w:r>
+      <w:r>
+        <w:rPr>
+          <w:b/>
+          <w:bCs/>
+          <w:sz w:val="26"/>
+          <w:szCs w:val="26"/>
+          <w:lang w:val="en-AE"/>
+        </w:rPr>
+        <w:t>.</w:t>
+      </w:r>
+      <w:r>
+        <w:rPr>
+          <w:b/>
+          <w:bCs/>
+          <w:sz w:val="26"/>
+          <w:szCs w:val="26"/>
+          <w:lang w:val="en-AE"/>
+        </w:rPr>
+        <w:t xml:space="preserve"> 3 Semantic Matching and Ranking</w:t>
       </w:r>
     </w:p>
     <w:p>
@@ -6331,6 +6517,8 @@
         <w:rPr>
           <w:b/>
           <w:bCs/>
+          <w:sz w:val="26"/>
+          <w:szCs w:val="26"/>
           <w:lang w:val="en-AE"/>
         </w:rPr>
       </w:pPr>
@@ -6338,9 +6526,31 @@
         <w:rPr>
           <w:b/>
           <w:bCs/>
+          <w:sz w:val="26"/>
+          <w:szCs w:val="26"/>
           <w:lang w:val="en-AE"/>
         </w:rPr>
-        <w:t>5 4 Sustainable Action Recommendations</w:t>
+        <w:t>5</w:t>
+      </w:r>
+      <w:r>
+        <w:rPr>
+          <w:b/>
+          <w:bCs/>
+          <w:sz w:val="26"/>
+          <w:szCs w:val="26"/>
+          <w:lang w:val="en-AE"/>
+        </w:rPr>
+        <w:t>.</w:t>
+      </w:r>
+      <w:r>
+        <w:rPr>
+          <w:b/>
+          <w:bCs/>
+          <w:sz w:val="26"/>
+          <w:szCs w:val="26"/>
+          <w:lang w:val="en-AE"/>
+        </w:rPr>
+        <w:t xml:space="preserve"> 4 Sustainable Action Recommendations</w:t>
       </w:r>
     </w:p>
     <w:p>
@@ -6353,7 +6563,14 @@
         <w:rPr>
           <w:lang w:val="en-AE"/>
         </w:rPr>
-        <w:t>Recommendations about repair, transfer, donation, recycling or disposal can change safety, ownership and cost. The prototype should use decision rules for hard limits, such as unavailable status, required inspection, hazardous material handling or missing approval. AI can sum up the factors and rank the allowed options but a user, with permission must make the final choice. Disposal must stay a controlled step and must never happen just because a language model gave a convincing explanation.</w:t>
+        <w:t xml:space="preserve">Recommendations about repair, transfer, donation, recycling or disposal can change safety, ownership and cost. The prototype should use decision rules for hard limits, such as unavailable status, required inspection, hazardous material handling or missing approval. AI can sum up the factors and rank the </w:t>
+      </w:r>
+      <w:r>
+        <w:rPr>
+          <w:lang w:val="en-AE"/>
+        </w:rPr>
+        <w:lastRenderedPageBreak/>
+        <w:t>allowed options but a user, with permission must make the final choice. Disposal must stay a controlled step and must never happen just because a language model gave a convincing explanation.</w:t>
       </w:r>
     </w:p>
     <w:p>
@@ -6361,6 +6578,8 @@
         <w:rPr>
           <w:b/>
           <w:bCs/>
+          <w:sz w:val="26"/>
+          <w:szCs w:val="26"/>
           <w:lang w:val="en-AE"/>
         </w:rPr>
       </w:pPr>
@@ -6368,9 +6587,31 @@
         <w:rPr>
           <w:b/>
           <w:bCs/>
+          <w:sz w:val="26"/>
+          <w:szCs w:val="26"/>
           <w:lang w:val="en-AE"/>
         </w:rPr>
-        <w:t>5 5 LLM Assistant and Generated Reports</w:t>
+        <w:t>5</w:t>
+      </w:r>
+      <w:r>
+        <w:rPr>
+          <w:b/>
+          <w:bCs/>
+          <w:sz w:val="26"/>
+          <w:szCs w:val="26"/>
+          <w:lang w:val="en-AE"/>
+        </w:rPr>
+        <w:t>.</w:t>
+      </w:r>
+      <w:r>
+        <w:rPr>
+          <w:b/>
+          <w:bCs/>
+          <w:sz w:val="26"/>
+          <w:szCs w:val="26"/>
+          <w:lang w:val="en-AE"/>
+        </w:rPr>
+        <w:t xml:space="preserve"> 5 LLM Assistant and Generated Reports</w:t>
       </w:r>
     </w:p>
     <w:p>
@@ -6391,6 +6632,8 @@
         <w:rPr>
           <w:b/>
           <w:bCs/>
+          <w:sz w:val="26"/>
+          <w:szCs w:val="26"/>
           <w:lang w:val="en-AE"/>
         </w:rPr>
       </w:pPr>
@@ -6398,6 +6641,18 @@
         <w:rPr>
           <w:b/>
           <w:bCs/>
+          <w:sz w:val="26"/>
+          <w:szCs w:val="26"/>
+          <w:lang w:val="en-AE"/>
+        </w:rPr>
+        <w:t>5</w:t>
+      </w:r>
+      <w:r>
+        <w:rPr>
+          <w:b/>
+          <w:bCs/>
+          <w:sz w:val="26"/>
+          <w:szCs w:val="26"/>
           <w:lang w:val="en-AE"/>
         </w:rPr>
         <w:t>.</w:t>
@@ -6406,9 +6661,11 @@
         <w:rPr>
           <w:b/>
           <w:bCs/>
+          <w:sz w:val="26"/>
+          <w:szCs w:val="26"/>
           <w:lang w:val="en-AE"/>
         </w:rPr>
-        <w:t>5 6 AI Failure and Fallback</w:t>
+        <w:t xml:space="preserve"> 6 AI Failure and Fallback</w:t>
       </w:r>
     </w:p>
     <w:p>
@@ -6501,6 +6758,8 @@
         <w:rPr>
           <w:b/>
           <w:bCs/>
+          <w:sz w:val="32"/>
+          <w:szCs w:val="32"/>
           <w:lang w:val="en-AE"/>
         </w:rPr>
       </w:pPr>
@@ -6508,6 +6767,8 @@
         <w:rPr>
           <w:b/>
           <w:bCs/>
+          <w:sz w:val="32"/>
+          <w:szCs w:val="32"/>
           <w:lang w:val="en-AE"/>
         </w:rPr>
         <w:t>6 Financial Feasibility</w:t>
@@ -6523,21 +6784,7 @@
         <w:rPr>
           <w:lang w:val="en-AE"/>
         </w:rPr>
-        <w:t xml:space="preserve">Financial feasibility is acceptable, for a student prototype. Phase 1 already identified the resources as the two team members, personal or university computers, Git and GitHub development tools, a database, </w:t>
-      </w:r>
-      <w:proofErr w:type="spellStart"/>
-      <w:r>
-        <w:rPr>
-          <w:lang w:val="en-AE"/>
-        </w:rPr>
-        <w:t>modeling</w:t>
-      </w:r>
-      <w:proofErr w:type="spellEnd"/>
-      <w:r>
-        <w:rPr>
-          <w:lang w:val="en-AE"/>
-        </w:rPr>
-        <w:t xml:space="preserve"> tools, testing tools and AI libraries or services. Most can be used without payment. The main uncertain costs are hosting external AI calls, file storage, backups and any future integration or security work.</w:t>
+        <w:t>Financial feasibility is acceptable, for a student prototype. Phase 1 already identified the resources as the two team members, personal or university computers, Git and GitHub development tools, a database, modeling tools, testing tools and AI libraries or services. Most can be used without payment. The main uncertain costs are hosting external AI calls, file storage, backups and any future integration or security work.</w:t>
       </w:r>
     </w:p>
     <w:p>
@@ -6545,6 +6792,8 @@
         <w:rPr>
           <w:b/>
           <w:bCs/>
+          <w:sz w:val="26"/>
+          <w:szCs w:val="26"/>
           <w:lang w:val="en-AE"/>
         </w:rPr>
       </w:pPr>
@@ -6552,9 +6801,31 @@
         <w:rPr>
           <w:b/>
           <w:bCs/>
+          <w:sz w:val="26"/>
+          <w:szCs w:val="26"/>
           <w:lang w:val="en-AE"/>
         </w:rPr>
-        <w:t>6 1 Prototype Cost Assumptions</w:t>
+        <w:t>6</w:t>
+      </w:r>
+      <w:r>
+        <w:rPr>
+          <w:b/>
+          <w:bCs/>
+          <w:sz w:val="26"/>
+          <w:szCs w:val="26"/>
+          <w:lang w:val="en-AE"/>
+        </w:rPr>
+        <w:t>.</w:t>
+      </w:r>
+      <w:r>
+        <w:rPr>
+          <w:b/>
+          <w:bCs/>
+          <w:sz w:val="26"/>
+          <w:szCs w:val="26"/>
+          <w:lang w:val="en-AE"/>
+        </w:rPr>
+        <w:t xml:space="preserve"> 1 Prototype Cost Assumptions</w:t>
       </w:r>
     </w:p>
     <w:p>
@@ -6840,21 +7111,7 @@
               <w:rPr>
                 <w:lang w:val="en-AE"/>
               </w:rPr>
-              <w:t xml:space="preserve">Development and </w:t>
-            </w:r>
-            <w:proofErr w:type="spellStart"/>
-            <w:r>
-              <w:rPr>
-                <w:lang w:val="en-AE"/>
-              </w:rPr>
-              <w:t>modeling</w:t>
-            </w:r>
-            <w:proofErr w:type="spellEnd"/>
-            <w:r>
-              <w:rPr>
-                <w:lang w:val="en-AE"/>
-              </w:rPr>
-              <w:t xml:space="preserve"> tools</w:t>
+              <w:t>Development and modeling tools</w:t>
             </w:r>
           </w:p>
         </w:tc>
@@ -7059,6 +7316,7 @@
               <w:rPr>
                 <w:lang w:val="en-AE"/>
               </w:rPr>
+              <w:lastRenderedPageBreak/>
               <w:t>Prototype hosting</w:t>
             </w:r>
           </w:p>
@@ -7535,21 +7793,7 @@
               <w:rPr>
                 <w:lang w:val="en-AE"/>
               </w:rPr>
-              <w:t xml:space="preserve">Excludes student </w:t>
-            </w:r>
-            <w:proofErr w:type="spellStart"/>
-            <w:r>
-              <w:rPr>
-                <w:lang w:val="en-AE"/>
-              </w:rPr>
-              <w:t>labor</w:t>
-            </w:r>
-            <w:proofErr w:type="spellEnd"/>
-            <w:r>
-              <w:rPr>
-                <w:lang w:val="en-AE"/>
-              </w:rPr>
-              <w:t xml:space="preserve"> and any production deployment</w:t>
+              <w:t>Excludes student labor and any production deployment</w:t>
             </w:r>
           </w:p>
         </w:tc>
@@ -7574,25 +7818,7 @@
           <w:iCs/>
           <w:lang w:val="en-AE"/>
         </w:rPr>
-        <w:t xml:space="preserve">These values are feasibility assumptions, not quotations. The project should be designed so the lower end remains possible. Any paid service should have a spending cap, an owner, usage logging, and a replacement path. Student </w:t>
-      </w:r>
-      <w:proofErr w:type="spellStart"/>
-      <w:r>
-        <w:rPr>
-          <w:i/>
-          <w:iCs/>
-          <w:lang w:val="en-AE"/>
-        </w:rPr>
-        <w:t>labor</w:t>
-      </w:r>
-      <w:proofErr w:type="spellEnd"/>
-      <w:r>
-        <w:rPr>
-          <w:i/>
-          <w:iCs/>
-          <w:lang w:val="en-AE"/>
-        </w:rPr>
-        <w:t xml:space="preserve"> is excluded from the direct cash total because it is course work, but the schedule section treats team time as the main scarce resource.</w:t>
+        <w:t>These values are feasibility assumptions, not quotations. The project should be designed so the lower end remains possible. Any paid service should have a spending cap, an owner, usage logging, and a replacement path. Student labor is excluded from the direct cash total because it is course work, but the schedule section treats team time as the main scarce resource.</w:t>
       </w:r>
     </w:p>
     <w:p>
@@ -7600,6 +7826,8 @@
         <w:rPr>
           <w:b/>
           <w:bCs/>
+          <w:sz w:val="26"/>
+          <w:szCs w:val="26"/>
           <w:lang w:val="en-AE"/>
         </w:rPr>
       </w:pPr>
@@ -7607,9 +7835,31 @@
         <w:rPr>
           <w:b/>
           <w:bCs/>
+          <w:sz w:val="26"/>
+          <w:szCs w:val="26"/>
           <w:lang w:val="en-AE"/>
         </w:rPr>
-        <w:t>6 2 Potential Benefits</w:t>
+        <w:t>6</w:t>
+      </w:r>
+      <w:r>
+        <w:rPr>
+          <w:b/>
+          <w:bCs/>
+          <w:sz w:val="26"/>
+          <w:szCs w:val="26"/>
+          <w:lang w:val="en-AE"/>
+        </w:rPr>
+        <w:t>.</w:t>
+      </w:r>
+      <w:r>
+        <w:rPr>
+          <w:b/>
+          <w:bCs/>
+          <w:sz w:val="26"/>
+          <w:szCs w:val="26"/>
+          <w:lang w:val="en-AE"/>
+        </w:rPr>
+        <w:t xml:space="preserve"> 2 Potential Benefits</w:t>
       </w:r>
     </w:p>
     <w:p>
@@ -7630,6 +7880,8 @@
         <w:rPr>
           <w:b/>
           <w:bCs/>
+          <w:sz w:val="26"/>
+          <w:szCs w:val="26"/>
           <w:lang w:val="en-AE"/>
         </w:rPr>
       </w:pPr>
@@ -7637,9 +7889,31 @@
         <w:rPr>
           <w:b/>
           <w:bCs/>
+          <w:sz w:val="26"/>
+          <w:szCs w:val="26"/>
           <w:lang w:val="en-AE"/>
         </w:rPr>
-        <w:t>6 3 Production Cost Gap</w:t>
+        <w:t>6</w:t>
+      </w:r>
+      <w:r>
+        <w:rPr>
+          <w:b/>
+          <w:bCs/>
+          <w:sz w:val="26"/>
+          <w:szCs w:val="26"/>
+          <w:lang w:val="en-AE"/>
+        </w:rPr>
+        <w:t>.</w:t>
+      </w:r>
+      <w:r>
+        <w:rPr>
+          <w:b/>
+          <w:bCs/>
+          <w:sz w:val="26"/>
+          <w:szCs w:val="26"/>
+          <w:lang w:val="en-AE"/>
+        </w:rPr>
+        <w:t xml:space="preserve"> 3 Production Cost Gap</w:t>
       </w:r>
     </w:p>
     <w:p>
@@ -7657,14 +7931,3603 @@
     </w:p>
     <w:p>
       <w:pPr>
+        <w:pStyle w:val="Heading1"/>
         <w:rPr>
+          <w:b w:val="0"/>
+          <w:bCs w:val="0"/>
+          <w:color w:val="000000" w:themeColor="text1"/>
+          <w:szCs w:val="32"/>
+        </w:rPr>
+      </w:pPr>
+      <w:r>
+        <w:rPr>
+          <w:color w:val="000000" w:themeColor="text1"/>
+          <w:szCs w:val="32"/>
+        </w:rPr>
+        <w:lastRenderedPageBreak/>
+        <w:t>7 Operational Feasibility</w:t>
+      </w:r>
+    </w:p>
+    <w:p>
+      <w:r>
+        <w:t>Operational feasibility is moderate to high because the proposed system follows recognizable university responsibilities. The workflow becomes difficult only if the application requires duplicate data entry, unclear ownership, or too many approval steps. The prototype should prove that each role can complete its part without seeing or changing unrelated information.</w:t>
+      </w:r>
+    </w:p>
+    <w:p>
+      <w:pPr>
+        <w:pStyle w:val="Heading2"/>
+        <w:rPr>
+          <w:b w:val="0"/>
+          <w:bCs w:val="0"/>
+          <w:color w:val="000000" w:themeColor="text1"/>
+        </w:rPr>
+      </w:pPr>
+      <w:r>
+        <w:rPr>
+          <w:color w:val="000000" w:themeColor="text1"/>
+        </w:rPr>
+        <w:t>7. 1 Proposed Operating Workflow</w:t>
+      </w:r>
+    </w:p>
+    <w:p>
+      <w:pPr>
+        <w:spacing w:after="60" w:line="269" w:lineRule="auto"/>
+        <w:ind w:left="490" w:hanging="403"/>
+        <w:rPr>
+          <w:color w:val="000000" w:themeColor="text1"/>
+        </w:rPr>
+      </w:pPr>
+      <w:r>
+        <w:rPr>
+          <w:color w:val="000000" w:themeColor="text1"/>
+        </w:rPr>
+        <w:t>1.  A department representative registers an asset or updates an approved record.</w:t>
+      </w:r>
+    </w:p>
+    <w:p>
+      <w:pPr>
+        <w:spacing w:after="60" w:line="269" w:lineRule="auto"/>
+        <w:ind w:left="490" w:hanging="403"/>
+        <w:rPr>
+          <w:color w:val="000000" w:themeColor="text1"/>
+        </w:rPr>
+      </w:pPr>
+      <w:r>
+        <w:rPr>
+          <w:color w:val="000000" w:themeColor="text1"/>
+        </w:rPr>
+        <w:t>2.  An asset custodian verifies condition, location, custody, and whether the item can be published.</w:t>
+      </w:r>
+    </w:p>
+    <w:p>
+      <w:pPr>
+        <w:spacing w:after="60" w:line="269" w:lineRule="auto"/>
+        <w:ind w:left="490" w:hanging="403"/>
+        <w:rPr>
+          <w:color w:val="000000" w:themeColor="text1"/>
+        </w:rPr>
+      </w:pPr>
+      <w:r>
+        <w:rPr>
+          <w:color w:val="000000" w:themeColor="text1"/>
+        </w:rPr>
+        <w:t>3.  A requester searches available records or submits a structured need.</w:t>
+      </w:r>
+    </w:p>
+    <w:p>
+      <w:pPr>
+        <w:spacing w:after="60" w:line="269" w:lineRule="auto"/>
+        <w:ind w:left="490" w:hanging="403"/>
+        <w:rPr>
+          <w:color w:val="000000" w:themeColor="text1"/>
+        </w:rPr>
+      </w:pPr>
+      <w:r>
+        <w:rPr>
+          <w:color w:val="000000" w:themeColor="text1"/>
+        </w:rPr>
+        <w:t>4.  The system returns rule-based results and optional AI-ranked recommendations with explanations.</w:t>
+      </w:r>
+    </w:p>
+    <w:p>
+      <w:pPr>
+        <w:spacing w:after="60" w:line="269" w:lineRule="auto"/>
+        <w:ind w:left="490" w:hanging="403"/>
+        <w:rPr>
+          <w:color w:val="000000" w:themeColor="text1"/>
+        </w:rPr>
+      </w:pPr>
+      <w:r>
+        <w:rPr>
+          <w:color w:val="000000" w:themeColor="text1"/>
+        </w:rPr>
+        <w:t>5.  Authorized staff review the request, confirm availability, and approve or reject the proposed release and transfer.</w:t>
+      </w:r>
+    </w:p>
+    <w:p>
+      <w:pPr>
+        <w:spacing w:after="60" w:line="269" w:lineRule="auto"/>
+        <w:ind w:left="490" w:hanging="403"/>
+        <w:rPr>
+          <w:color w:val="000000" w:themeColor="text1"/>
+        </w:rPr>
+      </w:pPr>
+      <w:r>
+        <w:rPr>
+          <w:color w:val="000000" w:themeColor="text1"/>
+        </w:rPr>
+        <w:t>6.  The system records collection or delivery, custody change, new location, and receipt confirmation.</w:t>
+      </w:r>
+    </w:p>
+    <w:p>
+      <w:pPr>
+        <w:spacing w:after="60" w:line="269" w:lineRule="auto"/>
+        <w:ind w:left="490" w:hanging="403"/>
+        <w:rPr>
+          <w:color w:val="000000" w:themeColor="text1"/>
+        </w:rPr>
+      </w:pPr>
+      <w:r>
+        <w:rPr>
+          <w:color w:val="000000" w:themeColor="text1"/>
+        </w:rPr>
+        <w:t>7.  Maintenance and sustainability events update the life cycle history and reporting measures.</w:t>
+      </w:r>
+    </w:p>
+    <w:p>
+      <w:pPr>
+        <w:pStyle w:val="Heading2"/>
+        <w:rPr>
+          <w:b w:val="0"/>
+          <w:bCs w:val="0"/>
+          <w:color w:val="000000" w:themeColor="text1"/>
+        </w:rPr>
+      </w:pPr>
+      <w:r>
+        <w:rPr>
+          <w:color w:val="000000" w:themeColor="text1"/>
+        </w:rPr>
+        <w:t>7. 2 Adoption Conditions</w:t>
+      </w:r>
+    </w:p>
+    <w:p>
+      <w:pPr>
+        <w:pStyle w:val="Caption"/>
+        <w:keepNext/>
+        <w:spacing w:before="80"/>
+        <w:jc w:val="center"/>
+      </w:pPr>
+      <w:r>
+        <w:t>Table 7 Operational Adoption Conditions</w:t>
+      </w:r>
+    </w:p>
+    <w:tbl>
+      <w:tblPr>
+        <w:tblW w:w="0" w:type="auto"/>
+        <w:jc w:val="center"/>
+        <w:tblBorders>
+          <w:top w:val="single" w:sz="6" w:space="0" w:color="D9D9D9"/>
+          <w:left w:val="single" w:sz="6" w:space="0" w:color="D9D9D9"/>
+          <w:bottom w:val="single" w:sz="6" w:space="0" w:color="D9D9D9"/>
+          <w:right w:val="single" w:sz="6" w:space="0" w:color="D9D9D9"/>
+          <w:insideH w:val="single" w:sz="6" w:space="0" w:color="D9D9D9"/>
+          <w:insideV w:val="single" w:sz="6" w:space="0" w:color="D9D9D9"/>
+        </w:tblBorders>
+        <w:tblLayout w:type="fixed"/>
+        <w:tblLook w:val="04A0" w:firstRow="1" w:lastRow="0" w:firstColumn="1" w:lastColumn="0" w:noHBand="0" w:noVBand="1"/>
+      </w:tblPr>
+      <w:tblGrid>
+        <w:gridCol w:w="4077"/>
+        <w:gridCol w:w="5420"/>
+      </w:tblGrid>
+      <w:tr>
+        <w:trPr>
+          <w:cantSplit/>
+          <w:tblHeader/>
+          <w:jc w:val="center"/>
+        </w:trPr>
+        <w:tc>
+          <w:tcPr>
+            <w:tcW w:w="4077" w:type="dxa"/>
+            <w:shd w:val="clear" w:color="auto" w:fill="17365D"/>
+            <w:tcMar>
+              <w:top w:w="105" w:type="dxa"/>
+              <w:left w:w="115" w:type="dxa"/>
+              <w:bottom w:w="105" w:type="dxa"/>
+              <w:right w:w="115" w:type="dxa"/>
+            </w:tcMar>
+            <w:vAlign w:val="center"/>
+          </w:tcPr>
+          <w:p>
+            <w:pPr>
+              <w:spacing w:after="0" w:line="240" w:lineRule="auto"/>
+              <w:jc w:val="center"/>
+            </w:pPr>
+            <w:r>
+              <w:rPr>
+                <w:b/>
+                <w:color w:val="FFFFFF"/>
+                <w:sz w:val="18"/>
+              </w:rPr>
+              <w:t>Condition</w:t>
+            </w:r>
+          </w:p>
+        </w:tc>
+        <w:tc>
+          <w:tcPr>
+            <w:tcW w:w="5420" w:type="dxa"/>
+            <w:shd w:val="clear" w:color="auto" w:fill="17365D"/>
+            <w:tcMar>
+              <w:top w:w="105" w:type="dxa"/>
+              <w:left w:w="115" w:type="dxa"/>
+              <w:bottom w:w="105" w:type="dxa"/>
+              <w:right w:w="115" w:type="dxa"/>
+            </w:tcMar>
+            <w:vAlign w:val="center"/>
+          </w:tcPr>
+          <w:p>
+            <w:pPr>
+              <w:spacing w:after="0" w:line="240" w:lineRule="auto"/>
+              <w:jc w:val="center"/>
+            </w:pPr>
+            <w:r>
+              <w:rPr>
+                <w:b/>
+                <w:color w:val="FFFFFF"/>
+                <w:sz w:val="18"/>
+              </w:rPr>
+              <w:t>Why It Matters</w:t>
+            </w:r>
+          </w:p>
+        </w:tc>
+      </w:tr>
+      <w:tr>
+        <w:trPr>
+          <w:cantSplit/>
+          <w:jc w:val="center"/>
+        </w:trPr>
+        <w:tc>
+          <w:tcPr>
+            <w:tcW w:w="4077" w:type="dxa"/>
+            <w:tcMar>
+              <w:top w:w="95" w:type="dxa"/>
+              <w:left w:w="110" w:type="dxa"/>
+              <w:bottom w:w="95" w:type="dxa"/>
+              <w:right w:w="110" w:type="dxa"/>
+            </w:tcMar>
+            <w:vAlign w:val="center"/>
+          </w:tcPr>
+          <w:p>
+            <w:pPr>
+              <w:spacing w:after="0" w:line="252" w:lineRule="auto"/>
+            </w:pPr>
+            <w:r>
+              <w:rPr>
+                <w:sz w:val="17"/>
+              </w:rPr>
+              <w:t>Clear ownership</w:t>
+            </w:r>
+          </w:p>
+        </w:tc>
+        <w:tc>
+          <w:tcPr>
+            <w:tcW w:w="5420" w:type="dxa"/>
+            <w:tcMar>
+              <w:top w:w="95" w:type="dxa"/>
+              <w:left w:w="110" w:type="dxa"/>
+              <w:bottom w:w="95" w:type="dxa"/>
+              <w:right w:w="110" w:type="dxa"/>
+            </w:tcMar>
+            <w:vAlign w:val="center"/>
+          </w:tcPr>
+          <w:p>
+            <w:pPr>
+              <w:spacing w:after="0" w:line="252" w:lineRule="auto"/>
+            </w:pPr>
+            <w:r>
+              <w:rPr>
+                <w:sz w:val="17"/>
+              </w:rPr>
+              <w:t>Users need to know who may publish, approve, transfer, and close records</w:t>
+            </w:r>
+          </w:p>
+        </w:tc>
+      </w:tr>
+      <w:tr>
+        <w:trPr>
+          <w:cantSplit/>
+          <w:jc w:val="center"/>
+        </w:trPr>
+        <w:tc>
+          <w:tcPr>
+            <w:tcW w:w="4077" w:type="dxa"/>
+            <w:shd w:val="clear" w:color="auto" w:fill="EAF2F8"/>
+            <w:tcMar>
+              <w:top w:w="95" w:type="dxa"/>
+              <w:left w:w="110" w:type="dxa"/>
+              <w:bottom w:w="95" w:type="dxa"/>
+              <w:right w:w="110" w:type="dxa"/>
+            </w:tcMar>
+            <w:vAlign w:val="center"/>
+          </w:tcPr>
+          <w:p>
+            <w:pPr>
+              <w:spacing w:after="0" w:line="252" w:lineRule="auto"/>
+            </w:pPr>
+            <w:r>
+              <w:rPr>
+                <w:sz w:val="17"/>
+              </w:rPr>
+              <w:t>Low entry burden</w:t>
+            </w:r>
+          </w:p>
+        </w:tc>
+        <w:tc>
+          <w:tcPr>
+            <w:tcW w:w="5420" w:type="dxa"/>
+            <w:shd w:val="clear" w:color="auto" w:fill="EAF2F8"/>
+            <w:tcMar>
+              <w:top w:w="95" w:type="dxa"/>
+              <w:left w:w="110" w:type="dxa"/>
+              <w:bottom w:w="95" w:type="dxa"/>
+              <w:right w:w="110" w:type="dxa"/>
+            </w:tcMar>
+            <w:vAlign w:val="center"/>
+          </w:tcPr>
+          <w:p>
+            <w:pPr>
+              <w:spacing w:after="0" w:line="252" w:lineRule="auto"/>
+            </w:pPr>
+            <w:r>
+              <w:rPr>
+                <w:sz w:val="17"/>
+              </w:rPr>
+              <w:t>Long forms will produce incomplete or outdated records</w:t>
+            </w:r>
+          </w:p>
+        </w:tc>
+      </w:tr>
+      <w:tr>
+        <w:trPr>
+          <w:cantSplit/>
+          <w:jc w:val="center"/>
+        </w:trPr>
+        <w:tc>
+          <w:tcPr>
+            <w:tcW w:w="4077" w:type="dxa"/>
+            <w:tcMar>
+              <w:top w:w="95" w:type="dxa"/>
+              <w:left w:w="110" w:type="dxa"/>
+              <w:bottom w:w="95" w:type="dxa"/>
+              <w:right w:w="110" w:type="dxa"/>
+            </w:tcMar>
+            <w:vAlign w:val="center"/>
+          </w:tcPr>
+          <w:p>
+            <w:pPr>
+              <w:spacing w:after="0" w:line="252" w:lineRule="auto"/>
+            </w:pPr>
+            <w:r>
+              <w:rPr>
+                <w:sz w:val="17"/>
+              </w:rPr>
+              <w:t>Visible status</w:t>
+            </w:r>
+          </w:p>
+        </w:tc>
+        <w:tc>
+          <w:tcPr>
+            <w:tcW w:w="5420" w:type="dxa"/>
+            <w:tcMar>
+              <w:top w:w="95" w:type="dxa"/>
+              <w:left w:w="110" w:type="dxa"/>
+              <w:bottom w:w="95" w:type="dxa"/>
+              <w:right w:w="110" w:type="dxa"/>
+            </w:tcMar>
+            <w:vAlign w:val="center"/>
+          </w:tcPr>
+          <w:p>
+            <w:pPr>
+              <w:spacing w:after="0" w:line="252" w:lineRule="auto"/>
+            </w:pPr>
+            <w:r>
+              <w:rPr>
+                <w:sz w:val="17"/>
+              </w:rPr>
+              <w:t>Departments need to know whether a request is waiting, approved, rejected, or completed</w:t>
+            </w:r>
+          </w:p>
+        </w:tc>
+      </w:tr>
+      <w:tr>
+        <w:trPr>
+          <w:cantSplit/>
+          <w:jc w:val="center"/>
+        </w:trPr>
+        <w:tc>
+          <w:tcPr>
+            <w:tcW w:w="4077" w:type="dxa"/>
+            <w:shd w:val="clear" w:color="auto" w:fill="EAF2F8"/>
+            <w:tcMar>
+              <w:top w:w="95" w:type="dxa"/>
+              <w:left w:w="110" w:type="dxa"/>
+              <w:bottom w:w="95" w:type="dxa"/>
+              <w:right w:w="110" w:type="dxa"/>
+            </w:tcMar>
+            <w:vAlign w:val="center"/>
+          </w:tcPr>
+          <w:p>
+            <w:pPr>
+              <w:spacing w:after="0" w:line="252" w:lineRule="auto"/>
+            </w:pPr>
+            <w:r>
+              <w:rPr>
+                <w:sz w:val="17"/>
+              </w:rPr>
+              <w:t>Reliable search</w:t>
+            </w:r>
+          </w:p>
+        </w:tc>
+        <w:tc>
+          <w:tcPr>
+            <w:tcW w:w="5420" w:type="dxa"/>
+            <w:shd w:val="clear" w:color="auto" w:fill="EAF2F8"/>
+            <w:tcMar>
+              <w:top w:w="95" w:type="dxa"/>
+              <w:left w:w="110" w:type="dxa"/>
+              <w:bottom w:w="95" w:type="dxa"/>
+              <w:right w:w="110" w:type="dxa"/>
+            </w:tcMar>
+            <w:vAlign w:val="center"/>
+          </w:tcPr>
+          <w:p>
+            <w:pPr>
+              <w:spacing w:after="0" w:line="252" w:lineRule="auto"/>
+            </w:pPr>
+            <w:r>
+              <w:rPr>
+                <w:sz w:val="17"/>
+              </w:rPr>
+              <w:t>Users will abandon the exchange if relevant assets are hard to find</w:t>
+            </w:r>
+          </w:p>
+        </w:tc>
+      </w:tr>
+      <w:tr>
+        <w:trPr>
+          <w:cantSplit/>
+          <w:jc w:val="center"/>
+        </w:trPr>
+        <w:tc>
+          <w:tcPr>
+            <w:tcW w:w="4077" w:type="dxa"/>
+            <w:tcMar>
+              <w:top w:w="95" w:type="dxa"/>
+              <w:left w:w="110" w:type="dxa"/>
+              <w:bottom w:w="95" w:type="dxa"/>
+              <w:right w:w="110" w:type="dxa"/>
+            </w:tcMar>
+            <w:vAlign w:val="center"/>
+          </w:tcPr>
+          <w:p>
+            <w:pPr>
+              <w:spacing w:after="0" w:line="252" w:lineRule="auto"/>
+            </w:pPr>
+            <w:r>
+              <w:rPr>
+                <w:sz w:val="17"/>
+              </w:rPr>
+              <w:t>Human accountability</w:t>
+            </w:r>
+          </w:p>
+        </w:tc>
+        <w:tc>
+          <w:tcPr>
+            <w:tcW w:w="5420" w:type="dxa"/>
+            <w:tcMar>
+              <w:top w:w="95" w:type="dxa"/>
+              <w:left w:w="110" w:type="dxa"/>
+              <w:bottom w:w="95" w:type="dxa"/>
+              <w:right w:w="110" w:type="dxa"/>
+            </w:tcMar>
+            <w:vAlign w:val="center"/>
+          </w:tcPr>
+          <w:p>
+            <w:pPr>
+              <w:spacing w:after="0" w:line="252" w:lineRule="auto"/>
+            </w:pPr>
+            <w:r>
+              <w:rPr>
+                <w:sz w:val="17"/>
+              </w:rPr>
+              <w:t>AI suggestions cannot replace approval or safety review</w:t>
+            </w:r>
+          </w:p>
+        </w:tc>
+      </w:tr>
+      <w:tr>
+        <w:trPr>
+          <w:cantSplit/>
+          <w:jc w:val="center"/>
+        </w:trPr>
+        <w:tc>
+          <w:tcPr>
+            <w:tcW w:w="4077" w:type="dxa"/>
+            <w:shd w:val="clear" w:color="auto" w:fill="EAF2F8"/>
+            <w:tcMar>
+              <w:top w:w="95" w:type="dxa"/>
+              <w:left w:w="110" w:type="dxa"/>
+              <w:bottom w:w="95" w:type="dxa"/>
+              <w:right w:w="110" w:type="dxa"/>
+            </w:tcMar>
+            <w:vAlign w:val="center"/>
+          </w:tcPr>
+          <w:p>
+            <w:pPr>
+              <w:spacing w:after="0" w:line="252" w:lineRule="auto"/>
+            </w:pPr>
+            <w:r>
+              <w:rPr>
+                <w:sz w:val="17"/>
+              </w:rPr>
+              <w:t>Training and help</w:t>
+            </w:r>
+          </w:p>
+        </w:tc>
+        <w:tc>
+          <w:tcPr>
+            <w:tcW w:w="5420" w:type="dxa"/>
+            <w:shd w:val="clear" w:color="auto" w:fill="EAF2F8"/>
+            <w:tcMar>
+              <w:top w:w="95" w:type="dxa"/>
+              <w:left w:w="110" w:type="dxa"/>
+              <w:bottom w:w="95" w:type="dxa"/>
+              <w:right w:w="110" w:type="dxa"/>
+            </w:tcMar>
+            <w:vAlign w:val="center"/>
+          </w:tcPr>
+          <w:p>
+            <w:pPr>
+              <w:spacing w:after="0" w:line="252" w:lineRule="auto"/>
+            </w:pPr>
+            <w:r>
+              <w:rPr>
+                <w:sz w:val="17"/>
+              </w:rPr>
+              <w:t>Different roles will use the system at different frequencies</w:t>
+            </w:r>
+          </w:p>
+        </w:tc>
+      </w:tr>
+      <w:tr>
+        <w:trPr>
+          <w:cantSplit/>
+          <w:jc w:val="center"/>
+        </w:trPr>
+        <w:tc>
+          <w:tcPr>
+            <w:tcW w:w="4077" w:type="dxa"/>
+            <w:tcMar>
+              <w:top w:w="95" w:type="dxa"/>
+              <w:left w:w="110" w:type="dxa"/>
+              <w:bottom w:w="95" w:type="dxa"/>
+              <w:right w:w="110" w:type="dxa"/>
+            </w:tcMar>
+            <w:vAlign w:val="center"/>
+          </w:tcPr>
+          <w:p>
+            <w:pPr>
+              <w:spacing w:after="0" w:line="252" w:lineRule="auto"/>
+            </w:pPr>
+            <w:r>
+              <w:rPr>
+                <w:sz w:val="17"/>
+              </w:rPr>
+              <w:t>Support path</w:t>
+            </w:r>
+          </w:p>
+        </w:tc>
+        <w:tc>
+          <w:tcPr>
+            <w:tcW w:w="5420" w:type="dxa"/>
+            <w:tcMar>
+              <w:top w:w="95" w:type="dxa"/>
+              <w:left w:w="110" w:type="dxa"/>
+              <w:bottom w:w="95" w:type="dxa"/>
+              <w:right w:w="110" w:type="dxa"/>
+            </w:tcMar>
+            <w:vAlign w:val="center"/>
+          </w:tcPr>
+          <w:p>
+            <w:pPr>
+              <w:spacing w:after="0" w:line="252" w:lineRule="auto"/>
+            </w:pPr>
+            <w:r>
+              <w:rPr>
+                <w:sz w:val="17"/>
+              </w:rPr>
+              <w:t>Incorrect records and access problems need an owner</w:t>
+            </w:r>
+          </w:p>
+        </w:tc>
+      </w:tr>
+    </w:tbl>
+    <w:p>
+      <w:pPr>
+        <w:spacing w:after="40"/>
+      </w:pPr>
+    </w:p>
+    <w:p>
+      <w:pPr>
+        <w:pStyle w:val="Heading2"/>
+        <w:rPr>
+          <w:b w:val="0"/>
+          <w:bCs w:val="0"/>
+          <w:color w:val="000000" w:themeColor="text1"/>
+        </w:rPr>
+      </w:pPr>
+      <w:r>
+        <w:rPr>
+          <w:color w:val="000000" w:themeColor="text1"/>
+        </w:rPr>
+        <w:t>7. 3 Change Management</w:t>
+      </w:r>
+    </w:p>
+    <w:p>
+      <w:pPr>
+        <w:rPr>
+          <w:color w:val="000000" w:themeColor="text1"/>
+        </w:rPr>
+      </w:pPr>
+      <w:r>
+        <w:rPr>
+          <w:color w:val="000000" w:themeColor="text1"/>
+        </w:rPr>
+        <w:t>The pilot should begin with a small number of categories and departments rather than attempting university-wide adoption. A narrow pilot makes it possible to align category names, test approval responsibilities, observe where users stop, and correct the workflow before more data accumulates. The team should collect feedback after asset registration, request submission, recommendation review, and transfer confirmation. The most useful operational metrics are task completion, time to complete, error rate, support requests, abandoned requests, and the reasons users override recommendations.</w:t>
+      </w:r>
+    </w:p>
+    <w:p>
+      <w:pPr>
+        <w:pStyle w:val="Heading1"/>
+        <w:rPr>
+          <w:b w:val="0"/>
+          <w:bCs w:val="0"/>
+          <w:color w:val="000000" w:themeColor="text1"/>
+          <w:szCs w:val="32"/>
+        </w:rPr>
+      </w:pPr>
+      <w:r>
+        <w:rPr>
+          <w:color w:val="000000" w:themeColor="text1"/>
+          <w:szCs w:val="32"/>
+        </w:rPr>
+        <w:lastRenderedPageBreak/>
+        <w:t>8 Schedule Feasibility</w:t>
+      </w:r>
+    </w:p>
+    <w:p>
+      <w:pPr>
+        <w:keepNext/>
+        <w:rPr>
+          <w:shd w:val="clear" w:color="auto" w:fill="FFFFFF"/>
+        </w:rPr>
+      </w:pPr>
+      <w:r>
+        <w:rPr>
+          <w:shd w:val="clear" w:color="auto" w:fill="FFFFFF"/>
+        </w:rPr>
+        <w:t>The project schedule remains feasible only if scope is reduced early and milestone dependencies are controlled. Phase 2 is due on 21 September 2026. Requirements are due on 5 October, design on 26 October, draft implementation on 16 November, and testing and final delivery on 23 November. The final period is compressed because testing and final delivery share the same deadline, so feature development must stop early enough to protect correction and documentation time.</w:t>
+      </w:r>
+    </w:p>
+    <w:p>
+      <w:pPr>
+        <w:keepNext/>
+        <w:rPr>
+          <w:shd w:val="clear" w:color="auto" w:fill="FFFFFF"/>
+        </w:rPr>
+      </w:pPr>
+    </w:p>
+    <w:p>
+      <w:pPr>
+        <w:keepNext/>
+      </w:pPr>
+      <w:r>
+        <w:rPr>
+          <w:noProof/>
+        </w:rPr>
+        <w:drawing>
+          <wp:inline distT="0" distB="0" distL="0" distR="0" wp14:anchorId="6592FA35" wp14:editId="5295A8C8">
+            <wp:extent cx="6080760" cy="2470309"/>
+            <wp:effectExtent l="0" t="0" r="0" b="0"/>
+            <wp:docPr id="778274235" name="Picture 778274235" descr="Timeline of project delivery milestones from Phase 1 on 14 September through Phases 7 and 8 on 23 November 2026" title="Timeline of project delivery milestones from Phase 1 on 14 September through Phases 7 and 8 on 23 November 2026"/>
+            <wp:cNvGraphicFramePr>
+              <a:graphicFrameLocks xmlns:a="http://schemas.openxmlformats.org/drawingml/2006/main" noChangeAspect="1"/>
+            </wp:cNvGraphicFramePr>
+            <a:graphic xmlns:a="http://schemas.openxmlformats.org/drawingml/2006/main">
+              <a:graphicData uri="http://schemas.openxmlformats.org/drawingml/2006/picture">
+                <pic:pic xmlns:pic="http://schemas.openxmlformats.org/drawingml/2006/picture">
+                  <pic:nvPicPr>
+                    <pic:cNvPr id="0" name="course_milestones.png"/>
+                    <pic:cNvPicPr/>
+                  </pic:nvPicPr>
+                  <pic:blipFill>
+                    <a:blip r:embed="rId8"/>
+                    <a:stretch>
+                      <a:fillRect/>
+                    </a:stretch>
+                  </pic:blipFill>
+                  <pic:spPr>
+                    <a:xfrm>
+                      <a:off x="0" y="0"/>
+                      <a:ext cx="6080760" cy="2470309"/>
+                    </a:xfrm>
+                    <a:prstGeom prst="rect">
+                      <a:avLst/>
+                    </a:prstGeom>
+                  </pic:spPr>
+                </pic:pic>
+              </a:graphicData>
+            </a:graphic>
+          </wp:inline>
+        </w:drawing>
+      </w:r>
+    </w:p>
+    <w:p>
+      <w:pPr>
+        <w:pStyle w:val="Caption"/>
+        <w:spacing w:before="80"/>
+        <w:jc w:val="center"/>
+      </w:pPr>
+      <w:r>
+        <w:t>Figure 1 Project delivery milestones</w:t>
+      </w:r>
+    </w:p>
+    <w:p>
+      <w:pPr>
+        <w:pStyle w:val="Heading2"/>
+        <w:rPr>
+          <w:b w:val="0"/>
+          <w:bCs w:val="0"/>
+          <w:color w:val="000000" w:themeColor="text1"/>
+        </w:rPr>
+      </w:pPr>
+      <w:r>
+        <w:rPr>
+          <w:color w:val="000000" w:themeColor="text1"/>
+        </w:rPr>
+        <w:t>8. 1 Development Priorities and Dependencies</w:t>
+      </w:r>
+    </w:p>
+    <w:p>
+      <w:r>
+        <w:t>Development should begin with a stable data model and clearly defined user roles because the system’s main functions depend on consistent asset and request information. After these the team can start to develop search, AI-supported matching, approval, and transfer. The required data and role responsibilities should be defined during the requirements phase and confirmed during the design phase before optional features are developed. Integration work should begin as soon as the data structures and communication rules are finalized so that technical problems can be identified and corrected before final testing. Priority should remain on completing and testing the core workflow before adding secondary features.</w:t>
+      </w:r>
+    </w:p>
+    <w:p>
+      <w:pPr>
+        <w:pStyle w:val="Heading2"/>
+        <w:rPr>
+          <w:b w:val="0"/>
+          <w:bCs w:val="0"/>
+          <w:color w:val="000000" w:themeColor="text1"/>
+        </w:rPr>
+      </w:pPr>
+      <w:r>
+        <w:rPr>
+          <w:color w:val="000000" w:themeColor="text1"/>
+        </w:rPr>
+        <w:t>8. 2 Scope Tiers</w:t>
+      </w:r>
+    </w:p>
+    <w:p>
+      <w:pPr>
+        <w:pStyle w:val="Caption"/>
+        <w:keepNext/>
+        <w:spacing w:before="80"/>
+        <w:jc w:val="center"/>
+      </w:pPr>
+      <w:r>
+        <w:t>Table 8 Scope Priorities</w:t>
+      </w:r>
+    </w:p>
+    <w:tbl>
+      <w:tblPr>
+        <w:tblW w:w="0" w:type="auto"/>
+        <w:jc w:val="center"/>
+        <w:tblBorders>
+          <w:top w:val="single" w:sz="6" w:space="0" w:color="D9D9D9"/>
+          <w:left w:val="single" w:sz="6" w:space="0" w:color="D9D9D9"/>
+          <w:bottom w:val="single" w:sz="6" w:space="0" w:color="D9D9D9"/>
+          <w:right w:val="single" w:sz="6" w:space="0" w:color="D9D9D9"/>
+          <w:insideH w:val="single" w:sz="6" w:space="0" w:color="D9D9D9"/>
+          <w:insideV w:val="single" w:sz="6" w:space="0" w:color="D9D9D9"/>
+        </w:tblBorders>
+        <w:tblLayout w:type="fixed"/>
+        <w:tblLook w:val="04A0" w:firstRow="1" w:lastRow="0" w:firstColumn="1" w:lastColumn="0" w:noHBand="0" w:noVBand="1"/>
+      </w:tblPr>
+      <w:tblGrid>
+        <w:gridCol w:w="1800"/>
+        <w:gridCol w:w="5256"/>
+        <w:gridCol w:w="3024"/>
+      </w:tblGrid>
+      <w:tr>
+        <w:trPr>
+          <w:cantSplit/>
+          <w:tblHeader/>
+          <w:jc w:val="center"/>
+        </w:trPr>
+        <w:tc>
+          <w:tcPr>
+            <w:tcW w:w="1800" w:type="dxa"/>
+            <w:shd w:val="clear" w:color="auto" w:fill="17365D"/>
+            <w:tcMar>
+              <w:top w:w="105" w:type="dxa"/>
+              <w:left w:w="115" w:type="dxa"/>
+              <w:bottom w:w="105" w:type="dxa"/>
+              <w:right w:w="115" w:type="dxa"/>
+            </w:tcMar>
+            <w:vAlign w:val="center"/>
+          </w:tcPr>
+          <w:p>
+            <w:pPr>
+              <w:spacing w:after="0" w:line="240" w:lineRule="auto"/>
+              <w:jc w:val="center"/>
+            </w:pPr>
+            <w:r>
+              <w:rPr>
+                <w:b/>
+                <w:color w:val="FFFFFF"/>
+                <w:sz w:val="18"/>
+              </w:rPr>
+              <w:t>Tier</w:t>
+            </w:r>
+          </w:p>
+        </w:tc>
+        <w:tc>
+          <w:tcPr>
+            <w:tcW w:w="5256" w:type="dxa"/>
+            <w:shd w:val="clear" w:color="auto" w:fill="17365D"/>
+            <w:tcMar>
+              <w:top w:w="105" w:type="dxa"/>
+              <w:left w:w="115" w:type="dxa"/>
+              <w:bottom w:w="105" w:type="dxa"/>
+              <w:right w:w="115" w:type="dxa"/>
+            </w:tcMar>
+            <w:vAlign w:val="center"/>
+          </w:tcPr>
+          <w:p>
+            <w:pPr>
+              <w:spacing w:after="0" w:line="240" w:lineRule="auto"/>
+              <w:jc w:val="center"/>
+            </w:pPr>
+            <w:r>
+              <w:rPr>
+                <w:b/>
+                <w:color w:val="FFFFFF"/>
+                <w:sz w:val="18"/>
+              </w:rPr>
+              <w:t>Functions</w:t>
+            </w:r>
+          </w:p>
+        </w:tc>
+        <w:tc>
+          <w:tcPr>
+            <w:tcW w:w="3024" w:type="dxa"/>
+            <w:shd w:val="clear" w:color="auto" w:fill="17365D"/>
+            <w:tcMar>
+              <w:top w:w="105" w:type="dxa"/>
+              <w:left w:w="115" w:type="dxa"/>
+              <w:bottom w:w="105" w:type="dxa"/>
+              <w:right w:w="115" w:type="dxa"/>
+            </w:tcMar>
+            <w:vAlign w:val="center"/>
+          </w:tcPr>
+          <w:p>
+            <w:pPr>
+              <w:spacing w:after="0" w:line="240" w:lineRule="auto"/>
+              <w:jc w:val="center"/>
+            </w:pPr>
+            <w:r>
+              <w:rPr>
+                <w:b/>
+                <w:color w:val="FFFFFF"/>
+                <w:sz w:val="18"/>
+              </w:rPr>
+              <w:t>Schedule Decision</w:t>
+            </w:r>
+          </w:p>
+        </w:tc>
+      </w:tr>
+      <w:tr>
+        <w:trPr>
+          <w:cantSplit/>
+          <w:jc w:val="center"/>
+        </w:trPr>
+        <w:tc>
+          <w:tcPr>
+            <w:tcW w:w="1800" w:type="dxa"/>
+            <w:tcMar>
+              <w:top w:w="95" w:type="dxa"/>
+              <w:left w:w="110" w:type="dxa"/>
+              <w:bottom w:w="95" w:type="dxa"/>
+              <w:right w:w="110" w:type="dxa"/>
+            </w:tcMar>
+            <w:vAlign w:val="center"/>
+          </w:tcPr>
+          <w:p>
+            <w:pPr>
+              <w:spacing w:after="0" w:line="252" w:lineRule="auto"/>
+              <w:jc w:val="center"/>
+            </w:pPr>
+            <w:r>
+              <w:rPr>
+                <w:sz w:val="17"/>
+              </w:rPr>
+              <w:t xml:space="preserve">Essential </w:t>
+            </w:r>
+          </w:p>
+        </w:tc>
+        <w:tc>
+          <w:tcPr>
+            <w:tcW w:w="5256" w:type="dxa"/>
+            <w:tcMar>
+              <w:top w:w="95" w:type="dxa"/>
+              <w:left w:w="110" w:type="dxa"/>
+              <w:bottom w:w="95" w:type="dxa"/>
+              <w:right w:w="110" w:type="dxa"/>
+            </w:tcMar>
+            <w:vAlign w:val="center"/>
+          </w:tcPr>
+          <w:p>
+            <w:pPr>
+              <w:spacing w:after="0" w:line="252" w:lineRule="auto"/>
+            </w:pPr>
+            <w:r>
+              <w:rPr>
+                <w:sz w:val="17"/>
+              </w:rPr>
+              <w:t>Authentication, roles, departments, asset registration, publication, search, request, approval, transfer confirmation, maintenance history, audit log</w:t>
+            </w:r>
+          </w:p>
+        </w:tc>
+        <w:tc>
+          <w:tcPr>
+            <w:tcW w:w="3024" w:type="dxa"/>
+            <w:tcMar>
+              <w:top w:w="95" w:type="dxa"/>
+              <w:left w:w="110" w:type="dxa"/>
+              <w:bottom w:w="95" w:type="dxa"/>
+              <w:right w:w="110" w:type="dxa"/>
+            </w:tcMar>
+            <w:vAlign w:val="center"/>
+          </w:tcPr>
+          <w:p>
+            <w:pPr>
+              <w:spacing w:after="0" w:line="252" w:lineRule="auto"/>
+            </w:pPr>
+            <w:r>
+              <w:rPr>
+                <w:sz w:val="17"/>
+              </w:rPr>
+              <w:t>Must work end to end before optional features</w:t>
+            </w:r>
+          </w:p>
+        </w:tc>
+      </w:tr>
+      <w:tr>
+        <w:trPr>
+          <w:cantSplit/>
+          <w:jc w:val="center"/>
+        </w:trPr>
+        <w:tc>
+          <w:tcPr>
+            <w:tcW w:w="1800" w:type="dxa"/>
+            <w:shd w:val="clear" w:color="auto" w:fill="EAF2F8"/>
+            <w:tcMar>
+              <w:top w:w="95" w:type="dxa"/>
+              <w:left w:w="110" w:type="dxa"/>
+              <w:bottom w:w="95" w:type="dxa"/>
+              <w:right w:w="110" w:type="dxa"/>
+            </w:tcMar>
+            <w:vAlign w:val="center"/>
+          </w:tcPr>
+          <w:p>
+            <w:pPr>
+              <w:spacing w:after="0" w:line="252" w:lineRule="auto"/>
+              <w:jc w:val="center"/>
+            </w:pPr>
+            <w:r>
+              <w:rPr>
+                <w:sz w:val="17"/>
+              </w:rPr>
+              <w:t xml:space="preserve">Essential - AI </w:t>
+            </w:r>
+          </w:p>
+        </w:tc>
+        <w:tc>
+          <w:tcPr>
+            <w:tcW w:w="5256" w:type="dxa"/>
+            <w:shd w:val="clear" w:color="auto" w:fill="EAF2F8"/>
+            <w:tcMar>
+              <w:top w:w="95" w:type="dxa"/>
+              <w:left w:w="110" w:type="dxa"/>
+              <w:bottom w:w="95" w:type="dxa"/>
+              <w:right w:w="110" w:type="dxa"/>
+            </w:tcMar>
+            <w:vAlign w:val="center"/>
+          </w:tcPr>
+          <w:p>
+            <w:pPr>
+              <w:spacing w:after="0" w:line="252" w:lineRule="auto"/>
+            </w:pPr>
+            <w:r>
+              <w:rPr>
+                <w:sz w:val="17"/>
+              </w:rPr>
+              <w:t>One classification or semantic matching service, confidence, explanation, user review, evaluation set, deterministic fallback</w:t>
+            </w:r>
+          </w:p>
+        </w:tc>
+        <w:tc>
+          <w:tcPr>
+            <w:tcW w:w="3024" w:type="dxa"/>
+            <w:shd w:val="clear" w:color="auto" w:fill="EAF2F8"/>
+            <w:tcMar>
+              <w:top w:w="95" w:type="dxa"/>
+              <w:left w:w="110" w:type="dxa"/>
+              <w:bottom w:w="95" w:type="dxa"/>
+              <w:right w:w="110" w:type="dxa"/>
+            </w:tcMar>
+            <w:vAlign w:val="center"/>
+          </w:tcPr>
+          <w:p>
+            <w:pPr>
+              <w:spacing w:after="0" w:line="252" w:lineRule="auto"/>
+            </w:pPr>
+            <w:r>
+              <w:rPr>
+                <w:sz w:val="17"/>
+              </w:rPr>
+              <w:t>Implement one function well rather than several untested functions</w:t>
+            </w:r>
+          </w:p>
+        </w:tc>
+      </w:tr>
+      <w:tr>
+        <w:trPr>
+          <w:cantSplit/>
+          <w:jc w:val="center"/>
+        </w:trPr>
+        <w:tc>
+          <w:tcPr>
+            <w:tcW w:w="1800" w:type="dxa"/>
+            <w:tcMar>
+              <w:top w:w="95" w:type="dxa"/>
+              <w:left w:w="110" w:type="dxa"/>
+              <w:bottom w:w="95" w:type="dxa"/>
+              <w:right w:w="110" w:type="dxa"/>
+            </w:tcMar>
+            <w:vAlign w:val="center"/>
+          </w:tcPr>
+          <w:p>
+            <w:pPr>
+              <w:spacing w:after="0" w:line="252" w:lineRule="auto"/>
+              <w:jc w:val="center"/>
+            </w:pPr>
+            <w:r>
+              <w:rPr>
+                <w:sz w:val="17"/>
+              </w:rPr>
+              <w:t>Desirable extension</w:t>
+            </w:r>
+          </w:p>
+        </w:tc>
+        <w:tc>
+          <w:tcPr>
+            <w:tcW w:w="5256" w:type="dxa"/>
+            <w:tcMar>
+              <w:top w:w="95" w:type="dxa"/>
+              <w:left w:w="110" w:type="dxa"/>
+              <w:bottom w:w="95" w:type="dxa"/>
+              <w:right w:w="110" w:type="dxa"/>
+            </w:tcMar>
+            <w:vAlign w:val="center"/>
+          </w:tcPr>
+          <w:p>
+            <w:pPr>
+              <w:spacing w:after="0" w:line="252" w:lineRule="auto"/>
+            </w:pPr>
+            <w:r>
+              <w:rPr>
+                <w:sz w:val="17"/>
+              </w:rPr>
+              <w:t>Second AI function, basic assistant, generated narrative report, notification improvement</w:t>
+            </w:r>
+          </w:p>
+        </w:tc>
+        <w:tc>
+          <w:tcPr>
+            <w:tcW w:w="3024" w:type="dxa"/>
+            <w:tcMar>
+              <w:top w:w="95" w:type="dxa"/>
+              <w:left w:w="110" w:type="dxa"/>
+              <w:bottom w:w="95" w:type="dxa"/>
+              <w:right w:w="110" w:type="dxa"/>
+            </w:tcMar>
+            <w:vAlign w:val="center"/>
+          </w:tcPr>
+          <w:p>
+            <w:pPr>
+              <w:spacing w:after="0" w:line="252" w:lineRule="auto"/>
+            </w:pPr>
+            <w:r>
+              <w:rPr>
+                <w:sz w:val="17"/>
+              </w:rPr>
+              <w:t>Add only after the essential workflow and tests pass</w:t>
+            </w:r>
+          </w:p>
+        </w:tc>
+      </w:tr>
+      <w:tr>
+        <w:trPr>
+          <w:cantSplit/>
+          <w:jc w:val="center"/>
+        </w:trPr>
+        <w:tc>
+          <w:tcPr>
+            <w:tcW w:w="1800" w:type="dxa"/>
+            <w:shd w:val="clear" w:color="auto" w:fill="EAF2F8"/>
+            <w:tcMar>
+              <w:top w:w="95" w:type="dxa"/>
+              <w:left w:w="110" w:type="dxa"/>
+              <w:bottom w:w="95" w:type="dxa"/>
+              <w:right w:w="110" w:type="dxa"/>
+            </w:tcMar>
+            <w:vAlign w:val="center"/>
+          </w:tcPr>
+          <w:p>
+            <w:pPr>
+              <w:spacing w:after="0" w:line="252" w:lineRule="auto"/>
+              <w:jc w:val="center"/>
+            </w:pPr>
+            <w:r>
+              <w:rPr>
+                <w:sz w:val="17"/>
+              </w:rPr>
+              <w:lastRenderedPageBreak/>
+              <w:t>Future enhancement</w:t>
+            </w:r>
+          </w:p>
+        </w:tc>
+        <w:tc>
+          <w:tcPr>
+            <w:tcW w:w="5256" w:type="dxa"/>
+            <w:shd w:val="clear" w:color="auto" w:fill="EAF2F8"/>
+            <w:tcMar>
+              <w:top w:w="95" w:type="dxa"/>
+              <w:left w:w="110" w:type="dxa"/>
+              <w:bottom w:w="95" w:type="dxa"/>
+              <w:right w:w="110" w:type="dxa"/>
+            </w:tcMar>
+            <w:vAlign w:val="center"/>
+          </w:tcPr>
+          <w:p>
+            <w:pPr>
+              <w:spacing w:after="0" w:line="252" w:lineRule="auto"/>
+            </w:pPr>
+            <w:r>
+              <w:rPr>
+                <w:sz w:val="17"/>
+              </w:rPr>
+              <w:t>Image recognition, predictive demand, full university integrations, advanced carbon model, autonomous workflow actions</w:t>
+            </w:r>
+          </w:p>
+        </w:tc>
+        <w:tc>
+          <w:tcPr>
+            <w:tcW w:w="3024" w:type="dxa"/>
+            <w:shd w:val="clear" w:color="auto" w:fill="EAF2F8"/>
+            <w:tcMar>
+              <w:top w:w="95" w:type="dxa"/>
+              <w:left w:w="110" w:type="dxa"/>
+              <w:bottom w:w="95" w:type="dxa"/>
+              <w:right w:w="110" w:type="dxa"/>
+            </w:tcMar>
+            <w:vAlign w:val="center"/>
+          </w:tcPr>
+          <w:p>
+            <w:pPr>
+              <w:spacing w:after="0" w:line="252" w:lineRule="auto"/>
+            </w:pPr>
+            <w:r>
+              <w:rPr>
+                <w:sz w:val="17"/>
+              </w:rPr>
+              <w:t>Exclude from the semester minimum scope</w:t>
+            </w:r>
+          </w:p>
+        </w:tc>
+      </w:tr>
+    </w:tbl>
+    <w:p>
+      <w:pPr>
+        <w:spacing w:after="40"/>
+      </w:pPr>
+    </w:p>
+    <w:p>
+      <w:pPr>
+        <w:pStyle w:val="Heading2"/>
+        <w:rPr>
+          <w:b w:val="0"/>
+          <w:bCs w:val="0"/>
+          <w:color w:val="000000" w:themeColor="text1"/>
+        </w:rPr>
+      </w:pPr>
+      <w:r>
+        <w:rPr>
+          <w:color w:val="000000" w:themeColor="text1"/>
+        </w:rPr>
+        <w:t xml:space="preserve">8. 3 </w:t>
+      </w:r>
+      <w:proofErr w:type="gramStart"/>
+      <w:r>
+        <w:rPr>
+          <w:color w:val="000000" w:themeColor="text1"/>
+        </w:rPr>
+        <w:t>Two Person</w:t>
+      </w:r>
+      <w:proofErr w:type="gramEnd"/>
+      <w:r>
+        <w:rPr>
+          <w:color w:val="000000" w:themeColor="text1"/>
+        </w:rPr>
+        <w:t xml:space="preserve"> Work Allocation</w:t>
+      </w:r>
+    </w:p>
+    <w:p>
+      <w:r>
+        <w:t>One team member can lead the user interface, application workflow, and baseline search while the other leads the database, AI adapter, and deployment. Both members should review the requirements, data model, integration, tests, and documentation. The team should not divide the project into isolated halves that meet only at the end.</w:t>
+      </w:r>
+    </w:p>
+    <w:p>
+      <w:pPr>
+        <w:pStyle w:val="Heading1"/>
+        <w:rPr>
+          <w:b w:val="0"/>
+          <w:bCs w:val="0"/>
+          <w:color w:val="000000" w:themeColor="text1"/>
+          <w:szCs w:val="32"/>
+        </w:rPr>
+      </w:pPr>
+      <w:r>
+        <w:rPr>
+          <w:color w:val="000000" w:themeColor="text1"/>
+          <w:szCs w:val="32"/>
+        </w:rPr>
+        <w:t>9 Legal Ethical Privacy Security and Policy Constraints</w:t>
+      </w:r>
+    </w:p>
+    <w:p>
+      <w:r>
+        <w:t>The project involves asset ownership, user identities, procurement values, maintenance history, photographs, documents, and AI service providers. These create legal and policy questions even in a prototype. UAE data protection law establishes requirements for maintaining the confidentiality of personal data, controlling how it is collected and processed, protecting individual rights, and managing cross-border data transfers. Khalifa University's public privacy page states that the institution uses security measures for personal information and limits disclosure to trusted parties and other permitted situations. This does not make a legal compliance determination. It identifies controls and approvals needed before real data or institutional systems are used.</w:t>
+      </w:r>
+    </w:p>
+    <w:p>
+      <w:pPr>
+        <w:pStyle w:val="Caption"/>
+        <w:keepNext/>
+        <w:spacing w:before="80"/>
+        <w:jc w:val="center"/>
+      </w:pPr>
+      <w:r>
+        <w:t>Table 9 Constraint and Control Matrix</w:t>
+      </w:r>
+    </w:p>
+    <w:tbl>
+      <w:tblPr>
+        <w:tblW w:w="0" w:type="auto"/>
+        <w:jc w:val="center"/>
+        <w:tblBorders>
+          <w:top w:val="single" w:sz="6" w:space="0" w:color="D9D9D9"/>
+          <w:left w:val="single" w:sz="6" w:space="0" w:color="D9D9D9"/>
+          <w:bottom w:val="single" w:sz="6" w:space="0" w:color="D9D9D9"/>
+          <w:right w:val="single" w:sz="6" w:space="0" w:color="D9D9D9"/>
+          <w:insideH w:val="single" w:sz="6" w:space="0" w:color="D9D9D9"/>
+          <w:insideV w:val="single" w:sz="6" w:space="0" w:color="D9D9D9"/>
+        </w:tblBorders>
+        <w:tblLayout w:type="fixed"/>
+        <w:tblLook w:val="04A0" w:firstRow="1" w:lastRow="0" w:firstColumn="1" w:lastColumn="0" w:noHBand="0" w:noVBand="1"/>
+      </w:tblPr>
+      <w:tblGrid>
+        <w:gridCol w:w="2088"/>
+        <w:gridCol w:w="3384"/>
+        <w:gridCol w:w="4608"/>
+      </w:tblGrid>
+      <w:tr>
+        <w:trPr>
+          <w:cantSplit/>
+          <w:tblHeader/>
+          <w:jc w:val="center"/>
+        </w:trPr>
+        <w:tc>
+          <w:tcPr>
+            <w:tcW w:w="2088" w:type="dxa"/>
+            <w:shd w:val="clear" w:color="auto" w:fill="17365D"/>
+            <w:tcMar>
+              <w:top w:w="105" w:type="dxa"/>
+              <w:left w:w="115" w:type="dxa"/>
+              <w:bottom w:w="105" w:type="dxa"/>
+              <w:right w:w="115" w:type="dxa"/>
+            </w:tcMar>
+            <w:vAlign w:val="center"/>
+          </w:tcPr>
+          <w:p>
+            <w:pPr>
+              <w:spacing w:after="0" w:line="240" w:lineRule="auto"/>
+              <w:jc w:val="center"/>
+            </w:pPr>
+            <w:r>
+              <w:rPr>
+                <w:b/>
+                <w:color w:val="FFFFFF"/>
+                <w:sz w:val="18"/>
+              </w:rPr>
+              <w:t>Constraint</w:t>
+            </w:r>
+          </w:p>
+        </w:tc>
+        <w:tc>
+          <w:tcPr>
+            <w:tcW w:w="3384" w:type="dxa"/>
+            <w:shd w:val="clear" w:color="auto" w:fill="17365D"/>
+            <w:tcMar>
+              <w:top w:w="105" w:type="dxa"/>
+              <w:left w:w="115" w:type="dxa"/>
+              <w:bottom w:w="105" w:type="dxa"/>
+              <w:right w:w="115" w:type="dxa"/>
+            </w:tcMar>
+            <w:vAlign w:val="center"/>
+          </w:tcPr>
+          <w:p>
+            <w:pPr>
+              <w:spacing w:after="0" w:line="240" w:lineRule="auto"/>
+              <w:jc w:val="center"/>
+            </w:pPr>
+            <w:r>
+              <w:rPr>
+                <w:b/>
+                <w:color w:val="FFFFFF"/>
+                <w:sz w:val="18"/>
+              </w:rPr>
+              <w:t>Project Exposure</w:t>
+            </w:r>
+          </w:p>
+        </w:tc>
+        <w:tc>
+          <w:tcPr>
+            <w:tcW w:w="4608" w:type="dxa"/>
+            <w:shd w:val="clear" w:color="auto" w:fill="17365D"/>
+            <w:tcMar>
+              <w:top w:w="105" w:type="dxa"/>
+              <w:left w:w="115" w:type="dxa"/>
+              <w:bottom w:w="105" w:type="dxa"/>
+              <w:right w:w="115" w:type="dxa"/>
+            </w:tcMar>
+            <w:vAlign w:val="center"/>
+          </w:tcPr>
+          <w:p>
+            <w:pPr>
+              <w:spacing w:after="0" w:line="240" w:lineRule="auto"/>
+              <w:jc w:val="center"/>
+            </w:pPr>
+            <w:r>
+              <w:rPr>
+                <w:b/>
+                <w:color w:val="FFFFFF"/>
+                <w:sz w:val="18"/>
+              </w:rPr>
+              <w:t>Required Control</w:t>
+            </w:r>
+          </w:p>
+        </w:tc>
+      </w:tr>
+      <w:tr>
+        <w:trPr>
+          <w:cantSplit/>
+          <w:jc w:val="center"/>
+        </w:trPr>
+        <w:tc>
+          <w:tcPr>
+            <w:tcW w:w="2088" w:type="dxa"/>
+            <w:tcMar>
+              <w:top w:w="95" w:type="dxa"/>
+              <w:left w:w="110" w:type="dxa"/>
+              <w:bottom w:w="95" w:type="dxa"/>
+              <w:right w:w="110" w:type="dxa"/>
+            </w:tcMar>
+            <w:vAlign w:val="center"/>
+          </w:tcPr>
+          <w:p>
+            <w:pPr>
+              <w:spacing w:after="0" w:line="252" w:lineRule="auto"/>
+            </w:pPr>
+            <w:r>
+              <w:rPr>
+                <w:sz w:val="16"/>
+              </w:rPr>
+              <w:t>Personal data</w:t>
+            </w:r>
+          </w:p>
+        </w:tc>
+        <w:tc>
+          <w:tcPr>
+            <w:tcW w:w="3384" w:type="dxa"/>
+            <w:tcMar>
+              <w:top w:w="95" w:type="dxa"/>
+              <w:left w:w="110" w:type="dxa"/>
+              <w:bottom w:w="95" w:type="dxa"/>
+              <w:right w:w="110" w:type="dxa"/>
+            </w:tcMar>
+            <w:vAlign w:val="center"/>
+          </w:tcPr>
+          <w:p>
+            <w:pPr>
+              <w:spacing w:after="0" w:line="252" w:lineRule="auto"/>
+            </w:pPr>
+            <w:r>
+              <w:rPr>
+                <w:sz w:val="16"/>
+              </w:rPr>
+              <w:t>Names, accounts, activity history, contact information</w:t>
+            </w:r>
+          </w:p>
+        </w:tc>
+        <w:tc>
+          <w:tcPr>
+            <w:tcW w:w="4608" w:type="dxa"/>
+            <w:tcMar>
+              <w:top w:w="95" w:type="dxa"/>
+              <w:left w:w="110" w:type="dxa"/>
+              <w:bottom w:w="95" w:type="dxa"/>
+              <w:right w:w="110" w:type="dxa"/>
+            </w:tcMar>
+            <w:vAlign w:val="center"/>
+          </w:tcPr>
+          <w:p>
+            <w:pPr>
+              <w:spacing w:after="0" w:line="252" w:lineRule="auto"/>
+            </w:pPr>
+            <w:r>
+              <w:rPr>
+                <w:sz w:val="16"/>
+              </w:rPr>
+              <w:t>Collect only necessary fields, control access, define purpose and retention, use approved data</w:t>
+            </w:r>
+          </w:p>
+        </w:tc>
+      </w:tr>
+      <w:tr>
+        <w:trPr>
+          <w:cantSplit/>
+          <w:jc w:val="center"/>
+        </w:trPr>
+        <w:tc>
+          <w:tcPr>
+            <w:tcW w:w="2088" w:type="dxa"/>
+            <w:shd w:val="clear" w:color="auto" w:fill="EAF2F8"/>
+            <w:tcMar>
+              <w:top w:w="95" w:type="dxa"/>
+              <w:left w:w="110" w:type="dxa"/>
+              <w:bottom w:w="95" w:type="dxa"/>
+              <w:right w:w="110" w:type="dxa"/>
+            </w:tcMar>
+            <w:vAlign w:val="center"/>
+          </w:tcPr>
+          <w:p>
+            <w:pPr>
+              <w:spacing w:after="0" w:line="252" w:lineRule="auto"/>
+            </w:pPr>
+            <w:r>
+              <w:rPr>
+                <w:sz w:val="16"/>
+              </w:rPr>
+              <w:t>Cross-border AI processing</w:t>
+            </w:r>
+          </w:p>
+        </w:tc>
+        <w:tc>
+          <w:tcPr>
+            <w:tcW w:w="3384" w:type="dxa"/>
+            <w:shd w:val="clear" w:color="auto" w:fill="EAF2F8"/>
+            <w:tcMar>
+              <w:top w:w="95" w:type="dxa"/>
+              <w:left w:w="110" w:type="dxa"/>
+              <w:bottom w:w="95" w:type="dxa"/>
+              <w:right w:w="110" w:type="dxa"/>
+            </w:tcMar>
+            <w:vAlign w:val="center"/>
+          </w:tcPr>
+          <w:p>
+            <w:pPr>
+              <w:spacing w:after="0" w:line="252" w:lineRule="auto"/>
+            </w:pPr>
+            <w:r>
+              <w:rPr>
+                <w:sz w:val="16"/>
+              </w:rPr>
+              <w:t>Prompts or records may be sent to an external provider</w:t>
+            </w:r>
+          </w:p>
+        </w:tc>
+        <w:tc>
+          <w:tcPr>
+            <w:tcW w:w="4608" w:type="dxa"/>
+            <w:shd w:val="clear" w:color="auto" w:fill="EAF2F8"/>
+            <w:tcMar>
+              <w:top w:w="95" w:type="dxa"/>
+              <w:left w:w="110" w:type="dxa"/>
+              <w:bottom w:w="95" w:type="dxa"/>
+              <w:right w:w="110" w:type="dxa"/>
+            </w:tcMar>
+            <w:vAlign w:val="center"/>
+          </w:tcPr>
+          <w:p>
+            <w:pPr>
+              <w:spacing w:after="0" w:line="252" w:lineRule="auto"/>
+            </w:pPr>
+            <w:r>
+              <w:rPr>
+                <w:sz w:val="16"/>
+              </w:rPr>
+              <w:t>Do not send restricted data without review of provider location, terms, retention, and approval</w:t>
+            </w:r>
+          </w:p>
+        </w:tc>
+      </w:tr>
+      <w:tr>
+        <w:trPr>
+          <w:cantSplit/>
+          <w:jc w:val="center"/>
+        </w:trPr>
+        <w:tc>
+          <w:tcPr>
+            <w:tcW w:w="2088" w:type="dxa"/>
+            <w:tcMar>
+              <w:top w:w="95" w:type="dxa"/>
+              <w:left w:w="110" w:type="dxa"/>
+              <w:bottom w:w="95" w:type="dxa"/>
+              <w:right w:w="110" w:type="dxa"/>
+            </w:tcMar>
+            <w:vAlign w:val="center"/>
+          </w:tcPr>
+          <w:p>
+            <w:pPr>
+              <w:spacing w:after="0" w:line="252" w:lineRule="auto"/>
+            </w:pPr>
+            <w:r>
+              <w:rPr>
+                <w:sz w:val="16"/>
+              </w:rPr>
+              <w:t>Asset ownership and transfer authorization</w:t>
+            </w:r>
+          </w:p>
+        </w:tc>
+        <w:tc>
+          <w:tcPr>
+            <w:tcW w:w="3384" w:type="dxa"/>
+            <w:tcMar>
+              <w:top w:w="95" w:type="dxa"/>
+              <w:left w:w="110" w:type="dxa"/>
+              <w:bottom w:w="95" w:type="dxa"/>
+              <w:right w:w="110" w:type="dxa"/>
+            </w:tcMar>
+            <w:vAlign w:val="center"/>
+          </w:tcPr>
+          <w:p>
+            <w:pPr>
+              <w:spacing w:after="0" w:line="252" w:lineRule="auto"/>
+            </w:pPr>
+            <w:r>
+              <w:rPr>
+                <w:sz w:val="16"/>
+              </w:rPr>
+              <w:t>A recommendation could be mistaken for authority to transfer</w:t>
+            </w:r>
+          </w:p>
+        </w:tc>
+        <w:tc>
+          <w:tcPr>
+            <w:tcW w:w="4608" w:type="dxa"/>
+            <w:tcMar>
+              <w:top w:w="95" w:type="dxa"/>
+              <w:left w:w="110" w:type="dxa"/>
+              <w:bottom w:w="95" w:type="dxa"/>
+              <w:right w:w="110" w:type="dxa"/>
+            </w:tcMar>
+            <w:vAlign w:val="center"/>
+          </w:tcPr>
+          <w:p>
+            <w:pPr>
+              <w:spacing w:after="0" w:line="252" w:lineRule="auto"/>
+            </w:pPr>
+            <w:r>
+              <w:rPr>
+                <w:sz w:val="16"/>
+              </w:rPr>
+              <w:t>Require authorized approval and receipt confirmation and preserve ownership history</w:t>
+            </w:r>
+          </w:p>
+        </w:tc>
+      </w:tr>
+      <w:tr>
+        <w:trPr>
+          <w:cantSplit/>
+          <w:jc w:val="center"/>
+        </w:trPr>
+        <w:tc>
+          <w:tcPr>
+            <w:tcW w:w="2088" w:type="dxa"/>
+            <w:shd w:val="clear" w:color="auto" w:fill="EAF2F8"/>
+            <w:tcMar>
+              <w:top w:w="95" w:type="dxa"/>
+              <w:left w:w="110" w:type="dxa"/>
+              <w:bottom w:w="95" w:type="dxa"/>
+              <w:right w:w="110" w:type="dxa"/>
+            </w:tcMar>
+            <w:vAlign w:val="center"/>
+          </w:tcPr>
+          <w:p>
+            <w:pPr>
+              <w:spacing w:after="0" w:line="252" w:lineRule="auto"/>
+            </w:pPr>
+            <w:r>
+              <w:rPr>
+                <w:sz w:val="16"/>
+              </w:rPr>
+              <w:t>Procurement and finance</w:t>
+            </w:r>
+          </w:p>
+        </w:tc>
+        <w:tc>
+          <w:tcPr>
+            <w:tcW w:w="3384" w:type="dxa"/>
+            <w:shd w:val="clear" w:color="auto" w:fill="EAF2F8"/>
+            <w:tcMar>
+              <w:top w:w="95" w:type="dxa"/>
+              <w:left w:w="110" w:type="dxa"/>
+              <w:bottom w:w="95" w:type="dxa"/>
+              <w:right w:w="110" w:type="dxa"/>
+            </w:tcMar>
+            <w:vAlign w:val="center"/>
+          </w:tcPr>
+          <w:p>
+            <w:pPr>
+              <w:spacing w:after="0" w:line="252" w:lineRule="auto"/>
+            </w:pPr>
+            <w:r>
+              <w:rPr>
+                <w:sz w:val="16"/>
+              </w:rPr>
+              <w:t>Prices, budgets, savings, and supplier data may be confidential</w:t>
+            </w:r>
+          </w:p>
+        </w:tc>
+        <w:tc>
+          <w:tcPr>
+            <w:tcW w:w="4608" w:type="dxa"/>
+            <w:shd w:val="clear" w:color="auto" w:fill="EAF2F8"/>
+            <w:tcMar>
+              <w:top w:w="95" w:type="dxa"/>
+              <w:left w:w="110" w:type="dxa"/>
+              <w:bottom w:w="95" w:type="dxa"/>
+              <w:right w:w="110" w:type="dxa"/>
+            </w:tcMar>
+            <w:vAlign w:val="center"/>
+          </w:tcPr>
+          <w:p>
+            <w:pPr>
+              <w:spacing w:after="0" w:line="252" w:lineRule="auto"/>
+            </w:pPr>
+            <w:r>
+              <w:rPr>
+                <w:sz w:val="16"/>
+              </w:rPr>
+              <w:t>Limit access, document data source, and separate sample values from actual records</w:t>
+            </w:r>
+          </w:p>
+        </w:tc>
+      </w:tr>
+      <w:tr>
+        <w:trPr>
+          <w:cantSplit/>
+          <w:jc w:val="center"/>
+        </w:trPr>
+        <w:tc>
+          <w:tcPr>
+            <w:tcW w:w="2088" w:type="dxa"/>
+            <w:tcMar>
+              <w:top w:w="95" w:type="dxa"/>
+              <w:left w:w="110" w:type="dxa"/>
+              <w:bottom w:w="95" w:type="dxa"/>
+              <w:right w:w="110" w:type="dxa"/>
+            </w:tcMar>
+            <w:vAlign w:val="center"/>
+          </w:tcPr>
+          <w:p>
+            <w:pPr>
+              <w:spacing w:after="0" w:line="252" w:lineRule="auto"/>
+            </w:pPr>
+            <w:r>
+              <w:rPr>
+                <w:sz w:val="16"/>
+              </w:rPr>
+              <w:t>Safety and hazardous assets</w:t>
+            </w:r>
+          </w:p>
+        </w:tc>
+        <w:tc>
+          <w:tcPr>
+            <w:tcW w:w="3384" w:type="dxa"/>
+            <w:tcMar>
+              <w:top w:w="95" w:type="dxa"/>
+              <w:left w:w="110" w:type="dxa"/>
+              <w:bottom w:w="95" w:type="dxa"/>
+              <w:right w:w="110" w:type="dxa"/>
+            </w:tcMar>
+            <w:vAlign w:val="center"/>
+          </w:tcPr>
+          <w:p>
+            <w:pPr>
+              <w:spacing w:after="0" w:line="252" w:lineRule="auto"/>
+            </w:pPr>
+            <w:r>
+              <w:rPr>
+                <w:sz w:val="16"/>
+              </w:rPr>
+              <w:t>Some equipment may require inspection, certification, or specialist disposal</w:t>
+            </w:r>
+          </w:p>
+        </w:tc>
+        <w:tc>
+          <w:tcPr>
+            <w:tcW w:w="4608" w:type="dxa"/>
+            <w:tcMar>
+              <w:top w:w="95" w:type="dxa"/>
+              <w:left w:w="110" w:type="dxa"/>
+              <w:bottom w:w="95" w:type="dxa"/>
+              <w:right w:w="110" w:type="dxa"/>
+            </w:tcMar>
+            <w:vAlign w:val="center"/>
+          </w:tcPr>
+          <w:p>
+            <w:pPr>
+              <w:spacing w:after="0" w:line="252" w:lineRule="auto"/>
+            </w:pPr>
+            <w:r>
+              <w:rPr>
+                <w:sz w:val="16"/>
+              </w:rPr>
+              <w:t>Flag restricted categories and prevent automated release or disposal</w:t>
+            </w:r>
+          </w:p>
+        </w:tc>
+      </w:tr>
+      <w:tr>
+        <w:trPr>
+          <w:cantSplit/>
+          <w:jc w:val="center"/>
+        </w:trPr>
+        <w:tc>
+          <w:tcPr>
+            <w:tcW w:w="2088" w:type="dxa"/>
+            <w:shd w:val="clear" w:color="auto" w:fill="EAF2F8"/>
+            <w:tcMar>
+              <w:top w:w="95" w:type="dxa"/>
+              <w:left w:w="110" w:type="dxa"/>
+              <w:bottom w:w="95" w:type="dxa"/>
+              <w:right w:w="110" w:type="dxa"/>
+            </w:tcMar>
+            <w:vAlign w:val="center"/>
+          </w:tcPr>
+          <w:p>
+            <w:pPr>
+              <w:spacing w:after="0" w:line="252" w:lineRule="auto"/>
+            </w:pPr>
+            <w:r>
+              <w:rPr>
+                <w:sz w:val="16"/>
+              </w:rPr>
+              <w:t>Intellectual property</w:t>
+            </w:r>
+          </w:p>
+        </w:tc>
+        <w:tc>
+          <w:tcPr>
+            <w:tcW w:w="3384" w:type="dxa"/>
+            <w:shd w:val="clear" w:color="auto" w:fill="EAF2F8"/>
+            <w:tcMar>
+              <w:top w:w="95" w:type="dxa"/>
+              <w:left w:w="110" w:type="dxa"/>
+              <w:bottom w:w="95" w:type="dxa"/>
+              <w:right w:w="110" w:type="dxa"/>
+            </w:tcMar>
+            <w:vAlign w:val="center"/>
+          </w:tcPr>
+          <w:p>
+            <w:pPr>
+              <w:spacing w:after="0" w:line="252" w:lineRule="auto"/>
+            </w:pPr>
+            <w:r>
+              <w:rPr>
+                <w:sz w:val="16"/>
+              </w:rPr>
+              <w:t>Uploaded documents, images, model outputs, and code may have usage limits</w:t>
+            </w:r>
+          </w:p>
+        </w:tc>
+        <w:tc>
+          <w:tcPr>
+            <w:tcW w:w="4608" w:type="dxa"/>
+            <w:shd w:val="clear" w:color="auto" w:fill="EAF2F8"/>
+            <w:tcMar>
+              <w:top w:w="95" w:type="dxa"/>
+              <w:left w:w="110" w:type="dxa"/>
+              <w:bottom w:w="95" w:type="dxa"/>
+              <w:right w:w="110" w:type="dxa"/>
+            </w:tcMar>
+            <w:vAlign w:val="center"/>
+          </w:tcPr>
+          <w:p>
+            <w:pPr>
+              <w:spacing w:after="0" w:line="252" w:lineRule="auto"/>
+            </w:pPr>
+            <w:r>
+              <w:rPr>
+                <w:sz w:val="16"/>
+              </w:rPr>
+              <w:t>Use approved content and licenses and record source and ownership</w:t>
+            </w:r>
+          </w:p>
+        </w:tc>
+      </w:tr>
+      <w:tr>
+        <w:trPr>
+          <w:cantSplit/>
+          <w:jc w:val="center"/>
+        </w:trPr>
+        <w:tc>
+          <w:tcPr>
+            <w:tcW w:w="2088" w:type="dxa"/>
+            <w:shd w:val="clear" w:color="auto" w:fill="EAF2F8"/>
+            <w:tcMar>
+              <w:top w:w="95" w:type="dxa"/>
+              <w:left w:w="110" w:type="dxa"/>
+              <w:bottom w:w="95" w:type="dxa"/>
+              <w:right w:w="110" w:type="dxa"/>
+            </w:tcMar>
+            <w:vAlign w:val="center"/>
+          </w:tcPr>
+          <w:p>
+            <w:pPr>
+              <w:spacing w:after="0" w:line="252" w:lineRule="auto"/>
+            </w:pPr>
+            <w:r>
+              <w:rPr>
+                <w:sz w:val="16"/>
+              </w:rPr>
+              <w:t>Security and audit</w:t>
+            </w:r>
+          </w:p>
+        </w:tc>
+        <w:tc>
+          <w:tcPr>
+            <w:tcW w:w="3384" w:type="dxa"/>
+            <w:shd w:val="clear" w:color="auto" w:fill="EAF2F8"/>
+            <w:tcMar>
+              <w:top w:w="95" w:type="dxa"/>
+              <w:left w:w="110" w:type="dxa"/>
+              <w:bottom w:w="95" w:type="dxa"/>
+              <w:right w:w="110" w:type="dxa"/>
+            </w:tcMar>
+            <w:vAlign w:val="center"/>
+          </w:tcPr>
+          <w:p>
+            <w:pPr>
+              <w:spacing w:after="0" w:line="252" w:lineRule="auto"/>
+            </w:pPr>
+            <w:r>
+              <w:rPr>
+                <w:sz w:val="16"/>
+              </w:rPr>
+              <w:t>Unauthorized edits could change ownership, status, or decisions</w:t>
+            </w:r>
+          </w:p>
+        </w:tc>
+        <w:tc>
+          <w:tcPr>
+            <w:tcW w:w="4608" w:type="dxa"/>
+            <w:shd w:val="clear" w:color="auto" w:fill="EAF2F8"/>
+            <w:tcMar>
+              <w:top w:w="95" w:type="dxa"/>
+              <w:left w:w="110" w:type="dxa"/>
+              <w:bottom w:w="95" w:type="dxa"/>
+              <w:right w:w="110" w:type="dxa"/>
+            </w:tcMar>
+            <w:vAlign w:val="center"/>
+          </w:tcPr>
+          <w:p>
+            <w:pPr>
+              <w:spacing w:after="0" w:line="252" w:lineRule="auto"/>
+            </w:pPr>
+            <w:r>
+              <w:rPr>
+                <w:sz w:val="16"/>
+              </w:rPr>
+              <w:t>Backend authorization, protected logs, secure sessions, validation, and access review</w:t>
+            </w:r>
+          </w:p>
+        </w:tc>
+      </w:tr>
+      <w:tr>
+        <w:trPr>
+          <w:cantSplit/>
+          <w:jc w:val="center"/>
+        </w:trPr>
+        <w:tc>
+          <w:tcPr>
+            <w:tcW w:w="2088" w:type="dxa"/>
+            <w:tcMar>
+              <w:top w:w="95" w:type="dxa"/>
+              <w:left w:w="110" w:type="dxa"/>
+              <w:bottom w:w="95" w:type="dxa"/>
+              <w:right w:w="110" w:type="dxa"/>
+            </w:tcMar>
+            <w:vAlign w:val="center"/>
+          </w:tcPr>
+          <w:p>
+            <w:pPr>
+              <w:spacing w:after="0" w:line="252" w:lineRule="auto"/>
+            </w:pPr>
+            <w:r>
+              <w:rPr>
+                <w:sz w:val="16"/>
+              </w:rPr>
+              <w:t>University policy</w:t>
+            </w:r>
+          </w:p>
+        </w:tc>
+        <w:tc>
+          <w:tcPr>
+            <w:tcW w:w="3384" w:type="dxa"/>
+            <w:tcMar>
+              <w:top w:w="95" w:type="dxa"/>
+              <w:left w:w="110" w:type="dxa"/>
+              <w:bottom w:w="95" w:type="dxa"/>
+              <w:right w:w="110" w:type="dxa"/>
+            </w:tcMar>
+            <w:vAlign w:val="center"/>
+          </w:tcPr>
+          <w:p>
+            <w:pPr>
+              <w:spacing w:after="0" w:line="252" w:lineRule="auto"/>
+            </w:pPr>
+            <w:r>
+              <w:rPr>
+                <w:sz w:val="16"/>
+              </w:rPr>
+              <w:t>Internal acceptable-use, identity, data, network, and procurement rules apply</w:t>
+            </w:r>
+          </w:p>
+        </w:tc>
+        <w:tc>
+          <w:tcPr>
+            <w:tcW w:w="4608" w:type="dxa"/>
+            <w:tcMar>
+              <w:top w:w="95" w:type="dxa"/>
+              <w:left w:w="110" w:type="dxa"/>
+              <w:bottom w:w="95" w:type="dxa"/>
+              <w:right w:w="110" w:type="dxa"/>
+            </w:tcMar>
+            <w:vAlign w:val="center"/>
+          </w:tcPr>
+          <w:p>
+            <w:pPr>
+              <w:spacing w:after="0" w:line="252" w:lineRule="auto"/>
+            </w:pPr>
+            <w:r>
+              <w:rPr>
+                <w:sz w:val="16"/>
+              </w:rPr>
+              <w:t>Consult current policy owners before integration or pilot deployment</w:t>
+            </w:r>
+          </w:p>
+        </w:tc>
+      </w:tr>
+    </w:tbl>
+    <w:p>
+      <w:pPr>
+        <w:spacing w:after="40"/>
+      </w:pPr>
+    </w:p>
+    <w:p>
+      <w:pPr>
+        <w:pStyle w:val="Heading2"/>
+        <w:rPr>
+          <w:b w:val="0"/>
+          <w:bCs w:val="0"/>
+          <w:color w:val="000000" w:themeColor="text1"/>
+        </w:rPr>
+      </w:pPr>
+      <w:r>
+        <w:rPr>
+          <w:color w:val="000000" w:themeColor="text1"/>
+        </w:rPr>
+        <w:lastRenderedPageBreak/>
+        <w:t>9. 1 Ethical Use of AI</w:t>
+      </w:r>
+    </w:p>
+    <w:p>
+      <w:r>
+        <w:t>The ethical boundary is straightforward: AI may help people find, classify, compare, and explain resources, but accountable users make consequential decisions. Every recommendation should show the main factors, confidence or uncertainty, and the model or rule version. Users must be able to reject the recommendation and provide a reason.</w:t>
+      </w:r>
+    </w:p>
+    <w:p>
+      <w:pPr>
+        <w:pStyle w:val="Heading2"/>
+        <w:rPr>
+          <w:b w:val="0"/>
+          <w:bCs w:val="0"/>
+          <w:color w:val="000000" w:themeColor="text1"/>
+        </w:rPr>
+      </w:pPr>
+      <w:r>
+        <w:rPr>
+          <w:color w:val="000000" w:themeColor="text1"/>
+        </w:rPr>
+        <w:t>9. 2 Privacy by Design</w:t>
+      </w:r>
+    </w:p>
+    <w:p>
+      <w:r>
+        <w:t>The prototype should avoid unnecessary personal fields. Access tests should verify that a requester cannot view another user's restricted activity, a department representative cannot approve an action outside the assigned role, and an external AI request does not include information that the model does not need. Logs should record relevant actions without copying full prompts or sensitive documents by default.</w:t>
+      </w:r>
+    </w:p>
+    <w:p>
+      <w:pPr>
+        <w:pStyle w:val="Heading1"/>
+        <w:rPr>
+          <w:b w:val="0"/>
+          <w:bCs w:val="0"/>
+          <w:color w:val="000000" w:themeColor="text1"/>
+          <w:szCs w:val="32"/>
+        </w:rPr>
+      </w:pPr>
+      <w:r>
+        <w:rPr>
+          <w:color w:val="000000" w:themeColor="text1"/>
+          <w:szCs w:val="32"/>
+        </w:rPr>
+        <w:t>10 Risk Assessment</w:t>
+      </w:r>
+    </w:p>
+    <w:p>
+      <w:r>
+        <w:t>The risk assessment combines the concerns raised in Phase 1 with the additional data, AI, privacy, and policy risks. Likelihood and impact use a five-point scale. The score is likelihood multiplied by impact. Values from 15 to 25 require immediate treatment, values from 8 to 14 require planned mitigation and monitoring, and lower values remain in the register for review.</w:t>
+      </w:r>
+    </w:p>
+    <w:p>
+      <w:pPr>
+        <w:pStyle w:val="Caption"/>
+        <w:keepNext/>
+        <w:spacing w:before="80"/>
+        <w:jc w:val="center"/>
+      </w:pPr>
+      <w:r>
+        <w:t>Table 10 Risk Register</w:t>
+      </w:r>
+    </w:p>
+    <w:tbl>
+      <w:tblPr>
+        <w:tblW w:w="0" w:type="auto"/>
+        <w:jc w:val="center"/>
+        <w:tblBorders>
+          <w:top w:val="single" w:sz="6" w:space="0" w:color="D9D9D9"/>
+          <w:left w:val="single" w:sz="6" w:space="0" w:color="D9D9D9"/>
+          <w:bottom w:val="single" w:sz="6" w:space="0" w:color="D9D9D9"/>
+          <w:right w:val="single" w:sz="6" w:space="0" w:color="D9D9D9"/>
+          <w:insideH w:val="single" w:sz="6" w:space="0" w:color="D9D9D9"/>
+          <w:insideV w:val="single" w:sz="6" w:space="0" w:color="D9D9D9"/>
+        </w:tblBorders>
+        <w:tblLayout w:type="fixed"/>
+        <w:tblLook w:val="04A0" w:firstRow="1" w:lastRow="0" w:firstColumn="1" w:lastColumn="0" w:noHBand="0" w:noVBand="1"/>
+      </w:tblPr>
+      <w:tblGrid>
+        <w:gridCol w:w="3024"/>
+        <w:gridCol w:w="503"/>
+        <w:gridCol w:w="503"/>
+        <w:gridCol w:w="792"/>
+        <w:gridCol w:w="5256"/>
+      </w:tblGrid>
+      <w:tr>
+        <w:trPr>
+          <w:cantSplit/>
+          <w:tblHeader/>
+          <w:jc w:val="center"/>
+        </w:trPr>
+        <w:tc>
+          <w:tcPr>
+            <w:tcW w:w="3024" w:type="dxa"/>
+            <w:shd w:val="clear" w:color="auto" w:fill="17365D"/>
+            <w:tcMar>
+              <w:top w:w="105" w:type="dxa"/>
+              <w:left w:w="115" w:type="dxa"/>
+              <w:bottom w:w="105" w:type="dxa"/>
+              <w:right w:w="115" w:type="dxa"/>
+            </w:tcMar>
+            <w:vAlign w:val="center"/>
+          </w:tcPr>
+          <w:p>
+            <w:pPr>
+              <w:spacing w:after="0" w:line="240" w:lineRule="auto"/>
+              <w:jc w:val="center"/>
+            </w:pPr>
+            <w:r>
+              <w:rPr>
+                <w:b/>
+                <w:color w:val="FFFFFF"/>
+                <w:sz w:val="18"/>
+              </w:rPr>
+              <w:t>Risk</w:t>
+            </w:r>
+          </w:p>
+        </w:tc>
+        <w:tc>
+          <w:tcPr>
+            <w:tcW w:w="503" w:type="dxa"/>
+            <w:shd w:val="clear" w:color="auto" w:fill="17365D"/>
+            <w:tcMar>
+              <w:top w:w="105" w:type="dxa"/>
+              <w:left w:w="115" w:type="dxa"/>
+              <w:bottom w:w="105" w:type="dxa"/>
+              <w:right w:w="115" w:type="dxa"/>
+            </w:tcMar>
+            <w:vAlign w:val="center"/>
+          </w:tcPr>
+          <w:p>
+            <w:pPr>
+              <w:spacing w:after="0" w:line="240" w:lineRule="auto"/>
+              <w:jc w:val="center"/>
+            </w:pPr>
+            <w:r>
+              <w:rPr>
+                <w:b/>
+                <w:color w:val="FFFFFF"/>
+                <w:sz w:val="18"/>
+              </w:rPr>
+              <w:t>L</w:t>
+            </w:r>
+          </w:p>
+        </w:tc>
+        <w:tc>
+          <w:tcPr>
+            <w:tcW w:w="503" w:type="dxa"/>
+            <w:shd w:val="clear" w:color="auto" w:fill="17365D"/>
+            <w:tcMar>
+              <w:top w:w="105" w:type="dxa"/>
+              <w:left w:w="115" w:type="dxa"/>
+              <w:bottom w:w="105" w:type="dxa"/>
+              <w:right w:w="115" w:type="dxa"/>
+            </w:tcMar>
+            <w:vAlign w:val="center"/>
+          </w:tcPr>
+          <w:p>
+            <w:pPr>
+              <w:spacing w:after="0" w:line="240" w:lineRule="auto"/>
+              <w:jc w:val="center"/>
+            </w:pPr>
+            <w:r>
+              <w:rPr>
+                <w:b/>
+                <w:color w:val="FFFFFF"/>
+                <w:sz w:val="18"/>
+              </w:rPr>
+              <w:t>I</w:t>
+            </w:r>
+          </w:p>
+        </w:tc>
+        <w:tc>
+          <w:tcPr>
+            <w:tcW w:w="792" w:type="dxa"/>
+            <w:shd w:val="clear" w:color="auto" w:fill="17365D"/>
+            <w:tcMar>
+              <w:top w:w="105" w:type="dxa"/>
+              <w:left w:w="115" w:type="dxa"/>
+              <w:bottom w:w="105" w:type="dxa"/>
+              <w:right w:w="115" w:type="dxa"/>
+            </w:tcMar>
+            <w:vAlign w:val="center"/>
+          </w:tcPr>
+          <w:p>
+            <w:pPr>
+              <w:spacing w:after="0" w:line="240" w:lineRule="auto"/>
+              <w:jc w:val="center"/>
+            </w:pPr>
+            <w:r>
+              <w:rPr>
+                <w:b/>
+                <w:color w:val="FFFFFF"/>
+                <w:sz w:val="18"/>
+              </w:rPr>
+              <w:t>Score</w:t>
+            </w:r>
+          </w:p>
+        </w:tc>
+        <w:tc>
+          <w:tcPr>
+            <w:tcW w:w="5256" w:type="dxa"/>
+            <w:shd w:val="clear" w:color="auto" w:fill="17365D"/>
+            <w:tcMar>
+              <w:top w:w="105" w:type="dxa"/>
+              <w:left w:w="115" w:type="dxa"/>
+              <w:bottom w:w="105" w:type="dxa"/>
+              <w:right w:w="115" w:type="dxa"/>
+            </w:tcMar>
+            <w:vAlign w:val="center"/>
+          </w:tcPr>
+          <w:p>
+            <w:pPr>
+              <w:spacing w:after="0" w:line="240" w:lineRule="auto"/>
+              <w:jc w:val="center"/>
+            </w:pPr>
+            <w:r>
+              <w:rPr>
+                <w:b/>
+                <w:color w:val="FFFFFF"/>
+                <w:sz w:val="18"/>
+              </w:rPr>
+              <w:t>Mitigation</w:t>
+            </w:r>
+          </w:p>
+        </w:tc>
+      </w:tr>
+      <w:tr>
+        <w:trPr>
+          <w:cantSplit/>
+          <w:jc w:val="center"/>
+        </w:trPr>
+        <w:tc>
+          <w:tcPr>
+            <w:tcW w:w="3024" w:type="dxa"/>
+            <w:tcMar>
+              <w:top w:w="95" w:type="dxa"/>
+              <w:left w:w="110" w:type="dxa"/>
+              <w:bottom w:w="95" w:type="dxa"/>
+              <w:right w:w="110" w:type="dxa"/>
+            </w:tcMar>
+            <w:vAlign w:val="center"/>
+          </w:tcPr>
+          <w:p>
+            <w:pPr>
+              <w:spacing w:after="0" w:line="252" w:lineRule="auto"/>
+            </w:pPr>
+            <w:r>
+              <w:rPr>
+                <w:sz w:val="15"/>
+              </w:rPr>
+              <w:t>Scope exceeds two-person capacity</w:t>
+            </w:r>
+          </w:p>
+        </w:tc>
+        <w:tc>
+          <w:tcPr>
+            <w:tcW w:w="503" w:type="dxa"/>
+            <w:tcMar>
+              <w:top w:w="95" w:type="dxa"/>
+              <w:left w:w="110" w:type="dxa"/>
+              <w:bottom w:w="95" w:type="dxa"/>
+              <w:right w:w="110" w:type="dxa"/>
+            </w:tcMar>
+            <w:vAlign w:val="center"/>
+          </w:tcPr>
+          <w:p>
+            <w:pPr>
+              <w:spacing w:after="0" w:line="252" w:lineRule="auto"/>
+              <w:jc w:val="center"/>
+            </w:pPr>
+            <w:r>
+              <w:rPr>
+                <w:sz w:val="15"/>
+              </w:rPr>
+              <w:t>4</w:t>
+            </w:r>
+          </w:p>
+        </w:tc>
+        <w:tc>
+          <w:tcPr>
+            <w:tcW w:w="503" w:type="dxa"/>
+            <w:tcMar>
+              <w:top w:w="95" w:type="dxa"/>
+              <w:left w:w="110" w:type="dxa"/>
+              <w:bottom w:w="95" w:type="dxa"/>
+              <w:right w:w="110" w:type="dxa"/>
+            </w:tcMar>
+            <w:vAlign w:val="center"/>
+          </w:tcPr>
+          <w:p>
+            <w:pPr>
+              <w:spacing w:after="0" w:line="252" w:lineRule="auto"/>
+              <w:jc w:val="center"/>
+            </w:pPr>
+            <w:r>
+              <w:rPr>
+                <w:sz w:val="15"/>
+              </w:rPr>
+              <w:t>5</w:t>
+            </w:r>
+          </w:p>
+        </w:tc>
+        <w:tc>
+          <w:tcPr>
+            <w:tcW w:w="792" w:type="dxa"/>
+            <w:tcMar>
+              <w:top w:w="95" w:type="dxa"/>
+              <w:left w:w="110" w:type="dxa"/>
+              <w:bottom w:w="95" w:type="dxa"/>
+              <w:right w:w="110" w:type="dxa"/>
+            </w:tcMar>
+            <w:vAlign w:val="center"/>
+          </w:tcPr>
+          <w:p>
+            <w:pPr>
+              <w:spacing w:after="0" w:line="252" w:lineRule="auto"/>
+              <w:jc w:val="center"/>
+            </w:pPr>
+            <w:r>
+              <w:rPr>
+                <w:sz w:val="15"/>
+              </w:rPr>
+              <w:t>20</w:t>
+            </w:r>
+          </w:p>
+        </w:tc>
+        <w:tc>
+          <w:tcPr>
+            <w:tcW w:w="5256" w:type="dxa"/>
+            <w:tcMar>
+              <w:top w:w="95" w:type="dxa"/>
+              <w:left w:w="110" w:type="dxa"/>
+              <w:bottom w:w="95" w:type="dxa"/>
+              <w:right w:w="110" w:type="dxa"/>
+            </w:tcMar>
+            <w:vAlign w:val="center"/>
+          </w:tcPr>
+          <w:p>
+            <w:pPr>
+              <w:spacing w:after="0" w:line="252" w:lineRule="auto"/>
+              <w:rPr>
+                <w:sz w:val="15"/>
+              </w:rPr>
+            </w:pPr>
+            <w:r>
+              <w:rPr>
+                <w:sz w:val="15"/>
+              </w:rPr>
+              <w:t>Finalize the essential scope and postpone optional features that could delay the core workflow.</w:t>
+            </w:r>
+          </w:p>
+        </w:tc>
+      </w:tr>
+      <w:tr>
+        <w:trPr>
+          <w:cantSplit/>
+          <w:jc w:val="center"/>
+        </w:trPr>
+        <w:tc>
+          <w:tcPr>
+            <w:tcW w:w="3024" w:type="dxa"/>
+            <w:shd w:val="clear" w:color="auto" w:fill="EAF2F8"/>
+            <w:tcMar>
+              <w:top w:w="95" w:type="dxa"/>
+              <w:left w:w="110" w:type="dxa"/>
+              <w:bottom w:w="95" w:type="dxa"/>
+              <w:right w:w="110" w:type="dxa"/>
+            </w:tcMar>
+            <w:vAlign w:val="center"/>
+          </w:tcPr>
+          <w:p>
+            <w:pPr>
+              <w:spacing w:after="0" w:line="252" w:lineRule="auto"/>
+            </w:pPr>
+            <w:r>
+              <w:rPr>
+                <w:sz w:val="15"/>
+              </w:rPr>
+              <w:t>Usable institutional data is unavailable</w:t>
+            </w:r>
+          </w:p>
+        </w:tc>
+        <w:tc>
+          <w:tcPr>
+            <w:tcW w:w="503" w:type="dxa"/>
+            <w:shd w:val="clear" w:color="auto" w:fill="EAF2F8"/>
+            <w:tcMar>
+              <w:top w:w="95" w:type="dxa"/>
+              <w:left w:w="110" w:type="dxa"/>
+              <w:bottom w:w="95" w:type="dxa"/>
+              <w:right w:w="110" w:type="dxa"/>
+            </w:tcMar>
+            <w:vAlign w:val="center"/>
+          </w:tcPr>
+          <w:p>
+            <w:pPr>
+              <w:spacing w:after="0" w:line="252" w:lineRule="auto"/>
+              <w:jc w:val="center"/>
+            </w:pPr>
+            <w:r>
+              <w:rPr>
+                <w:sz w:val="15"/>
+              </w:rPr>
+              <w:t>4</w:t>
+            </w:r>
+          </w:p>
+        </w:tc>
+        <w:tc>
+          <w:tcPr>
+            <w:tcW w:w="503" w:type="dxa"/>
+            <w:shd w:val="clear" w:color="auto" w:fill="EAF2F8"/>
+            <w:tcMar>
+              <w:top w:w="95" w:type="dxa"/>
+              <w:left w:w="110" w:type="dxa"/>
+              <w:bottom w:w="95" w:type="dxa"/>
+              <w:right w:w="110" w:type="dxa"/>
+            </w:tcMar>
+            <w:vAlign w:val="center"/>
+          </w:tcPr>
+          <w:p>
+            <w:pPr>
+              <w:spacing w:after="0" w:line="252" w:lineRule="auto"/>
+              <w:jc w:val="center"/>
+            </w:pPr>
+            <w:r>
+              <w:rPr>
+                <w:sz w:val="15"/>
+              </w:rPr>
+              <w:t>4</w:t>
+            </w:r>
+          </w:p>
+        </w:tc>
+        <w:tc>
+          <w:tcPr>
+            <w:tcW w:w="792" w:type="dxa"/>
+            <w:shd w:val="clear" w:color="auto" w:fill="EAF2F8"/>
+            <w:tcMar>
+              <w:top w:w="95" w:type="dxa"/>
+              <w:left w:w="110" w:type="dxa"/>
+              <w:bottom w:w="95" w:type="dxa"/>
+              <w:right w:w="110" w:type="dxa"/>
+            </w:tcMar>
+            <w:vAlign w:val="center"/>
+          </w:tcPr>
+          <w:p>
+            <w:pPr>
+              <w:spacing w:after="0" w:line="252" w:lineRule="auto"/>
+              <w:jc w:val="center"/>
+            </w:pPr>
+            <w:r>
+              <w:rPr>
+                <w:sz w:val="15"/>
+              </w:rPr>
+              <w:t>16</w:t>
+            </w:r>
+          </w:p>
+        </w:tc>
+        <w:tc>
+          <w:tcPr>
+            <w:tcW w:w="5256" w:type="dxa"/>
+            <w:shd w:val="clear" w:color="auto" w:fill="EAF2F8"/>
+            <w:tcMar>
+              <w:top w:w="95" w:type="dxa"/>
+              <w:left w:w="110" w:type="dxa"/>
+              <w:bottom w:w="95" w:type="dxa"/>
+              <w:right w:w="110" w:type="dxa"/>
+            </w:tcMar>
+            <w:vAlign w:val="center"/>
+          </w:tcPr>
+          <w:p>
+            <w:pPr>
+              <w:spacing w:after="0" w:line="252" w:lineRule="auto"/>
+            </w:pPr>
+            <w:r>
+              <w:rPr>
+                <w:sz w:val="15"/>
+              </w:rPr>
+              <w:t>Use synthetic or approved anonymized data</w:t>
+            </w:r>
+          </w:p>
+        </w:tc>
+      </w:tr>
+      <w:tr>
+        <w:trPr>
+          <w:cantSplit/>
+          <w:jc w:val="center"/>
+        </w:trPr>
+        <w:tc>
+          <w:tcPr>
+            <w:tcW w:w="3024" w:type="dxa"/>
+            <w:tcMar>
+              <w:top w:w="95" w:type="dxa"/>
+              <w:left w:w="110" w:type="dxa"/>
+              <w:bottom w:w="95" w:type="dxa"/>
+              <w:right w:w="110" w:type="dxa"/>
+            </w:tcMar>
+            <w:vAlign w:val="center"/>
+          </w:tcPr>
+          <w:p>
+            <w:pPr>
+              <w:spacing w:after="0" w:line="252" w:lineRule="auto"/>
+            </w:pPr>
+            <w:r>
+              <w:rPr>
+                <w:sz w:val="15"/>
+              </w:rPr>
+              <w:t>AI matches are irrelevant or unstable</w:t>
+            </w:r>
+          </w:p>
+        </w:tc>
+        <w:tc>
+          <w:tcPr>
+            <w:tcW w:w="503" w:type="dxa"/>
+            <w:tcMar>
+              <w:top w:w="95" w:type="dxa"/>
+              <w:left w:w="110" w:type="dxa"/>
+              <w:bottom w:w="95" w:type="dxa"/>
+              <w:right w:w="110" w:type="dxa"/>
+            </w:tcMar>
+            <w:vAlign w:val="center"/>
+          </w:tcPr>
+          <w:p>
+            <w:pPr>
+              <w:spacing w:after="0" w:line="252" w:lineRule="auto"/>
+              <w:jc w:val="center"/>
+            </w:pPr>
+            <w:r>
+              <w:rPr>
+                <w:sz w:val="15"/>
+              </w:rPr>
+              <w:t>3</w:t>
+            </w:r>
+          </w:p>
+        </w:tc>
+        <w:tc>
+          <w:tcPr>
+            <w:tcW w:w="503" w:type="dxa"/>
+            <w:tcMar>
+              <w:top w:w="95" w:type="dxa"/>
+              <w:left w:w="110" w:type="dxa"/>
+              <w:bottom w:w="95" w:type="dxa"/>
+              <w:right w:w="110" w:type="dxa"/>
+            </w:tcMar>
+            <w:vAlign w:val="center"/>
+          </w:tcPr>
+          <w:p>
+            <w:pPr>
+              <w:spacing w:after="0" w:line="252" w:lineRule="auto"/>
+              <w:jc w:val="center"/>
+            </w:pPr>
+            <w:r>
+              <w:rPr>
+                <w:sz w:val="15"/>
+              </w:rPr>
+              <w:t>4</w:t>
+            </w:r>
+          </w:p>
+        </w:tc>
+        <w:tc>
+          <w:tcPr>
+            <w:tcW w:w="792" w:type="dxa"/>
+            <w:tcMar>
+              <w:top w:w="95" w:type="dxa"/>
+              <w:left w:w="110" w:type="dxa"/>
+              <w:bottom w:w="95" w:type="dxa"/>
+              <w:right w:w="110" w:type="dxa"/>
+            </w:tcMar>
+            <w:vAlign w:val="center"/>
+          </w:tcPr>
+          <w:p>
+            <w:pPr>
+              <w:spacing w:after="0" w:line="252" w:lineRule="auto"/>
+              <w:jc w:val="center"/>
+            </w:pPr>
+            <w:r>
+              <w:rPr>
+                <w:sz w:val="15"/>
+              </w:rPr>
+              <w:t>12</w:t>
+            </w:r>
+          </w:p>
+        </w:tc>
+        <w:tc>
+          <w:tcPr>
+            <w:tcW w:w="5256" w:type="dxa"/>
+            <w:tcMar>
+              <w:top w:w="95" w:type="dxa"/>
+              <w:left w:w="110" w:type="dxa"/>
+              <w:bottom w:w="95" w:type="dxa"/>
+              <w:right w:w="110" w:type="dxa"/>
+            </w:tcMar>
+            <w:vAlign w:val="center"/>
+          </w:tcPr>
+          <w:p>
+            <w:pPr>
+              <w:spacing w:after="0" w:line="252" w:lineRule="auto"/>
+            </w:pPr>
+            <w:r>
+              <w:rPr>
+                <w:sz w:val="15"/>
+              </w:rPr>
+              <w:t>Create labeled evaluation set, store versions, retain filters and manual selection</w:t>
+            </w:r>
+          </w:p>
+        </w:tc>
+      </w:tr>
+      <w:tr>
+        <w:trPr>
+          <w:cantSplit/>
+          <w:jc w:val="center"/>
+        </w:trPr>
+        <w:tc>
+          <w:tcPr>
+            <w:tcW w:w="3024" w:type="dxa"/>
+            <w:shd w:val="clear" w:color="auto" w:fill="EAF2F8"/>
+            <w:tcMar>
+              <w:top w:w="95" w:type="dxa"/>
+              <w:left w:w="110" w:type="dxa"/>
+              <w:bottom w:w="95" w:type="dxa"/>
+              <w:right w:w="110" w:type="dxa"/>
+            </w:tcMar>
+            <w:vAlign w:val="center"/>
+          </w:tcPr>
+          <w:p>
+            <w:pPr>
+              <w:spacing w:after="0" w:line="252" w:lineRule="auto"/>
+            </w:pPr>
+            <w:r>
+              <w:rPr>
+                <w:sz w:val="15"/>
+              </w:rPr>
+              <w:t>External AI cost exceeds the plan</w:t>
+            </w:r>
+          </w:p>
+        </w:tc>
+        <w:tc>
+          <w:tcPr>
+            <w:tcW w:w="503" w:type="dxa"/>
+            <w:shd w:val="clear" w:color="auto" w:fill="EAF2F8"/>
+            <w:tcMar>
+              <w:top w:w="95" w:type="dxa"/>
+              <w:left w:w="110" w:type="dxa"/>
+              <w:bottom w:w="95" w:type="dxa"/>
+              <w:right w:w="110" w:type="dxa"/>
+            </w:tcMar>
+            <w:vAlign w:val="center"/>
+          </w:tcPr>
+          <w:p>
+            <w:pPr>
+              <w:spacing w:after="0" w:line="252" w:lineRule="auto"/>
+              <w:jc w:val="center"/>
+            </w:pPr>
+            <w:r>
+              <w:rPr>
+                <w:sz w:val="15"/>
+              </w:rPr>
+              <w:t>3</w:t>
+            </w:r>
+          </w:p>
+        </w:tc>
+        <w:tc>
+          <w:tcPr>
+            <w:tcW w:w="503" w:type="dxa"/>
+            <w:shd w:val="clear" w:color="auto" w:fill="EAF2F8"/>
+            <w:tcMar>
+              <w:top w:w="95" w:type="dxa"/>
+              <w:left w:w="110" w:type="dxa"/>
+              <w:bottom w:w="95" w:type="dxa"/>
+              <w:right w:w="110" w:type="dxa"/>
+            </w:tcMar>
+            <w:vAlign w:val="center"/>
+          </w:tcPr>
+          <w:p>
+            <w:pPr>
+              <w:spacing w:after="0" w:line="252" w:lineRule="auto"/>
+              <w:jc w:val="center"/>
+            </w:pPr>
+            <w:r>
+              <w:rPr>
+                <w:sz w:val="15"/>
+              </w:rPr>
+              <w:t>3</w:t>
+            </w:r>
+          </w:p>
+        </w:tc>
+        <w:tc>
+          <w:tcPr>
+            <w:tcW w:w="792" w:type="dxa"/>
+            <w:shd w:val="clear" w:color="auto" w:fill="EAF2F8"/>
+            <w:tcMar>
+              <w:top w:w="95" w:type="dxa"/>
+              <w:left w:w="110" w:type="dxa"/>
+              <w:bottom w:w="95" w:type="dxa"/>
+              <w:right w:w="110" w:type="dxa"/>
+            </w:tcMar>
+            <w:vAlign w:val="center"/>
+          </w:tcPr>
+          <w:p>
+            <w:pPr>
+              <w:spacing w:after="0" w:line="252" w:lineRule="auto"/>
+              <w:jc w:val="center"/>
+            </w:pPr>
+            <w:r>
+              <w:rPr>
+                <w:sz w:val="15"/>
+              </w:rPr>
+              <w:t>9</w:t>
+            </w:r>
+          </w:p>
+        </w:tc>
+        <w:tc>
+          <w:tcPr>
+            <w:tcW w:w="5256" w:type="dxa"/>
+            <w:shd w:val="clear" w:color="auto" w:fill="EAF2F8"/>
+            <w:tcMar>
+              <w:top w:w="95" w:type="dxa"/>
+              <w:left w:w="110" w:type="dxa"/>
+              <w:bottom w:w="95" w:type="dxa"/>
+              <w:right w:w="110" w:type="dxa"/>
+            </w:tcMar>
+            <w:vAlign w:val="center"/>
+          </w:tcPr>
+          <w:p>
+            <w:pPr>
+              <w:spacing w:after="0" w:line="252" w:lineRule="auto"/>
+            </w:pPr>
+            <w:r>
+              <w:rPr>
+                <w:sz w:val="15"/>
+              </w:rPr>
+              <w:t>Cut back on AI functions</w:t>
+            </w:r>
+          </w:p>
+        </w:tc>
+      </w:tr>
+      <w:tr>
+        <w:trPr>
+          <w:cantSplit/>
+          <w:jc w:val="center"/>
+        </w:trPr>
+        <w:tc>
+          <w:tcPr>
+            <w:tcW w:w="3024" w:type="dxa"/>
+            <w:tcMar>
+              <w:top w:w="95" w:type="dxa"/>
+              <w:left w:w="110" w:type="dxa"/>
+              <w:bottom w:w="95" w:type="dxa"/>
+              <w:right w:w="110" w:type="dxa"/>
+            </w:tcMar>
+            <w:vAlign w:val="center"/>
+          </w:tcPr>
+          <w:p>
+            <w:pPr>
+              <w:spacing w:after="0" w:line="252" w:lineRule="auto"/>
+            </w:pPr>
+            <w:r>
+              <w:rPr>
+                <w:sz w:val="15"/>
+              </w:rPr>
+              <w:t>Privacy or policy violation</w:t>
+            </w:r>
+          </w:p>
+        </w:tc>
+        <w:tc>
+          <w:tcPr>
+            <w:tcW w:w="503" w:type="dxa"/>
+            <w:tcMar>
+              <w:top w:w="95" w:type="dxa"/>
+              <w:left w:w="110" w:type="dxa"/>
+              <w:bottom w:w="95" w:type="dxa"/>
+              <w:right w:w="110" w:type="dxa"/>
+            </w:tcMar>
+            <w:vAlign w:val="center"/>
+          </w:tcPr>
+          <w:p>
+            <w:pPr>
+              <w:spacing w:after="0" w:line="252" w:lineRule="auto"/>
+              <w:jc w:val="center"/>
+            </w:pPr>
+            <w:r>
+              <w:rPr>
+                <w:sz w:val="15"/>
+              </w:rPr>
+              <w:t>2</w:t>
+            </w:r>
+          </w:p>
+        </w:tc>
+        <w:tc>
+          <w:tcPr>
+            <w:tcW w:w="503" w:type="dxa"/>
+            <w:tcMar>
+              <w:top w:w="95" w:type="dxa"/>
+              <w:left w:w="110" w:type="dxa"/>
+              <w:bottom w:w="95" w:type="dxa"/>
+              <w:right w:w="110" w:type="dxa"/>
+            </w:tcMar>
+            <w:vAlign w:val="center"/>
+          </w:tcPr>
+          <w:p>
+            <w:pPr>
+              <w:spacing w:after="0" w:line="252" w:lineRule="auto"/>
+              <w:jc w:val="center"/>
+            </w:pPr>
+            <w:r>
+              <w:rPr>
+                <w:sz w:val="15"/>
+              </w:rPr>
+              <w:t>5</w:t>
+            </w:r>
+          </w:p>
+        </w:tc>
+        <w:tc>
+          <w:tcPr>
+            <w:tcW w:w="792" w:type="dxa"/>
+            <w:tcMar>
+              <w:top w:w="95" w:type="dxa"/>
+              <w:left w:w="110" w:type="dxa"/>
+              <w:bottom w:w="95" w:type="dxa"/>
+              <w:right w:w="110" w:type="dxa"/>
+            </w:tcMar>
+            <w:vAlign w:val="center"/>
+          </w:tcPr>
+          <w:p>
+            <w:pPr>
+              <w:spacing w:after="0" w:line="252" w:lineRule="auto"/>
+              <w:jc w:val="center"/>
+            </w:pPr>
+            <w:r>
+              <w:rPr>
+                <w:sz w:val="15"/>
+              </w:rPr>
+              <w:t>10</w:t>
+            </w:r>
+          </w:p>
+        </w:tc>
+        <w:tc>
+          <w:tcPr>
+            <w:tcW w:w="5256" w:type="dxa"/>
+            <w:tcMar>
+              <w:top w:w="95" w:type="dxa"/>
+              <w:left w:w="110" w:type="dxa"/>
+              <w:bottom w:w="95" w:type="dxa"/>
+              <w:right w:w="110" w:type="dxa"/>
+            </w:tcMar>
+            <w:vAlign w:val="center"/>
+          </w:tcPr>
+          <w:p>
+            <w:pPr>
+              <w:spacing w:after="0" w:line="252" w:lineRule="auto"/>
+            </w:pPr>
+            <w:r>
+              <w:rPr>
+                <w:sz w:val="15"/>
+              </w:rPr>
+              <w:t>Minimize collected data, review service terms and obtain approval before real data</w:t>
+            </w:r>
+          </w:p>
+        </w:tc>
+      </w:tr>
+      <w:tr>
+        <w:trPr>
+          <w:cantSplit/>
+          <w:jc w:val="center"/>
+        </w:trPr>
+        <w:tc>
+          <w:tcPr>
+            <w:tcW w:w="3024" w:type="dxa"/>
+            <w:shd w:val="clear" w:color="auto" w:fill="EAF2F8"/>
+            <w:tcMar>
+              <w:top w:w="95" w:type="dxa"/>
+              <w:left w:w="110" w:type="dxa"/>
+              <w:bottom w:w="95" w:type="dxa"/>
+              <w:right w:w="110" w:type="dxa"/>
+            </w:tcMar>
+            <w:vAlign w:val="center"/>
+          </w:tcPr>
+          <w:p>
+            <w:pPr>
+              <w:spacing w:after="0" w:line="252" w:lineRule="auto"/>
+            </w:pPr>
+            <w:r>
+              <w:rPr>
+                <w:sz w:val="15"/>
+              </w:rPr>
+              <w:t>Unauthorized ownership or status change</w:t>
+            </w:r>
+          </w:p>
+        </w:tc>
+        <w:tc>
+          <w:tcPr>
+            <w:tcW w:w="503" w:type="dxa"/>
+            <w:shd w:val="clear" w:color="auto" w:fill="EAF2F8"/>
+            <w:tcMar>
+              <w:top w:w="95" w:type="dxa"/>
+              <w:left w:w="110" w:type="dxa"/>
+              <w:bottom w:w="95" w:type="dxa"/>
+              <w:right w:w="110" w:type="dxa"/>
+            </w:tcMar>
+            <w:vAlign w:val="center"/>
+          </w:tcPr>
+          <w:p>
+            <w:pPr>
+              <w:spacing w:after="0" w:line="252" w:lineRule="auto"/>
+              <w:jc w:val="center"/>
+            </w:pPr>
+            <w:r>
+              <w:rPr>
+                <w:sz w:val="15"/>
+              </w:rPr>
+              <w:t>2</w:t>
+            </w:r>
+          </w:p>
+        </w:tc>
+        <w:tc>
+          <w:tcPr>
+            <w:tcW w:w="503" w:type="dxa"/>
+            <w:shd w:val="clear" w:color="auto" w:fill="EAF2F8"/>
+            <w:tcMar>
+              <w:top w:w="95" w:type="dxa"/>
+              <w:left w:w="110" w:type="dxa"/>
+              <w:bottom w:w="95" w:type="dxa"/>
+              <w:right w:w="110" w:type="dxa"/>
+            </w:tcMar>
+            <w:vAlign w:val="center"/>
+          </w:tcPr>
+          <w:p>
+            <w:pPr>
+              <w:spacing w:after="0" w:line="252" w:lineRule="auto"/>
+              <w:jc w:val="center"/>
+            </w:pPr>
+            <w:r>
+              <w:rPr>
+                <w:sz w:val="15"/>
+              </w:rPr>
+              <w:t>5</w:t>
+            </w:r>
+          </w:p>
+        </w:tc>
+        <w:tc>
+          <w:tcPr>
+            <w:tcW w:w="792" w:type="dxa"/>
+            <w:shd w:val="clear" w:color="auto" w:fill="EAF2F8"/>
+            <w:tcMar>
+              <w:top w:w="95" w:type="dxa"/>
+              <w:left w:w="110" w:type="dxa"/>
+              <w:bottom w:w="95" w:type="dxa"/>
+              <w:right w:w="110" w:type="dxa"/>
+            </w:tcMar>
+            <w:vAlign w:val="center"/>
+          </w:tcPr>
+          <w:p>
+            <w:pPr>
+              <w:spacing w:after="0" w:line="252" w:lineRule="auto"/>
+              <w:jc w:val="center"/>
+            </w:pPr>
+            <w:r>
+              <w:rPr>
+                <w:sz w:val="15"/>
+              </w:rPr>
+              <w:t>10</w:t>
+            </w:r>
+          </w:p>
+        </w:tc>
+        <w:tc>
+          <w:tcPr>
+            <w:tcW w:w="5256" w:type="dxa"/>
+            <w:shd w:val="clear" w:color="auto" w:fill="EAF2F8"/>
+            <w:tcMar>
+              <w:top w:w="95" w:type="dxa"/>
+              <w:left w:w="110" w:type="dxa"/>
+              <w:bottom w:w="95" w:type="dxa"/>
+              <w:right w:w="110" w:type="dxa"/>
+            </w:tcMar>
+            <w:vAlign w:val="center"/>
+          </w:tcPr>
+          <w:p>
+            <w:pPr>
+              <w:spacing w:after="0" w:line="252" w:lineRule="auto"/>
+            </w:pPr>
+            <w:r>
+              <w:rPr>
+                <w:sz w:val="15"/>
+              </w:rPr>
+              <w:t>Apply backend authorization, separate approval responsibilities and maintain protected audit records.</w:t>
+            </w:r>
+          </w:p>
+        </w:tc>
+      </w:tr>
+      <w:tr>
+        <w:trPr>
+          <w:cantSplit/>
+          <w:jc w:val="center"/>
+        </w:trPr>
+        <w:tc>
+          <w:tcPr>
+            <w:tcW w:w="3024" w:type="dxa"/>
+            <w:tcMar>
+              <w:top w:w="95" w:type="dxa"/>
+              <w:left w:w="110" w:type="dxa"/>
+              <w:bottom w:w="95" w:type="dxa"/>
+              <w:right w:w="110" w:type="dxa"/>
+            </w:tcMar>
+            <w:vAlign w:val="center"/>
+          </w:tcPr>
+          <w:p>
+            <w:pPr>
+              <w:spacing w:after="0" w:line="252" w:lineRule="auto"/>
+            </w:pPr>
+            <w:r>
+              <w:rPr>
+                <w:sz w:val="15"/>
+              </w:rPr>
+              <w:t>Integration work begins too late</w:t>
+            </w:r>
+          </w:p>
+        </w:tc>
+        <w:tc>
+          <w:tcPr>
+            <w:tcW w:w="503" w:type="dxa"/>
+            <w:tcMar>
+              <w:top w:w="95" w:type="dxa"/>
+              <w:left w:w="110" w:type="dxa"/>
+              <w:bottom w:w="95" w:type="dxa"/>
+              <w:right w:w="110" w:type="dxa"/>
+            </w:tcMar>
+            <w:vAlign w:val="center"/>
+          </w:tcPr>
+          <w:p>
+            <w:pPr>
+              <w:spacing w:after="0" w:line="252" w:lineRule="auto"/>
+              <w:jc w:val="center"/>
+            </w:pPr>
+            <w:r>
+              <w:rPr>
+                <w:sz w:val="15"/>
+              </w:rPr>
+              <w:t>4</w:t>
+            </w:r>
+          </w:p>
+        </w:tc>
+        <w:tc>
+          <w:tcPr>
+            <w:tcW w:w="503" w:type="dxa"/>
+            <w:tcMar>
+              <w:top w:w="95" w:type="dxa"/>
+              <w:left w:w="110" w:type="dxa"/>
+              <w:bottom w:w="95" w:type="dxa"/>
+              <w:right w:w="110" w:type="dxa"/>
+            </w:tcMar>
+            <w:vAlign w:val="center"/>
+          </w:tcPr>
+          <w:p>
+            <w:pPr>
+              <w:spacing w:after="0" w:line="252" w:lineRule="auto"/>
+              <w:jc w:val="center"/>
+            </w:pPr>
+            <w:r>
+              <w:rPr>
+                <w:sz w:val="15"/>
+              </w:rPr>
+              <w:t>4</w:t>
+            </w:r>
+          </w:p>
+        </w:tc>
+        <w:tc>
+          <w:tcPr>
+            <w:tcW w:w="792" w:type="dxa"/>
+            <w:tcMar>
+              <w:top w:w="95" w:type="dxa"/>
+              <w:left w:w="110" w:type="dxa"/>
+              <w:bottom w:w="95" w:type="dxa"/>
+              <w:right w:w="110" w:type="dxa"/>
+            </w:tcMar>
+            <w:vAlign w:val="center"/>
+          </w:tcPr>
+          <w:p>
+            <w:pPr>
+              <w:spacing w:after="0" w:line="252" w:lineRule="auto"/>
+              <w:jc w:val="center"/>
+            </w:pPr>
+            <w:r>
+              <w:rPr>
+                <w:sz w:val="15"/>
+              </w:rPr>
+              <w:t>16</w:t>
+            </w:r>
+          </w:p>
+        </w:tc>
+        <w:tc>
+          <w:tcPr>
+            <w:tcW w:w="5256" w:type="dxa"/>
+            <w:tcMar>
+              <w:top w:w="95" w:type="dxa"/>
+              <w:left w:w="110" w:type="dxa"/>
+              <w:bottom w:w="95" w:type="dxa"/>
+              <w:right w:w="110" w:type="dxa"/>
+            </w:tcMar>
+            <w:vAlign w:val="center"/>
+          </w:tcPr>
+          <w:p>
+            <w:pPr>
+              <w:spacing w:after="0" w:line="252" w:lineRule="auto"/>
+            </w:pPr>
+            <w:r>
+              <w:rPr>
+                <w:sz w:val="15"/>
+              </w:rPr>
+              <w:t>Define interfaces during design and complete an early end-to-end demonstration</w:t>
+            </w:r>
+          </w:p>
+        </w:tc>
+      </w:tr>
+      <w:tr>
+        <w:trPr>
+          <w:cantSplit/>
+          <w:jc w:val="center"/>
+        </w:trPr>
+        <w:tc>
+          <w:tcPr>
+            <w:tcW w:w="3024" w:type="dxa"/>
+            <w:shd w:val="clear" w:color="auto" w:fill="EAF2F8"/>
+            <w:tcMar>
+              <w:top w:w="95" w:type="dxa"/>
+              <w:left w:w="110" w:type="dxa"/>
+              <w:bottom w:w="95" w:type="dxa"/>
+              <w:right w:w="110" w:type="dxa"/>
+            </w:tcMar>
+            <w:vAlign w:val="center"/>
+          </w:tcPr>
+          <w:p>
+            <w:pPr>
+              <w:spacing w:after="0" w:line="252" w:lineRule="auto"/>
+            </w:pPr>
+            <w:r>
+              <w:rPr>
+                <w:sz w:val="15"/>
+              </w:rPr>
+              <w:t>Sustainability figures are misleading</w:t>
+            </w:r>
+          </w:p>
+        </w:tc>
+        <w:tc>
+          <w:tcPr>
+            <w:tcW w:w="503" w:type="dxa"/>
+            <w:shd w:val="clear" w:color="auto" w:fill="EAF2F8"/>
+            <w:tcMar>
+              <w:top w:w="95" w:type="dxa"/>
+              <w:left w:w="110" w:type="dxa"/>
+              <w:bottom w:w="95" w:type="dxa"/>
+              <w:right w:w="110" w:type="dxa"/>
+            </w:tcMar>
+            <w:vAlign w:val="center"/>
+          </w:tcPr>
+          <w:p>
+            <w:pPr>
+              <w:spacing w:after="0" w:line="252" w:lineRule="auto"/>
+              <w:jc w:val="center"/>
+            </w:pPr>
+            <w:r>
+              <w:rPr>
+                <w:sz w:val="15"/>
+              </w:rPr>
+              <w:t>3</w:t>
+            </w:r>
+          </w:p>
+        </w:tc>
+        <w:tc>
+          <w:tcPr>
+            <w:tcW w:w="503" w:type="dxa"/>
+            <w:shd w:val="clear" w:color="auto" w:fill="EAF2F8"/>
+            <w:tcMar>
+              <w:top w:w="95" w:type="dxa"/>
+              <w:left w:w="110" w:type="dxa"/>
+              <w:bottom w:w="95" w:type="dxa"/>
+              <w:right w:w="110" w:type="dxa"/>
+            </w:tcMar>
+            <w:vAlign w:val="center"/>
+          </w:tcPr>
+          <w:p>
+            <w:pPr>
+              <w:spacing w:after="0" w:line="252" w:lineRule="auto"/>
+              <w:jc w:val="center"/>
+            </w:pPr>
+            <w:r>
+              <w:rPr>
+                <w:sz w:val="15"/>
+              </w:rPr>
+              <w:t>4</w:t>
+            </w:r>
+          </w:p>
+        </w:tc>
+        <w:tc>
+          <w:tcPr>
+            <w:tcW w:w="792" w:type="dxa"/>
+            <w:shd w:val="clear" w:color="auto" w:fill="EAF2F8"/>
+            <w:tcMar>
+              <w:top w:w="95" w:type="dxa"/>
+              <w:left w:w="110" w:type="dxa"/>
+              <w:bottom w:w="95" w:type="dxa"/>
+              <w:right w:w="110" w:type="dxa"/>
+            </w:tcMar>
+            <w:vAlign w:val="center"/>
+          </w:tcPr>
+          <w:p>
+            <w:pPr>
+              <w:spacing w:after="0" w:line="252" w:lineRule="auto"/>
+              <w:jc w:val="center"/>
+            </w:pPr>
+            <w:r>
+              <w:rPr>
+                <w:sz w:val="15"/>
+              </w:rPr>
+              <w:t>12</w:t>
+            </w:r>
+          </w:p>
+        </w:tc>
+        <w:tc>
+          <w:tcPr>
+            <w:tcW w:w="5256" w:type="dxa"/>
+            <w:shd w:val="clear" w:color="auto" w:fill="EAF2F8"/>
+            <w:tcMar>
+              <w:top w:w="95" w:type="dxa"/>
+              <w:left w:w="110" w:type="dxa"/>
+              <w:bottom w:w="95" w:type="dxa"/>
+              <w:right w:w="110" w:type="dxa"/>
+            </w:tcMar>
+            <w:vAlign w:val="center"/>
+          </w:tcPr>
+          <w:p>
+            <w:pPr>
+              <w:spacing w:after="0" w:line="252" w:lineRule="auto"/>
+            </w:pPr>
+            <w:r>
+              <w:rPr>
+                <w:sz w:val="15"/>
+              </w:rPr>
+              <w:t>Note assumptions and possibilities and increase storage units</w:t>
+            </w:r>
+          </w:p>
+        </w:tc>
+      </w:tr>
+      <w:tr>
+        <w:trPr>
+          <w:cantSplit/>
+          <w:jc w:val="center"/>
+        </w:trPr>
+        <w:tc>
+          <w:tcPr>
+            <w:tcW w:w="3024" w:type="dxa"/>
+            <w:tcMar>
+              <w:top w:w="95" w:type="dxa"/>
+              <w:left w:w="110" w:type="dxa"/>
+              <w:bottom w:w="95" w:type="dxa"/>
+              <w:right w:w="110" w:type="dxa"/>
+            </w:tcMar>
+            <w:vAlign w:val="center"/>
+          </w:tcPr>
+          <w:p>
+            <w:pPr>
+              <w:spacing w:after="0" w:line="252" w:lineRule="auto"/>
+            </w:pPr>
+            <w:r>
+              <w:rPr>
+                <w:sz w:val="15"/>
+              </w:rPr>
+              <w:t>Safety restricted asset is released</w:t>
+            </w:r>
+          </w:p>
+        </w:tc>
+        <w:tc>
+          <w:tcPr>
+            <w:tcW w:w="503" w:type="dxa"/>
+            <w:tcMar>
+              <w:top w:w="95" w:type="dxa"/>
+              <w:left w:w="110" w:type="dxa"/>
+              <w:bottom w:w="95" w:type="dxa"/>
+              <w:right w:w="110" w:type="dxa"/>
+            </w:tcMar>
+            <w:vAlign w:val="center"/>
+          </w:tcPr>
+          <w:p>
+            <w:pPr>
+              <w:spacing w:after="0" w:line="252" w:lineRule="auto"/>
+              <w:jc w:val="center"/>
+            </w:pPr>
+            <w:r>
+              <w:rPr>
+                <w:sz w:val="15"/>
+              </w:rPr>
+              <w:t>2</w:t>
+            </w:r>
+          </w:p>
+        </w:tc>
+        <w:tc>
+          <w:tcPr>
+            <w:tcW w:w="503" w:type="dxa"/>
+            <w:tcMar>
+              <w:top w:w="95" w:type="dxa"/>
+              <w:left w:w="110" w:type="dxa"/>
+              <w:bottom w:w="95" w:type="dxa"/>
+              <w:right w:w="110" w:type="dxa"/>
+            </w:tcMar>
+            <w:vAlign w:val="center"/>
+          </w:tcPr>
+          <w:p>
+            <w:pPr>
+              <w:spacing w:after="0" w:line="252" w:lineRule="auto"/>
+              <w:jc w:val="center"/>
+            </w:pPr>
+            <w:r>
+              <w:rPr>
+                <w:sz w:val="15"/>
+              </w:rPr>
+              <w:t>5</w:t>
+            </w:r>
+          </w:p>
+        </w:tc>
+        <w:tc>
+          <w:tcPr>
+            <w:tcW w:w="792" w:type="dxa"/>
+            <w:tcMar>
+              <w:top w:w="95" w:type="dxa"/>
+              <w:left w:w="110" w:type="dxa"/>
+              <w:bottom w:w="95" w:type="dxa"/>
+              <w:right w:w="110" w:type="dxa"/>
+            </w:tcMar>
+            <w:vAlign w:val="center"/>
+          </w:tcPr>
+          <w:p>
+            <w:pPr>
+              <w:spacing w:after="0" w:line="252" w:lineRule="auto"/>
+              <w:jc w:val="center"/>
+            </w:pPr>
+            <w:r>
+              <w:rPr>
+                <w:sz w:val="15"/>
+              </w:rPr>
+              <w:t>10</w:t>
+            </w:r>
+          </w:p>
+        </w:tc>
+        <w:tc>
+          <w:tcPr>
+            <w:tcW w:w="5256" w:type="dxa"/>
+            <w:tcMar>
+              <w:top w:w="95" w:type="dxa"/>
+              <w:left w:w="110" w:type="dxa"/>
+              <w:bottom w:w="95" w:type="dxa"/>
+              <w:right w:w="110" w:type="dxa"/>
+            </w:tcMar>
+            <w:vAlign w:val="center"/>
+          </w:tcPr>
+          <w:p>
+            <w:pPr>
+              <w:spacing w:after="0" w:line="252" w:lineRule="auto"/>
+              <w:rPr>
+                <w:sz w:val="15"/>
+              </w:rPr>
+            </w:pPr>
+            <w:r>
+              <w:rPr>
+                <w:sz w:val="15"/>
+              </w:rPr>
+              <w:t>Flag restricted asset categories and require inspection and authorized approval.</w:t>
+            </w:r>
+          </w:p>
+        </w:tc>
+      </w:tr>
+      <w:tr>
+        <w:trPr>
+          <w:cantSplit/>
+          <w:jc w:val="center"/>
+        </w:trPr>
+        <w:tc>
+          <w:tcPr>
+            <w:tcW w:w="3024" w:type="dxa"/>
+            <w:shd w:val="clear" w:color="auto" w:fill="EAF2F8"/>
+            <w:tcMar>
+              <w:top w:w="95" w:type="dxa"/>
+              <w:left w:w="110" w:type="dxa"/>
+              <w:bottom w:w="95" w:type="dxa"/>
+              <w:right w:w="110" w:type="dxa"/>
+            </w:tcMar>
+            <w:vAlign w:val="center"/>
+          </w:tcPr>
+          <w:p>
+            <w:pPr>
+              <w:spacing w:after="0" w:line="252" w:lineRule="auto"/>
+            </w:pPr>
+            <w:r>
+              <w:rPr>
+                <w:sz w:val="15"/>
+              </w:rPr>
+              <w:t>Final testing time is compressed</w:t>
+            </w:r>
+          </w:p>
+        </w:tc>
+        <w:tc>
+          <w:tcPr>
+            <w:tcW w:w="503" w:type="dxa"/>
+            <w:shd w:val="clear" w:color="auto" w:fill="EAF2F8"/>
+            <w:tcMar>
+              <w:top w:w="95" w:type="dxa"/>
+              <w:left w:w="110" w:type="dxa"/>
+              <w:bottom w:w="95" w:type="dxa"/>
+              <w:right w:w="110" w:type="dxa"/>
+            </w:tcMar>
+            <w:vAlign w:val="center"/>
+          </w:tcPr>
+          <w:p>
+            <w:pPr>
+              <w:spacing w:after="0" w:line="252" w:lineRule="auto"/>
+              <w:jc w:val="center"/>
+            </w:pPr>
+            <w:r>
+              <w:rPr>
+                <w:sz w:val="15"/>
+              </w:rPr>
+              <w:t>4</w:t>
+            </w:r>
+          </w:p>
+        </w:tc>
+        <w:tc>
+          <w:tcPr>
+            <w:tcW w:w="503" w:type="dxa"/>
+            <w:shd w:val="clear" w:color="auto" w:fill="EAF2F8"/>
+            <w:tcMar>
+              <w:top w:w="95" w:type="dxa"/>
+              <w:left w:w="110" w:type="dxa"/>
+              <w:bottom w:w="95" w:type="dxa"/>
+              <w:right w:w="110" w:type="dxa"/>
+            </w:tcMar>
+            <w:vAlign w:val="center"/>
+          </w:tcPr>
+          <w:p>
+            <w:pPr>
+              <w:spacing w:after="0" w:line="252" w:lineRule="auto"/>
+              <w:jc w:val="center"/>
+            </w:pPr>
+            <w:r>
+              <w:rPr>
+                <w:sz w:val="15"/>
+              </w:rPr>
+              <w:t>4</w:t>
+            </w:r>
+          </w:p>
+        </w:tc>
+        <w:tc>
+          <w:tcPr>
+            <w:tcW w:w="792" w:type="dxa"/>
+            <w:shd w:val="clear" w:color="auto" w:fill="EAF2F8"/>
+            <w:tcMar>
+              <w:top w:w="95" w:type="dxa"/>
+              <w:left w:w="110" w:type="dxa"/>
+              <w:bottom w:w="95" w:type="dxa"/>
+              <w:right w:w="110" w:type="dxa"/>
+            </w:tcMar>
+            <w:vAlign w:val="center"/>
+          </w:tcPr>
+          <w:p>
+            <w:pPr>
+              <w:spacing w:after="0" w:line="252" w:lineRule="auto"/>
+              <w:jc w:val="center"/>
+            </w:pPr>
+            <w:r>
+              <w:rPr>
+                <w:sz w:val="15"/>
+              </w:rPr>
+              <w:t>16</w:t>
+            </w:r>
+          </w:p>
+        </w:tc>
+        <w:tc>
+          <w:tcPr>
+            <w:tcW w:w="5256" w:type="dxa"/>
+            <w:shd w:val="clear" w:color="auto" w:fill="EAF2F8"/>
+            <w:tcMar>
+              <w:top w:w="95" w:type="dxa"/>
+              <w:left w:w="110" w:type="dxa"/>
+              <w:bottom w:w="95" w:type="dxa"/>
+              <w:right w:w="110" w:type="dxa"/>
+            </w:tcMar>
+            <w:vAlign w:val="center"/>
+          </w:tcPr>
+          <w:p>
+            <w:pPr>
+              <w:spacing w:after="0" w:line="252" w:lineRule="auto"/>
+              <w:rPr>
+                <w:sz w:val="15"/>
+              </w:rPr>
+            </w:pPr>
+            <w:r>
+              <w:rPr>
+                <w:sz w:val="15"/>
+              </w:rPr>
+              <w:t>Test throughout development, automate repeatable checks and reserve the final week for corrections.</w:t>
+            </w:r>
+          </w:p>
+        </w:tc>
+      </w:tr>
+    </w:tbl>
+    <w:p>
+      <w:pPr>
+        <w:spacing w:after="40"/>
+      </w:pPr>
+    </w:p>
+    <w:p>
+      <w:pPr>
+        <w:pStyle w:val="Heading2"/>
+        <w:rPr>
+          <w:b w:val="0"/>
+          <w:bCs w:val="0"/>
+          <w:color w:val="000000" w:themeColor="text1"/>
+        </w:rPr>
+      </w:pPr>
+      <w:r>
+        <w:rPr>
+          <w:color w:val="000000" w:themeColor="text1"/>
+        </w:rPr>
+        <w:lastRenderedPageBreak/>
+        <w:t>10. 1 Highest Priority Responses</w:t>
+      </w:r>
+    </w:p>
+    <w:p>
+      <w:r>
+        <w:t>The highest risks are schedule and data related. The team should respond before development by approving the minimum scope, generating a representative synthetic dataset, defining interfaces between application and AI modules, and preparing a working environment that either member can run. These controls reduce several risks at once because they make parallel work possible and prevent late discovery that the AI or workflow depends on missing information.</w:t>
+      </w:r>
+    </w:p>
+    <w:p/>
+    <w:p/>
+    <w:p>
+      <w:pPr>
+        <w:tabs>
+          <w:tab w:val="left" w:pos="916"/>
+          <w:tab w:val="left" w:pos="1832"/>
+          <w:tab w:val="left" w:pos="2748"/>
+          <w:tab w:val="left" w:pos="3664"/>
+          <w:tab w:val="left" w:pos="4580"/>
+          <w:tab w:val="left" w:pos="5496"/>
+          <w:tab w:val="left" w:pos="6412"/>
+          <w:tab w:val="left" w:pos="7328"/>
+          <w:tab w:val="left" w:pos="8244"/>
+          <w:tab w:val="left" w:pos="9160"/>
+          <w:tab w:val="left" w:pos="10076"/>
+          <w:tab w:val="left" w:pos="10992"/>
+          <w:tab w:val="left" w:pos="11908"/>
+          <w:tab w:val="left" w:pos="12824"/>
+          <w:tab w:val="left" w:pos="13740"/>
+          <w:tab w:val="left" w:pos="14656"/>
+        </w:tabs>
+        <w:spacing w:after="0" w:line="240" w:lineRule="auto"/>
+        <w:rPr>
+          <w:rFonts w:ascii="Courier New" w:eastAsia="Times New Roman" w:hAnsi="Courier New" w:cs="Courier New"/>
+          <w:color w:val="auto"/>
+          <w:sz w:val="20"/>
+          <w:szCs w:val="20"/>
           <w:lang w:val="en-AE"/>
         </w:rPr>
       </w:pPr>
     </w:p>
     <w:sectPr>
-      <w:headerReference w:type="default" r:id="rId8"/>
-      <w:footerReference w:type="default" r:id="rId9"/>
+      <w:headerReference w:type="default" r:id="rId9"/>
+      <w:footerReference w:type="default" r:id="rId10"/>
       <w:pgSz w:w="12240" w:h="15840"/>
       <w:pgMar w:top="1080" w:right="1181" w:bottom="1037" w:left="1181" w:header="504" w:footer="504" w:gutter="0"/>
       <w:pgNumType w:start="1"/>
@@ -7677,7 +11540,7 @@
 </file>
 
 <file path=word/endnotes.xml><?xml version="1.0" encoding="utf-8"?>
-<w:endnotes xmlns:wpc="http://schemas.microsoft.com/office/word/2010/wordprocessingCanvas" xmlns:cx="http://schemas.microsoft.com/office/drawing/2014/chartex" xmlns:cx1="http://schemas.microsoft.com/office/drawing/2015/9/8/chartex" xmlns:cx2="http://schemas.microsoft.com/office/drawing/2015/10/21/chartex" xmlns:cx3="http://schemas.microsoft.com/office/drawing/2016/5/9/chartex" xmlns:cx4="http://schemas.microsoft.com/office/drawing/2016/5/10/chartex" xmlns:cx5="http://schemas.microsoft.com/office/drawing/2016/5/11/chartex" xmlns:cx6="http://schemas.microsoft.com/office/drawing/2016/5/12/chartex" xmlns:cx7="http://schemas.microsoft.com/office/drawing/2016/5/13/chartex" xmlns:cx8="http://schemas.microsoft.com/office/drawing/2016/5/14/chartex" xmlns:mc="http://schemas.openxmlformats.org/markup-compatibility/2006" xmlns:aink="http://schemas.microsoft.com/office/drawing/2016/ink" xmlns:am3d="http://schemas.microsoft.com/office/drawing/2017/model3d" xmlns:o="urn:schemas-microsoft-com:office:office" xmlns:oel="http://schemas.microsoft.com/office/2019/extlst" xmlns:r="http://schemas.openxmlformats.org/officeDocument/2006/relationships" xmlns:m="http://schemas.openxmlformats.org/officeDocument/2006/math" xmlns:v="urn:schemas-microsoft-com:vml" xmlns:wp14="http://schemas.microsoft.com/office/word/2010/wordprocessingDrawing" xmlns:wp="http://schemas.openxmlformats.org/drawingml/2006/wordprocessingDrawing" xmlns:w10="urn:schemas-microsoft-com:office:word" xmlns:w="http://schemas.openxmlformats.org/wordprocessingml/2006/main" xmlns:w14="http://schemas.microsoft.com/office/word/2010/wordml" xmlns:w15="http://schemas.microsoft.com/office/word/2012/wordml" xmlns:w16cex="http://schemas.microsoft.com/office/word/2018/wordml/cex" xmlns:w16cid="http://schemas.microsoft.com/office/word/2016/wordml/cid" xmlns:w16="http://schemas.microsoft.com/office/word/2018/wordml" xmlns:w16du="http://schemas.microsoft.com/office/word/2023/wordml/word16du" xmlns:w16sdtdh="http://schemas.microsoft.com/office/word/2020/wordml/sdtdatahash" xmlns:w16sdtfl="http://schemas.microsoft.com/office/word/2024/wordml/sdtformatlock" xmlns:w16se="http://schemas.microsoft.com/office/word/2015/wordml/symex" xmlns:wpg="http://schemas.microsoft.com/office/word/2010/wordprocessingGroup" xmlns:wpi="http://schemas.microsoft.com/office/word/2010/wordprocessingInk" xmlns:wne="http://schemas.microsoft.com/office/word/2006/wordml" xmlns:wps="http://schemas.microsoft.com/office/word/2010/wordprocessingShape" mc:Ignorable="w14 w15 w16se w16cid w16 w16cex w16sdtdh w16sdtfl w16du wp14">
+<w:endnotes xmlns:wpc="http://schemas.microsoft.com/office/word/2010/wordprocessingCanvas" xmlns:cx="http://schemas.microsoft.com/office/drawing/2014/chartex" xmlns:cx1="http://schemas.microsoft.com/office/drawing/2015/9/8/chartex" xmlns:cx2="http://schemas.microsoft.com/office/drawing/2015/10/21/chartex" xmlns:cx3="http://schemas.microsoft.com/office/drawing/2016/5/9/chartex" xmlns:cx4="http://schemas.microsoft.com/office/drawing/2016/5/10/chartex" xmlns:cx5="http://schemas.microsoft.com/office/drawing/2016/5/11/chartex" xmlns:cx6="http://schemas.microsoft.com/office/drawing/2016/5/12/chartex" xmlns:cx7="http://schemas.microsoft.com/office/drawing/2016/5/13/chartex" xmlns:cx8="http://schemas.microsoft.com/office/drawing/2016/5/14/chartex" xmlns:mc="http://schemas.openxmlformats.org/markup-compatibility/2006" xmlns:m="http://schemas.openxmlformats.org/officeDocument/2006/math" xmlns:aink="http://schemas.microsoft.com/office/drawing/2016/ink" xmlns:am3d="http://schemas.microsoft.com/office/drawing/2017/model3d" xmlns:oel="http://schemas.microsoft.com/office/2019/extlst" xmlns:r="http://schemas.openxmlformats.org/officeDocument/2006/relationships" xmlns:wp14="http://schemas.microsoft.com/office/word/2010/wordprocessingDrawing" xmlns:wp="http://schemas.openxmlformats.org/drawingml/2006/wordprocessingDrawing" xmlns:wpg="http://schemas.microsoft.com/office/word/2010/wordprocessingGroup" xmlns:wpi="http://schemas.microsoft.com/office/word/2010/wordprocessingInk" xmlns:wps="http://schemas.microsoft.com/office/word/2010/wordprocessingShape" xmlns:o="urn:schemas-microsoft-com:office:office" xmlns:v="urn:schemas-microsoft-com:vml" xmlns:w10="urn:schemas-microsoft-com:office:word" xmlns:w="http://schemas.openxmlformats.org/wordprocessingml/2006/main" xmlns:w14="http://schemas.microsoft.com/office/word/2010/wordml" xmlns:w15="http://schemas.microsoft.com/office/word/2012/wordml" xmlns:w16cex="http://schemas.microsoft.com/office/word/2018/wordml/cex" xmlns:w16cid="http://schemas.microsoft.com/office/word/2016/wordml/cid" xmlns:w16="http://schemas.microsoft.com/office/word/2018/wordml" xmlns:w16sdtdh="http://schemas.microsoft.com/office/word/2020/wordml/sdtdatahash" xmlns:w16sdtfl="http://schemas.microsoft.com/office/word/2024/wordml/sdtformatlock" xmlns:w16se="http://schemas.microsoft.com/office/word/2015/wordml/symex" xmlns:w16du="http://schemas.microsoft.com/office/word/2023/wordml/word16du" xmlns:wne="http://schemas.microsoft.com/office/word/2006/wordml" mc:Ignorable="w14 w15 w16se w16cid w16 w16cex w16sdtdh w16sdtfl w16du wp14">
   <w:endnote w:type="separator" w:id="-1">
     <w:p>
       <w:pPr>
@@ -7702,7 +11565,7 @@
 </file>
 
 <file path=word/footer1.xml><?xml version="1.0" encoding="utf-8"?>
-<w:ftr xmlns:wpc="http://schemas.microsoft.com/office/word/2010/wordprocessingCanvas" xmlns:cx="http://schemas.microsoft.com/office/drawing/2014/chartex" xmlns:cx1="http://schemas.microsoft.com/office/drawing/2015/9/8/chartex" xmlns:cx2="http://schemas.microsoft.com/office/drawing/2015/10/21/chartex" xmlns:cx3="http://schemas.microsoft.com/office/drawing/2016/5/9/chartex" xmlns:cx4="http://schemas.microsoft.com/office/drawing/2016/5/10/chartex" xmlns:cx5="http://schemas.microsoft.com/office/drawing/2016/5/11/chartex" xmlns:cx6="http://schemas.microsoft.com/office/drawing/2016/5/12/chartex" xmlns:cx7="http://schemas.microsoft.com/office/drawing/2016/5/13/chartex" xmlns:cx8="http://schemas.microsoft.com/office/drawing/2016/5/14/chartex" xmlns:mc="http://schemas.openxmlformats.org/markup-compatibility/2006" xmlns:aink="http://schemas.microsoft.com/office/drawing/2016/ink" xmlns:am3d="http://schemas.microsoft.com/office/drawing/2017/model3d" xmlns:o="urn:schemas-microsoft-com:office:office" xmlns:oel="http://schemas.microsoft.com/office/2019/extlst" xmlns:r="http://schemas.openxmlformats.org/officeDocument/2006/relationships" xmlns:m="http://schemas.openxmlformats.org/officeDocument/2006/math" xmlns:v="urn:schemas-microsoft-com:vml" xmlns:wp14="http://schemas.microsoft.com/office/word/2010/wordprocessingDrawing" xmlns:wp="http://schemas.openxmlformats.org/drawingml/2006/wordprocessingDrawing" xmlns:w10="urn:schemas-microsoft-com:office:word" xmlns:w="http://schemas.openxmlformats.org/wordprocessingml/2006/main" xmlns:w14="http://schemas.microsoft.com/office/word/2010/wordml" xmlns:w15="http://schemas.microsoft.com/office/word/2012/wordml" xmlns:w16cex="http://schemas.microsoft.com/office/word/2018/wordml/cex" xmlns:w16cid="http://schemas.microsoft.com/office/word/2016/wordml/cid" xmlns:w16="http://schemas.microsoft.com/office/word/2018/wordml" xmlns:w16du="http://schemas.microsoft.com/office/word/2023/wordml/word16du" xmlns:w16sdtdh="http://schemas.microsoft.com/office/word/2020/wordml/sdtdatahash" xmlns:w16sdtfl="http://schemas.microsoft.com/office/word/2024/wordml/sdtformatlock" xmlns:w16se="http://schemas.microsoft.com/office/word/2015/wordml/symex" xmlns:wpg="http://schemas.microsoft.com/office/word/2010/wordprocessingGroup" xmlns:wpi="http://schemas.microsoft.com/office/word/2010/wordprocessingInk" xmlns:wne="http://schemas.microsoft.com/office/word/2006/wordml" xmlns:wps="http://schemas.microsoft.com/office/word/2010/wordprocessingShape" mc:Ignorable="w14 w15 w16se w16cid w16 w16cex w16sdtdh w16sdtfl w16du wp14">
+<w:ftr xmlns:wpc="http://schemas.microsoft.com/office/word/2010/wordprocessingCanvas" xmlns:cx="http://schemas.microsoft.com/office/drawing/2014/chartex" xmlns:cx1="http://schemas.microsoft.com/office/drawing/2015/9/8/chartex" xmlns:cx2="http://schemas.microsoft.com/office/drawing/2015/10/21/chartex" xmlns:cx3="http://schemas.microsoft.com/office/drawing/2016/5/9/chartex" xmlns:cx4="http://schemas.microsoft.com/office/drawing/2016/5/10/chartex" xmlns:cx5="http://schemas.microsoft.com/office/drawing/2016/5/11/chartex" xmlns:cx6="http://schemas.microsoft.com/office/drawing/2016/5/12/chartex" xmlns:cx7="http://schemas.microsoft.com/office/drawing/2016/5/13/chartex" xmlns:cx8="http://schemas.microsoft.com/office/drawing/2016/5/14/chartex" xmlns:mc="http://schemas.openxmlformats.org/markup-compatibility/2006" xmlns:m="http://schemas.openxmlformats.org/officeDocument/2006/math" xmlns:aink="http://schemas.microsoft.com/office/drawing/2016/ink" xmlns:am3d="http://schemas.microsoft.com/office/drawing/2017/model3d" xmlns:oel="http://schemas.microsoft.com/office/2019/extlst" xmlns:r="http://schemas.openxmlformats.org/officeDocument/2006/relationships" xmlns:wp14="http://schemas.microsoft.com/office/word/2010/wordprocessingDrawing" xmlns:wp="http://schemas.openxmlformats.org/drawingml/2006/wordprocessingDrawing" xmlns:wpg="http://schemas.microsoft.com/office/word/2010/wordprocessingGroup" xmlns:wpi="http://schemas.microsoft.com/office/word/2010/wordprocessingInk" xmlns:wps="http://schemas.microsoft.com/office/word/2010/wordprocessingShape" xmlns:o="urn:schemas-microsoft-com:office:office" xmlns:v="urn:schemas-microsoft-com:vml" xmlns:w10="urn:schemas-microsoft-com:office:word" xmlns:w="http://schemas.openxmlformats.org/wordprocessingml/2006/main" xmlns:w14="http://schemas.microsoft.com/office/word/2010/wordml" xmlns:w15="http://schemas.microsoft.com/office/word/2012/wordml" xmlns:w16cex="http://schemas.microsoft.com/office/word/2018/wordml/cex" xmlns:w16cid="http://schemas.microsoft.com/office/word/2016/wordml/cid" xmlns:w16="http://schemas.microsoft.com/office/word/2018/wordml" xmlns:w16sdtdh="http://schemas.microsoft.com/office/word/2020/wordml/sdtdatahash" xmlns:w16sdtfl="http://schemas.microsoft.com/office/word/2024/wordml/sdtformatlock" xmlns:w16se="http://schemas.microsoft.com/office/word/2015/wordml/symex" xmlns:w16du="http://schemas.microsoft.com/office/word/2023/wordml/word16du" xmlns:wne="http://schemas.microsoft.com/office/word/2006/wordml" mc:Ignorable="w14 w15 w16se w16cid w16 w16cex w16sdtdh w16sdtfl w16du wp14">
   <w:p>
     <w:pPr>
       <w:pStyle w:val="Footer"/>
@@ -7725,6 +11588,12 @@
       <w:fldChar w:fldCharType="separate"/>
     </w:r>
     <w:r>
+      <w:rPr>
+        <w:noProof/>
+      </w:rPr>
+      <w:t>2</w:t>
+    </w:r>
+    <w:r>
       <w:fldChar w:fldCharType="end"/>
     </w:r>
   </w:p>
@@ -7732,7 +11601,7 @@
 </file>
 
 <file path=word/footnotes.xml><?xml version="1.0" encoding="utf-8"?>
-<w:footnotes xmlns:wpc="http://schemas.microsoft.com/office/word/2010/wordprocessingCanvas" xmlns:cx="http://schemas.microsoft.com/office/drawing/2014/chartex" xmlns:cx1="http://schemas.microsoft.com/office/drawing/2015/9/8/chartex" xmlns:cx2="http://schemas.microsoft.com/office/drawing/2015/10/21/chartex" xmlns:cx3="http://schemas.microsoft.com/office/drawing/2016/5/9/chartex" xmlns:cx4="http://schemas.microsoft.com/office/drawing/2016/5/10/chartex" xmlns:cx5="http://schemas.microsoft.com/office/drawing/2016/5/11/chartex" xmlns:cx6="http://schemas.microsoft.com/office/drawing/2016/5/12/chartex" xmlns:cx7="http://schemas.microsoft.com/office/drawing/2016/5/13/chartex" xmlns:cx8="http://schemas.microsoft.com/office/drawing/2016/5/14/chartex" xmlns:mc="http://schemas.openxmlformats.org/markup-compatibility/2006" xmlns:aink="http://schemas.microsoft.com/office/drawing/2016/ink" xmlns:am3d="http://schemas.microsoft.com/office/drawing/2017/model3d" xmlns:o="urn:schemas-microsoft-com:office:office" xmlns:oel="http://schemas.microsoft.com/office/2019/extlst" xmlns:r="http://schemas.openxmlformats.org/officeDocument/2006/relationships" xmlns:m="http://schemas.openxmlformats.org/officeDocument/2006/math" xmlns:v="urn:schemas-microsoft-com:vml" xmlns:wp14="http://schemas.microsoft.com/office/word/2010/wordprocessingDrawing" xmlns:wp="http://schemas.openxmlformats.org/drawingml/2006/wordprocessingDrawing" xmlns:w10="urn:schemas-microsoft-com:office:word" xmlns:w="http://schemas.openxmlformats.org/wordprocessingml/2006/main" xmlns:w14="http://schemas.microsoft.com/office/word/2010/wordml" xmlns:w15="http://schemas.microsoft.com/office/word/2012/wordml" xmlns:w16cex="http://schemas.microsoft.com/office/word/2018/wordml/cex" xmlns:w16cid="http://schemas.microsoft.com/office/word/2016/wordml/cid" xmlns:w16="http://schemas.microsoft.com/office/word/2018/wordml" xmlns:w16du="http://schemas.microsoft.com/office/word/2023/wordml/word16du" xmlns:w16sdtdh="http://schemas.microsoft.com/office/word/2020/wordml/sdtdatahash" xmlns:w16sdtfl="http://schemas.microsoft.com/office/word/2024/wordml/sdtformatlock" xmlns:w16se="http://schemas.microsoft.com/office/word/2015/wordml/symex" xmlns:wpg="http://schemas.microsoft.com/office/word/2010/wordprocessingGroup" xmlns:wpi="http://schemas.microsoft.com/office/word/2010/wordprocessingInk" xmlns:wne="http://schemas.microsoft.com/office/word/2006/wordml" xmlns:wps="http://schemas.microsoft.com/office/word/2010/wordprocessingShape" mc:Ignorable="w14 w15 w16se w16cid w16 w16cex w16sdtdh w16sdtfl w16du wp14">
+<w:footnotes xmlns:wpc="http://schemas.microsoft.com/office/word/2010/wordprocessingCanvas" xmlns:cx="http://schemas.microsoft.com/office/drawing/2014/chartex" xmlns:cx1="http://schemas.microsoft.com/office/drawing/2015/9/8/chartex" xmlns:cx2="http://schemas.microsoft.com/office/drawing/2015/10/21/chartex" xmlns:cx3="http://schemas.microsoft.com/office/drawing/2016/5/9/chartex" xmlns:cx4="http://schemas.microsoft.com/office/drawing/2016/5/10/chartex" xmlns:cx5="http://schemas.microsoft.com/office/drawing/2016/5/11/chartex" xmlns:cx6="http://schemas.microsoft.com/office/drawing/2016/5/12/chartex" xmlns:cx7="http://schemas.microsoft.com/office/drawing/2016/5/13/chartex" xmlns:cx8="http://schemas.microsoft.com/office/drawing/2016/5/14/chartex" xmlns:mc="http://schemas.openxmlformats.org/markup-compatibility/2006" xmlns:m="http://schemas.openxmlformats.org/officeDocument/2006/math" xmlns:aink="http://schemas.microsoft.com/office/drawing/2016/ink" xmlns:am3d="http://schemas.microsoft.com/office/drawing/2017/model3d" xmlns:oel="http://schemas.microsoft.com/office/2019/extlst" xmlns:r="http://schemas.openxmlformats.org/officeDocument/2006/relationships" xmlns:wp14="http://schemas.microsoft.com/office/word/2010/wordprocessingDrawing" xmlns:wp="http://schemas.openxmlformats.org/drawingml/2006/wordprocessingDrawing" xmlns:wpg="http://schemas.microsoft.com/office/word/2010/wordprocessingGroup" xmlns:wpi="http://schemas.microsoft.com/office/word/2010/wordprocessingInk" xmlns:wps="http://schemas.microsoft.com/office/word/2010/wordprocessingShape" xmlns:o="urn:schemas-microsoft-com:office:office" xmlns:v="urn:schemas-microsoft-com:vml" xmlns:w10="urn:schemas-microsoft-com:office:word" xmlns:w="http://schemas.openxmlformats.org/wordprocessingml/2006/main" xmlns:w14="http://schemas.microsoft.com/office/word/2010/wordml" xmlns:w15="http://schemas.microsoft.com/office/word/2012/wordml" xmlns:w16cex="http://schemas.microsoft.com/office/word/2018/wordml/cex" xmlns:w16cid="http://schemas.microsoft.com/office/word/2016/wordml/cid" xmlns:w16="http://schemas.microsoft.com/office/word/2018/wordml" xmlns:w16sdtdh="http://schemas.microsoft.com/office/word/2020/wordml/sdtdatahash" xmlns:w16sdtfl="http://schemas.microsoft.com/office/word/2024/wordml/sdtformatlock" xmlns:w16se="http://schemas.microsoft.com/office/word/2015/wordml/symex" xmlns:w16du="http://schemas.microsoft.com/office/word/2023/wordml/word16du" xmlns:wne="http://schemas.microsoft.com/office/word/2006/wordml" mc:Ignorable="w14 w15 w16se w16cid w16 w16cex w16sdtdh w16sdtfl w16du wp14">
   <w:footnote w:type="separator" w:id="-1">
     <w:p>
       <w:pPr>
@@ -7757,7 +11626,7 @@
 </file>
 
 <file path=word/header1.xml><?xml version="1.0" encoding="utf-8"?>
-<w:hdr xmlns:wpc="http://schemas.microsoft.com/office/word/2010/wordprocessingCanvas" xmlns:cx="http://schemas.microsoft.com/office/drawing/2014/chartex" xmlns:cx1="http://schemas.microsoft.com/office/drawing/2015/9/8/chartex" xmlns:cx2="http://schemas.microsoft.com/office/drawing/2015/10/21/chartex" xmlns:cx3="http://schemas.microsoft.com/office/drawing/2016/5/9/chartex" xmlns:cx4="http://schemas.microsoft.com/office/drawing/2016/5/10/chartex" xmlns:cx5="http://schemas.microsoft.com/office/drawing/2016/5/11/chartex" xmlns:cx6="http://schemas.microsoft.com/office/drawing/2016/5/12/chartex" xmlns:cx7="http://schemas.microsoft.com/office/drawing/2016/5/13/chartex" xmlns:cx8="http://schemas.microsoft.com/office/drawing/2016/5/14/chartex" xmlns:mc="http://schemas.openxmlformats.org/markup-compatibility/2006" xmlns:aink="http://schemas.microsoft.com/office/drawing/2016/ink" xmlns:am3d="http://schemas.microsoft.com/office/drawing/2017/model3d" xmlns:o="urn:schemas-microsoft-com:office:office" xmlns:oel="http://schemas.microsoft.com/office/2019/extlst" xmlns:r="http://schemas.openxmlformats.org/officeDocument/2006/relationships" xmlns:m="http://schemas.openxmlformats.org/officeDocument/2006/math" xmlns:v="urn:schemas-microsoft-com:vml" xmlns:wp14="http://schemas.microsoft.com/office/word/2010/wordprocessingDrawing" xmlns:wp="http://schemas.openxmlformats.org/drawingml/2006/wordprocessingDrawing" xmlns:w10="urn:schemas-microsoft-com:office:word" xmlns:w="http://schemas.openxmlformats.org/wordprocessingml/2006/main" xmlns:w14="http://schemas.microsoft.com/office/word/2010/wordml" xmlns:w15="http://schemas.microsoft.com/office/word/2012/wordml" xmlns:w16cex="http://schemas.microsoft.com/office/word/2018/wordml/cex" xmlns:w16cid="http://schemas.microsoft.com/office/word/2016/wordml/cid" xmlns:w16="http://schemas.microsoft.com/office/word/2018/wordml" xmlns:w16du="http://schemas.microsoft.com/office/word/2023/wordml/word16du" xmlns:w16sdtdh="http://schemas.microsoft.com/office/word/2020/wordml/sdtdatahash" xmlns:w16sdtfl="http://schemas.microsoft.com/office/word/2024/wordml/sdtformatlock" xmlns:w16se="http://schemas.microsoft.com/office/word/2015/wordml/symex" xmlns:wpg="http://schemas.microsoft.com/office/word/2010/wordprocessingGroup" xmlns:wpi="http://schemas.microsoft.com/office/word/2010/wordprocessingInk" xmlns:wne="http://schemas.microsoft.com/office/word/2006/wordml" xmlns:wps="http://schemas.microsoft.com/office/word/2010/wordprocessingShape" mc:Ignorable="w14 w15 w16se w16cid w16 w16cex w16sdtdh w16sdtfl w16du wp14">
+<w:hdr xmlns:wpc="http://schemas.microsoft.com/office/word/2010/wordprocessingCanvas" xmlns:cx="http://schemas.microsoft.com/office/drawing/2014/chartex" xmlns:cx1="http://schemas.microsoft.com/office/drawing/2015/9/8/chartex" xmlns:cx2="http://schemas.microsoft.com/office/drawing/2015/10/21/chartex" xmlns:cx3="http://schemas.microsoft.com/office/drawing/2016/5/9/chartex" xmlns:cx4="http://schemas.microsoft.com/office/drawing/2016/5/10/chartex" xmlns:cx5="http://schemas.microsoft.com/office/drawing/2016/5/11/chartex" xmlns:cx6="http://schemas.microsoft.com/office/drawing/2016/5/12/chartex" xmlns:cx7="http://schemas.microsoft.com/office/drawing/2016/5/13/chartex" xmlns:cx8="http://schemas.microsoft.com/office/drawing/2016/5/14/chartex" xmlns:mc="http://schemas.openxmlformats.org/markup-compatibility/2006" xmlns:m="http://schemas.openxmlformats.org/officeDocument/2006/math" xmlns:aink="http://schemas.microsoft.com/office/drawing/2016/ink" xmlns:am3d="http://schemas.microsoft.com/office/drawing/2017/model3d" xmlns:oel="http://schemas.microsoft.com/office/2019/extlst" xmlns:r="http://schemas.openxmlformats.org/officeDocument/2006/relationships" xmlns:wp14="http://schemas.microsoft.com/office/word/2010/wordprocessingDrawing" xmlns:wp="http://schemas.openxmlformats.org/drawingml/2006/wordprocessingDrawing" xmlns:wpg="http://schemas.microsoft.com/office/word/2010/wordprocessingGroup" xmlns:wpi="http://schemas.microsoft.com/office/word/2010/wordprocessingInk" xmlns:wps="http://schemas.microsoft.com/office/word/2010/wordprocessingShape" xmlns:o="urn:schemas-microsoft-com:office:office" xmlns:v="urn:schemas-microsoft-com:vml" xmlns:w10="urn:schemas-microsoft-com:office:word" xmlns:w="http://schemas.openxmlformats.org/wordprocessingml/2006/main" xmlns:w14="http://schemas.microsoft.com/office/word/2010/wordml" xmlns:w15="http://schemas.microsoft.com/office/word/2012/wordml" xmlns:w16cex="http://schemas.microsoft.com/office/word/2018/wordml/cex" xmlns:w16cid="http://schemas.microsoft.com/office/word/2016/wordml/cid" xmlns:w16="http://schemas.microsoft.com/office/word/2018/wordml" xmlns:w16sdtdh="http://schemas.microsoft.com/office/word/2020/wordml/sdtdatahash" xmlns:w16sdtfl="http://schemas.microsoft.com/office/word/2024/wordml/sdtformatlock" xmlns:w16se="http://schemas.microsoft.com/office/word/2015/wordml/symex" xmlns:w16du="http://schemas.microsoft.com/office/word/2023/wordml/word16du" xmlns:wne="http://schemas.microsoft.com/office/word/2006/wordml" mc:Ignorable="w14 w15 w16se w16cid w16 w16cex w16sdtdh w16sdtfl w16du wp14">
   <w:p>
     <w:pPr>
       <w:pStyle w:val="Header"/>
@@ -7775,7 +11644,7 @@
 </file>
 
 <file path=word/numbering.xml><?xml version="1.0" encoding="utf-8"?>
-<w:numbering xmlns:wpc="http://schemas.microsoft.com/office/word/2010/wordprocessingCanvas" xmlns:cx="http://schemas.microsoft.com/office/drawing/2014/chartex" xmlns:cx1="http://schemas.microsoft.com/office/drawing/2015/9/8/chartex" xmlns:cx2="http://schemas.microsoft.com/office/drawing/2015/10/21/chartex" xmlns:cx3="http://schemas.microsoft.com/office/drawing/2016/5/9/chartex" xmlns:cx4="http://schemas.microsoft.com/office/drawing/2016/5/10/chartex" xmlns:cx5="http://schemas.microsoft.com/office/drawing/2016/5/11/chartex" xmlns:cx6="http://schemas.microsoft.com/office/drawing/2016/5/12/chartex" xmlns:cx7="http://schemas.microsoft.com/office/drawing/2016/5/13/chartex" xmlns:cx8="http://schemas.microsoft.com/office/drawing/2016/5/14/chartex" xmlns:mc="http://schemas.openxmlformats.org/markup-compatibility/2006" xmlns:aink="http://schemas.microsoft.com/office/drawing/2016/ink" xmlns:am3d="http://schemas.microsoft.com/office/drawing/2017/model3d" xmlns:o="urn:schemas-microsoft-com:office:office" xmlns:oel="http://schemas.microsoft.com/office/2019/extlst" xmlns:r="http://schemas.openxmlformats.org/officeDocument/2006/relationships" xmlns:m="http://schemas.openxmlformats.org/officeDocument/2006/math" xmlns:v="urn:schemas-microsoft-com:vml" xmlns:wp14="http://schemas.microsoft.com/office/word/2010/wordprocessingDrawing" xmlns:wp="http://schemas.openxmlformats.org/drawingml/2006/wordprocessingDrawing" xmlns:w10="urn:schemas-microsoft-com:office:word" xmlns:w="http://schemas.openxmlformats.org/wordprocessingml/2006/main" xmlns:w14="http://schemas.microsoft.com/office/word/2010/wordml" xmlns:w15="http://schemas.microsoft.com/office/word/2012/wordml" xmlns:w16cex="http://schemas.microsoft.com/office/word/2018/wordml/cex" xmlns:w16cid="http://schemas.microsoft.com/office/word/2016/wordml/cid" xmlns:w16="http://schemas.microsoft.com/office/word/2018/wordml" xmlns:w16du="http://schemas.microsoft.com/office/word/2023/wordml/word16du" xmlns:w16sdtdh="http://schemas.microsoft.com/office/word/2020/wordml/sdtdatahash" xmlns:w16sdtfl="http://schemas.microsoft.com/office/word/2024/wordml/sdtformatlock" xmlns:w16se="http://schemas.microsoft.com/office/word/2015/wordml/symex" xmlns:wpg="http://schemas.microsoft.com/office/word/2010/wordprocessingGroup" xmlns:wpi="http://schemas.microsoft.com/office/word/2010/wordprocessingInk" xmlns:wne="http://schemas.microsoft.com/office/word/2006/wordml" xmlns:wps="http://schemas.microsoft.com/office/word/2010/wordprocessingShape" mc:Ignorable="w14 w15 w16se w16cid w16 w16cex w16sdtdh w16sdtfl w16du wp14">
+<w:numbering xmlns:wpc="http://schemas.microsoft.com/office/word/2010/wordprocessingCanvas" xmlns:cx="http://schemas.microsoft.com/office/drawing/2014/chartex" xmlns:cx1="http://schemas.microsoft.com/office/drawing/2015/9/8/chartex" xmlns:cx2="http://schemas.microsoft.com/office/drawing/2015/10/21/chartex" xmlns:cx3="http://schemas.microsoft.com/office/drawing/2016/5/9/chartex" xmlns:cx4="http://schemas.microsoft.com/office/drawing/2016/5/10/chartex" xmlns:cx5="http://schemas.microsoft.com/office/drawing/2016/5/11/chartex" xmlns:cx6="http://schemas.microsoft.com/office/drawing/2016/5/12/chartex" xmlns:cx7="http://schemas.microsoft.com/office/drawing/2016/5/13/chartex" xmlns:cx8="http://schemas.microsoft.com/office/drawing/2016/5/14/chartex" xmlns:mc="http://schemas.openxmlformats.org/markup-compatibility/2006" xmlns:m="http://schemas.openxmlformats.org/officeDocument/2006/math" xmlns:aink="http://schemas.microsoft.com/office/drawing/2016/ink" xmlns:am3d="http://schemas.microsoft.com/office/drawing/2017/model3d" xmlns:oel="http://schemas.microsoft.com/office/2019/extlst" xmlns:r="http://schemas.openxmlformats.org/officeDocument/2006/relationships" xmlns:wp14="http://schemas.microsoft.com/office/word/2010/wordprocessingDrawing" xmlns:wp="http://schemas.openxmlformats.org/drawingml/2006/wordprocessingDrawing" xmlns:wpg="http://schemas.microsoft.com/office/word/2010/wordprocessingGroup" xmlns:wpi="http://schemas.microsoft.com/office/word/2010/wordprocessingInk" xmlns:wps="http://schemas.microsoft.com/office/word/2010/wordprocessingShape" xmlns:o="urn:schemas-microsoft-com:office:office" xmlns:v="urn:schemas-microsoft-com:vml" xmlns:w10="urn:schemas-microsoft-com:office:word" xmlns:w="http://schemas.openxmlformats.org/wordprocessingml/2006/main" xmlns:w14="http://schemas.microsoft.com/office/word/2010/wordml" xmlns:w15="http://schemas.microsoft.com/office/word/2012/wordml" xmlns:w16cex="http://schemas.microsoft.com/office/word/2018/wordml/cex" xmlns:w16cid="http://schemas.microsoft.com/office/word/2016/wordml/cid" xmlns:w16="http://schemas.microsoft.com/office/word/2018/wordml" xmlns:w16sdtdh="http://schemas.microsoft.com/office/word/2020/wordml/sdtdatahash" xmlns:w16sdtfl="http://schemas.microsoft.com/office/word/2024/wordml/sdtformatlock" xmlns:w16se="http://schemas.microsoft.com/office/word/2015/wordml/symex" xmlns:w16du="http://schemas.microsoft.com/office/word/2023/wordml/word16du" xmlns:wne="http://schemas.microsoft.com/office/word/2006/wordml" mc:Ignorable="w14 w15 w16se w16cid w16 w16cex w16sdtdh w16sdtfl w16du wp14">
   <w:abstractNum w:abstractNumId="0" w15:restartNumberingAfterBreak="0">
     <w:nsid w:val="FFFFFF7C"/>
     <w:multiLevelType w:val="singleLevel"/>
@@ -8130,7 +11999,7 @@
 </file>
 
 <file path=word/styles.xml><?xml version="1.0" encoding="utf-8"?>
-<w:styles xmlns:mc="http://schemas.openxmlformats.org/markup-compatibility/2006" xmlns:r="http://schemas.openxmlformats.org/officeDocument/2006/relationships" xmlns:w="http://schemas.openxmlformats.org/wordprocessingml/2006/main" xmlns:w14="http://schemas.microsoft.com/office/word/2010/wordml" xmlns:w15="http://schemas.microsoft.com/office/word/2012/wordml" xmlns:w16cex="http://schemas.microsoft.com/office/word/2018/wordml/cex" xmlns:w16cid="http://schemas.microsoft.com/office/word/2016/wordml/cid" xmlns:w16="http://schemas.microsoft.com/office/word/2018/wordml" xmlns:w16du="http://schemas.microsoft.com/office/word/2023/wordml/word16du" xmlns:w16sdtdh="http://schemas.microsoft.com/office/word/2020/wordml/sdtdatahash" xmlns:w16sdtfl="http://schemas.microsoft.com/office/word/2024/wordml/sdtformatlock" xmlns:w16se="http://schemas.microsoft.com/office/word/2015/wordml/symex" mc:Ignorable="w14 w15 w16se w16cid w16 w16cex w16sdtdh w16sdtfl w16du">
+<w:styles xmlns:mc="http://schemas.openxmlformats.org/markup-compatibility/2006" xmlns:r="http://schemas.openxmlformats.org/officeDocument/2006/relationships" xmlns:w="http://schemas.openxmlformats.org/wordprocessingml/2006/main" xmlns:w14="http://schemas.microsoft.com/office/word/2010/wordml" xmlns:w15="http://schemas.microsoft.com/office/word/2012/wordml" xmlns:w16cex="http://schemas.microsoft.com/office/word/2018/wordml/cex" xmlns:w16cid="http://schemas.microsoft.com/office/word/2016/wordml/cid" xmlns:w16="http://schemas.microsoft.com/office/word/2018/wordml" xmlns:w16sdtdh="http://schemas.microsoft.com/office/word/2020/wordml/sdtdatahash" xmlns:w16sdtfl="http://schemas.microsoft.com/office/word/2024/wordml/sdtformatlock" xmlns:w16se="http://schemas.microsoft.com/office/word/2015/wordml/symex" xmlns:w16du="http://schemas.microsoft.com/office/word/2023/wordml/word16du" mc:Ignorable="w14 w15 w16se w16cid w16 w16cex w16sdtdh w16sdtfl w16du">
   <w:docDefaults>
     <w:rPrDefault>
       <w:rPr>
@@ -8737,6 +12606,7 @@
   <w:style w:type="character" w:default="1" w:styleId="DefaultParagraphFont">
     <w:name w:val="Default Paragraph Font"/>
     <w:uiPriority w:val="1"/>
+    <w:semiHidden/>
     <w:unhideWhenUsed/>
   </w:style>
   <w:style w:type="table" w:default="1" w:styleId="TableNormal">
@@ -19510,6 +23380,70 @@
       </w:tcPr>
     </w:tblStylePr>
   </w:style>
+  <w:style w:type="paragraph" w:styleId="HTMLPreformatted">
+    <w:name w:val="HTML Preformatted"/>
+    <w:basedOn w:val="Normal"/>
+    <w:link w:val="HTMLPreformattedChar"/>
+    <w:uiPriority w:val="99"/>
+    <w:semiHidden/>
+    <w:unhideWhenUsed/>
+    <w:rsid w:val="00900E04"/>
+    <w:pPr>
+      <w:tabs>
+        <w:tab w:val="left" w:pos="916"/>
+        <w:tab w:val="left" w:pos="1832"/>
+        <w:tab w:val="left" w:pos="2748"/>
+        <w:tab w:val="left" w:pos="3664"/>
+        <w:tab w:val="left" w:pos="4580"/>
+        <w:tab w:val="left" w:pos="5496"/>
+        <w:tab w:val="left" w:pos="6412"/>
+        <w:tab w:val="left" w:pos="7328"/>
+        <w:tab w:val="left" w:pos="8244"/>
+        <w:tab w:val="left" w:pos="9160"/>
+        <w:tab w:val="left" w:pos="10076"/>
+        <w:tab w:val="left" w:pos="10992"/>
+        <w:tab w:val="left" w:pos="11908"/>
+        <w:tab w:val="left" w:pos="12824"/>
+        <w:tab w:val="left" w:pos="13740"/>
+        <w:tab w:val="left" w:pos="14656"/>
+      </w:tabs>
+      <w:spacing w:after="0" w:line="240" w:lineRule="auto"/>
+    </w:pPr>
+    <w:rPr>
+      <w:rFonts w:ascii="Courier New" w:eastAsia="Times New Roman" w:hAnsi="Courier New" w:cs="Courier New"/>
+      <w:color w:val="auto"/>
+      <w:sz w:val="20"/>
+      <w:szCs w:val="20"/>
+      <w:lang w:val="en-AE"/>
+    </w:rPr>
+  </w:style>
+  <w:style w:type="character" w:customStyle="1" w:styleId="HTMLPreformattedChar">
+    <w:name w:val="HTML Preformatted Char"/>
+    <w:basedOn w:val="DefaultParagraphFont"/>
+    <w:link w:val="HTMLPreformatted"/>
+    <w:uiPriority w:val="99"/>
+    <w:semiHidden/>
+    <w:rsid w:val="00900E04"/>
+    <w:rPr>
+      <w:rFonts w:ascii="Courier New" w:eastAsia="Times New Roman" w:hAnsi="Courier New" w:cs="Courier New"/>
+      <w:sz w:val="20"/>
+      <w:szCs w:val="20"/>
+      <w:lang w:val="en-AE"/>
+    </w:rPr>
+  </w:style>
+  <w:style w:type="character" w:styleId="HTMLCode">
+    <w:name w:val="HTML Code"/>
+    <w:basedOn w:val="DefaultParagraphFont"/>
+    <w:uiPriority w:val="99"/>
+    <w:semiHidden/>
+    <w:unhideWhenUsed/>
+    <w:rsid w:val="00900E04"/>
+    <w:rPr>
+      <w:rFonts w:ascii="Courier New" w:eastAsia="Times New Roman" w:hAnsi="Courier New" w:cs="Courier New"/>
+      <w:sz w:val="20"/>
+      <w:szCs w:val="20"/>
+    </w:rPr>
+  </w:style>
 </w:styles>
 </file>
 

</xml_diff>

<commit_message>
Add new section to Phase 2 feasibility study
</commit_message>
<xml_diff>
--- a/docs/Phase_2_Feasibility_Study.docx
+++ b/docs/Phase_2_Feasibility_Study.docx
@@ -1149,11 +1149,7 @@
         <w:t>Schedule feasibility is the most immediate management concern. The course allocates one week to Phase 2, two weeks to requirements, three weeks to design, three weeks to implementation, and a final compressed testing and submission period. A two-person team can complete a convincing prototype only if it delivers a narrow end-to-end workflow first. Advanced image classification, predictive demand forecasting, broad integration with university systems, and autonomous recommendations should remain future extensions unless the core workflow is stable ahead of schedule.</w:t>
       </w:r>
     </w:p>
-    <w:p>
-      <w:r>
-        <w:br w:type="page"/>
-      </w:r>
-    </w:p>
+    <w:p/>
     <w:p>
       <w:pPr>
         <w:pStyle w:val="Caption"/>
@@ -3108,8 +3104,16 @@
               <w:rPr>
                 <w:lang w:val="en-AE"/>
               </w:rPr>
-              <w:t>Architecture complexity, software availability, integration effort, performance, fallback behavior</w:t>
-            </w:r>
+              <w:t xml:space="preserve">Architecture complexity, software availability, integration effort, performance, fallback </w:t>
+            </w:r>
+            <w:proofErr w:type="spellStart"/>
+            <w:r>
+              <w:rPr>
+                <w:lang w:val="en-AE"/>
+              </w:rPr>
+              <w:t>behavior</w:t>
+            </w:r>
+            <w:proofErr w:type="spellEnd"/>
           </w:p>
         </w:tc>
       </w:tr>
@@ -3756,7 +3760,14 @@
         <w:rPr>
           <w:lang w:val="en-AE"/>
         </w:rPr>
-        <w:t>The application should show the AI functions through a service interface. The classification function takes approved asset fields. Gives back suggested categories, tags, missing metadata, confidence and an explanation. The matching function takes a request and candidate assets. Gives back ranked suggestions. The rest of the application stays in charge of authentication, authorization, workflow status, approvals, audit records and final decisions. This setup lets the team swap a model for a local model or a deterministic rule, without having to rewrite everything.</w:t>
+        <w:t xml:space="preserve">The application should show the AI functions through a service interface. The classification function takes approved asset fields. Gives back suggested categories, tags, missing metadata, confidence and an explanation. The matching function takes a request and candidate assets. Gives back ranked suggestions. The rest of the application stays in charge of authentication, authorization, workflow status, approvals, audit records and final decisions. This setup lets the team swap a model for a local model or a deterministic rule, without having to rewrite </w:t>
+      </w:r>
+      <w:proofErr w:type="spellStart"/>
+      <w:r>
+        <w:rPr>
+          <w:lang w:val="en-AE"/>
+        </w:rPr>
+        <w:t>everything.</w:t>
       </w:r>
       <w:r>
         <w:rPr>
@@ -3764,7 +3775,16 @@
           <w:bCs/>
           <w:lang w:val="en-AE"/>
         </w:rPr>
-        <w:t>Table 4 Technical Component Feasibility</w:t>
+        <w:t>Table</w:t>
+      </w:r>
+      <w:proofErr w:type="spellEnd"/>
+      <w:r>
+        <w:rPr>
+          <w:b/>
+          <w:bCs/>
+          <w:lang w:val="en-AE"/>
+        </w:rPr>
+        <w:t xml:space="preserve"> 4 Technical Component Feasibility</w:t>
       </w:r>
     </w:p>
     <w:tbl>
@@ -6033,7 +6053,21 @@
               <w:rPr>
                 <w:lang w:val="en-AE"/>
               </w:rPr>
-              <w:t>Use clearly labeled sample reference values</w:t>
+              <w:t xml:space="preserve">Use clearly </w:t>
+            </w:r>
+            <w:proofErr w:type="spellStart"/>
+            <w:r>
+              <w:rPr>
+                <w:lang w:val="en-AE"/>
+              </w:rPr>
+              <w:t>labeled</w:t>
+            </w:r>
+            <w:proofErr w:type="spellEnd"/>
+            <w:r>
+              <w:rPr>
+                <w:lang w:val="en-AE"/>
+              </w:rPr>
+              <w:t xml:space="preserve"> sample reference values</w:t>
             </w:r>
           </w:p>
         </w:tc>
@@ -6399,7 +6433,21 @@
         <w:rPr>
           <w:lang w:val="en-AE"/>
         </w:rPr>
-        <w:t>Classification can work well as a help tool. A person can type an asset title, description, specifications. Optionally add a picture. The AI service might propose a Classification, subcategory, material tag or a missing field. The interface should display the Classification suggestion of quietly changing the person’s own input. To judge the AI use a labeled test set that the model did not see during creation. The team can track Classification accuracy, top</w:t>
+        <w:t xml:space="preserve">Classification can work well as a help tool. A person can type an asset title, description, specifications. Optionally add a picture. The AI service might propose a Classification, subcategory, material tag or a missing field. The interface should display the Classification suggestion of quietly changing the person’s own input. To judge the AI use a </w:t>
+      </w:r>
+      <w:proofErr w:type="spellStart"/>
+      <w:r>
+        <w:rPr>
+          <w:lang w:val="en-AE"/>
+        </w:rPr>
+        <w:t>labeled</w:t>
+      </w:r>
+      <w:proofErr w:type="spellEnd"/>
+      <w:r>
+        <w:rPr>
+          <w:lang w:val="en-AE"/>
+        </w:rPr>
+        <w:t xml:space="preserve"> test set that the model did not see during creation. The team can track Classification accuracy, top</w:t>
       </w:r>
       <w:r>
         <w:rPr>
@@ -6734,7 +6782,21 @@
         <w:rPr>
           <w:lang w:val="en-AE"/>
         </w:rPr>
-        <w:t>Financial feasibility is acceptable, for a student prototype. Phase 1 already identified the resources as the two team members, personal or university computers, Git and GitHub development tools, a database, modeling tools, testing tools and AI libraries or services. Most can be used without payment. The main uncertain costs are hosting external AI calls, file storage, backups and any future integration or security work.</w:t>
+        <w:t xml:space="preserve">Financial feasibility is acceptable, for a student prototype. Phase 1 already identified the resources as the two team members, personal or university computers, Git and GitHub development tools, a database, </w:t>
+      </w:r>
+      <w:proofErr w:type="spellStart"/>
+      <w:r>
+        <w:rPr>
+          <w:lang w:val="en-AE"/>
+        </w:rPr>
+        <w:t>modeling</w:t>
+      </w:r>
+      <w:proofErr w:type="spellEnd"/>
+      <w:r>
+        <w:rPr>
+          <w:lang w:val="en-AE"/>
+        </w:rPr>
+        <w:t xml:space="preserve"> tools, testing tools and AI libraries or services. Most can be used without payment. The main uncertain costs are hosting external AI calls, file storage, backups and any future integration or security work.</w:t>
       </w:r>
     </w:p>
     <w:p>
@@ -7061,7 +7123,21 @@
               <w:rPr>
                 <w:lang w:val="en-AE"/>
               </w:rPr>
-              <w:t>Development and modeling tools</w:t>
+              <w:t xml:space="preserve">Development and </w:t>
+            </w:r>
+            <w:proofErr w:type="spellStart"/>
+            <w:r>
+              <w:rPr>
+                <w:lang w:val="en-AE"/>
+              </w:rPr>
+              <w:t>modeling</w:t>
+            </w:r>
+            <w:proofErr w:type="spellEnd"/>
+            <w:r>
+              <w:rPr>
+                <w:lang w:val="en-AE"/>
+              </w:rPr>
+              <w:t xml:space="preserve"> tools</w:t>
             </w:r>
           </w:p>
         </w:tc>
@@ -7742,7 +7818,21 @@
               <w:rPr>
                 <w:lang w:val="en-AE"/>
               </w:rPr>
-              <w:t>Excludes student labor and any production deployment</w:t>
+              <w:t xml:space="preserve">Excludes student </w:t>
+            </w:r>
+            <w:proofErr w:type="spellStart"/>
+            <w:r>
+              <w:rPr>
+                <w:lang w:val="en-AE"/>
+              </w:rPr>
+              <w:t>labor</w:t>
+            </w:r>
+            <w:proofErr w:type="spellEnd"/>
+            <w:r>
+              <w:rPr>
+                <w:lang w:val="en-AE"/>
+              </w:rPr>
+              <w:t xml:space="preserve"> and any production deployment</w:t>
             </w:r>
           </w:p>
         </w:tc>
@@ -7767,7 +7857,25 @@
           <w:iCs/>
           <w:lang w:val="en-AE"/>
         </w:rPr>
-        <w:t>These values are feasibility assumptions, not quotations. The project should be designed so the lower end remains possible. Any paid service should have a spending cap, an owner, usage logging, and a replacement path. Student labor is excluded from the direct cash total because it is course work, but the schedule section treats team time as the main scarce resource.</w:t>
+        <w:t xml:space="preserve">These values are feasibility assumptions, not quotations. The project should be designed so the lower end remains possible. Any paid service should have a spending cap, an owner, usage logging, and a replacement path. Student </w:t>
+      </w:r>
+      <w:proofErr w:type="spellStart"/>
+      <w:r>
+        <w:rPr>
+          <w:i/>
+          <w:iCs/>
+          <w:lang w:val="en-AE"/>
+        </w:rPr>
+        <w:t>labor</w:t>
+      </w:r>
+      <w:proofErr w:type="spellEnd"/>
+      <w:r>
+        <w:rPr>
+          <w:i/>
+          <w:iCs/>
+          <w:lang w:val="en-AE"/>
+        </w:rPr>
+        <w:t xml:space="preserve"> is excluded from the direct cash total because it is course work, but the schedule section treats team time as the main scarce resource.</w:t>
       </w:r>
     </w:p>
     <w:p>

</xml_diff>